<commit_message>
📰 Atualiza boletim - 2026-07-07
</commit_message>
<xml_diff>
--- a/output/boletim.docx
+++ b/output/boletim.docx
@@ -52,7 +52,7 @@
                 <w:color w:val="FFFFFF"/>
                 <w:sz w:val="28"/>
               </w:rPr>
-              <w:t>6 de julho de 2026</w:t>
+              <w:t>7 de julho de 2026</w:t>
             </w:r>
           </w:p>
         </w:tc>
@@ -87,7 +87,7 @@
                 <w:color w:val="1A4D2E"/>
                 <w:sz w:val="56"/>
               </w:rPr>
-              <w:t>57</w:t>
+              <w:t>24</w:t>
             </w:r>
           </w:p>
         </w:tc>
@@ -106,7 +106,7 @@
                 <w:color w:val="C0392B"/>
                 <w:sz w:val="56"/>
               </w:rPr>
-              <w:t>17</w:t>
+              <w:t>8</w:t>
             </w:r>
           </w:p>
         </w:tc>
@@ -125,7 +125,7 @@
                 <w:color w:val="D68910"/>
                 <w:sz w:val="56"/>
               </w:rPr>
-              <w:t>20</w:t>
+              <w:t>11</w:t>
             </w:r>
           </w:p>
         </w:tc>
@@ -144,7 +144,7 @@
                 <w:color w:val="7F8C8D"/>
                 <w:sz w:val="56"/>
               </w:rPr>
-              <w:t>20</w:t>
+              <w:t>5</w:t>
             </w:r>
           </w:p>
         </w:tc>
@@ -307,7 +307,7 @@
                   <w:u w:val="single"/>
                   <w:b/>
                 </w:rPr>
-                <w:t>Lei nº 15.458, de 3.7.2026 - Abre crédito extraordinário em favor do Ministério da Integração e do Desenvolvimento Regional, no valor de R$ 266.512.000,00 (duzentos e sessenta e seis milhões quinhentos e doze mil reais), para os fins que especifica.</w:t>
+                <w:t>Decreto nº 13.056, de 6.7.2026 - Altera o Decreto nº 12.301, de 9 de dezembro de 2024, que dispõe sobre a aprovação de diretrizes e de estratégias relativas à governança corporativa nas empresas estatais federais e à administração das participações societárias da União.</w:t>
               </w:r>
             </w:hyperlink>
           </w:p>
@@ -320,7 +320,7 @@
                 <w:color w:val="4A4A4A"/>
                 <w:sz w:val="18"/>
               </w:rPr>
-              <w:t>Abre crédito extraordinário para o Ministério da Integração e do Desenvolvimento Regional, no valor de R$ 266.512.000,00.</w:t>
+              <w:t>Altera decreto sobre diretrizes e estratégias de governança corporativa e administração de participações societárias em empresas estatais federais.</w:t>
             </w:r>
           </w:p>
         </w:tc>
@@ -351,7 +351,7 @@
                 <w:color w:val="1A4D2E"/>
                 <w:sz w:val="16"/>
               </w:rPr>
-              <w:t>PLANALTO | RESENHA DIARIA</w:t>
+              <w:t>BANCO CENTRAL | NORMAS</w:t>
             </w:r>
           </w:p>
           <w:p>
@@ -365,7 +365,7 @@
                   <w:u w:val="single"/>
                   <w:b/>
                 </w:rPr>
-                <w:t>Medida Provisória nº 1.375, de 3.7.2026 - Amplia o rol de Carreiras e Planos Especiais de Cargos cujos ocupantes fazem jus à indenização de que trata a Lei nº 12.855, de 2 de setembro de 2013, altera a Lei nº 15.367, de 30 de março de 2026, para admitir que as pessoas de que tratam o art. 6º da Emenda Constitucional nº 79, de 27 de maio de 2014, e o art. 6º da Emenda Constitucional nº 98, de 6 de dezembro de 2017, exerçam o direito de opção de que tratam os art. 52 a art. 54 da referida Lei, e transforma cargos efetivos vagos.</w:t>
+                <w:t>Comunicado n° 45.511, 7/7/2026</w:t>
               </w:r>
             </w:hyperlink>
           </w:p>
@@ -378,7 +378,7 @@
                 <w:color w:val="4A4A4A"/>
                 <w:sz w:val="18"/>
               </w:rPr>
-              <w:t>MP amplia rol de carreiras com direito a indenização, altera leis sobre opção de cargos e transforma cargos vagos.</w:t>
+              <w:t>Divulga as Taxas Básicas Financeiras (TBF), os Redutores "R" e as Taxas Referenciais (TR) relativos a 4, 5 e 6 de julho de 2026.</w:t>
             </w:r>
           </w:p>
         </w:tc>
@@ -409,7 +409,7 @@
                 <w:color w:val="1A4D2E"/>
                 <w:sz w:val="16"/>
               </w:rPr>
-              <w:t>PLANALTO | RESENHA DIARIA</w:t>
+              <w:t>BANCO CENTRAL | NORMAS</w:t>
             </w:r>
           </w:p>
           <w:p>
@@ -423,7 +423,7 @@
                   <w:u w:val="single"/>
                   <w:b/>
                 </w:rPr>
-                <w:t>Decreto nº 13.054, de 3.7.2026 - Altera o Regulamento da Previdência Social, aprovado pelo Decreto nº 3.048, de 6 de maio de 1999, para dispor sobre a condição de segurado especial dos associados em cooperativas.</w:t>
+                <w:t>Comunicado n° 45.510, 6/7/2026</w:t>
               </w:r>
             </w:hyperlink>
           </w:p>
@@ -436,7 +436,7 @@
                 <w:color w:val="4A4A4A"/>
                 <w:sz w:val="18"/>
               </w:rPr>
-              <w:t>Altera o Regulamento da Previdência Social para incluir associados em cooperativas como segurados especiais.</w:t>
+              <w:t>Divulga condições para a realização de operações compromissadas com instituições financeiras participantes do módulo Oferta Pública (Ofpub).</w:t>
             </w:r>
           </w:p>
         </w:tc>
@@ -467,7 +467,7 @@
                 <w:color w:val="1A4D2E"/>
                 <w:sz w:val="16"/>
               </w:rPr>
-              <w:t>PLANALTO | RESENHA DIARIA</w:t>
+              <w:t>BANCO CENTRAL | NORMAS</w:t>
             </w:r>
           </w:p>
           <w:p>
@@ -481,7 +481,7 @@
                   <w:u w:val="single"/>
                   <w:b/>
                 </w:rPr>
-                <w:t>Decreto nº 13.052, de 3.7.2026 - Altera o Decreto nº 11.002, de 17 de março de 2022, que regulamenta a Lei nº 13.954, de 16 de dezembro de 2019, e a Medida Provisória nº 2.215-10, de 31 de agosto de 2001, para dispor sobre a remuneração dos militares na ativa, os proventos na inatividade e as pensões militares.</w:t>
+                <w:t>Comunicado n° 45.507, 6/7/2026</w:t>
               </w:r>
             </w:hyperlink>
           </w:p>
@@ -494,7 +494,7 @@
                 <w:color w:val="4A4A4A"/>
                 <w:sz w:val="18"/>
               </w:rPr>
-              <w:t>Altera decreto sobre remuneração, proventos e pensões de militares na ativa e inatividade.</w:t>
+              <w:t>Divulga a Taxa Básica Financeira (TBF), o Redutor "R" e a Taxa Referencial (TR) relativos a 3 de julho de 2026.</w:t>
             </w:r>
           </w:p>
         </w:tc>
@@ -525,7 +525,7 @@
                 <w:color w:val="1A4D2E"/>
                 <w:sz w:val="16"/>
               </w:rPr>
-              <w:t>PLANALTO | RESENHA DIARIA</w:t>
+              <w:t>MINISTÉRIO DA FAZENDA | NOTÍCIAS</w:t>
             </w:r>
           </w:p>
           <w:p>
@@ -539,7 +539,7 @@
                   <w:u w:val="single"/>
                   <w:b/>
                 </w:rPr>
-                <w:t>Decreto nº 13.050, de 3.7.2026 - Altera o Decreto nº 9.226, de 6 de dezembro de 2017, que regulamenta a Lei nº 12.855, de 2 de setembro de 2013, que institui a indenização devida a ocupante de cargo efetivo das Carreiras e Planos Especiais de Cargos que especifica, em exercício nas unidades situadas em localidades estratégicas vinculadas à prevenção, controle, fiscalização e repressão dos delitos transfronteiriços.</w:t>
+                <w:t>Polícia Federal apura esquema de lavagem de dinheiro ligado a apostas ilegais</w:t>
               </w:r>
             </w:hyperlink>
           </w:p>
@@ -552,7 +552,7 @@
                 <w:color w:val="4A4A4A"/>
                 <w:sz w:val="18"/>
               </w:rPr>
-              <w:t>Altera decreto sobre indenização a servidores em localidades estratégicas de combate a delitos transfronteiriços.</w:t>
+              <w:t>Informações da Secretaria de Prêmios e Apostas (SPA) auxiliam investigação da Polícia Federal sobre lavagem de dinheiro em apostas ilegais.</w:t>
             </w:r>
           </w:p>
         </w:tc>
@@ -621,7 +621,7 @@
           <w:color w:val="1A1A1A"/>
           <w:sz w:val="22"/>
         </w:rPr>
-        <w:t xml:space="preserve">Lei nº 15.458, de 3.7.2026 - Abre crédito extraordinário em favor do Ministério da Integração e do Desenvolvimento Regional, no valor de R$ 266.512.000,00 (duzentos e sessenta e seis milhões quinhentos e doze mil reais), para os fins que especifica.   </w:t>
+        <w:t xml:space="preserve">Decreto nº 13.056, de 6.7.2026 - Altera o Decreto nº 12.301, de 9 de dezembro de 2024, que dispõe sobre a aprovação de diretrizes e de estratégias relativas à governança corporativa nas empresas estatais federais e à administração das participações societárias da União.   </w:t>
       </w:r>
       <w:r>
         <w:rPr>
@@ -641,7 +641,7 @@
           <w:color w:val="4A4A4A"/>
           <w:sz w:val="20"/>
         </w:rPr>
-        <w:t>Abre crédito extraordinário para o Ministério da Integração e do Desenvolvimento Regional, no valor de R$ 266.512.000,00.</w:t>
+        <w:t>Altera decreto sobre diretrizes e estratégias de governança corporativa e administração de participações societárias em empresas estatais federais.</w:t>
       </w:r>
     </w:p>
     <w:p>
@@ -684,7 +684,7 @@
           <w:color w:val="888888"/>
           <w:sz w:val="16"/>
         </w:rPr>
-        <w:t>Legislação federal com impacto orçamentário significativo.</w:t>
+        <w:t>Legislação nova com impacto direto em governança corporativa de estatais federais.</w:t>
       </w:r>
     </w:p>
     <w:p>
@@ -697,7 +697,7 @@
           <w:color w:val="1A1A1A"/>
           <w:sz w:val="22"/>
         </w:rPr>
-        <w:t xml:space="preserve">Decreto nº 13.055, de 3.7.2026 - Altera o Decreto nº 11.712, de 20 de setembro de 2023, que qualifica organizações militares da Marinha como Organizações Militares Prestadoras de Serviços, com autonomia de gestão.   </w:t>
+        <w:t xml:space="preserve">Lei nº 15.458, de 3.7.2026 - Abre crédito extraordinário em favor do Ministério da Integração e do Desenvolvimento Regional, no valor de R$ 266.512.000,00 (duzentos e sessenta e seis milhões quinhentos e doze mil reais), para os fins que especifica.   </w:t>
       </w:r>
       <w:r>
         <w:rPr>
@@ -717,7 +717,7 @@
           <w:color w:val="4A4A4A"/>
           <w:sz w:val="20"/>
         </w:rPr>
-        <w:t>Altera decreto que qualifica organizações militares da Marinha como prestadoras de serviços com autonomia de gestão.</w:t>
+        <w:t>Abre crédito extraordinário de R$ 266,5 milhões para o Ministério da Integração e do Desenvolvimento Regional.</w:t>
       </w:r>
     </w:p>
     <w:p>
@@ -760,7 +760,7 @@
           <w:color w:val="888888"/>
           <w:sz w:val="16"/>
         </w:rPr>
-        <w:t>Ato administrativo que impacta a gestão de órgãos públicos.</w:t>
+        <w:t>Abertura de crédito extraordinário com impacto orçamentário.</w:t>
       </w:r>
     </w:p>
     <w:p>
@@ -773,15 +773,15 @@
           <w:color w:val="1A1A1A"/>
           <w:sz w:val="22"/>
         </w:rPr>
-        <w:t xml:space="preserve">Medida Provisória nº 1.375, de 3.7.2026 - Amplia o rol de Carreiras e Planos Especiais de Cargos cujos ocupantes fazem jus à indenização de que trata a Lei nº 12.855, de 2 de setembro de 2013, altera a Lei nº 15.367, de 30 de março de 2026, para admitir que as pessoas de que tratam o art. 6º da Emenda Constitucional nº 79, de 27 de maio de 2014, e o art. 6º da Emenda Constitucional nº 98, de 6 de dezembro de 2017, exerçam o direito de opção de que tratam os art. 52 a art. 54 da referida Lei, e transforma cargos efetivos vagos.   </w:t>
+        <w:t xml:space="preserve">Decreto nº 13.055, de 3.7.2026 - Altera o Decreto nº 11.712, de 20 de setembro de 2023, que qualifica organizações militares da Marinha como Organizações Militares Prestadoras de Serviços, com autonomia de gestão.   </w:t>
       </w:r>
       <w:r>
         <w:rPr>
           <w:b/>
-          <w:color w:val="C0392B"/>
+          <w:color w:val="D68910"/>
           <w:sz w:val="16"/>
         </w:rPr>
-        <w:t>[ALTA]</w:t>
+        <w:t>[MÉDIA]</w:t>
       </w:r>
     </w:p>
     <w:p>
@@ -793,7 +793,7 @@
           <w:color w:val="4A4A4A"/>
           <w:sz w:val="20"/>
         </w:rPr>
-        <w:t>MP amplia rol de carreiras com direito a indenização, altera leis sobre opção de cargos e transforma cargos vagos.</w:t>
+        <w:t>Altera decreto que qualifica organizações militares da Marinha como prestadoras de serviços com autonomia de gestão.</w:t>
       </w:r>
     </w:p>
     <w:p>
@@ -813,159 +813,7 @@
           <w:color w:val="888888"/>
           <w:sz w:val="18"/>
         </w:rPr>
-        <w:t xml:space="preserve">2026-07-03   </w:t>
-      </w:r>
-      <w:hyperlink r:id="rId10">
-        <w:r>
-          <w:rPr>
-            <w:color w:val="1A4D2E"/>
-            <w:u w:val="single"/>
-            <w:b/>
-          </w:rPr>
-          <w:t>Acessar materia</w:t>
-        </w:r>
-      </w:hyperlink>
-    </w:p>
-    <w:p>
-      <w:pPr>
-        <w:spacing w:after="120"/>
-      </w:pPr>
-      <w:r>
-        <w:rPr>
-          <w:i/>
-          <w:color w:val="888888"/>
-          <w:sz w:val="16"/>
-        </w:rPr>
-        <w:t>Legislação federal com impacto em carreiras e planos de cargos públicos.</w:t>
-      </w:r>
-    </w:p>
-    <w:p>
-      <w:pPr>
-        <w:spacing w:before="160" w:after="40"/>
-      </w:pPr>
-      <w:r>
-        <w:rPr>
-          <w:b/>
-          <w:color w:val="1A1A1A"/>
-          <w:sz w:val="22"/>
-        </w:rPr>
-        <w:t xml:space="preserve">Decreto nº 13.054, de 3.7.2026 - Altera o Regulamento da Previdência Social, aprovado pelo Decreto nº 3.048, de 6 de maio de 1999, para dispor sobre a condição de segurado especial dos associados em cooperativas.   </w:t>
-      </w:r>
-      <w:r>
-        <w:rPr>
-          <w:b/>
-          <w:color w:val="C0392B"/>
-          <w:sz w:val="16"/>
-        </w:rPr>
-        <w:t>[ALTA]</w:t>
-      </w:r>
-    </w:p>
-    <w:p>
-      <w:pPr>
-        <w:spacing w:after="40"/>
-      </w:pPr>
-      <w:r>
-        <w:rPr>
-          <w:color w:val="4A4A4A"/>
-          <w:sz w:val="20"/>
-        </w:rPr>
-        <w:t>Altera o Regulamento da Previdência Social para incluir associados em cooperativas como segurados especiais.</w:t>
-      </w:r>
-    </w:p>
-    <w:p>
-      <w:pPr>
-        <w:spacing w:after="40"/>
-      </w:pPr>
-      <w:r>
-        <w:rPr>
-          <w:b/>
-          <w:color w:val="888888"/>
-          <w:sz w:val="18"/>
-        </w:rPr>
-        <w:t xml:space="preserve">Publicado: </w:t>
-      </w:r>
-      <w:r>
-        <w:rPr>
-          <w:color w:val="888888"/>
-          <w:sz w:val="18"/>
-        </w:rPr>
-        <w:t xml:space="preserve">2026-07-03   </w:t>
-      </w:r>
-      <w:hyperlink r:id="rId11">
-        <w:r>
-          <w:rPr>
-            <w:color w:val="1A4D2E"/>
-            <w:u w:val="single"/>
-            <w:b/>
-          </w:rPr>
-          <w:t>Acessar materia</w:t>
-        </w:r>
-      </w:hyperlink>
-    </w:p>
-    <w:p>
-      <w:pPr>
-        <w:spacing w:after="120"/>
-      </w:pPr>
-      <w:r>
-        <w:rPr>
-          <w:i/>
-          <w:color w:val="888888"/>
-          <w:sz w:val="16"/>
-        </w:rPr>
-        <w:t>Legislação federal com impacto direto na previdência social e cooperativas.</w:t>
-      </w:r>
-    </w:p>
-    <w:p>
-      <w:pPr>
-        <w:spacing w:before="160" w:after="40"/>
-      </w:pPr>
-      <w:r>
-        <w:rPr>
-          <w:b/>
-          <w:color w:val="1A1A1A"/>
-          <w:sz w:val="22"/>
-        </w:rPr>
-        <w:t xml:space="preserve">Decreto nº 13.053, de 3.7.2026 - Altera o Decreto nº 11.329, de 1º de janeiro de 2023, que aprova a Estrutura Regimental e o Quadro Demonstrativo dos Cargos em Comissão, das Funções de Confiança e das Gratificações da Casa Civil da Presidência da República e remaneja e transforma cargos em comissão, funções de confiança e gratificações.   </w:t>
-      </w:r>
-      <w:r>
-        <w:rPr>
-          <w:b/>
-          <w:color w:val="D68910"/>
-          <w:sz w:val="16"/>
-        </w:rPr>
-        <w:t>[MÉDIA]</w:t>
-      </w:r>
-    </w:p>
-    <w:p>
-      <w:pPr>
-        <w:spacing w:after="40"/>
-      </w:pPr>
-      <w:r>
-        <w:rPr>
-          <w:color w:val="4A4A4A"/>
-          <w:sz w:val="20"/>
-        </w:rPr>
-        <w:t>Altera estrutura regimental e quadro de cargos da Casa Civil da Presidência da República.</w:t>
-      </w:r>
-    </w:p>
-    <w:p>
-      <w:pPr>
-        <w:spacing w:after="40"/>
-      </w:pPr>
-      <w:r>
-        <w:rPr>
-          <w:b/>
-          <w:color w:val="888888"/>
-          <w:sz w:val="18"/>
-        </w:rPr>
-        <w:t xml:space="preserve">Publicado: </w:t>
-      </w:r>
-      <w:r>
-        <w:rPr>
-          <w:color w:val="888888"/>
-          <w:sz w:val="18"/>
-        </w:rPr>
-        <w:t xml:space="preserve">2026-07-03   </w:t>
+        <w:t xml:space="preserve">2026-07-06   </w:t>
       </w:r>
       <w:hyperlink r:id="rId15">
         <w:r>
@@ -988,539 +836,7 @@
           <w:color w:val="888888"/>
           <w:sz w:val="16"/>
         </w:rPr>
-        <w:t>Ato administrativo que reorganiza a estrutura de cargos na administração pública.</w:t>
-      </w:r>
-    </w:p>
-    <w:p>
-      <w:pPr>
-        <w:spacing w:before="160" w:after="40"/>
-      </w:pPr>
-      <w:r>
-        <w:rPr>
-          <w:b/>
-          <w:color w:val="1A1A1A"/>
-          <w:sz w:val="22"/>
-        </w:rPr>
-        <w:t xml:space="preserve">Decreto nº 13.052, de 3.7.2026 - Altera o Decreto nº 11.002, de 17 de março de 2022, que regulamenta a Lei nº 13.954, de 16 de dezembro de 2019, e a Medida Provisória nº 2.215-10, de 31 de agosto de 2001, para dispor sobre a remuneração dos militares na ativa, os proventos na inatividade e as pensões militares.   </w:t>
-      </w:r>
-      <w:r>
-        <w:rPr>
-          <w:b/>
-          <w:color w:val="C0392B"/>
-          <w:sz w:val="16"/>
-        </w:rPr>
-        <w:t>[ALTA]</w:t>
-      </w:r>
-    </w:p>
-    <w:p>
-      <w:pPr>
-        <w:spacing w:after="40"/>
-      </w:pPr>
-      <w:r>
-        <w:rPr>
-          <w:color w:val="4A4A4A"/>
-          <w:sz w:val="20"/>
-        </w:rPr>
-        <w:t>Altera decreto sobre remuneração, proventos e pensões de militares na ativa e inatividade.</w:t>
-      </w:r>
-    </w:p>
-    <w:p>
-      <w:pPr>
-        <w:spacing w:after="40"/>
-      </w:pPr>
-      <w:r>
-        <w:rPr>
-          <w:b/>
-          <w:color w:val="888888"/>
-          <w:sz w:val="18"/>
-        </w:rPr>
-        <w:t xml:space="preserve">Publicado: </w:t>
-      </w:r>
-      <w:r>
-        <w:rPr>
-          <w:color w:val="888888"/>
-          <w:sz w:val="18"/>
-        </w:rPr>
-        <w:t xml:space="preserve">2026-07-03   </w:t>
-      </w:r>
-      <w:hyperlink r:id="rId12">
-        <w:r>
-          <w:rPr>
-            <w:color w:val="1A4D2E"/>
-            <w:u w:val="single"/>
-            <w:b/>
-          </w:rPr>
-          <w:t>Acessar materia</w:t>
-        </w:r>
-      </w:hyperlink>
-    </w:p>
-    <w:p>
-      <w:pPr>
-        <w:spacing w:after="120"/>
-      </w:pPr>
-      <w:r>
-        <w:rPr>
-          <w:i/>
-          <w:color w:val="888888"/>
-          <w:sz w:val="16"/>
-        </w:rPr>
-        <w:t>Legislação federal com impacto direto em direitos e remuneração de militares.</w:t>
-      </w:r>
-    </w:p>
-    <w:p>
-      <w:pPr>
-        <w:spacing w:before="160" w:after="40"/>
-      </w:pPr>
-      <w:r>
-        <w:rPr>
-          <w:b/>
-          <w:color w:val="1A1A1A"/>
-          <w:sz w:val="22"/>
-        </w:rPr>
-        <w:t xml:space="preserve">Decreto nº 13.051, de 3.7.2026 - Dispõe sobre a distribuição do quantitativo de Gratificação Temporária de Execução e Apoio a Atividades Técnicas e Administrativas – GTATA.   </w:t>
-      </w:r>
-      <w:r>
-        <w:rPr>
-          <w:b/>
-          <w:color w:val="D68910"/>
-          <w:sz w:val="16"/>
-        </w:rPr>
-        <w:t>[MÉDIA]</w:t>
-      </w:r>
-    </w:p>
-    <w:p>
-      <w:pPr>
-        <w:spacing w:after="40"/>
-      </w:pPr>
-      <w:r>
-        <w:rPr>
-          <w:color w:val="4A4A4A"/>
-          <w:sz w:val="20"/>
-        </w:rPr>
-        <w:t>Dispõe sobre a distribuição de Gratificação Temporária para atividades técnicas e administrativas (GTATA).</w:t>
-      </w:r>
-    </w:p>
-    <w:p>
-      <w:pPr>
-        <w:spacing w:after="40"/>
-      </w:pPr>
-      <w:r>
-        <w:rPr>
-          <w:b/>
-          <w:color w:val="888888"/>
-          <w:sz w:val="18"/>
-        </w:rPr>
-        <w:t xml:space="preserve">Publicado: </w:t>
-      </w:r>
-      <w:r>
-        <w:rPr>
-          <w:color w:val="888888"/>
-          <w:sz w:val="18"/>
-        </w:rPr>
-        <w:t xml:space="preserve">2026-07-03   </w:t>
-      </w:r>
-      <w:hyperlink r:id="rId16">
-        <w:r>
-          <w:rPr>
-            <w:color w:val="1A4D2E"/>
-            <w:u w:val="single"/>
-            <w:b/>
-          </w:rPr>
-          <w:t>Acessar materia</w:t>
-        </w:r>
-      </w:hyperlink>
-    </w:p>
-    <w:p>
-      <w:pPr>
-        <w:spacing w:after="120"/>
-      </w:pPr>
-      <w:r>
-        <w:rPr>
-          <w:i/>
-          <w:color w:val="888888"/>
-          <w:sz w:val="16"/>
-        </w:rPr>
-        <w:t>Ato administrativo que impacta a remuneração de servidores.</w:t>
-      </w:r>
-    </w:p>
-    <w:p>
-      <w:pPr>
-        <w:spacing w:before="160" w:after="40"/>
-      </w:pPr>
-      <w:r>
-        <w:rPr>
-          <w:b/>
-          <w:color w:val="1A1A1A"/>
-          <w:sz w:val="22"/>
-        </w:rPr>
-        <w:t xml:space="preserve">Decreto nº 13.050, de 3.7.2026 - Altera o Decreto nº 9.226, de 6 de dezembro de 2017, que regulamenta a Lei nº 12.855, de 2 de setembro de 2013, que institui a indenização devida a ocupante de cargo efetivo das Carreiras e Planos Especiais de Cargos que especifica, em exercício nas unidades situadas em localidades estratégicas vinculadas à prevenção, controle, fiscalização e repressão dos delitos transfronteiriços.   </w:t>
-      </w:r>
-      <w:r>
-        <w:rPr>
-          <w:b/>
-          <w:color w:val="C0392B"/>
-          <w:sz w:val="16"/>
-        </w:rPr>
-        <w:t>[ALTA]</w:t>
-      </w:r>
-    </w:p>
-    <w:p>
-      <w:pPr>
-        <w:spacing w:after="40"/>
-      </w:pPr>
-      <w:r>
-        <w:rPr>
-          <w:color w:val="4A4A4A"/>
-          <w:sz w:val="20"/>
-        </w:rPr>
-        <w:t>Altera decreto sobre indenização a servidores em localidades estratégicas de combate a delitos transfronteiriços.</w:t>
-      </w:r>
-    </w:p>
-    <w:p>
-      <w:pPr>
-        <w:spacing w:after="40"/>
-      </w:pPr>
-      <w:r>
-        <w:rPr>
-          <w:b/>
-          <w:color w:val="888888"/>
-          <w:sz w:val="18"/>
-        </w:rPr>
-        <w:t xml:space="preserve">Publicado: </w:t>
-      </w:r>
-      <w:r>
-        <w:rPr>
-          <w:color w:val="888888"/>
-          <w:sz w:val="18"/>
-        </w:rPr>
-        <w:t xml:space="preserve">2026-07-03   </w:t>
-      </w:r>
-      <w:hyperlink r:id="rId13">
-        <w:r>
-          <w:rPr>
-            <w:color w:val="1A4D2E"/>
-            <w:u w:val="single"/>
-            <w:b/>
-          </w:rPr>
-          <w:t>Acessar materia</w:t>
-        </w:r>
-      </w:hyperlink>
-    </w:p>
-    <w:p>
-      <w:pPr>
-        <w:spacing w:after="120"/>
-      </w:pPr>
-      <w:r>
-        <w:rPr>
-          <w:i/>
-          <w:color w:val="888888"/>
-          <w:sz w:val="16"/>
-        </w:rPr>
-        <w:t>Legislação federal com impacto em direitos de servidores públicos.</w:t>
-      </w:r>
-    </w:p>
-    <w:p>
-      <w:pPr>
-        <w:spacing w:before="160" w:after="40"/>
-      </w:pPr>
-      <w:r>
-        <w:rPr>
-          <w:b/>
-          <w:color w:val="1A1A1A"/>
-          <w:sz w:val="22"/>
-        </w:rPr>
-        <w:t xml:space="preserve">Decreto nº 13.049, de 3.7.2026 - Regulamenta a Lei nº 12.855, de 2 de setembro de 2013, que institui a indenização devida a ocupante de cargo efetivo das Carreiras e Planos Especiais de Cargos que especifica, em exercício nas unidades situadas em localidades estratégicas vinculadas à prevenção, controle, fiscalização e repressão dos delitos transfronteiriços, quanto às Carreiras e aos Planos de Cargos que especifica.   </w:t>
-      </w:r>
-      <w:r>
-        <w:rPr>
-          <w:b/>
-          <w:color w:val="C0392B"/>
-          <w:sz w:val="16"/>
-        </w:rPr>
-        <w:t>[ALTA]</w:t>
-      </w:r>
-    </w:p>
-    <w:p>
-      <w:pPr>
-        <w:spacing w:after="40"/>
-      </w:pPr>
-      <w:r>
-        <w:rPr>
-          <w:color w:val="4A4A4A"/>
-          <w:sz w:val="20"/>
-        </w:rPr>
-        <w:t>Regulamenta lei sobre indenização a servidores em localidades estratégicas de combate a delitos transfronteiriços.</w:t>
-      </w:r>
-    </w:p>
-    <w:p>
-      <w:pPr>
-        <w:spacing w:after="40"/>
-      </w:pPr>
-      <w:r>
-        <w:rPr>
-          <w:b/>
-          <w:color w:val="888888"/>
-          <w:sz w:val="18"/>
-        </w:rPr>
-        <w:t xml:space="preserve">Publicado: </w:t>
-      </w:r>
-      <w:r>
-        <w:rPr>
-          <w:color w:val="888888"/>
-          <w:sz w:val="18"/>
-        </w:rPr>
-        <w:t xml:space="preserve">2026-07-03   </w:t>
-      </w:r>
-      <w:hyperlink r:id="rId17">
-        <w:r>
-          <w:rPr>
-            <w:color w:val="1A4D2E"/>
-            <w:u w:val="single"/>
-            <w:b/>
-          </w:rPr>
-          <w:t>Acessar materia</w:t>
-        </w:r>
-      </w:hyperlink>
-    </w:p>
-    <w:p>
-      <w:pPr>
-        <w:spacing w:after="120"/>
-      </w:pPr>
-      <w:r>
-        <w:rPr>
-          <w:i/>
-          <w:color w:val="888888"/>
-          <w:sz w:val="16"/>
-        </w:rPr>
-        <w:t>Legislação federal com impacto em direitos de servidores públicos.</w:t>
-      </w:r>
-    </w:p>
-    <w:p>
-      <w:pPr>
-        <w:spacing w:before="160" w:after="40"/>
-      </w:pPr>
-      <w:r>
-        <w:rPr>
-          <w:b/>
-          <w:color w:val="1A1A1A"/>
-          <w:sz w:val="22"/>
-        </w:rPr>
-        <w:t xml:space="preserve">Decreto nº 13.048, de 3.7.2026 - Estabelece os critérios e os procedimentos para a concessão do Reconhecimento de Saberes e Competências aos servidores ocupantes dos cargos do Plano de Carreira dos Cargos Técnico-Administrativos em Educação.   </w:t>
-      </w:r>
-      <w:r>
-        <w:rPr>
-          <w:b/>
-          <w:color w:val="D68910"/>
-          <w:sz w:val="16"/>
-        </w:rPr>
-        <w:t>[MÉDIA]</w:t>
-      </w:r>
-    </w:p>
-    <w:p>
-      <w:pPr>
-        <w:spacing w:after="40"/>
-      </w:pPr>
-      <w:r>
-        <w:rPr>
-          <w:color w:val="4A4A4A"/>
-          <w:sz w:val="20"/>
-        </w:rPr>
-        <w:t>Estabelece critérios para concessão de Reconhecimento de Saberes e Competências a servidores técnico-administrativos em Educação.</w:t>
-      </w:r>
-    </w:p>
-    <w:p>
-      <w:pPr>
-        <w:spacing w:after="40"/>
-      </w:pPr>
-      <w:r>
-        <w:rPr>
-          <w:b/>
-          <w:color w:val="888888"/>
-          <w:sz w:val="18"/>
-        </w:rPr>
-        <w:t xml:space="preserve">Publicado: </w:t>
-      </w:r>
-      <w:r>
-        <w:rPr>
-          <w:color w:val="888888"/>
-          <w:sz w:val="18"/>
-        </w:rPr>
-        <w:t xml:space="preserve">2026-07-03   </w:t>
-      </w:r>
-      <w:hyperlink r:id="rId18">
-        <w:r>
-          <w:rPr>
-            <w:color w:val="1A4D2E"/>
-            <w:u w:val="single"/>
-            <w:b/>
-          </w:rPr>
-          <w:t>Acessar materia</w:t>
-        </w:r>
-      </w:hyperlink>
-    </w:p>
-    <w:p>
-      <w:pPr>
-        <w:spacing w:after="120"/>
-      </w:pPr>
-      <w:r>
-        <w:rPr>
-          <w:i/>
-          <w:color w:val="888888"/>
-          <w:sz w:val="16"/>
-        </w:rPr>
-        <w:t>Ato administrativo que impacta a carreira de servidores públicos.</w:t>
-      </w:r>
-    </w:p>
-    <w:p>
-      <w:pPr>
-        <w:spacing w:before="160" w:after="40"/>
-      </w:pPr>
-      <w:r>
-        <w:rPr>
-          <w:b/>
-          <w:color w:val="1A1A1A"/>
-          <w:sz w:val="22"/>
-        </w:rPr>
-        <w:t xml:space="preserve">Lei nº 15.457, de 3.7.2026 - Cria a Universidade Federal do Esporte.   </w:t>
-      </w:r>
-      <w:r>
-        <w:rPr>
-          <w:b/>
-          <w:color w:val="C0392B"/>
-          <w:sz w:val="16"/>
-        </w:rPr>
-        <w:t>[ALTA]</w:t>
-      </w:r>
-    </w:p>
-    <w:p>
-      <w:pPr>
-        <w:spacing w:after="40"/>
-      </w:pPr>
-      <w:r>
-        <w:rPr>
-          <w:color w:val="4A4A4A"/>
-          <w:sz w:val="20"/>
-        </w:rPr>
-        <w:t>Cria a Universidade Federal do Esporte.</w:t>
-      </w:r>
-    </w:p>
-    <w:p>
-      <w:pPr>
-        <w:spacing w:after="40"/>
-      </w:pPr>
-      <w:r>
-        <w:rPr>
-          <w:b/>
-          <w:color w:val="888888"/>
-          <w:sz w:val="18"/>
-        </w:rPr>
-        <w:t xml:space="preserve">Publicado: </w:t>
-      </w:r>
-      <w:r>
-        <w:rPr>
-          <w:color w:val="888888"/>
-          <w:sz w:val="18"/>
-        </w:rPr>
-        <w:t xml:space="preserve">2026-07-03   </w:t>
-      </w:r>
-      <w:hyperlink r:id="rId19">
-        <w:r>
-          <w:rPr>
-            <w:color w:val="1A4D2E"/>
-            <w:u w:val="single"/>
-            <w:b/>
-          </w:rPr>
-          <w:t>Acessar materia</w:t>
-        </w:r>
-      </w:hyperlink>
-    </w:p>
-    <w:p>
-      <w:pPr>
-        <w:spacing w:after="120"/>
-      </w:pPr>
-      <w:r>
-        <w:rPr>
-          <w:i/>
-          <w:color w:val="888888"/>
-          <w:sz w:val="16"/>
-        </w:rPr>
-        <w:t>Legislação federal que cria uma nova instituição de ensino superior.</w:t>
-      </w:r>
-    </w:p>
-    <w:p>
-      <w:pPr>
-        <w:spacing w:before="160" w:after="40"/>
-      </w:pPr>
-      <w:r>
-        <w:rPr>
-          <w:b/>
-          <w:color w:val="1A1A1A"/>
-          <w:sz w:val="22"/>
-        </w:rPr>
-        <w:t xml:space="preserve">Lei nº 15.456, de 3.7.2026 - Regulamenta a profissão de protesista/ortesista ortopédico.   </w:t>
-      </w:r>
-      <w:r>
-        <w:rPr>
-          <w:b/>
-          <w:color w:val="C0392B"/>
-          <w:sz w:val="16"/>
-        </w:rPr>
-        <w:t>[ALTA]</w:t>
-      </w:r>
-    </w:p>
-    <w:p>
-      <w:pPr>
-        <w:spacing w:after="40"/>
-      </w:pPr>
-      <w:r>
-        <w:rPr>
-          <w:color w:val="4A4A4A"/>
-          <w:sz w:val="20"/>
-        </w:rPr>
-        <w:t>Regulamenta a profissão de protesista/ortesista ortopédico.</w:t>
-      </w:r>
-    </w:p>
-    <w:p>
-      <w:pPr>
-        <w:spacing w:after="40"/>
-      </w:pPr>
-      <w:r>
-        <w:rPr>
-          <w:b/>
-          <w:color w:val="888888"/>
-          <w:sz w:val="18"/>
-        </w:rPr>
-        <w:t xml:space="preserve">Publicado: </w:t>
-      </w:r>
-      <w:r>
-        <w:rPr>
-          <w:color w:val="888888"/>
-          <w:sz w:val="18"/>
-        </w:rPr>
-        <w:t xml:space="preserve">2026-07-03   </w:t>
-      </w:r>
-      <w:hyperlink r:id="rId20">
-        <w:r>
-          <w:rPr>
-            <w:color w:val="1A4D2E"/>
-            <w:u w:val="single"/>
-            <w:b/>
-          </w:rPr>
-          <w:t>Acessar materia</w:t>
-        </w:r>
-      </w:hyperlink>
-    </w:p>
-    <w:p>
-      <w:pPr>
-        <w:spacing w:after="120"/>
-      </w:pPr>
-      <w:r>
-        <w:rPr>
-          <w:i/>
-          <w:color w:val="888888"/>
-          <w:sz w:val="16"/>
-        </w:rPr>
-        <w:t>Legislação federal que regulamenta uma profissão.</w:t>
+        <w:t>Alteração de decreto administrativo com impacto na gestão de organizações militares.</w:t>
       </w:r>
     </w:p>
     <w:p/>
@@ -1586,15 +902,319 @@
           <w:color w:val="1A1A1A"/>
           <w:sz w:val="22"/>
         </w:rPr>
+        <w:t xml:space="preserve">Comunicado n° 45.513, 7/7/2026   </w:t>
+      </w:r>
+      <w:r>
+        <w:rPr>
+          <w:b/>
+          <w:color w:val="D68910"/>
+          <w:sz w:val="16"/>
+        </w:rPr>
+        <w:t>[MÉDIA]</w:t>
+      </w:r>
+    </w:p>
+    <w:p>
+      <w:pPr>
+        <w:spacing w:after="40"/>
+      </w:pPr>
+      <w:r>
+        <w:rPr>
+          <w:color w:val="4A4A4A"/>
+          <w:sz w:val="20"/>
+        </w:rPr>
+        <w:t>Divulga nomes de pessoas eleitas ou nomeadas para cargos de administração em instituições autorizadas a funcionar, para recebimento de objeções.</w:t>
+      </w:r>
+    </w:p>
+    <w:p>
+      <w:pPr>
+        <w:spacing w:after="40"/>
+      </w:pPr>
+      <w:r>
+        <w:rPr>
+          <w:b/>
+          <w:color w:val="888888"/>
+          <w:sz w:val="18"/>
+        </w:rPr>
+        <w:t xml:space="preserve">Publicado: </w:t>
+      </w:r>
+      <w:r>
+        <w:rPr>
+          <w:color w:val="888888"/>
+          <w:sz w:val="18"/>
+        </w:rPr>
+        <w:t xml:space="preserve">2026-07-07T09:32   </w:t>
+      </w:r>
+      <w:hyperlink r:id="rId16">
+        <w:r>
+          <w:rPr>
+            <w:color w:val="1A4D2E"/>
+            <w:u w:val="single"/>
+            <w:b/>
+          </w:rPr>
+          <w:t>Acessar materia</w:t>
+        </w:r>
+      </w:hyperlink>
+    </w:p>
+    <w:p>
+      <w:pPr>
+        <w:spacing w:after="120"/>
+      </w:pPr>
+      <w:r>
+        <w:rPr>
+          <w:i/>
+          <w:color w:val="888888"/>
+          <w:sz w:val="16"/>
+        </w:rPr>
+        <w:t>Comunicado administrativo sobre nomeações em instituições financeiras.</w:t>
+      </w:r>
+    </w:p>
+    <w:p>
+      <w:pPr>
+        <w:spacing w:before="160" w:after="40"/>
+      </w:pPr>
+      <w:r>
+        <w:rPr>
+          <w:b/>
+          <w:color w:val="1A1A1A"/>
+          <w:sz w:val="22"/>
+        </w:rPr>
+        <w:t xml:space="preserve">Comunicado n° 45.512, 7/7/2026   </w:t>
+      </w:r>
+      <w:r>
+        <w:rPr>
+          <w:b/>
+          <w:color w:val="D68910"/>
+          <w:sz w:val="16"/>
+        </w:rPr>
+        <w:t>[MÉDIA]</w:t>
+      </w:r>
+    </w:p>
+    <w:p>
+      <w:pPr>
+        <w:spacing w:after="40"/>
+      </w:pPr>
+      <w:r>
+        <w:rPr>
+          <w:color w:val="4A4A4A"/>
+          <w:sz w:val="20"/>
+        </w:rPr>
+        <w:t>Divulga nomes aprovados para cargos em órgãos estatutários ou contratuais de sociedades autorizadas a funcionar pelo Banco Central do Brasil.</w:t>
+      </w:r>
+    </w:p>
+    <w:p>
+      <w:pPr>
+        <w:spacing w:after="40"/>
+      </w:pPr>
+      <w:r>
+        <w:rPr>
+          <w:b/>
+          <w:color w:val="888888"/>
+          <w:sz w:val="18"/>
+        </w:rPr>
+        <w:t xml:space="preserve">Publicado: </w:t>
+      </w:r>
+      <w:r>
+        <w:rPr>
+          <w:color w:val="888888"/>
+          <w:sz w:val="18"/>
+        </w:rPr>
+        <w:t xml:space="preserve">2026-07-07T09:30   </w:t>
+      </w:r>
+      <w:hyperlink r:id="rId17">
+        <w:r>
+          <w:rPr>
+            <w:color w:val="1A4D2E"/>
+            <w:u w:val="single"/>
+            <w:b/>
+          </w:rPr>
+          <w:t>Acessar materia</w:t>
+        </w:r>
+      </w:hyperlink>
+    </w:p>
+    <w:p>
+      <w:pPr>
+        <w:spacing w:after="120"/>
+      </w:pPr>
+      <w:r>
+        <w:rPr>
+          <w:i/>
+          <w:color w:val="888888"/>
+          <w:sz w:val="16"/>
+        </w:rPr>
+        <w:t>Comunicado administrativo sobre aprovação de nomes em instituições financeiras.</w:t>
+      </w:r>
+    </w:p>
+    <w:p>
+      <w:pPr>
+        <w:spacing w:before="160" w:after="40"/>
+      </w:pPr>
+      <w:r>
+        <w:rPr>
+          <w:b/>
+          <w:color w:val="1A1A1A"/>
+          <w:sz w:val="22"/>
+        </w:rPr>
+        <w:t xml:space="preserve">Comunicado n° 45.511, 7/7/2026   </w:t>
+      </w:r>
+      <w:r>
+        <w:rPr>
+          <w:b/>
+          <w:color w:val="C0392B"/>
+          <w:sz w:val="16"/>
+        </w:rPr>
+        <w:t>[ALTA]</w:t>
+      </w:r>
+    </w:p>
+    <w:p>
+      <w:pPr>
+        <w:spacing w:after="40"/>
+      </w:pPr>
+      <w:r>
+        <w:rPr>
+          <w:color w:val="4A4A4A"/>
+          <w:sz w:val="20"/>
+        </w:rPr>
+        <w:t>Divulga as Taxas Básicas Financeiras (TBF), os Redutores "R" e as Taxas Referenciais (TR) relativos a 4, 5 e 6 de julho de 2026.</w:t>
+      </w:r>
+    </w:p>
+    <w:p>
+      <w:pPr>
+        <w:spacing w:after="40"/>
+      </w:pPr>
+      <w:r>
+        <w:rPr>
+          <w:b/>
+          <w:color w:val="888888"/>
+          <w:sz w:val="18"/>
+        </w:rPr>
+        <w:t xml:space="preserve">Publicado: </w:t>
+      </w:r>
+      <w:r>
+        <w:rPr>
+          <w:color w:val="888888"/>
+          <w:sz w:val="18"/>
+        </w:rPr>
+        <w:t xml:space="preserve">2026-07-07T09:06   </w:t>
+      </w:r>
+      <w:hyperlink r:id="rId10">
+        <w:r>
+          <w:rPr>
+            <w:color w:val="1A4D2E"/>
+            <w:u w:val="single"/>
+            <w:b/>
+          </w:rPr>
+          <w:t>Acessar materia</w:t>
+        </w:r>
+      </w:hyperlink>
+    </w:p>
+    <w:p>
+      <w:pPr>
+        <w:spacing w:after="120"/>
+      </w:pPr>
+      <w:r>
+        <w:rPr>
+          <w:i/>
+          <w:color w:val="888888"/>
+          <w:sz w:val="16"/>
+        </w:rPr>
+        <w:t>Divulgação de taxas financeiras de referência com impacto no mercado.</w:t>
+      </w:r>
+    </w:p>
+    <w:p>
+      <w:pPr>
+        <w:spacing w:before="160" w:after="40"/>
+      </w:pPr>
+      <w:r>
+        <w:rPr>
+          <w:b/>
+          <w:color w:val="1A1A1A"/>
+          <w:sz w:val="22"/>
+        </w:rPr>
+        <w:t xml:space="preserve">Comunicado n° 45.510, 6/7/2026   </w:t>
+      </w:r>
+      <w:r>
+        <w:rPr>
+          <w:b/>
+          <w:color w:val="C0392B"/>
+          <w:sz w:val="16"/>
+        </w:rPr>
+        <w:t>[ALTA]</w:t>
+      </w:r>
+    </w:p>
+    <w:p>
+      <w:pPr>
+        <w:spacing w:after="40"/>
+      </w:pPr>
+      <w:r>
+        <w:rPr>
+          <w:color w:val="4A4A4A"/>
+          <w:sz w:val="20"/>
+        </w:rPr>
+        <w:t>Divulga condições para a realização de operações compromissadas com instituições financeiras participantes do módulo Oferta Pública (Ofpub).</w:t>
+      </w:r>
+    </w:p>
+    <w:p>
+      <w:pPr>
+        <w:spacing w:after="40"/>
+      </w:pPr>
+      <w:r>
+        <w:rPr>
+          <w:b/>
+          <w:color w:val="888888"/>
+          <w:sz w:val="18"/>
+        </w:rPr>
+        <w:t xml:space="preserve">Publicado: </w:t>
+      </w:r>
+      <w:r>
+        <w:rPr>
+          <w:color w:val="888888"/>
+          <w:sz w:val="18"/>
+        </w:rPr>
+        <w:t xml:space="preserve">2026-07-06T18:30   </w:t>
+      </w:r>
+      <w:hyperlink r:id="rId11">
+        <w:r>
+          <w:rPr>
+            <w:color w:val="1A4D2E"/>
+            <w:u w:val="single"/>
+            <w:b/>
+          </w:rPr>
+          <w:t>Acessar materia</w:t>
+        </w:r>
+      </w:hyperlink>
+    </w:p>
+    <w:p>
+      <w:pPr>
+        <w:spacing w:after="120"/>
+      </w:pPr>
+      <w:r>
+        <w:rPr>
+          <w:i/>
+          <w:color w:val="888888"/>
+          <w:sz w:val="16"/>
+        </w:rPr>
+        <w:t>Normativa sobre operações financeiras no mercado, impactando instituições financeiras.</w:t>
+      </w:r>
+    </w:p>
+    <w:p>
+      <w:pPr>
+        <w:spacing w:before="160" w:after="40"/>
+      </w:pPr>
+      <w:r>
+        <w:rPr>
+          <w:b/>
+          <w:color w:val="1A1A1A"/>
+          <w:sz w:val="22"/>
+        </w:rPr>
         <w:t xml:space="preserve">Comunicado n° 45.509, 6/7/2026   </w:t>
       </w:r>
       <w:r>
         <w:rPr>
           <w:b/>
-          <w:color w:val="7F8C8D"/>
+          <w:color w:val="D68910"/>
           <w:sz w:val="16"/>
         </w:rPr>
-        <w:t>[BAIXA]</w:t>
+        <w:t>[MÉDIA]</w:t>
       </w:r>
     </w:p>
     <w:p>
@@ -1606,7 +1226,7 @@
           <w:color w:val="4A4A4A"/>
           <w:sz w:val="20"/>
         </w:rPr>
-        <w:t>Divulga nomes de pessoas eleitas ou nomeadas para cargos de administração em instituições autorizadas a funcionar, para recebimento de eventuais objeções.</w:t>
+        <w:t>Divulga nomes de pessoas eleitas ou nomeadas para cargos de administração em instituições autorizadas a funcionar, para recebimento de objeções.</w:t>
       </w:r>
     </w:p>
     <w:p>
@@ -1628,7 +1248,7 @@
         </w:rPr>
         <w:t xml:space="preserve">2026-07-06T10:07   </w:t>
       </w:r>
-      <w:hyperlink r:id="rId21">
+      <w:hyperlink r:id="rId18">
         <w:r>
           <w:rPr>
             <w:color w:val="1A4D2E"/>
@@ -1649,7 +1269,7 @@
           <w:color w:val="888888"/>
           <w:sz w:val="16"/>
         </w:rPr>
-        <w:t>Notícia administrativa sobre nomeações em instituições financeiras.</w:t>
+        <w:t>Comunicado administrativo sobre nomeações em instituições financeiras.</w:t>
       </w:r>
     </w:p>
     <w:p>
@@ -1667,10 +1287,10 @@
       <w:r>
         <w:rPr>
           <w:b/>
-          <w:color w:val="7F8C8D"/>
+          <w:color w:val="D68910"/>
           <w:sz w:val="16"/>
         </w:rPr>
-        <w:t>[BAIXA]</w:t>
+        <w:t>[MÉDIA]</w:t>
       </w:r>
     </w:p>
     <w:p>
@@ -1682,7 +1302,7 @@
           <w:color w:val="4A4A4A"/>
           <w:sz w:val="20"/>
         </w:rPr>
-        <w:t>Divulga nome aprovado de pessoas eleitas/nomeadas para cargos de órgãos estatutários ou contratuais de sociedades autorizadas a funcionar pelo Banco Central do Brasil.</w:t>
+        <w:t>Divulga nomes aprovados de pessoas eleitas/nomeadas para cargos de órgãos estatutários ou contratuais de sociedades autorizadas a funcionar pelo Banco Central do Brasil.</w:t>
       </w:r>
     </w:p>
     <w:p>
@@ -1704,7 +1324,7 @@
         </w:rPr>
         <w:t xml:space="preserve">2026-07-06T10:06   </w:t>
       </w:r>
-      <w:hyperlink r:id="rId22">
+      <w:hyperlink r:id="rId19">
         <w:r>
           <w:rPr>
             <w:color w:val="1A4D2E"/>
@@ -1725,7 +1345,7 @@
           <w:color w:val="888888"/>
           <w:sz w:val="16"/>
         </w:rPr>
-        <w:t>Notícia administrativa sobre aprovação de nomes em instituições financeiras.</w:t>
+        <w:t>Comunicado administrativo sobre aprovação de nomes em instituições financeiras.</w:t>
       </w:r>
     </w:p>
     <w:p>
@@ -1743,10 +1363,10 @@
       <w:r>
         <w:rPr>
           <w:b/>
-          <w:color w:val="D68910"/>
+          <w:color w:val="C0392B"/>
           <w:sz w:val="16"/>
         </w:rPr>
-        <w:t>[MÉDIA]</w:t>
+        <w:t>[ALTA]</w:t>
       </w:r>
     </w:p>
     <w:p>
@@ -1780,7 +1400,7 @@
         </w:rPr>
         <w:t xml:space="preserve">2026-07-06T09:01   </w:t>
       </w:r>
-      <w:hyperlink r:id="rId23">
+      <w:hyperlink r:id="rId12">
         <w:r>
           <w:rPr>
             <w:color w:val="1A4D2E"/>
@@ -1801,8 +1421,29 @@
           <w:color w:val="888888"/>
           <w:sz w:val="16"/>
         </w:rPr>
-        <w:t>Informação relevante para o mercado financeiro sobre taxas de referência.</w:t>
+        <w:t>Divulgação de taxas financeiras de referência com impacto no mercado.</w:t>
       </w:r>
+    </w:p>
+    <w:p>
+      <w:pPr>
+        <w:spacing w:before="240" w:after="80"/>
+      </w:pPr>
+      <w:r>
+        <w:rPr>
+          <w:b/>
+          <w:color w:val="1A4D2E"/>
+          <w:sz w:val="20"/>
+        </w:rPr>
+        <w:t>CVM | NOTÍCIAS</w:t>
+      </w:r>
+    </w:p>
+    <w:p>
+      <w:pPr>
+        <w:spacing w:before="0" w:after="40"/>
+        <w:pBdr>
+          <w:bottom w:val="single" w:sz="8" w:space="1" w:color="1A4D2E"/>
+        </w:pBdr>
+      </w:pPr>
     </w:p>
     <w:p>
       <w:pPr>
@@ -1814,15 +1455,15 @@
           <w:color w:val="1A1A1A"/>
           <w:sz w:val="22"/>
         </w:rPr>
-        <w:t xml:space="preserve">Comunicado n° 45.506, 3/7/2026   </w:t>
+        <w:t xml:space="preserve">Colegiado da CVM aceita proposta de Termo de Compromisso com Pátria Investimentos Ltda. e seu diretor no valor de R$ 1.890.000,00   </w:t>
       </w:r>
       <w:r>
         <w:rPr>
           <w:b/>
-          <w:color w:val="D68910"/>
+          <w:color w:val="C0392B"/>
           <w:sz w:val="16"/>
         </w:rPr>
-        <w:t>[MÉDIA]</w:t>
+        <w:t>[ALTA]</w:t>
       </w:r>
     </w:p>
     <w:p>
@@ -1834,7 +1475,7 @@
           <w:color w:val="4A4A4A"/>
           <w:sz w:val="20"/>
         </w:rPr>
-        <w:t>Divulga condições para a realização de operações compromissadas com instituições financeiras participantes do módulo Oferta Pública (Ofpub).</w:t>
+        <w:t>Colegiado da CVM aceita Termo de Compromisso de R$ 1,89 milhão com Pátria Investimentos Ltda. e seu diretor.</w:t>
       </w:r>
     </w:p>
     <w:p>
@@ -1854,9 +1495,9 @@
           <w:color w:val="888888"/>
           <w:sz w:val="18"/>
         </w:rPr>
-        <w:t xml:space="preserve">2026-07-03T18:30   </w:t>
+        <w:t xml:space="preserve">2026-07-06   </w:t>
       </w:r>
-      <w:hyperlink r:id="rId24">
+      <w:hyperlink r:id="rId20">
         <w:r>
           <w:rPr>
             <w:color w:val="1A4D2E"/>
@@ -1877,7 +1518,7 @@
           <w:color w:val="888888"/>
           <w:sz w:val="16"/>
         </w:rPr>
-        <w:t>Impacta operações financeiras e participantes do mercado.</w:t>
+        <w:t>Decisão regulatória com valor significativo e impacto em mercado de capitais.</w:t>
       </w:r>
     </w:p>
     <w:p>
@@ -1890,15 +1531,15 @@
           <w:color w:val="1A1A1A"/>
           <w:sz w:val="22"/>
         </w:rPr>
-        <w:t xml:space="preserve">Resolução CMN n° 5.326, 3/7/2026   </w:t>
+        <w:t xml:space="preserve">Prorrogadas inscrições para edição 2026 do Programa TOP até 13/7   </w:t>
       </w:r>
       <w:r>
         <w:rPr>
           <w:b/>
-          <w:color w:val="C0392B"/>
+          <w:color w:val="7F8C8D"/>
           <w:sz w:val="16"/>
         </w:rPr>
-        <w:t>[ALTA]</w:t>
+        <w:t>[BAIXA]</w:t>
       </w:r>
     </w:p>
     <w:p>
@@ -1910,7 +1551,7 @@
           <w:color w:val="4A4A4A"/>
           <w:sz w:val="20"/>
         </w:rPr>
-        <w:t>Estabelece as condições, os encargos financeiros e os prazos aplicáveis à linha de crédito reembolsável de que trata o art. 3º da Medida Provisória nº 1.373, de 29 de junho de 2026.</w:t>
+        <w:t>Inscrições para o Programa TOP 2026, curso gratuito e online para professores, são prorrogadas até 13 de julho.</w:t>
       </w:r>
     </w:p>
     <w:p>
@@ -1930,9 +1571,9 @@
           <w:color w:val="888888"/>
           <w:sz w:val="18"/>
         </w:rPr>
-        <w:t xml:space="preserve">2026-07-03T18:01   </w:t>
+        <w:t xml:space="preserve">2026-07-06   </w:t>
       </w:r>
-      <w:hyperlink r:id="rId25">
+      <w:hyperlink r:id="rId21">
         <w:r>
           <w:rPr>
             <w:color w:val="1A4D2E"/>
@@ -1953,733 +1594,7 @@
           <w:color w:val="888888"/>
           <w:sz w:val="16"/>
         </w:rPr>
-        <w:t>Norma regulatória com impacto direto em linhas de crédito.</w:t>
-      </w:r>
-    </w:p>
-    <w:p>
-      <w:pPr>
-        <w:spacing w:before="160" w:after="40"/>
-      </w:pPr>
-      <w:r>
-        <w:rPr>
-          <w:b/>
-          <w:color w:val="1A1A1A"/>
-          <w:sz w:val="22"/>
-        </w:rPr>
-        <w:t xml:space="preserve">Resolução CMN n° 5.325, 3/7/2026   </w:t>
-      </w:r>
-      <w:r>
-        <w:rPr>
-          <w:b/>
-          <w:color w:val="C0392B"/>
-          <w:sz w:val="16"/>
-        </w:rPr>
-        <w:t>[ALTA]</w:t>
-      </w:r>
-    </w:p>
-    <w:p>
-      <w:pPr>
-        <w:spacing w:after="40"/>
-      </w:pPr>
-      <w:r>
-        <w:rPr>
-          <w:color w:val="4A4A4A"/>
-          <w:sz w:val="20"/>
-        </w:rPr>
-        <w:t>Estabelece as condições, os encargos financeiros, os prazos e as demais normas regulamentadoras aplicáveis às linhas de financiamento para beneficiários adimplentes do Fundo de Financiamento Estudantil – Fies.</w:t>
-      </w:r>
-    </w:p>
-    <w:p>
-      <w:pPr>
-        <w:spacing w:after="40"/>
-      </w:pPr>
-      <w:r>
-        <w:rPr>
-          <w:b/>
-          <w:color w:val="888888"/>
-          <w:sz w:val="18"/>
-        </w:rPr>
-        <w:t xml:space="preserve">Publicado: </w:t>
-      </w:r>
-      <w:r>
-        <w:rPr>
-          <w:color w:val="888888"/>
-          <w:sz w:val="18"/>
-        </w:rPr>
-        <w:t xml:space="preserve">2026-07-03T18:01   </w:t>
-      </w:r>
-      <w:hyperlink r:id="rId26">
-        <w:r>
-          <w:rPr>
-            <w:color w:val="1A4D2E"/>
-            <w:u w:val="single"/>
-            <w:b/>
-          </w:rPr>
-          <w:t>Acessar materia</w:t>
-        </w:r>
-      </w:hyperlink>
-    </w:p>
-    <w:p>
-      <w:pPr>
-        <w:spacing w:after="120"/>
-      </w:pPr>
-      <w:r>
-        <w:rPr>
-          <w:i/>
-          <w:color w:val="888888"/>
-          <w:sz w:val="16"/>
-        </w:rPr>
-        <w:t>Norma regulatória com impacto direto em financiamentos estudantis.</w:t>
-      </w:r>
-    </w:p>
-    <w:p>
-      <w:pPr>
-        <w:spacing w:before="160" w:after="40"/>
-      </w:pPr>
-      <w:r>
-        <w:rPr>
-          <w:b/>
-          <w:color w:val="1A1A1A"/>
-          <w:sz w:val="22"/>
-        </w:rPr>
-        <w:t xml:space="preserve">Comunicado n° 45.505, 3/7/2026   </w:t>
-      </w:r>
-      <w:r>
-        <w:rPr>
-          <w:b/>
-          <w:color w:val="7F8C8D"/>
-          <w:sz w:val="16"/>
-        </w:rPr>
-        <w:t>[BAIXA]</w:t>
-      </w:r>
-    </w:p>
-    <w:p>
-      <w:pPr>
-        <w:spacing w:after="40"/>
-      </w:pPr>
-      <w:r>
-        <w:rPr>
-          <w:color w:val="4A4A4A"/>
-          <w:sz w:val="20"/>
-        </w:rPr>
-        <w:t>Divulga nomes de pessoas eleitas ou nomeadas para ocupar cargos de administração em instituições autorizadas a funcionar, para recebimento de eventuais objeções.</w:t>
-      </w:r>
-    </w:p>
-    <w:p>
-      <w:pPr>
-        <w:spacing w:after="40"/>
-      </w:pPr>
-      <w:r>
-        <w:rPr>
-          <w:b/>
-          <w:color w:val="888888"/>
-          <w:sz w:val="18"/>
-        </w:rPr>
-        <w:t xml:space="preserve">Publicado: </w:t>
-      </w:r>
-      <w:r>
-        <w:rPr>
-          <w:color w:val="888888"/>
-          <w:sz w:val="18"/>
-        </w:rPr>
-        <w:t xml:space="preserve">2026-07-03T09:54   </w:t>
-      </w:r>
-      <w:hyperlink r:id="rId27">
-        <w:r>
-          <w:rPr>
-            <w:color w:val="1A4D2E"/>
-            <w:u w:val="single"/>
-            <w:b/>
-          </w:rPr>
-          <w:t>Acessar materia</w:t>
-        </w:r>
-      </w:hyperlink>
-    </w:p>
-    <w:p>
-      <w:pPr>
-        <w:spacing w:after="120"/>
-      </w:pPr>
-      <w:r>
-        <w:rPr>
-          <w:i/>
-          <w:color w:val="888888"/>
-          <w:sz w:val="16"/>
-        </w:rPr>
-        <w:t>Notícia administrativa sobre nomeações em instituições financeiras.</w:t>
-      </w:r>
-    </w:p>
-    <w:p>
-      <w:pPr>
-        <w:spacing w:before="160" w:after="40"/>
-      </w:pPr>
-      <w:r>
-        <w:rPr>
-          <w:b/>
-          <w:color w:val="1A1A1A"/>
-          <w:sz w:val="22"/>
-        </w:rPr>
-        <w:t xml:space="preserve">Comunicado n° 45.504, 3/7/2026   </w:t>
-      </w:r>
-      <w:r>
-        <w:rPr>
-          <w:b/>
-          <w:color w:val="7F8C8D"/>
-          <w:sz w:val="16"/>
-        </w:rPr>
-        <w:t>[BAIXA]</w:t>
-      </w:r>
-    </w:p>
-    <w:p>
-      <w:pPr>
-        <w:spacing w:after="40"/>
-      </w:pPr>
-      <w:r>
-        <w:rPr>
-          <w:color w:val="4A4A4A"/>
-          <w:sz w:val="20"/>
-        </w:rPr>
-        <w:t>Divulga nome aprovado de pessoas eleitas/nomeadas para cargos de órgãos estatutários ou contratuais de sociedades autorizadas a funcionar pelo Banco Central do Brasil.</w:t>
-      </w:r>
-    </w:p>
-    <w:p>
-      <w:pPr>
-        <w:spacing w:after="40"/>
-      </w:pPr>
-      <w:r>
-        <w:rPr>
-          <w:b/>
-          <w:color w:val="888888"/>
-          <w:sz w:val="18"/>
-        </w:rPr>
-        <w:t xml:space="preserve">Publicado: </w:t>
-      </w:r>
-      <w:r>
-        <w:rPr>
-          <w:color w:val="888888"/>
-          <w:sz w:val="18"/>
-        </w:rPr>
-        <w:t xml:space="preserve">2026-07-03T09:53   </w:t>
-      </w:r>
-      <w:hyperlink r:id="rId28">
-        <w:r>
-          <w:rPr>
-            <w:color w:val="1A4D2E"/>
-            <w:u w:val="single"/>
-            <w:b/>
-          </w:rPr>
-          <w:t>Acessar materia</w:t>
-        </w:r>
-      </w:hyperlink>
-    </w:p>
-    <w:p>
-      <w:pPr>
-        <w:spacing w:after="120"/>
-      </w:pPr>
-      <w:r>
-        <w:rPr>
-          <w:i/>
-          <w:color w:val="888888"/>
-          <w:sz w:val="16"/>
-        </w:rPr>
-        <w:t>Notícia administrativa sobre aprovação de nomes em instituições financeiras.</w:t>
-      </w:r>
-    </w:p>
-    <w:p>
-      <w:pPr>
-        <w:spacing w:before="160" w:after="40"/>
-      </w:pPr>
-      <w:r>
-        <w:rPr>
-          <w:b/>
-          <w:color w:val="1A1A1A"/>
-          <w:sz w:val="22"/>
-        </w:rPr>
-        <w:t xml:space="preserve">Comunicado n° 45.503, 3/7/2026   </w:t>
-      </w:r>
-      <w:r>
-        <w:rPr>
-          <w:b/>
-          <w:color w:val="D68910"/>
-          <w:sz w:val="16"/>
-        </w:rPr>
-        <w:t>[MÉDIA]</w:t>
-      </w:r>
-    </w:p>
-    <w:p>
-      <w:pPr>
-        <w:spacing w:after="40"/>
-      </w:pPr>
-      <w:r>
-        <w:rPr>
-          <w:color w:val="4A4A4A"/>
-          <w:sz w:val="20"/>
-        </w:rPr>
-        <w:t>Divulga a Taxa Básica Financeira (TBF), o Redutor "R" e a Taxa Referencial (TR) relativos a 2 de julho de 2026.</w:t>
-      </w:r>
-    </w:p>
-    <w:p>
-      <w:pPr>
-        <w:spacing w:after="40"/>
-      </w:pPr>
-      <w:r>
-        <w:rPr>
-          <w:b/>
-          <w:color w:val="888888"/>
-          <w:sz w:val="18"/>
-        </w:rPr>
-        <w:t xml:space="preserve">Publicado: </w:t>
-      </w:r>
-      <w:r>
-        <w:rPr>
-          <w:color w:val="888888"/>
-          <w:sz w:val="18"/>
-        </w:rPr>
-        <w:t xml:space="preserve">2026-07-03T09:01   </w:t>
-      </w:r>
-      <w:hyperlink r:id="rId29">
-        <w:r>
-          <w:rPr>
-            <w:color w:val="1A4D2E"/>
-            <w:u w:val="single"/>
-            <w:b/>
-          </w:rPr>
-          <w:t>Acessar materia</w:t>
-        </w:r>
-      </w:hyperlink>
-    </w:p>
-    <w:p>
-      <w:pPr>
-        <w:spacing w:after="120"/>
-      </w:pPr>
-      <w:r>
-        <w:rPr>
-          <w:i/>
-          <w:color w:val="888888"/>
-          <w:sz w:val="16"/>
-        </w:rPr>
-        <w:t>Informação relevante para o mercado financeiro sobre taxas de referência.</w:t>
-      </w:r>
-    </w:p>
-    <w:p>
-      <w:pPr>
-        <w:spacing w:before="240" w:after="80"/>
-      </w:pPr>
-      <w:r>
-        <w:rPr>
-          <w:b/>
-          <w:color w:val="1A4D2E"/>
-          <w:sz w:val="20"/>
-        </w:rPr>
-        <w:t>CVM | NOTÍCIAS</w:t>
-      </w:r>
-    </w:p>
-    <w:p>
-      <w:pPr>
-        <w:spacing w:before="0" w:after="40"/>
-        <w:pBdr>
-          <w:bottom w:val="single" w:sz="8" w:space="1" w:color="1A4D2E"/>
-        </w:pBdr>
-      </w:pPr>
-    </w:p>
-    <w:p>
-      <w:pPr>
-        <w:spacing w:before="160" w:after="40"/>
-      </w:pPr>
-      <w:r>
-        <w:rPr>
-          <w:b/>
-          <w:color w:val="1A1A1A"/>
-          <w:sz w:val="22"/>
-        </w:rPr>
-        <w:t xml:space="preserve">CVM adequa canais de comunicação para cumprir normas do período eleitoral   </w:t>
-      </w:r>
-      <w:r>
-        <w:rPr>
-          <w:b/>
-          <w:color w:val="7F8C8D"/>
-          <w:sz w:val="16"/>
-        </w:rPr>
-        <w:t>[BAIXA]</w:t>
-      </w:r>
-    </w:p>
-    <w:p>
-      <w:pPr>
-        <w:spacing w:after="40"/>
-      </w:pPr>
-      <w:r>
-        <w:rPr>
-          <w:color w:val="4A4A4A"/>
-          <w:sz w:val="20"/>
-        </w:rPr>
-        <w:t>A CVM informa que os comentários em suas redes sociais estarão desativados até o fim das eleições, em adequação às normas eleitorais.</w:t>
-      </w:r>
-    </w:p>
-    <w:p>
-      <w:pPr>
-        <w:spacing w:after="40"/>
-      </w:pPr>
-      <w:r>
-        <w:rPr>
-          <w:b/>
-          <w:color w:val="888888"/>
-          <w:sz w:val="18"/>
-        </w:rPr>
-        <w:t xml:space="preserve">Publicado: </w:t>
-      </w:r>
-      <w:r>
-        <w:rPr>
-          <w:color w:val="888888"/>
-          <w:sz w:val="18"/>
-        </w:rPr>
-        <w:t xml:space="preserve">2026-07-03   </w:t>
-      </w:r>
-      <w:hyperlink r:id="rId30">
-        <w:r>
-          <w:rPr>
-            <w:color w:val="1A4D2E"/>
-            <w:u w:val="single"/>
-            <w:b/>
-          </w:rPr>
-          <w:t>Acessar materia</w:t>
-        </w:r>
-      </w:hyperlink>
-    </w:p>
-    <w:p>
-      <w:pPr>
-        <w:spacing w:after="120"/>
-      </w:pPr>
-      <w:r>
-        <w:rPr>
-          <w:i/>
-          <w:color w:val="888888"/>
-          <w:sz w:val="16"/>
-        </w:rPr>
-        <w:t>Notícia institucional sobre adequação a período eleitoral.</w:t>
-      </w:r>
-    </w:p>
-    <w:p>
-      <w:pPr>
-        <w:spacing w:before="160" w:after="40"/>
-      </w:pPr>
-      <w:r>
-        <w:rPr>
-          <w:b/>
-          <w:color w:val="1A1A1A"/>
-          <w:sz w:val="22"/>
-        </w:rPr>
-        <w:t xml:space="preserve">Plano Emergencial de Reestruturação da CVM é homologado pelo STF e reforça condições para atuação da Autarquia   </w:t>
-      </w:r>
-      <w:r>
-        <w:rPr>
-          <w:b/>
-          <w:color w:val="C0392B"/>
-          <w:sz w:val="16"/>
-        </w:rPr>
-        <w:t>[ALTA]</w:t>
-      </w:r>
-    </w:p>
-    <w:p>
-      <w:pPr>
-        <w:spacing w:after="40"/>
-      </w:pPr>
-      <w:r>
-        <w:rPr>
-          <w:color w:val="4A4A4A"/>
-          <w:sz w:val="20"/>
-        </w:rPr>
-        <w:t>Decisão do STF homologa o Plano Emergencial de Reestruturação da CVM, fortalecendo as condições para a atuação da Autarquia.</w:t>
-      </w:r>
-    </w:p>
-    <w:p>
-      <w:pPr>
-        <w:spacing w:after="40"/>
-      </w:pPr>
-      <w:r>
-        <w:rPr>
-          <w:b/>
-          <w:color w:val="888888"/>
-          <w:sz w:val="18"/>
-        </w:rPr>
-        <w:t xml:space="preserve">Publicado: </w:t>
-      </w:r>
-      <w:r>
-        <w:rPr>
-          <w:color w:val="888888"/>
-          <w:sz w:val="18"/>
-        </w:rPr>
-        <w:t xml:space="preserve">2026-07-03   </w:t>
-      </w:r>
-      <w:hyperlink r:id="rId31">
-        <w:r>
-          <w:rPr>
-            <w:color w:val="1A4D2E"/>
-            <w:u w:val="single"/>
-            <w:b/>
-          </w:rPr>
-          <w:t>Acessar materia</w:t>
-        </w:r>
-      </w:hyperlink>
-    </w:p>
-    <w:p>
-      <w:pPr>
-        <w:spacing w:after="120"/>
-      </w:pPr>
-      <w:r>
-        <w:rPr>
-          <w:i/>
-          <w:color w:val="888888"/>
-          <w:sz w:val="16"/>
-        </w:rPr>
-        <w:t>Decisão judicial com impacto na estrutura e atuação de autarquia reguladora do mercado de capitais.</w:t>
-      </w:r>
-    </w:p>
-    <w:p>
-      <w:pPr>
-        <w:spacing w:before="160" w:after="40"/>
-      </w:pPr>
-      <w:r>
-        <w:rPr>
-          <w:b/>
-          <w:color w:val="1A1A1A"/>
-          <w:sz w:val="22"/>
-        </w:rPr>
-        <w:t xml:space="preserve">Expediente na CVM-SP em 9/7   </w:t>
-      </w:r>
-      <w:r>
-        <w:rPr>
-          <w:b/>
-          <w:color w:val="7F8C8D"/>
-          <w:sz w:val="16"/>
-        </w:rPr>
-        <w:t>[BAIXA]</w:t>
-      </w:r>
-    </w:p>
-    <w:p>
-      <w:pPr>
-        <w:spacing w:after="40"/>
-      </w:pPr>
-      <w:r>
-        <w:rPr>
-          <w:color w:val="4A4A4A"/>
-          <w:sz w:val="20"/>
-        </w:rPr>
-        <w:t>A CVM-SP seguirá o disposto em Portaria do Ministério da Gestão e Inovação em Serviços Públicos (MGI) sobre o expediente em 9 de julho.</w:t>
-      </w:r>
-    </w:p>
-    <w:p>
-      <w:pPr>
-        <w:spacing w:after="40"/>
-      </w:pPr>
-      <w:r>
-        <w:rPr>
-          <w:b/>
-          <w:color w:val="888888"/>
-          <w:sz w:val="18"/>
-        </w:rPr>
-        <w:t xml:space="preserve">Publicado: </w:t>
-      </w:r>
-      <w:r>
-        <w:rPr>
-          <w:color w:val="888888"/>
-          <w:sz w:val="18"/>
-        </w:rPr>
-        <w:t xml:space="preserve">2026-07-03   </w:t>
-      </w:r>
-      <w:hyperlink r:id="rId32">
-        <w:r>
-          <w:rPr>
-            <w:color w:val="1A4D2E"/>
-            <w:u w:val="single"/>
-            <w:b/>
-          </w:rPr>
-          <w:t>Acessar materia</w:t>
-        </w:r>
-      </w:hyperlink>
-    </w:p>
-    <w:p>
-      <w:pPr>
-        <w:spacing w:after="120"/>
-      </w:pPr>
-      <w:r>
-        <w:rPr>
-          <w:i/>
-          <w:color w:val="888888"/>
-          <w:sz w:val="16"/>
-        </w:rPr>
-        <w:t>Notícia administrativa sobre funcionamento da autarquia.</w:t>
-      </w:r>
-    </w:p>
-    <w:p>
-      <w:pPr>
-        <w:spacing w:before="160" w:after="40"/>
-      </w:pPr>
-      <w:r>
-        <w:rPr>
-          <w:b/>
-          <w:color w:val="1A1A1A"/>
-          <w:sz w:val="22"/>
-        </w:rPr>
-        <w:t xml:space="preserve">Área técnica da CVM divulga lista com 11 companhias abertas inadimplentes   </w:t>
-      </w:r>
-      <w:r>
-        <w:rPr>
-          <w:b/>
-          <w:color w:val="D68910"/>
-          <w:sz w:val="16"/>
-        </w:rPr>
-        <w:t>[MÉDIA]</w:t>
-      </w:r>
-    </w:p>
-    <w:p>
-      <w:pPr>
-        <w:spacing w:after="40"/>
-      </w:pPr>
-      <w:r>
-        <w:rPr>
-          <w:color w:val="4A4A4A"/>
-          <w:sz w:val="20"/>
-        </w:rPr>
-        <w:t>CVM divulga lista de 11 companhias abertas que não enviaram documentos periódicos à Autarquia há no mínimo três meses.</w:t>
-      </w:r>
-    </w:p>
-    <w:p>
-      <w:pPr>
-        <w:spacing w:after="40"/>
-      </w:pPr>
-      <w:r>
-        <w:rPr>
-          <w:b/>
-          <w:color w:val="888888"/>
-          <w:sz w:val="18"/>
-        </w:rPr>
-        <w:t xml:space="preserve">Publicado: </w:t>
-      </w:r>
-      <w:r>
-        <w:rPr>
-          <w:color w:val="888888"/>
-          <w:sz w:val="18"/>
-        </w:rPr>
-        <w:t xml:space="preserve">2026-07-03   </w:t>
-      </w:r>
-      <w:hyperlink r:id="rId33">
-        <w:r>
-          <w:rPr>
-            <w:color w:val="1A4D2E"/>
-            <w:u w:val="single"/>
-            <w:b/>
-          </w:rPr>
-          <w:t>Acessar materia</w:t>
-        </w:r>
-      </w:hyperlink>
-    </w:p>
-    <w:p>
-      <w:pPr>
-        <w:spacing w:after="120"/>
-      </w:pPr>
-      <w:r>
-        <w:rPr>
-          <w:i/>
-          <w:color w:val="888888"/>
-          <w:sz w:val="16"/>
-        </w:rPr>
-        <w:t>Ação de fiscalização com impacto em companhias abertas e no mercado de capitais.</w:t>
-      </w:r>
-    </w:p>
-    <w:p>
-      <w:pPr>
-        <w:spacing w:before="240" w:after="80"/>
-      </w:pPr>
-      <w:r>
-        <w:rPr>
-          <w:b/>
-          <w:color w:val="1A4D2E"/>
-          <w:sz w:val="20"/>
-        </w:rPr>
-        <w:t>B3 | OFÍCIOS E COMUNICADOS</w:t>
-      </w:r>
-    </w:p>
-    <w:p>
-      <w:pPr>
-        <w:spacing w:before="0" w:after="40"/>
-        <w:pBdr>
-          <w:bottom w:val="single" w:sz="8" w:space="1" w:color="1A4D2E"/>
-        </w:pBdr>
-      </w:pPr>
-    </w:p>
-    <w:p>
-      <w:pPr>
-        <w:spacing w:before="160" w:after="40"/>
-      </w:pPr>
-      <w:r>
-        <w:rPr>
-          <w:b/>
-          <w:color w:val="1A1A1A"/>
-          <w:sz w:val="22"/>
-        </w:rPr>
-        <w:t xml:space="preserve">034-2026-VPC-Ofício Circular Programa de Incentivo para a Integração à Plataforma 24x7 do Programa do Tesouro Direto – 2026   </w:t>
-      </w:r>
-      <w:r>
-        <w:rPr>
-          <w:b/>
-          <w:color w:val="D68910"/>
-          <w:sz w:val="16"/>
-        </w:rPr>
-        <w:t>[MÉDIA]</w:t>
-      </w:r>
-    </w:p>
-    <w:p>
-      <w:pPr>
-        <w:spacing w:after="40"/>
-      </w:pPr>
-      <w:r>
-        <w:rPr>
-          <w:color w:val="4A4A4A"/>
-          <w:sz w:val="20"/>
-        </w:rPr>
-        <w:t>O programa visa incentivar a integração tecnológica dos agentes de custódia interessados em se habilitar na nova infraestrutura operacional do Tesouro Direto.</w:t>
-      </w:r>
-    </w:p>
-    <w:p>
-      <w:pPr>
-        <w:spacing w:after="40"/>
-      </w:pPr>
-      <w:r>
-        <w:rPr>
-          <w:b/>
-          <w:color w:val="888888"/>
-          <w:sz w:val="18"/>
-        </w:rPr>
-        <w:t xml:space="preserve">Publicado: </w:t>
-      </w:r>
-      <w:r>
-        <w:rPr>
-          <w:color w:val="888888"/>
-          <w:sz w:val="18"/>
-        </w:rPr>
-        <w:t xml:space="preserve">2026-07-03   </w:t>
-      </w:r>
-      <w:hyperlink r:id="rId34">
-        <w:r>
-          <w:rPr>
-            <w:color w:val="1A4D2E"/>
-            <w:u w:val="single"/>
-            <w:b/>
-          </w:rPr>
-          <w:t>Acessar materia</w:t>
-        </w:r>
-      </w:hyperlink>
-    </w:p>
-    <w:p>
-      <w:pPr>
-        <w:spacing w:after="120"/>
-      </w:pPr>
-      <w:r>
-        <w:rPr>
-          <w:i/>
-          <w:color w:val="888888"/>
-          <w:sz w:val="16"/>
-        </w:rPr>
-        <w:t>Comunicado com impacto em operações e tecnologia do mercado financeiro.</w:t>
+        <w:t>Notícia sobre evento/capacitação, de interesse institucional.</w:t>
       </w:r>
     </w:p>
     <w:p/>
@@ -2765,7 +1680,7 @@
           <w:color w:val="4A4A4A"/>
           <w:sz w:val="20"/>
         </w:rPr>
-        <w:t>Evento reúne especialistas para discutir o futuro do setor elétrico, com programação e palestrantes confirmados.</w:t>
+        <w:t>Evento reúne especialistas para discutir o futuro do setor elétrico.</w:t>
       </w:r>
     </w:p>
     <w:p>
@@ -2787,7 +1702,7 @@
         </w:rPr>
         <w:t xml:space="preserve">2026-07-06   </w:t>
       </w:r>
-      <w:hyperlink r:id="rId35">
+      <w:hyperlink r:id="rId22">
         <w:r>
           <w:rPr>
             <w:color w:val="1A4D2E"/>
@@ -2808,83 +1723,7 @@
           <w:color w:val="888888"/>
           <w:sz w:val="16"/>
         </w:rPr>
-        <w:t>Notícia sobre evento institucional da CCEE.</w:t>
-      </w:r>
-    </w:p>
-    <w:p>
-      <w:pPr>
-        <w:spacing w:before="160" w:after="40"/>
-      </w:pPr>
-      <w:r>
-        <w:rPr>
-          <w:b/>
-          <w:color w:val="1A1A1A"/>
-          <w:sz w:val="22"/>
-        </w:rPr>
-        <w:t xml:space="preserve">No segundo dia do EVEx 2026, Fórum CCEE amplia diálogo sobre o futuro da abertura do mercado, segurança e certificação   </w:t>
-      </w:r>
-      <w:r>
-        <w:rPr>
-          <w:b/>
-          <w:color w:val="7F8C8D"/>
-          <w:sz w:val="16"/>
-        </w:rPr>
-        <w:t>[BAIXA]</w:t>
-      </w:r>
-    </w:p>
-    <w:p>
-      <w:pPr>
-        <w:spacing w:after="40"/>
-      </w:pPr>
-      <w:r>
-        <w:rPr>
-          <w:color w:val="4A4A4A"/>
-          <w:sz w:val="20"/>
-        </w:rPr>
-        <w:t>Fórum CCEE discutiu a abertura do mercado, segurança e certificação no segundo dia do EVEx 2026, com participação de diretores.</w:t>
-      </w:r>
-    </w:p>
-    <w:p>
-      <w:pPr>
-        <w:spacing w:after="40"/>
-      </w:pPr>
-      <w:r>
-        <w:rPr>
-          <w:b/>
-          <w:color w:val="888888"/>
-          <w:sz w:val="18"/>
-        </w:rPr>
-        <w:t xml:space="preserve">Publicado: </w:t>
-      </w:r>
-      <w:r>
-        <w:rPr>
-          <w:color w:val="888888"/>
-          <w:sz w:val="18"/>
-        </w:rPr>
-        <w:t xml:space="preserve">2026-07-03   </w:t>
-      </w:r>
-      <w:hyperlink r:id="rId36">
-        <w:r>
-          <w:rPr>
-            <w:color w:val="1A4D2E"/>
-            <w:u w:val="single"/>
-            <w:b/>
-          </w:rPr>
-          <w:t>Acessar materia</w:t>
-        </w:r>
-      </w:hyperlink>
-    </w:p>
-    <w:p>
-      <w:pPr>
-        <w:spacing w:after="120"/>
-      </w:pPr>
-      <w:r>
-        <w:rPr>
-          <w:i/>
-          <w:color w:val="888888"/>
-          <w:sz w:val="16"/>
-        </w:rPr>
-        <w:t>Notícia sobre evento institucional e diálogo setorial.</w:t>
+        <w:t>Notícia institucional sobre evento, de interesse geral mas sem impacto regulatório direto.</w:t>
       </w:r>
     </w:p>
     <w:p>
@@ -2938,7 +1777,7 @@
           <w:color w:val="4A4A4A"/>
           <w:sz w:val="20"/>
         </w:rPr>
-        <w:t>A ANP informa que já está utilizando perfis temporários nas redes sociais em adequação ao período eleitoral.</w:t>
+        <w:t>A ANP informa que já está utilizando perfis temporários nas redes sociais devido ao período eleitoral.</w:t>
       </w:r>
     </w:p>
     <w:p>
@@ -2960,7 +1799,7 @@
         </w:rPr>
         <w:t xml:space="preserve">2026-07-06   </w:t>
       </w:r>
-      <w:hyperlink r:id="rId37">
+      <w:hyperlink r:id="rId23">
         <w:r>
           <w:rPr>
             <w:color w:val="1A4D2E"/>
@@ -2981,1708 +1820,7 @@
           <w:color w:val="888888"/>
           <w:sz w:val="16"/>
         </w:rPr>
-        <w:t>Notícia institucional sobre adequação a período eleitoral.</w:t>
-      </w:r>
-    </w:p>
-    <w:p>
-      <w:pPr>
-        <w:spacing w:before="160" w:after="40"/>
-      </w:pPr>
-      <w:r>
-        <w:rPr>
-          <w:b/>
-          <w:color w:val="1A1A1A"/>
-          <w:sz w:val="22"/>
-        </w:rPr>
-        <w:t xml:space="preserve">Seca na Região Norte: ANP acompanha abastecimento de combustíveis   </w:t>
-      </w:r>
-      <w:r>
-        <w:rPr>
-          <w:b/>
-          <w:color w:val="D68910"/>
-          <w:sz w:val="16"/>
-        </w:rPr>
-        <w:t>[MÉDIA]</w:t>
-      </w:r>
-    </w:p>
-    <w:p>
-      <w:pPr>
-        <w:spacing w:after="40"/>
-      </w:pPr>
-      <w:r>
-        <w:rPr>
-          <w:color w:val="4A4A4A"/>
-          <w:sz w:val="20"/>
-        </w:rPr>
-        <w:t>A ANP está acompanhando o abastecimento de combustíveis na Região Norte devido à seca, monitorando a situação.</w:t>
-      </w:r>
-    </w:p>
-    <w:p>
-      <w:pPr>
-        <w:spacing w:after="40"/>
-      </w:pPr>
-      <w:r>
-        <w:rPr>
-          <w:b/>
-          <w:color w:val="888888"/>
-          <w:sz w:val="18"/>
-        </w:rPr>
-        <w:t xml:space="preserve">Publicado: </w:t>
-      </w:r>
-      <w:r>
-        <w:rPr>
-          <w:color w:val="888888"/>
-          <w:sz w:val="18"/>
-        </w:rPr>
-        <w:t xml:space="preserve">2026-07-03   </w:t>
-      </w:r>
-      <w:hyperlink r:id="rId38">
-        <w:r>
-          <w:rPr>
-            <w:color w:val="1A4D2E"/>
-            <w:u w:val="single"/>
-            <w:b/>
-          </w:rPr>
-          <w:t>Acessar materia</w:t>
-        </w:r>
-      </w:hyperlink>
-    </w:p>
-    <w:p>
-      <w:pPr>
-        <w:spacing w:after="120"/>
-      </w:pPr>
-      <w:r>
-        <w:rPr>
-          <w:i/>
-          <w:color w:val="888888"/>
-          <w:sz w:val="16"/>
-        </w:rPr>
-        <w:t>Acompanhamento regulatório de situação que afeta o abastecimento de combustíveis.</w:t>
-      </w:r>
-    </w:p>
-    <w:p>
-      <w:pPr>
-        <w:spacing w:before="160" w:after="40"/>
-      </w:pPr>
-      <w:r>
-        <w:rPr>
-          <w:b/>
-          <w:color w:val="1A1A1A"/>
-          <w:sz w:val="22"/>
-        </w:rPr>
-        <w:t xml:space="preserve">Entre os dias 29/6 e 3/7, a ANP realizou 146 ações de fiscalização com foco em preços abusivos   </w:t>
-      </w:r>
-      <w:r>
-        <w:rPr>
-          <w:b/>
-          <w:color w:val="D68910"/>
-          <w:sz w:val="16"/>
-        </w:rPr>
-        <w:t>[MÉDIA]</w:t>
-      </w:r>
-    </w:p>
-    <w:p>
-      <w:pPr>
-        <w:spacing w:after="40"/>
-      </w:pPr>
-      <w:r>
-        <w:rPr>
-          <w:color w:val="4A4A4A"/>
-          <w:sz w:val="20"/>
-        </w:rPr>
-        <w:t>A ANP realizou 146 ações de fiscalização em 16 estados, com foco em preços abusivos de combustíveis.</w:t>
-      </w:r>
-    </w:p>
-    <w:p>
-      <w:pPr>
-        <w:spacing w:after="40"/>
-      </w:pPr>
-      <w:r>
-        <w:rPr>
-          <w:b/>
-          <w:color w:val="888888"/>
-          <w:sz w:val="18"/>
-        </w:rPr>
-        <w:t xml:space="preserve">Publicado: </w:t>
-      </w:r>
-      <w:r>
-        <w:rPr>
-          <w:color w:val="888888"/>
-          <w:sz w:val="18"/>
-        </w:rPr>
-        <w:t xml:space="preserve">2026-07-03   </w:t>
-      </w:r>
-      <w:hyperlink r:id="rId39">
-        <w:r>
-          <w:rPr>
-            <w:color w:val="1A4D2E"/>
-            <w:u w:val="single"/>
-            <w:b/>
-          </w:rPr>
-          <w:t>Acessar materia</w:t>
-        </w:r>
-      </w:hyperlink>
-    </w:p>
-    <w:p>
-      <w:pPr>
-        <w:spacing w:after="120"/>
-      </w:pPr>
-      <w:r>
-        <w:rPr>
-          <w:i/>
-          <w:color w:val="888888"/>
-          <w:sz w:val="16"/>
-        </w:rPr>
-        <w:t>Ações de fiscalização setorial com impacto direto no mercado de combustíveis.</w:t>
-      </w:r>
-    </w:p>
-    <w:p>
-      <w:pPr>
-        <w:spacing w:before="240" w:after="80"/>
-      </w:pPr>
-      <w:r>
-        <w:rPr>
-          <w:b/>
-          <w:color w:val="1A4D2E"/>
-          <w:sz w:val="20"/>
-        </w:rPr>
-        <w:t>MME | NOTÍCIAS</w:t>
-      </w:r>
-    </w:p>
-    <w:p>
-      <w:pPr>
-        <w:spacing w:before="0" w:after="40"/>
-        <w:pBdr>
-          <w:bottom w:val="single" w:sz="8" w:space="1" w:color="1A4D2E"/>
-        </w:pBdr>
-      </w:pPr>
-    </w:p>
-    <w:p>
-      <w:pPr>
-        <w:spacing w:before="160" w:after="40"/>
-      </w:pPr>
-      <w:r>
-        <w:rPr>
-          <w:b/>
-          <w:color w:val="1A1A1A"/>
-          <w:sz w:val="22"/>
-        </w:rPr>
-        <w:t xml:space="preserve">Entenda cada item cobrado na conta de luz e como acompanhar o consumo   </w:t>
-      </w:r>
-      <w:r>
-        <w:rPr>
-          <w:b/>
-          <w:color w:val="7F8C8D"/>
-          <w:sz w:val="16"/>
-        </w:rPr>
-        <w:t>[BAIXA]</w:t>
-      </w:r>
-    </w:p>
-    <w:p>
-      <w:pPr>
-        <w:spacing w:after="40"/>
-      </w:pPr>
-      <w:r>
-        <w:rPr>
-          <w:color w:val="4A4A4A"/>
-          <w:sz w:val="20"/>
-        </w:rPr>
-        <w:t>Explica bandeiras tarifárias, ICMS, contribuição de iluminação pública e outros encargos da fatura de energia elétrica.</w:t>
-      </w:r>
-    </w:p>
-    <w:p>
-      <w:pPr>
-        <w:spacing w:after="40"/>
-      </w:pPr>
-      <w:r>
-        <w:rPr>
-          <w:b/>
-          <w:color w:val="888888"/>
-          <w:sz w:val="18"/>
-        </w:rPr>
-        <w:t xml:space="preserve">Publicado: </w:t>
-      </w:r>
-      <w:r>
-        <w:rPr>
-          <w:color w:val="888888"/>
-          <w:sz w:val="18"/>
-        </w:rPr>
-        <w:t xml:space="preserve">2026-07-03   </w:t>
-      </w:r>
-      <w:hyperlink r:id="rId40">
-        <w:r>
-          <w:rPr>
-            <w:color w:val="1A4D2E"/>
-            <w:u w:val="single"/>
-            <w:b/>
-          </w:rPr>
-          <w:t>Acessar materia</w:t>
-        </w:r>
-      </w:hyperlink>
-    </w:p>
-    <w:p>
-      <w:pPr>
-        <w:spacing w:after="120"/>
-      </w:pPr>
-      <w:r>
-        <w:rPr>
-          <w:i/>
-          <w:color w:val="888888"/>
-          <w:sz w:val="16"/>
-        </w:rPr>
-        <w:t>Conteúdo informativo geral para o consumidor.</w:t>
-      </w:r>
-    </w:p>
-    <w:p>
-      <w:pPr>
-        <w:spacing w:before="160" w:after="40"/>
-      </w:pPr>
-      <w:r>
-        <w:rPr>
-          <w:b/>
-          <w:color w:val="1A1A1A"/>
-          <w:sz w:val="22"/>
-        </w:rPr>
-        <w:t xml:space="preserve">O que são sistemas isolados?   </w:t>
-      </w:r>
-      <w:r>
-        <w:rPr>
-          <w:b/>
-          <w:color w:val="7F8C8D"/>
-          <w:sz w:val="16"/>
-        </w:rPr>
-        <w:t>[BAIXA]</w:t>
-      </w:r>
-    </w:p>
-    <w:p>
-      <w:pPr>
-        <w:spacing w:after="40"/>
-      </w:pPr>
-      <w:r>
-        <w:rPr>
-          <w:color w:val="4A4A4A"/>
-          <w:sz w:val="20"/>
-        </w:rPr>
-        <w:t>Explica como localidades isoladas garantem abastecimento elétrico com tecnologias eficientes e sustentáveis.</w:t>
-      </w:r>
-    </w:p>
-    <w:p>
-      <w:pPr>
-        <w:spacing w:after="40"/>
-      </w:pPr>
-      <w:r>
-        <w:rPr>
-          <w:b/>
-          <w:color w:val="888888"/>
-          <w:sz w:val="18"/>
-        </w:rPr>
-        <w:t xml:space="preserve">Publicado: </w:t>
-      </w:r>
-      <w:r>
-        <w:rPr>
-          <w:color w:val="888888"/>
-          <w:sz w:val="18"/>
-        </w:rPr>
-        <w:t xml:space="preserve">2026-07-03   </w:t>
-      </w:r>
-      <w:hyperlink r:id="rId41">
-        <w:r>
-          <w:rPr>
-            <w:color w:val="1A4D2E"/>
-            <w:u w:val="single"/>
-            <w:b/>
-          </w:rPr>
-          <w:t>Acessar materia</w:t>
-        </w:r>
-      </w:hyperlink>
-    </w:p>
-    <w:p>
-      <w:pPr>
-        <w:spacing w:after="120"/>
-      </w:pPr>
-      <w:r>
-        <w:rPr>
-          <w:i/>
-          <w:color w:val="888888"/>
-          <w:sz w:val="16"/>
-        </w:rPr>
-        <w:t>Conteúdo informativo geral sobre o setor elétrico.</w:t>
-      </w:r>
-    </w:p>
-    <w:p>
-      <w:pPr>
-        <w:spacing w:before="160" w:after="40"/>
-      </w:pPr>
-      <w:r>
-        <w:rPr>
-          <w:b/>
-          <w:color w:val="1A1A1A"/>
-          <w:sz w:val="22"/>
-        </w:rPr>
-        <w:t xml:space="preserve">Saiba a diferença entre minério, mineral e rocha   </w:t>
-      </w:r>
-      <w:r>
-        <w:rPr>
-          <w:b/>
-          <w:color w:val="7F8C8D"/>
-          <w:sz w:val="16"/>
-        </w:rPr>
-        <w:t>[BAIXA]</w:t>
-      </w:r>
-    </w:p>
-    <w:p>
-      <w:pPr>
-        <w:spacing w:after="40"/>
-      </w:pPr>
-      <w:r>
-        <w:rPr>
-          <w:color w:val="4A4A4A"/>
-          <w:sz w:val="20"/>
-        </w:rPr>
-        <w:t>Entenda as origens e aplicações de minério, mineral e rocha no cotidiano e desenvolvimento da sociedade.</w:t>
-      </w:r>
-    </w:p>
-    <w:p>
-      <w:pPr>
-        <w:spacing w:after="40"/>
-      </w:pPr>
-      <w:r>
-        <w:rPr>
-          <w:b/>
-          <w:color w:val="888888"/>
-          <w:sz w:val="18"/>
-        </w:rPr>
-        <w:t xml:space="preserve">Publicado: </w:t>
-      </w:r>
-      <w:r>
-        <w:rPr>
-          <w:color w:val="888888"/>
-          <w:sz w:val="18"/>
-        </w:rPr>
-        <w:t xml:space="preserve">2026-07-03   </w:t>
-      </w:r>
-      <w:hyperlink r:id="rId42">
-        <w:r>
-          <w:rPr>
-            <w:color w:val="1A4D2E"/>
-            <w:u w:val="single"/>
-            <w:b/>
-          </w:rPr>
-          <w:t>Acessar materia</w:t>
-        </w:r>
-      </w:hyperlink>
-    </w:p>
-    <w:p>
-      <w:pPr>
-        <w:spacing w:after="120"/>
-      </w:pPr>
-      <w:r>
-        <w:rPr>
-          <w:i/>
-          <w:color w:val="888888"/>
-          <w:sz w:val="16"/>
-        </w:rPr>
-        <w:t>Conteúdo informativo geral sobre mineração.</w:t>
-      </w:r>
-    </w:p>
-    <w:p>
-      <w:pPr>
-        <w:spacing w:before="160" w:after="40"/>
-      </w:pPr>
-      <w:r>
-        <w:rPr>
-          <w:b/>
-          <w:color w:val="1A1A1A"/>
-          <w:sz w:val="22"/>
-        </w:rPr>
-        <w:t xml:space="preserve">Saiba como ter acesso ao Programa Gás do Povo   </w:t>
-      </w:r>
-      <w:r>
-        <w:rPr>
-          <w:b/>
-          <w:color w:val="D68910"/>
-          <w:sz w:val="16"/>
-        </w:rPr>
-        <w:t>[MÉDIA]</w:t>
-      </w:r>
-    </w:p>
-    <w:p>
-      <w:pPr>
-        <w:spacing w:after="40"/>
-      </w:pPr>
-      <w:r>
-        <w:rPr>
-          <w:color w:val="4A4A4A"/>
-          <w:sz w:val="20"/>
-        </w:rPr>
-        <w:t>Entenda quem pode participar e como funciona o recebimento do benefício do Programa Gás do Povo.</w:t>
-      </w:r>
-    </w:p>
-    <w:p>
-      <w:pPr>
-        <w:spacing w:after="40"/>
-      </w:pPr>
-      <w:r>
-        <w:rPr>
-          <w:b/>
-          <w:color w:val="888888"/>
-          <w:sz w:val="18"/>
-        </w:rPr>
-        <w:t xml:space="preserve">Publicado: </w:t>
-      </w:r>
-      <w:r>
-        <w:rPr>
-          <w:color w:val="888888"/>
-          <w:sz w:val="18"/>
-        </w:rPr>
-        <w:t xml:space="preserve">2026-07-03   </w:t>
-      </w:r>
-      <w:hyperlink r:id="rId43">
-        <w:r>
-          <w:rPr>
-            <w:color w:val="1A4D2E"/>
-            <w:u w:val="single"/>
-            <w:b/>
-          </w:rPr>
-          <w:t>Acessar materia</w:t>
-        </w:r>
-      </w:hyperlink>
-    </w:p>
-    <w:p>
-      <w:pPr>
-        <w:spacing w:after="120"/>
-      </w:pPr>
-      <w:r>
-        <w:rPr>
-          <w:i/>
-          <w:color w:val="888888"/>
-          <w:sz w:val="16"/>
-        </w:rPr>
-        <w:t>Notícia sobre programa social com impacto direto em cidadãos.</w:t>
-      </w:r>
-    </w:p>
-    <w:p>
-      <w:pPr>
-        <w:spacing w:before="160" w:after="40"/>
-      </w:pPr>
-      <w:r>
-        <w:rPr>
-          <w:b/>
-          <w:color w:val="1A1A1A"/>
-          <w:sz w:val="22"/>
-        </w:rPr>
-        <w:t xml:space="preserve">A Força dos Ventos marítimos   </w:t>
-      </w:r>
-      <w:r>
-        <w:rPr>
-          <w:b/>
-          <w:color w:val="7F8C8D"/>
-          <w:sz w:val="16"/>
-        </w:rPr>
-        <w:t>[BAIXA]</w:t>
-      </w:r>
-    </w:p>
-    <w:p>
-      <w:pPr>
-        <w:spacing w:after="40"/>
-      </w:pPr>
-      <w:r>
-        <w:rPr>
-          <w:color w:val="4A4A4A"/>
-          <w:sz w:val="20"/>
-        </w:rPr>
-        <w:t>Entenda a participação da energia eólica offshore na matriz energética brasileira.</w:t>
-      </w:r>
-    </w:p>
-    <w:p>
-      <w:pPr>
-        <w:spacing w:after="40"/>
-      </w:pPr>
-      <w:r>
-        <w:rPr>
-          <w:b/>
-          <w:color w:val="888888"/>
-          <w:sz w:val="18"/>
-        </w:rPr>
-        <w:t xml:space="preserve">Publicado: </w:t>
-      </w:r>
-      <w:r>
-        <w:rPr>
-          <w:color w:val="888888"/>
-          <w:sz w:val="18"/>
-        </w:rPr>
-        <w:t xml:space="preserve">2026-07-03   </w:t>
-      </w:r>
-      <w:hyperlink r:id="rId44">
-        <w:r>
-          <w:rPr>
-            <w:color w:val="1A4D2E"/>
-            <w:u w:val="single"/>
-            <w:b/>
-          </w:rPr>
-          <w:t>Acessar materia</w:t>
-        </w:r>
-      </w:hyperlink>
-    </w:p>
-    <w:p>
-      <w:pPr>
-        <w:spacing w:after="120"/>
-      </w:pPr>
-      <w:r>
-        <w:rPr>
-          <w:i/>
-          <w:color w:val="888888"/>
-          <w:sz w:val="16"/>
-        </w:rPr>
-        <w:t>Conteúdo informativo geral sobre energia renovável.</w:t>
-      </w:r>
-    </w:p>
-    <w:p>
-      <w:pPr>
-        <w:spacing w:before="160" w:after="40"/>
-      </w:pPr>
-      <w:r>
-        <w:rPr>
-          <w:b/>
-          <w:color w:val="1A1A1A"/>
-          <w:sz w:val="22"/>
-        </w:rPr>
-        <w:t xml:space="preserve">Como a energia elétrica é transportada pelo Brasil   </w:t>
-      </w:r>
-      <w:r>
-        <w:rPr>
-          <w:b/>
-          <w:color w:val="7F8C8D"/>
-          <w:sz w:val="16"/>
-        </w:rPr>
-        <w:t>[BAIXA]</w:t>
-      </w:r>
-    </w:p>
-    <w:p>
-      <w:pPr>
-        <w:spacing w:after="40"/>
-      </w:pPr>
-      <w:r>
-        <w:rPr>
-          <w:color w:val="4A4A4A"/>
-          <w:sz w:val="20"/>
-        </w:rPr>
-        <w:t>Entenda a função das linhas de transmissão no transporte de energia elétrica no Brasil.</w:t>
-      </w:r>
-    </w:p>
-    <w:p>
-      <w:pPr>
-        <w:spacing w:after="40"/>
-      </w:pPr>
-      <w:r>
-        <w:rPr>
-          <w:b/>
-          <w:color w:val="888888"/>
-          <w:sz w:val="18"/>
-        </w:rPr>
-        <w:t xml:space="preserve">Publicado: </w:t>
-      </w:r>
-      <w:r>
-        <w:rPr>
-          <w:color w:val="888888"/>
-          <w:sz w:val="18"/>
-        </w:rPr>
-        <w:t xml:space="preserve">2026-07-03   </w:t>
-      </w:r>
-      <w:hyperlink r:id="rId45">
-        <w:r>
-          <w:rPr>
-            <w:color w:val="1A4D2E"/>
-            <w:u w:val="single"/>
-            <w:b/>
-          </w:rPr>
-          <w:t>Acessar materia</w:t>
-        </w:r>
-      </w:hyperlink>
-    </w:p>
-    <w:p>
-      <w:pPr>
-        <w:spacing w:after="120"/>
-      </w:pPr>
-      <w:r>
-        <w:rPr>
-          <w:i/>
-          <w:color w:val="888888"/>
-          <w:sz w:val="16"/>
-        </w:rPr>
-        <w:t>Conteúdo informativo geral sobre infraestrutura energética.</w:t>
-      </w:r>
-    </w:p>
-    <w:p>
-      <w:pPr>
-        <w:spacing w:before="160" w:after="40"/>
-      </w:pPr>
-      <w:r>
-        <w:rPr>
-          <w:b/>
-          <w:color w:val="1A1A1A"/>
-          <w:sz w:val="22"/>
-        </w:rPr>
-        <w:t xml:space="preserve">Biometano: resíduos transformados em energia   </w:t>
-      </w:r>
-      <w:r>
-        <w:rPr>
-          <w:b/>
-          <w:color w:val="7F8C8D"/>
-          <w:sz w:val="16"/>
-        </w:rPr>
-        <w:t>[BAIXA]</w:t>
-      </w:r>
-    </w:p>
-    <w:p>
-      <w:pPr>
-        <w:spacing w:after="40"/>
-      </w:pPr>
-      <w:r>
-        <w:rPr>
-          <w:color w:val="4A4A4A"/>
-          <w:sz w:val="20"/>
-        </w:rPr>
-        <w:t>O biocombustível produzido a partir do aproveitamento de matéria orgânica possui aplicações semelhantes às do gás natural.</w:t>
-      </w:r>
-    </w:p>
-    <w:p>
-      <w:pPr>
-        <w:spacing w:after="40"/>
-      </w:pPr>
-      <w:r>
-        <w:rPr>
-          <w:b/>
-          <w:color w:val="888888"/>
-          <w:sz w:val="18"/>
-        </w:rPr>
-        <w:t xml:space="preserve">Publicado: </w:t>
-      </w:r>
-      <w:r>
-        <w:rPr>
-          <w:color w:val="888888"/>
-          <w:sz w:val="18"/>
-        </w:rPr>
-        <w:t xml:space="preserve">2026-07-03   </w:t>
-      </w:r>
-      <w:hyperlink r:id="rId46">
-        <w:r>
-          <w:rPr>
-            <w:color w:val="1A4D2E"/>
-            <w:u w:val="single"/>
-            <w:b/>
-          </w:rPr>
-          <w:t>Acessar materia</w:t>
-        </w:r>
-      </w:hyperlink>
-    </w:p>
-    <w:p>
-      <w:pPr>
-        <w:spacing w:after="120"/>
-      </w:pPr>
-      <w:r>
-        <w:rPr>
-          <w:i/>
-          <w:color w:val="888888"/>
-          <w:sz w:val="16"/>
-        </w:rPr>
-        <w:t>Conteúdo informativo geral sobre biocombustíveis.</w:t>
-      </w:r>
-    </w:p>
-    <w:p>
-      <w:pPr>
-        <w:spacing w:before="160" w:after="40"/>
-      </w:pPr>
-      <w:r>
-        <w:rPr>
-          <w:b/>
-          <w:color w:val="1A1A1A"/>
-          <w:sz w:val="22"/>
-        </w:rPr>
-        <w:t xml:space="preserve">DEFESO ELEITORAL 2026   </w:t>
-      </w:r>
-      <w:r>
-        <w:rPr>
-          <w:b/>
-          <w:color w:val="7F8C8D"/>
-          <w:sz w:val="16"/>
-        </w:rPr>
-        <w:t>[BAIXA]</w:t>
-      </w:r>
-    </w:p>
-    <w:p>
-      <w:pPr>
-        <w:spacing w:after="40"/>
-      </w:pPr>
-      <w:r>
-        <w:rPr>
-          <w:color w:val="4A4A4A"/>
-          <w:sz w:val="20"/>
-        </w:rPr>
-        <w:t>Aviso importante sobre o período de defeso eleitoral em 2026.</w:t>
-      </w:r>
-    </w:p>
-    <w:p>
-      <w:pPr>
-        <w:spacing w:after="40"/>
-      </w:pPr>
-      <w:r>
-        <w:rPr>
-          <w:b/>
-          <w:color w:val="888888"/>
-          <w:sz w:val="18"/>
-        </w:rPr>
-        <w:t xml:space="preserve">Publicado: </w:t>
-      </w:r>
-      <w:r>
-        <w:rPr>
-          <w:color w:val="888888"/>
-          <w:sz w:val="18"/>
-        </w:rPr>
-        <w:t xml:space="preserve">2026-07-03   </w:t>
-      </w:r>
-      <w:hyperlink r:id="rId47">
-        <w:r>
-          <w:rPr>
-            <w:color w:val="1A4D2E"/>
-            <w:u w:val="single"/>
-            <w:b/>
-          </w:rPr>
-          <w:t>Acessar materia</w:t>
-        </w:r>
-      </w:hyperlink>
-    </w:p>
-    <w:p>
-      <w:pPr>
-        <w:spacing w:after="120"/>
-      </w:pPr>
-      <w:r>
-        <w:rPr>
-          <w:i/>
-          <w:color w:val="888888"/>
-          <w:sz w:val="16"/>
-        </w:rPr>
-        <w:t>Notícia institucional sobre adequação a período eleitoral.</w:t>
-      </w:r>
-    </w:p>
-    <w:p>
-      <w:pPr>
-        <w:spacing w:before="240" w:after="80"/>
-      </w:pPr>
-      <w:r>
-        <w:rPr>
-          <w:b/>
-          <w:color w:val="1A4D2E"/>
-          <w:sz w:val="20"/>
-        </w:rPr>
-        <w:t>ONS | NOTÍCIAS</w:t>
-      </w:r>
-    </w:p>
-    <w:p>
-      <w:pPr>
-        <w:spacing w:before="0" w:after="40"/>
-        <w:pBdr>
-          <w:bottom w:val="single" w:sz="8" w:space="1" w:color="1A4D2E"/>
-        </w:pBdr>
-      </w:pPr>
-    </w:p>
-    <w:p>
-      <w:pPr>
-        <w:spacing w:before="160" w:after="40"/>
-      </w:pPr>
-      <w:r>
-        <w:rPr>
-          <w:b/>
-          <w:color w:val="1A1A1A"/>
-          <w:sz w:val="22"/>
-        </w:rPr>
-        <w:t xml:space="preserve">ONS indica afluências acima da Média de Longo Termo na região Sul, com 155%   </w:t>
-      </w:r>
-      <w:r>
-        <w:rPr>
-          <w:b/>
-          <w:color w:val="D68910"/>
-          <w:sz w:val="16"/>
-        </w:rPr>
-        <w:t>[MÉDIA]</w:t>
-      </w:r>
-    </w:p>
-    <w:p>
-      <w:pPr>
-        <w:spacing w:after="40"/>
-      </w:pPr>
-      <w:r>
-        <w:rPr>
-          <w:color w:val="4A4A4A"/>
-          <w:sz w:val="20"/>
-        </w:rPr>
-        <w:t>Previsões no Sudeste/Centro-Oeste também superam 90% da MLT, indicando boas condições hidrológicas.</w:t>
-      </w:r>
-    </w:p>
-    <w:p>
-      <w:pPr>
-        <w:spacing w:after="40"/>
-      </w:pPr>
-      <w:r>
-        <w:rPr>
-          <w:b/>
-          <w:color w:val="888888"/>
-          <w:sz w:val="18"/>
-        </w:rPr>
-        <w:t xml:space="preserve">Publicado: </w:t>
-      </w:r>
-      <w:r>
-        <w:rPr>
-          <w:color w:val="888888"/>
-          <w:sz w:val="18"/>
-        </w:rPr>
-        <w:t xml:space="preserve">2026-07-03   </w:t>
-      </w:r>
-      <w:hyperlink r:id="rId48">
-        <w:r>
-          <w:rPr>
-            <w:color w:val="1A4D2E"/>
-            <w:u w:val="single"/>
-            <w:b/>
-          </w:rPr>
-          <w:t>Acessar materia</w:t>
-        </w:r>
-      </w:hyperlink>
-    </w:p>
-    <w:p>
-      <w:pPr>
-        <w:spacing w:after="120"/>
-      </w:pPr>
-      <w:r>
-        <w:rPr>
-          <w:i/>
-          <w:color w:val="888888"/>
-          <w:sz w:val="16"/>
-        </w:rPr>
-        <w:t>Informação relevante sobre condições hidrológicas e operação do sistema elétrico.</w:t>
-      </w:r>
-    </w:p>
-    <w:p>
-      <w:pPr>
-        <w:spacing w:before="240" w:after="80"/>
-      </w:pPr>
-      <w:r>
-        <w:rPr>
-          <w:b/>
-          <w:color w:val="1A4D2E"/>
-          <w:sz w:val="20"/>
-        </w:rPr>
-        <w:t>ANEEL | ÚLTIMAS NOTÍCIAS</w:t>
-      </w:r>
-    </w:p>
-    <w:p>
-      <w:pPr>
-        <w:spacing w:before="0" w:after="40"/>
-        <w:pBdr>
-          <w:bottom w:val="single" w:sz="8" w:space="1" w:color="1A4D2E"/>
-        </w:pBdr>
-      </w:pPr>
-    </w:p>
-    <w:p>
-      <w:pPr>
-        <w:spacing w:before="160" w:after="40"/>
-      </w:pPr>
-      <w:r>
-        <w:rPr>
-          <w:b/>
-          <w:color w:val="1A1A1A"/>
-          <w:sz w:val="22"/>
-        </w:rPr>
-        <w:t xml:space="preserve">Bandeira tarifária em julho permanece amarela   </w:t>
-      </w:r>
-      <w:r>
-        <w:rPr>
-          <w:b/>
-          <w:color w:val="D68910"/>
-          <w:sz w:val="16"/>
-        </w:rPr>
-        <w:t>[MÉDIA]</w:t>
-      </w:r>
-    </w:p>
-    <w:p>
-      <w:pPr>
-        <w:spacing w:after="40"/>
-      </w:pPr>
-      <w:r>
-        <w:rPr>
-          <w:color w:val="4A4A4A"/>
-          <w:sz w:val="20"/>
-        </w:rPr>
-        <w:t>A conta de luz dos consumidores continua tendo acréscimo de R$ 1,885 a cada 100 kWh em julho.</w:t>
-      </w:r>
-    </w:p>
-    <w:p>
-      <w:pPr>
-        <w:spacing w:after="40"/>
-      </w:pPr>
-      <w:r>
-        <w:rPr>
-          <w:b/>
-          <w:color w:val="888888"/>
-          <w:sz w:val="18"/>
-        </w:rPr>
-        <w:t xml:space="preserve">Publicado: </w:t>
-      </w:r>
-      <w:r>
-        <w:rPr>
-          <w:color w:val="888888"/>
-          <w:sz w:val="18"/>
-        </w:rPr>
-        <w:t xml:space="preserve">2026-07-03   </w:t>
-      </w:r>
-      <w:hyperlink r:id="rId49">
-        <w:r>
-          <w:rPr>
-            <w:color w:val="1A4D2E"/>
-            <w:u w:val="single"/>
-            <w:b/>
-          </w:rPr>
-          <w:t>Acessar materia</w:t>
-        </w:r>
-      </w:hyperlink>
-    </w:p>
-    <w:p>
-      <w:pPr>
-        <w:spacing w:after="120"/>
-      </w:pPr>
-      <w:r>
-        <w:rPr>
-          <w:i/>
-          <w:color w:val="888888"/>
-          <w:sz w:val="16"/>
-        </w:rPr>
-        <w:t>Impacta diretamente o custo da energia para consumidores.</w:t>
-      </w:r>
-    </w:p>
-    <w:p>
-      <w:pPr>
-        <w:spacing w:before="160" w:after="40"/>
-      </w:pPr>
-      <w:r>
-        <w:rPr>
-          <w:b/>
-          <w:color w:val="1A1A1A"/>
-          <w:sz w:val="22"/>
-        </w:rPr>
-        <w:t xml:space="preserve">Medidores de energia elétrica: ANEEL abre segunda fase da consulta pública   </w:t>
-      </w:r>
-      <w:r>
-        <w:rPr>
-          <w:b/>
-          <w:color w:val="C0392B"/>
-          <w:sz w:val="16"/>
-        </w:rPr>
-        <w:t>[ALTA]</w:t>
-      </w:r>
-    </w:p>
-    <w:p>
-      <w:pPr>
-        <w:spacing w:after="40"/>
-      </w:pPr>
-      <w:r>
-        <w:rPr>
-          <w:color w:val="4A4A4A"/>
-          <w:sz w:val="20"/>
-        </w:rPr>
-        <w:t>A ANEEL abre a segunda fase da consulta pública para receber sugestões sobre requisitos mínimos em medidores inteligentes de energia elétrica.</w:t>
-      </w:r>
-    </w:p>
-    <w:p>
-      <w:pPr>
-        <w:spacing w:after="40"/>
-      </w:pPr>
-      <w:r>
-        <w:rPr>
-          <w:b/>
-          <w:color w:val="888888"/>
-          <w:sz w:val="18"/>
-        </w:rPr>
-        <w:t xml:space="preserve">Publicado: </w:t>
-      </w:r>
-      <w:r>
-        <w:rPr>
-          <w:color w:val="888888"/>
-          <w:sz w:val="18"/>
-        </w:rPr>
-        <w:t xml:space="preserve">2026-07-03   </w:t>
-      </w:r>
-      <w:hyperlink r:id="rId50">
-        <w:r>
-          <w:rPr>
-            <w:color w:val="1A4D2E"/>
-            <w:u w:val="single"/>
-            <w:b/>
-          </w:rPr>
-          <w:t>Acessar materia</w:t>
-        </w:r>
-      </w:hyperlink>
-    </w:p>
-    <w:p>
-      <w:pPr>
-        <w:spacing w:after="120"/>
-      </w:pPr>
-      <w:r>
-        <w:rPr>
-          <w:i/>
-          <w:color w:val="888888"/>
-          <w:sz w:val="16"/>
-        </w:rPr>
-        <w:t>Abertura de consulta pública sobre regulamentação técnica com impacto no setor elétrico.</w:t>
-      </w:r>
-    </w:p>
-    <w:p>
-      <w:pPr>
-        <w:spacing w:before="160" w:after="40"/>
-      </w:pPr>
-      <w:r>
-        <w:rPr>
-          <w:b/>
-          <w:color w:val="1A1A1A"/>
-          <w:sz w:val="22"/>
-        </w:rPr>
-        <w:t xml:space="preserve">Olimpíada Nacional de Eficiência Energética 2026 está com inscrições abertas   </w:t>
-      </w:r>
-      <w:r>
-        <w:rPr>
-          <w:b/>
-          <w:color w:val="7F8C8D"/>
-          <w:sz w:val="16"/>
-        </w:rPr>
-        <w:t>[BAIXA]</w:t>
-      </w:r>
-    </w:p>
-    <w:p>
-      <w:pPr>
-        <w:spacing w:after="40"/>
-      </w:pPr>
-      <w:r>
-        <w:rPr>
-          <w:color w:val="4A4A4A"/>
-          <w:sz w:val="20"/>
-        </w:rPr>
-        <w:t>A Olimpíada Nacional de Eficiência Energética 2026 está com inscrições abertas, incluindo pela primeira vez estudantes do ensino médio.</w:t>
-      </w:r>
-    </w:p>
-    <w:p>
-      <w:pPr>
-        <w:spacing w:after="40"/>
-      </w:pPr>
-      <w:r>
-        <w:rPr>
-          <w:b/>
-          <w:color w:val="888888"/>
-          <w:sz w:val="18"/>
-        </w:rPr>
-        <w:t xml:space="preserve">Publicado: </w:t>
-      </w:r>
-      <w:r>
-        <w:rPr>
-          <w:color w:val="888888"/>
-          <w:sz w:val="18"/>
-        </w:rPr>
-        <w:t xml:space="preserve">2026-07-03   </w:t>
-      </w:r>
-      <w:hyperlink r:id="rId51">
-        <w:r>
-          <w:rPr>
-            <w:color w:val="1A4D2E"/>
-            <w:u w:val="single"/>
-            <w:b/>
-          </w:rPr>
-          <w:t>Acessar materia</w:t>
-        </w:r>
-      </w:hyperlink>
-    </w:p>
-    <w:p>
-      <w:pPr>
-        <w:spacing w:after="120"/>
-      </w:pPr>
-      <w:r>
-        <w:rPr>
-          <w:i/>
-          <w:color w:val="888888"/>
-          <w:sz w:val="16"/>
-        </w:rPr>
-        <w:t>Notícia institucional sobre evento educacional.</w:t>
-      </w:r>
-    </w:p>
-    <w:p>
-      <w:pPr>
-        <w:spacing w:before="240" w:after="80"/>
-      </w:pPr>
-      <w:r>
-        <w:rPr>
-          <w:b/>
-          <w:color w:val="1A4D2E"/>
-          <w:sz w:val="20"/>
-        </w:rPr>
-        <w:t>ANM | NOTÍCIAS</w:t>
-      </w:r>
-    </w:p>
-    <w:p>
-      <w:pPr>
-        <w:spacing w:before="0" w:after="40"/>
-        <w:pBdr>
-          <w:bottom w:val="single" w:sz="8" w:space="1" w:color="1A4D2E"/>
-        </w:pBdr>
-      </w:pPr>
-    </w:p>
-    <w:p>
-      <w:pPr>
-        <w:spacing w:before="160" w:after="40"/>
-      </w:pPr>
-      <w:r>
-        <w:rPr>
-          <w:b/>
-          <w:color w:val="1A1A1A"/>
-          <w:sz w:val="22"/>
-        </w:rPr>
-        <w:t xml:space="preserve">Parceria com o Serpro avança em solução para fortalecer a integridade dos royalties da mineração   </w:t>
-      </w:r>
-      <w:r>
-        <w:rPr>
-          <w:b/>
-          <w:color w:val="D68910"/>
-          <w:sz w:val="16"/>
-        </w:rPr>
-        <w:t>[MÉDIA]</w:t>
-      </w:r>
-    </w:p>
-    <w:p>
-      <w:pPr>
-        <w:spacing w:after="40"/>
-      </w:pPr>
-      <w:r>
-        <w:rPr>
-          <w:color w:val="4A4A4A"/>
-          <w:sz w:val="20"/>
-        </w:rPr>
-        <w:t>Oficina discutiu medidas para ampliar compliance, combater concorrência desleal e modernizar a gestão da CFEM.</w:t>
-      </w:r>
-    </w:p>
-    <w:p>
-      <w:pPr>
-        <w:spacing w:after="40"/>
-      </w:pPr>
-      <w:r>
-        <w:rPr>
-          <w:b/>
-          <w:color w:val="888888"/>
-          <w:sz w:val="18"/>
-        </w:rPr>
-        <w:t xml:space="preserve">Publicado: </w:t>
-      </w:r>
-      <w:r>
-        <w:rPr>
-          <w:color w:val="888888"/>
-          <w:sz w:val="18"/>
-        </w:rPr>
-        <w:t xml:space="preserve">2026-07-03T18:09   </w:t>
-      </w:r>
-      <w:hyperlink r:id="rId52">
-        <w:r>
-          <w:rPr>
-            <w:color w:val="1A4D2E"/>
-            <w:u w:val="single"/>
-            <w:b/>
-          </w:rPr>
-          <w:t>Acessar materia</w:t>
-        </w:r>
-      </w:hyperlink>
-    </w:p>
-    <w:p>
-      <w:pPr>
-        <w:spacing w:after="120"/>
-      </w:pPr>
-      <w:r>
-        <w:rPr>
-          <w:i/>
-          <w:color w:val="888888"/>
-          <w:sz w:val="16"/>
-        </w:rPr>
-        <w:t>Iniciativa para melhorar a gestão e fiscalização de royalties da mineração.</w:t>
-      </w:r>
-    </w:p>
-    <w:p>
-      <w:pPr>
-        <w:spacing w:before="240" w:after="80"/>
-      </w:pPr>
-      <w:r>
-        <w:rPr>
-          <w:b/>
-          <w:color w:val="1A4D2E"/>
-          <w:sz w:val="20"/>
-        </w:rPr>
-        <w:t>EPE | NOTÍCIAS</w:t>
-      </w:r>
-    </w:p>
-    <w:p>
-      <w:pPr>
-        <w:spacing w:before="0" w:after="40"/>
-        <w:pBdr>
-          <w:bottom w:val="single" w:sz="8" w:space="1" w:color="1A4D2E"/>
-        </w:pBdr>
-      </w:pPr>
-    </w:p>
-    <w:p>
-      <w:pPr>
-        <w:spacing w:before="160" w:after="40"/>
-      </w:pPr>
-      <w:r>
-        <w:rPr>
-          <w:b/>
-          <w:color w:val="1A1A1A"/>
-          <w:sz w:val="22"/>
-        </w:rPr>
-        <w:t xml:space="preserve">EPE e ONS Divulgam Nota Técnica com a Metodologia, Premissas e Critérios para os Leilões de Reserva de Capacidade (LRCAP) de 2026 – Armazenamento Nacional e Armazenamento   </w:t>
-      </w:r>
-      <w:r>
-        <w:rPr>
-          <w:b/>
-          <w:color w:val="C0392B"/>
-          <w:sz w:val="16"/>
-        </w:rPr>
-        <w:t>[ALTA]</w:t>
-      </w:r>
-    </w:p>
-    <w:p>
-      <w:pPr>
-        <w:spacing w:after="40"/>
-      </w:pPr>
-      <w:r>
-        <w:rPr>
-          <w:color w:val="4A4A4A"/>
-          <w:sz w:val="20"/>
-        </w:rPr>
-        <w:t>Documento conjunto EPE e ONS apresenta metodologia, premissas e critérios para definição da Capacidade Remanescente do SIN para leilões de reserva de capacidade.</w:t>
-      </w:r>
-    </w:p>
-    <w:p>
-      <w:pPr>
-        <w:spacing w:after="40"/>
-      </w:pPr>
-      <w:r>
-        <w:rPr>
-          <w:b/>
-          <w:color w:val="888888"/>
-          <w:sz w:val="18"/>
-        </w:rPr>
-        <w:t xml:space="preserve">Publicado: </w:t>
-      </w:r>
-      <w:r>
-        <w:rPr>
-          <w:color w:val="888888"/>
-          <w:sz w:val="18"/>
-        </w:rPr>
-        <w:t xml:space="preserve">2026-07-03   </w:t>
-      </w:r>
-      <w:hyperlink r:id="rId53">
-        <w:r>
-          <w:rPr>
-            <w:color w:val="1A4D2E"/>
-            <w:u w:val="single"/>
-            <w:b/>
-          </w:rPr>
-          <w:t>Acessar materia</w:t>
-        </w:r>
-      </w:hyperlink>
-    </w:p>
-    <w:p>
-      <w:pPr>
-        <w:spacing w:after="120"/>
-      </w:pPr>
-      <w:r>
-        <w:rPr>
-          <w:i/>
-          <w:color w:val="888888"/>
-          <w:sz w:val="16"/>
-        </w:rPr>
-        <w:t>Publicação de metodologia e critérios para leilões de energia, com impacto regulatório e de mercado.</w:t>
-      </w:r>
-    </w:p>
-    <w:p>
-      <w:pPr>
-        <w:spacing w:before="160" w:after="40"/>
-      </w:pPr>
-      <w:r>
-        <w:rPr>
-          <w:b/>
-          <w:color w:val="1A1A1A"/>
-          <w:sz w:val="22"/>
-        </w:rPr>
-        <w:t xml:space="preserve">EPE participa do workshop “Planejamento da Transmissão para a Transição Energética”   </w:t>
-      </w:r>
-      <w:r>
-        <w:rPr>
-          <w:b/>
-          <w:color w:val="D68910"/>
-          <w:sz w:val="16"/>
-        </w:rPr>
-        <w:t>[MÉDIA]</w:t>
-      </w:r>
-    </w:p>
-    <w:p>
-      <w:pPr>
-        <w:spacing w:after="40"/>
-      </w:pPr>
-      <w:r>
-        <w:rPr>
-          <w:color w:val="4A4A4A"/>
-          <w:sz w:val="20"/>
-        </w:rPr>
-        <w:t>Evento discutiu oportunidades de integração e planejamento de reforços na transmissão, com foco em eficiência e sustentabilidade.</w:t>
-      </w:r>
-    </w:p>
-    <w:p>
-      <w:pPr>
-        <w:spacing w:after="40"/>
-      </w:pPr>
-      <w:r>
-        <w:rPr>
-          <w:b/>
-          <w:color w:val="888888"/>
-          <w:sz w:val="18"/>
-        </w:rPr>
-        <w:t xml:space="preserve">Publicado: </w:t>
-      </w:r>
-      <w:r>
-        <w:rPr>
-          <w:color w:val="888888"/>
-          <w:sz w:val="18"/>
-        </w:rPr>
-        <w:t xml:space="preserve">2026-07-03   </w:t>
-      </w:r>
-      <w:hyperlink r:id="rId54">
-        <w:r>
-          <w:rPr>
-            <w:color w:val="1A4D2E"/>
-            <w:u w:val="single"/>
-            <w:b/>
-          </w:rPr>
-          <w:t>Acessar materia</w:t>
-        </w:r>
-      </w:hyperlink>
-    </w:p>
-    <w:p>
-      <w:pPr>
-        <w:spacing w:after="120"/>
-      </w:pPr>
-      <w:r>
-        <w:rPr>
-          <w:i/>
-          <w:color w:val="888888"/>
-          <w:sz w:val="16"/>
-        </w:rPr>
-        <w:t>Participação em evento setorial sobre planejamento estratégico de energia.</w:t>
-      </w:r>
-    </w:p>
-    <w:p>
-      <w:pPr>
-        <w:spacing w:before="160" w:after="40"/>
-      </w:pPr>
-      <w:r>
-        <w:rPr>
-          <w:b/>
-          <w:color w:val="1A1A1A"/>
-          <w:sz w:val="22"/>
-        </w:rPr>
-        <w:t xml:space="preserve">Segunda etapa do Leilão de Transmissão nº 1/2026 tem deságio e contrata todos os lotes   </w:t>
-      </w:r>
-      <w:r>
-        <w:rPr>
-          <w:b/>
-          <w:color w:val="C0392B"/>
-          <w:sz w:val="16"/>
-        </w:rPr>
-        <w:t>[ALTA]</w:t>
-      </w:r>
-    </w:p>
-    <w:p>
-      <w:pPr>
-        <w:spacing w:after="40"/>
-      </w:pPr>
-      <w:r>
-        <w:rPr>
-          <w:color w:val="4A4A4A"/>
-          <w:sz w:val="20"/>
-        </w:rPr>
-        <w:t>Leilão de Transmissão com quatro lotes e investimentos de R$ 1,8 bilhão teve 100% de sucesso, com deságio.</w:t>
-      </w:r>
-    </w:p>
-    <w:p>
-      <w:pPr>
-        <w:spacing w:after="40"/>
-      </w:pPr>
-      <w:r>
-        <w:rPr>
-          <w:b/>
-          <w:color w:val="888888"/>
-          <w:sz w:val="18"/>
-        </w:rPr>
-        <w:t xml:space="preserve">Publicado: </w:t>
-      </w:r>
-      <w:r>
-        <w:rPr>
-          <w:color w:val="888888"/>
-          <w:sz w:val="18"/>
-        </w:rPr>
-        <w:t xml:space="preserve">2026-07-03   </w:t>
-      </w:r>
-      <w:hyperlink r:id="rId55">
-        <w:r>
-          <w:rPr>
-            <w:color w:val="1A4D2E"/>
-            <w:u w:val="single"/>
-            <w:b/>
-          </w:rPr>
-          <w:t>Acessar materia</w:t>
-        </w:r>
-      </w:hyperlink>
-    </w:p>
-    <w:p>
-      <w:pPr>
-        <w:spacing w:after="120"/>
-      </w:pPr>
-      <w:r>
-        <w:rPr>
-          <w:i/>
-          <w:color w:val="888888"/>
-          <w:sz w:val="16"/>
-        </w:rPr>
-        <w:t>Resultado de leilão de infraestrutura energética com grande volume de investimentos.</w:t>
-      </w:r>
-    </w:p>
-    <w:p>
-      <w:pPr>
-        <w:spacing w:before="160" w:after="40"/>
-      </w:pPr>
-      <w:r>
-        <w:rPr>
-          <w:b/>
-          <w:color w:val="1A1A1A"/>
-          <w:sz w:val="22"/>
-        </w:rPr>
-        <w:t xml:space="preserve">EPE recebe prêmio por excelência em planejamento energético durante o EVEx Brasil 2026   </w:t>
-      </w:r>
-      <w:r>
-        <w:rPr>
-          <w:b/>
-          <w:color w:val="7F8C8D"/>
-          <w:sz w:val="16"/>
-        </w:rPr>
-        <w:t>[BAIXA]</w:t>
-      </w:r>
-    </w:p>
-    <w:p>
-      <w:pPr>
-        <w:spacing w:after="40"/>
-      </w:pPr>
-      <w:r>
-        <w:rPr>
-          <w:color w:val="4A4A4A"/>
-          <w:sz w:val="20"/>
-        </w:rPr>
-        <w:t>A EPE foi premiada com "Vanguarda em Planejamento e Inteligência Setorial" no EVEx Brasil 2026, reconhecendo sua excelência técnica.</w:t>
-      </w:r>
-    </w:p>
-    <w:p>
-      <w:pPr>
-        <w:spacing w:after="40"/>
-      </w:pPr>
-      <w:r>
-        <w:rPr>
-          <w:b/>
-          <w:color w:val="888888"/>
-          <w:sz w:val="18"/>
-        </w:rPr>
-        <w:t xml:space="preserve">Publicado: </w:t>
-      </w:r>
-      <w:r>
-        <w:rPr>
-          <w:color w:val="888888"/>
-          <w:sz w:val="18"/>
-        </w:rPr>
-        <w:t xml:space="preserve">2026-07-03   </w:t>
-      </w:r>
-      <w:hyperlink r:id="rId56">
-        <w:r>
-          <w:rPr>
-            <w:color w:val="1A4D2E"/>
-            <w:u w:val="single"/>
-            <w:b/>
-          </w:rPr>
-          <w:t>Acessar materia</w:t>
-        </w:r>
-      </w:hyperlink>
-    </w:p>
-    <w:p>
-      <w:pPr>
-        <w:spacing w:after="120"/>
-      </w:pPr>
-      <w:r>
-        <w:rPr>
-          <w:i/>
-          <w:color w:val="888888"/>
-          <w:sz w:val="16"/>
-        </w:rPr>
-        <w:t>Notícia institucional sobre premiação.</w:t>
-      </w:r>
-    </w:p>
-    <w:p>
-      <w:pPr>
-        <w:spacing w:before="160" w:after="40"/>
-      </w:pPr>
-      <w:r>
-        <w:rPr>
-          <w:b/>
-          <w:color w:val="1A1A1A"/>
-          <w:sz w:val="22"/>
-        </w:rPr>
-        <w:t xml:space="preserve">EPE publica Rodadas de Licitação no Mundo em 2026   </w:t>
-      </w:r>
-      <w:r>
-        <w:rPr>
-          <w:b/>
-          <w:color w:val="D68910"/>
-          <w:sz w:val="16"/>
-        </w:rPr>
-        <w:t>[MÉDIA]</w:t>
-      </w:r>
-    </w:p>
-    <w:p>
-      <w:pPr>
-        <w:spacing w:after="40"/>
-      </w:pPr>
-      <w:r>
-        <w:rPr>
-          <w:color w:val="4A4A4A"/>
-          <w:sz w:val="20"/>
-        </w:rPr>
-        <w:t>Documento reúne informações sobre rodadas de licitação de áreas exploratórias em 2025 e 2026, destacando estratégias de segurança energética.</w:t>
-      </w:r>
-    </w:p>
-    <w:p>
-      <w:pPr>
-        <w:spacing w:after="40"/>
-      </w:pPr>
-      <w:r>
-        <w:rPr>
-          <w:b/>
-          <w:color w:val="888888"/>
-          <w:sz w:val="18"/>
-        </w:rPr>
-        <w:t xml:space="preserve">Publicado: </w:t>
-      </w:r>
-      <w:r>
-        <w:rPr>
-          <w:color w:val="888888"/>
-          <w:sz w:val="18"/>
-        </w:rPr>
-        <w:t xml:space="preserve">2026-07-03   </w:t>
-      </w:r>
-      <w:hyperlink r:id="rId57">
-        <w:r>
-          <w:rPr>
-            <w:color w:val="1A4D2E"/>
-            <w:u w:val="single"/>
-            <w:b/>
-          </w:rPr>
-          <w:t>Acessar materia</w:t>
-        </w:r>
-      </w:hyperlink>
-    </w:p>
-    <w:p>
-      <w:pPr>
-        <w:spacing w:after="120"/>
-      </w:pPr>
-      <w:r>
-        <w:rPr>
-          <w:i/>
-          <w:color w:val="888888"/>
-          <w:sz w:val="16"/>
-        </w:rPr>
-        <w:t>Publicação de estudo relevante para o setor de petróleo e gás.</w:t>
-      </w:r>
-    </w:p>
-    <w:p>
-      <w:pPr>
-        <w:spacing w:before="160" w:after="40"/>
-      </w:pPr>
-      <w:r>
-        <w:rPr>
-          <w:b/>
-          <w:color w:val="1A1A1A"/>
-          <w:sz w:val="22"/>
-        </w:rPr>
-        <w:t xml:space="preserve">Primeiro caderno do PDE 2036 reúne contexto, perspectivas e premissas para o setor energético   </w:t>
-      </w:r>
-      <w:r>
-        <w:rPr>
-          <w:b/>
-          <w:color w:val="D68910"/>
-          <w:sz w:val="16"/>
-        </w:rPr>
-        <w:t>[MÉDIA]</w:t>
-      </w:r>
-    </w:p>
-    <w:p>
-      <w:pPr>
-        <w:spacing w:after="40"/>
-      </w:pPr>
-      <w:r>
-        <w:rPr>
-          <w:color w:val="4A4A4A"/>
-          <w:sz w:val="20"/>
-        </w:rPr>
-        <w:t>MME e EPE publicaram o Caderno de Contexto, Perspectivas e Premissas, primeira publicação do Plano Decenal de Expansão de Energia 2036.</w:t>
-      </w:r>
-    </w:p>
-    <w:p>
-      <w:pPr>
-        <w:spacing w:after="40"/>
-      </w:pPr>
-      <w:r>
-        <w:rPr>
-          <w:b/>
-          <w:color w:val="888888"/>
-          <w:sz w:val="18"/>
-        </w:rPr>
-        <w:t xml:space="preserve">Publicado: </w:t>
-      </w:r>
-      <w:r>
-        <w:rPr>
-          <w:color w:val="888888"/>
-          <w:sz w:val="18"/>
-        </w:rPr>
-        <w:t xml:space="preserve">2026-07-03   </w:t>
-      </w:r>
-      <w:hyperlink r:id="rId58">
-        <w:r>
-          <w:rPr>
-            <w:color w:val="1A4D2E"/>
-            <w:u w:val="single"/>
-            <w:b/>
-          </w:rPr>
-          <w:t>Acessar materia</w:t>
-        </w:r>
-      </w:hyperlink>
-    </w:p>
-    <w:p>
-      <w:pPr>
-        <w:spacing w:after="120"/>
-      </w:pPr>
-      <w:r>
-        <w:rPr>
-          <w:i/>
-          <w:color w:val="888888"/>
-          <w:sz w:val="16"/>
-        </w:rPr>
-        <w:t>Publicação de estudo estratégico para o planejamento energético nacional.</w:t>
+        <w:t>Notícia institucional sobre adequação a normas eleitorais, sem impacto regulatório direto.</w:t>
       </w:r>
     </w:p>
     <w:p/>
@@ -4748,7 +1886,7 @@
           <w:color w:val="1A1A1A"/>
           <w:sz w:val="22"/>
         </w:rPr>
-        <w:t xml:space="preserve">Renegociação de dívidas está disponível para famílias, estudantes com financiamento do Fies, empresas e agricultores familiares   </w:t>
+        <w:t xml:space="preserve">Polícia Federal apura esquema de lavagem de dinheiro ligado a apostas ilegais   </w:t>
       </w:r>
       <w:r>
         <w:rPr>
@@ -4768,7 +1906,7 @@
           <w:color w:val="4A4A4A"/>
           <w:sz w:val="20"/>
         </w:rPr>
-        <w:t>Confira as condições para cada categoria de renegociação de dívidas, incluindo famílias, estudantes do Fies, empresas e agricultores familiares.</w:t>
+        <w:t>Informações da Secretaria de Prêmios e Apostas (SPA) auxiliam investigação da Polícia Federal sobre lavagem de dinheiro em apostas ilegais.</w:t>
       </w:r>
     </w:p>
     <w:p>
@@ -4788,9 +1926,9 @@
           <w:color w:val="888888"/>
           <w:sz w:val="18"/>
         </w:rPr>
-        <w:t xml:space="preserve">2026-07-03   </w:t>
+        <w:t xml:space="preserve">2026-07-06   </w:t>
       </w:r>
-      <w:hyperlink r:id="rId59">
+      <w:hyperlink r:id="rId13">
         <w:r>
           <w:rPr>
             <w:color w:val="1A4D2E"/>
@@ -4811,8 +1949,29 @@
           <w:color w:val="888888"/>
           <w:sz w:val="16"/>
         </w:rPr>
-        <w:t>Notícia com impacto direto em diversos setores da economia e cidadãos.</w:t>
+        <w:t>Notícia sobre investigação criminal e regulatória com potencial impacto no setor de apostas e lavagem de dinheiro.</w:t>
       </w:r>
+    </w:p>
+    <w:p>
+      <w:pPr>
+        <w:spacing w:before="240" w:after="80"/>
+      </w:pPr>
+      <w:r>
+        <w:rPr>
+          <w:b/>
+          <w:color w:val="1A4D2E"/>
+          <w:sz w:val="20"/>
+        </w:rPr>
+        <w:t>COAF | NOTÍCIAS</w:t>
+      </w:r>
+    </w:p>
+    <w:p>
+      <w:pPr>
+        <w:spacing w:before="0" w:after="40"/>
+        <w:pBdr>
+          <w:bottom w:val="single" w:sz="8" w:space="1" w:color="1A4D2E"/>
+        </w:pBdr>
+      </w:pPr>
     </w:p>
     <w:p>
       <w:pPr>
@@ -4824,7 +1983,7 @@
           <w:color w:val="1A1A1A"/>
           <w:sz w:val="22"/>
         </w:rPr>
-        <w:t xml:space="preserve">Plataforma centralizada de autoexclusão permite bloquear sites de apostas autorizados de uma só vez   </w:t>
+        <w:t xml:space="preserve">Atenção! O Coaf não bloqueia, libera ou retém dinheiro, bens ou qualquer outro tipo de recurso financeiro   </w:t>
       </w:r>
       <w:r>
         <w:rPr>
@@ -4844,7 +2003,7 @@
           <w:color w:val="4A4A4A"/>
           <w:sz w:val="20"/>
         </w:rPr>
-        <w:t>Nova plataforma permite que usuários solicitem a autoexclusão para bloquear sites de apostas autorizados.</w:t>
+        <w:t>O Coaf alerta a população sobre falsas comunicações, esclarecendo que não realiza bloqueio, liberação ou retenção de recursos financeiros.</w:t>
       </w:r>
     </w:p>
     <w:p>
@@ -4864,9 +2023,9 @@
           <w:color w:val="888888"/>
           <w:sz w:val="18"/>
         </w:rPr>
-        <w:t xml:space="preserve">2026-07-03   </w:t>
+        <w:t xml:space="preserve">2026-07-06T18:21   </w:t>
       </w:r>
-      <w:hyperlink r:id="rId60">
+      <w:hyperlink r:id="rId24">
         <w:r>
           <w:rPr>
             <w:color w:val="1A4D2E"/>
@@ -4887,7 +2046,7 @@
           <w:color w:val="888888"/>
           <w:sz w:val="16"/>
         </w:rPr>
-        <w:t>Notícia sobre nova ferramenta de regulação de apostas online.</w:t>
+        <w:t>Esclarecimento público importante para evitar golpes e desinformação sobre a atuação do órgão.</w:t>
       </w:r>
     </w:p>
     <w:p/>
@@ -4932,7 +2091,7 @@
           <w:color w:val="1A4D2E"/>
           <w:sz w:val="20"/>
         </w:rPr>
-        <w:t>MINISTÉRIO DA AGRICULTURA | NOTÍCIAS</w:t>
+        <w:t>ANVISA | NOTÍCIAS</w:t>
       </w:r>
     </w:p>
     <w:p>
@@ -4953,15 +2112,15 @@
           <w:color w:val="1A1A1A"/>
           <w:sz w:val="22"/>
         </w:rPr>
-        <w:t xml:space="preserve">.   </w:t>
+        <w:t xml:space="preserve">Canetas do Paraguai NÃO demonstraram equivalência com medicamentos registrados no Brasil   </w:t>
       </w:r>
       <w:r>
         <w:rPr>
           <w:b/>
-          <w:color w:val="7F8C8D"/>
+          <w:color w:val="D68910"/>
           <w:sz w:val="16"/>
         </w:rPr>
-        <w:t>[BAIXA]</w:t>
+        <w:t>[MÉDIA]</w:t>
       </w:r>
     </w:p>
     <w:p>
@@ -4973,7 +2132,7 @@
           <w:color w:val="4A4A4A"/>
           <w:sz w:val="20"/>
         </w:rPr>
-        <w:t>Comunicado sobre o período de defeso eleitoral, com imagem ilustrativa.</w:t>
+        <w:t>Anvisa alerta que canetas do Paraguai não têm equivalência comprovada com medicamentos registrados no Brasil, exigindo testes específicos.</w:t>
       </w:r>
     </w:p>
     <w:p>
@@ -4993,9 +2152,9 @@
           <w:color w:val="888888"/>
           <w:sz w:val="18"/>
         </w:rPr>
-        <w:t xml:space="preserve">2026-07-03   </w:t>
+        <w:t xml:space="preserve">2026-07-06   </w:t>
       </w:r>
-      <w:hyperlink r:id="rId61">
+      <w:hyperlink r:id="rId25">
         <w:r>
           <w:rPr>
             <w:color w:val="1A4D2E"/>
@@ -5016,29 +2175,160 @@
           <w:color w:val="888888"/>
           <w:sz w:val="16"/>
         </w:rPr>
-        <w:t>Notícia institucional genérica sobre adequação a período eleitoral.</w:t>
+        <w:t>Alerta sanitário e checagem de fatos sobre produtos de saúde, relevante para consumidores e setor farmacêutico.</w:t>
       </w:r>
     </w:p>
     <w:p>
       <w:pPr>
-        <w:spacing w:before="240" w:after="80"/>
+        <w:spacing w:before="160" w:after="40"/>
       </w:pPr>
       <w:r>
         <w:rPr>
           <w:b/>
-          <w:color w:val="1A4D2E"/>
-          <w:sz w:val="20"/>
+          <w:color w:val="1A1A1A"/>
+          <w:sz w:val="22"/>
         </w:rPr>
-        <w:t>ANVISA | NOTÍCIAS</w:t>
+        <w:t xml:space="preserve">Anvisa aprova nova indicação terapêutica para medicamento que trata câncer de mama   </w:t>
+      </w:r>
+      <w:r>
+        <w:rPr>
+          <w:b/>
+          <w:color w:val="C0392B"/>
+          <w:sz w:val="16"/>
+        </w:rPr>
+        <w:t>[ALTA]</w:t>
       </w:r>
     </w:p>
     <w:p>
       <w:pPr>
-        <w:spacing w:before="0" w:after="40"/>
-        <w:pBdr>
-          <w:bottom w:val="single" w:sz="8" w:space="1" w:color="1A4D2E"/>
-        </w:pBdr>
-      </w:pPr>
+        <w:spacing w:after="40"/>
+      </w:pPr>
+      <w:r>
+        <w:rPr>
+          <w:color w:val="4A4A4A"/>
+          <w:sz w:val="20"/>
+        </w:rPr>
+        <w:t>Anvisa aprova nova indicação terapêutica para medicamento de câncer de mama, beneficiando pacientes com doença invasiva residual.</w:t>
+      </w:r>
+    </w:p>
+    <w:p>
+      <w:pPr>
+        <w:spacing w:after="40"/>
+      </w:pPr>
+      <w:r>
+        <w:rPr>
+          <w:b/>
+          <w:color w:val="888888"/>
+          <w:sz w:val="18"/>
+        </w:rPr>
+        <w:t xml:space="preserve">Publicado: </w:t>
+      </w:r>
+      <w:r>
+        <w:rPr>
+          <w:color w:val="888888"/>
+          <w:sz w:val="18"/>
+        </w:rPr>
+        <w:t xml:space="preserve">2026-07-06   </w:t>
+      </w:r>
+      <w:hyperlink r:id="rId26">
+        <w:r>
+          <w:rPr>
+            <w:color w:val="1A4D2E"/>
+            <w:u w:val="single"/>
+            <w:b/>
+          </w:rPr>
+          <w:t>Acessar materia</w:t>
+        </w:r>
+      </w:hyperlink>
+    </w:p>
+    <w:p>
+      <w:pPr>
+        <w:spacing w:after="120"/>
+      </w:pPr>
+      <w:r>
+        <w:rPr>
+          <w:i/>
+          <w:color w:val="888888"/>
+          <w:sz w:val="16"/>
+        </w:rPr>
+        <w:t>Aprovação de nova indicação terapêutica para medicamento, com impacto direto na saúde pública e indústria farmacêutica.</w:t>
+      </w:r>
+    </w:p>
+    <w:p>
+      <w:pPr>
+        <w:spacing w:before="160" w:after="40"/>
+      </w:pPr>
+      <w:r>
+        <w:rPr>
+          <w:b/>
+          <w:color w:val="1A1A1A"/>
+          <w:sz w:val="22"/>
+        </w:rPr>
+        <w:t xml:space="preserve">Anvisa disponibiliza nova ferramenta para consulta de alertas sanitários   </w:t>
+      </w:r>
+      <w:r>
+        <w:rPr>
+          <w:b/>
+          <w:color w:val="D68910"/>
+          <w:sz w:val="16"/>
+        </w:rPr>
+        <w:t>[MÉDIA]</w:t>
+      </w:r>
+    </w:p>
+    <w:p>
+      <w:pPr>
+        <w:spacing w:after="40"/>
+      </w:pPr>
+      <w:r>
+        <w:rPr>
+          <w:color w:val="4A4A4A"/>
+          <w:sz w:val="20"/>
+        </w:rPr>
+        <w:t>Anvisa lança nova ferramenta no portal de consultas para facilitar o acesso a alertas sanitários, substituindo o Sistec.</w:t>
+      </w:r>
+    </w:p>
+    <w:p>
+      <w:pPr>
+        <w:spacing w:after="40"/>
+      </w:pPr>
+      <w:r>
+        <w:rPr>
+          <w:b/>
+          <w:color w:val="888888"/>
+          <w:sz w:val="18"/>
+        </w:rPr>
+        <w:t xml:space="preserve">Publicado: </w:t>
+      </w:r>
+      <w:r>
+        <w:rPr>
+          <w:color w:val="888888"/>
+          <w:sz w:val="18"/>
+        </w:rPr>
+        <w:t xml:space="preserve">2026-07-06   </w:t>
+      </w:r>
+      <w:hyperlink r:id="rId27">
+        <w:r>
+          <w:rPr>
+            <w:color w:val="1A4D2E"/>
+            <w:u w:val="single"/>
+            <w:b/>
+          </w:rPr>
+          <w:t>Acessar materia</w:t>
+        </w:r>
+      </w:hyperlink>
+    </w:p>
+    <w:p>
+      <w:pPr>
+        <w:spacing w:after="120"/>
+      </w:pPr>
+      <w:r>
+        <w:rPr>
+          <w:i/>
+          <w:color w:val="888888"/>
+          <w:sz w:val="16"/>
+        </w:rPr>
+        <w:t>Melhoria em ferramenta de consulta pública de alertas sanitários, facilitando o acesso à informação regulatória.</w:t>
+      </w:r>
     </w:p>
     <w:p>
       <w:pPr>
@@ -5070,7 +2360,7 @@
           <w:color w:val="4A4A4A"/>
           <w:sz w:val="20"/>
         </w:rPr>
-        <w:t>Os novos compêndios da Farmacopeia Brasileira, aprovados em junho, entram em vigor após lançamento no 16º Encontro Internacional das Farmacopeias Mundiais.</w:t>
+        <w:t>Novos compêndios da Farmacopeia Brasileira, aprovados em junho, entram em vigor, estabelecendo padrões para medicamentos.</w:t>
       </w:r>
     </w:p>
     <w:p>
@@ -5092,7 +2382,7 @@
         </w:rPr>
         <w:t xml:space="preserve">2026-07-06   </w:t>
       </w:r>
-      <w:hyperlink r:id="rId62">
+      <w:hyperlink r:id="rId28">
         <w:r>
           <w:rPr>
             <w:color w:val="1A4D2E"/>
@@ -5113,8 +2403,29 @@
           <w:color w:val="888888"/>
           <w:sz w:val="16"/>
         </w:rPr>
-        <w:t>Notícia regulatória com impacto em padrões farmacêuticos e na indústria.</w:t>
+        <w:t>Entrada em vigor de normas que estabelecem padrões para medicamentos, com impacto direto na indústria farmacêutica.</w:t>
       </w:r>
+    </w:p>
+    <w:p>
+      <w:pPr>
+        <w:spacing w:before="240" w:after="80"/>
+      </w:pPr>
+      <w:r>
+        <w:rPr>
+          <w:b/>
+          <w:color w:val="1A4D2E"/>
+          <w:sz w:val="20"/>
+        </w:rPr>
+        <w:t>INPI | NOTÍCIAS</w:t>
+      </w:r>
+    </w:p>
+    <w:p>
+      <w:pPr>
+        <w:spacing w:before="0" w:after="40"/>
+        <w:pBdr>
+          <w:bottom w:val="single" w:sz="8" w:space="1" w:color="1A4D2E"/>
+        </w:pBdr>
+      </w:pPr>
     </w:p>
     <w:p>
       <w:pPr>
@@ -5126,15 +2437,15 @@
           <w:color w:val="1A1A1A"/>
           <w:sz w:val="22"/>
         </w:rPr>
-        <w:t xml:space="preserve">Canais de divulgação da Anvisa serão ajustados durante período do defeso eleitoral   </w:t>
+        <w:t xml:space="preserve">INPI esclarece dúvidas sobre acesso com CNPJ na conta Gov.br   </w:t>
       </w:r>
       <w:r>
         <w:rPr>
           <w:b/>
-          <w:color w:val="7F8C8D"/>
+          <w:color w:val="D68910"/>
           <w:sz w:val="16"/>
         </w:rPr>
-        <w:t>[BAIXA]</w:t>
+        <w:t>[MÉDIA]</w:t>
       </w:r>
     </w:p>
     <w:p>
@@ -5146,7 +2457,7 @@
           <w:color w:val="4A4A4A"/>
           <w:sz w:val="20"/>
         </w:rPr>
-        <w:t>O portal e as redes sociais da Anvisa se adequarão à legislação eleitoral a partir de 4 de julho.</w:t>
+        <w:t>O INPI publica esclarecimentos sobre o acesso de pessoas jurídicas (CNPJ) aos serviços da conta Gov.br.</w:t>
       </w:r>
     </w:p>
     <w:p>
@@ -5166,9 +2477,9 @@
           <w:color w:val="888888"/>
           <w:sz w:val="18"/>
         </w:rPr>
-        <w:t xml:space="preserve">2026-07-04   </w:t>
+        <w:t xml:space="preserve">2026-07-06T16:59   </w:t>
       </w:r>
-      <w:hyperlink r:id="rId63">
+      <w:hyperlink r:id="rId29">
         <w:r>
           <w:rPr>
             <w:color w:val="1A4D2E"/>
@@ -5189,7 +2500,7 @@
           <w:color w:val="888888"/>
           <w:sz w:val="16"/>
         </w:rPr>
-        <w:t>Notícia institucional sobre adequação a período eleitoral.</w:t>
+        <w:t>Esclarecimento administrativo sobre acesso a serviços públicos, relevante para empresas.</w:t>
       </w:r>
     </w:p>
     <w:p>
@@ -5202,15 +2513,15 @@
           <w:color w:val="1A1A1A"/>
           <w:sz w:val="22"/>
         </w:rPr>
-        <w:t xml:space="preserve">Anvisa atualiza listas de substâncias para uso em cosméticos   </w:t>
+        <w:t xml:space="preserve">Encerradas as inscrições para a Oficina de PCT em julho   </w:t>
       </w:r>
       <w:r>
         <w:rPr>
           <w:b/>
-          <w:color w:val="C0392B"/>
+          <w:color w:val="7F8C8D"/>
           <w:sz w:val="16"/>
         </w:rPr>
-        <w:t>[ALTA]</w:t>
+        <w:t>[BAIXA]</w:t>
       </w:r>
     </w:p>
     <w:p>
@@ -5222,7 +2533,7 @@
           <w:color w:val="4A4A4A"/>
           <w:sz w:val="20"/>
         </w:rPr>
-        <w:t>Novas regras da Anvisa para listas de substâncias em cosméticos alinham o mercado brasileiro a padrões internacionais e do Mercosul.</w:t>
+        <w:t>As inscrições para a Oficina de PCT (Tratado de Cooperação em Matéria de Patentes) de julho foram encerradas.</w:t>
       </w:r>
     </w:p>
     <w:p>
@@ -5242,9 +2553,9 @@
           <w:color w:val="888888"/>
           <w:sz w:val="18"/>
         </w:rPr>
-        <w:t xml:space="preserve">2026-07-03   </w:t>
+        <w:t xml:space="preserve">2026-07-06T15:11   </w:t>
       </w:r>
-      <w:hyperlink r:id="rId64">
+      <w:hyperlink r:id="rId30">
         <w:r>
           <w:rPr>
             <w:color w:val="1A4D2E"/>
@@ -5265,7 +2576,7 @@
           <w:color w:val="888888"/>
           <w:sz w:val="16"/>
         </w:rPr>
-        <w:t>Atualização regulatória com impacto direto na indústria de cosméticos.</w:t>
+        <w:t>Notícia sobre o encerramento de inscrições para um evento de capacitação.</w:t>
       </w:r>
     </w:p>
     <w:p>
@@ -5278,15 +2589,15 @@
           <w:color w:val="1A1A1A"/>
           <w:sz w:val="22"/>
         </w:rPr>
-        <w:t xml:space="preserve">Anvisa determina apreensão de saneantes sem registro   </w:t>
+        <w:t xml:space="preserve">Inscrições para Chamamento Público sobre casos de sucesso vão até 31/7   </w:t>
       </w:r>
       <w:r>
         <w:rPr>
           <w:b/>
-          <w:color w:val="D68910"/>
+          <w:color w:val="7F8C8D"/>
           <w:sz w:val="16"/>
         </w:rPr>
-        <w:t>[MÉDIA]</w:t>
+        <w:t>[BAIXA]</w:t>
       </w:r>
     </w:p>
     <w:p>
@@ -5298,7 +2609,7 @@
           <w:color w:val="4A4A4A"/>
           <w:sz w:val="20"/>
         </w:rPr>
-        <w:t>A Anvisa determinou a apreensão de saneantes fabricados por empresas sem autorização de funcionamento, visando a segurança sanitária.</w:t>
+        <w:t>O INPI abriu inscrições para um chamamento público de casos de sucesso, com prazo até 31 de julho.</w:t>
       </w:r>
     </w:p>
     <w:p>
@@ -5318,9 +2629,9 @@
           <w:color w:val="888888"/>
           <w:sz w:val="18"/>
         </w:rPr>
-        <w:t xml:space="preserve">2026-07-03   </w:t>
+        <w:t xml:space="preserve">2026-07-06T13:04   </w:t>
       </w:r>
-      <w:hyperlink r:id="rId65">
+      <w:hyperlink r:id="rId31">
         <w:r>
           <w:rPr>
             <w:color w:val="1A4D2E"/>
@@ -5341,7 +2652,83 @@
           <w:color w:val="888888"/>
           <w:sz w:val="16"/>
         </w:rPr>
-        <w:t>Ação de fiscalização com impacto na segurança sanitária e empresas.</w:t>
+        <w:t>Chamamento público para coleta de informações, de interesse institucional.</w:t>
+      </w:r>
+    </w:p>
+    <w:p>
+      <w:pPr>
+        <w:spacing w:before="160" w:after="40"/>
+      </w:pPr>
+      <w:r>
+        <w:rPr>
+          <w:b/>
+          <w:color w:val="1A1A1A"/>
+          <w:sz w:val="22"/>
+        </w:rPr>
+        <w:t xml:space="preserve">Edital de credenciamento para buscas de anterioridades de patentes está aberto   </w:t>
+      </w:r>
+      <w:r>
+        <w:rPr>
+          <w:b/>
+          <w:color w:val="D68910"/>
+          <w:sz w:val="16"/>
+        </w:rPr>
+        <w:t>[MÉDIA]</w:t>
+      </w:r>
+    </w:p>
+    <w:p>
+      <w:pPr>
+        <w:spacing w:after="40"/>
+      </w:pPr>
+      <w:r>
+        <w:rPr>
+          <w:color w:val="4A4A4A"/>
+          <w:sz w:val="20"/>
+        </w:rPr>
+        <w:t>Edital de credenciamento para profissionais realizarem buscas de anterioridades de patentes está aberto no INPI.</w:t>
+      </w:r>
+    </w:p>
+    <w:p>
+      <w:pPr>
+        <w:spacing w:after="40"/>
+      </w:pPr>
+      <w:r>
+        <w:rPr>
+          <w:b/>
+          <w:color w:val="888888"/>
+          <w:sz w:val="18"/>
+        </w:rPr>
+        <w:t xml:space="preserve">Publicado: </w:t>
+      </w:r>
+      <w:r>
+        <w:rPr>
+          <w:color w:val="888888"/>
+          <w:sz w:val="18"/>
+        </w:rPr>
+        <w:t xml:space="preserve">2026-07-06T12:49   </w:t>
+      </w:r>
+      <w:hyperlink r:id="rId32">
+        <w:r>
+          <w:rPr>
+            <w:color w:val="1A4D2E"/>
+            <w:u w:val="single"/>
+            <w:b/>
+          </w:rPr>
+          <w:t>Acessar materia</w:t>
+        </w:r>
+      </w:hyperlink>
+    </w:p>
+    <w:p>
+      <w:pPr>
+        <w:spacing w:after="120"/>
+      </w:pPr>
+      <w:r>
+        <w:rPr>
+          <w:i/>
+          <w:color w:val="888888"/>
+          <w:sz w:val="16"/>
+        </w:rPr>
+        <w:t>Edital de credenciamento para serviço técnico, relevante para profissionais da área de patentes.</w:t>
       </w:r>
     </w:p>
     <w:p/>
@@ -5406,7 +2793,7 @@
           <w:color w:val="4A4A4A"/>
           <w:sz w:val="18"/>
         </w:rPr>
-        <w:t>Secretaria de Prêmios e Apostas | Notícias - Nenhum resultado foi encontrado na janela temporal.</w:t>
+        <w:t>B3 | Ofícios e Comunicados - Todos os itens encontrados estão fora da janela temporal.</w:t>
       </w:r>
     </w:p>
     <w:p>
@@ -5418,7 +2805,79 @@
           <w:color w:val="4A4A4A"/>
           <w:sz w:val="18"/>
         </w:rPr>
-        <w:t>INPI | Notícias - Nenhuma publicação encontrada na janela temporal.</w:t>
+        <w:t>MME | Notícias - Todos os itens encontrados estão fora da janela temporal.</w:t>
+      </w:r>
+    </w:p>
+    <w:p>
+      <w:pPr>
+        <w:pStyle w:val="ListBullet"/>
+      </w:pPr>
+      <w:r>
+        <w:rPr>
+          <w:color w:val="4A4A4A"/>
+          <w:sz w:val="18"/>
+        </w:rPr>
+        <w:t>ONS | Notícias - Nenhum item encontrado na janela temporal.</w:t>
+      </w:r>
+    </w:p>
+    <w:p>
+      <w:pPr>
+        <w:pStyle w:val="ListBullet"/>
+      </w:pPr>
+      <w:r>
+        <w:rPr>
+          <w:color w:val="4A4A4A"/>
+          <w:sz w:val="18"/>
+        </w:rPr>
+        <w:t>ANEEL | Últimas Notícias - Todos os itens encontrados estão fora da janela temporal.</w:t>
+      </w:r>
+    </w:p>
+    <w:p>
+      <w:pPr>
+        <w:pStyle w:val="ListBullet"/>
+      </w:pPr>
+      <w:r>
+        <w:rPr>
+          <w:color w:val="4A4A4A"/>
+          <w:sz w:val="18"/>
+        </w:rPr>
+        <w:t>Secretaria de Prêmios e Apostas | Notícias - Nenhum resultado foi encontrado na janela temporal.</w:t>
+      </w:r>
+    </w:p>
+    <w:p>
+      <w:pPr>
+        <w:pStyle w:val="ListBullet"/>
+      </w:pPr>
+      <w:r>
+        <w:rPr>
+          <w:color w:val="4A4A4A"/>
+          <w:sz w:val="18"/>
+        </w:rPr>
+        <w:t>Ministério da Agricultura | Notícias - Todos os itens encontrados estão fora da janela temporal.</w:t>
+      </w:r>
+    </w:p>
+    <w:p>
+      <w:pPr>
+        <w:pStyle w:val="ListBullet"/>
+      </w:pPr>
+      <w:r>
+        <w:rPr>
+          <w:color w:val="4A4A4A"/>
+          <w:sz w:val="18"/>
+        </w:rPr>
+        <w:t>ANM | Notícias - Todos os itens encontrados estão fora da janela temporal.</w:t>
+      </w:r>
+    </w:p>
+    <w:p>
+      <w:pPr>
+        <w:pStyle w:val="ListBullet"/>
+      </w:pPr>
+      <w:r>
+        <w:rPr>
+          <w:color w:val="4A4A4A"/>
+          <w:sz w:val="18"/>
+        </w:rPr>
+        <w:t>EPE | Notícias - Todos os itens encontrados estão fora da janela temporal.</w:t>
       </w:r>
     </w:p>
     <w:p>
@@ -5440,7 +2899,7 @@
           <w:color w:val="4A4A4A"/>
           <w:sz w:val="18"/>
         </w:rPr>
-        <w:t>Receita Federal | Normas - Página de busca, sem conteúdo direto ou resultados identificáveis na janela.</w:t>
+        <w:t>Receita Federal | Normas - Conteúdo da fonte é um formulário de busca, não listagem de normas recentes.</w:t>
       </w:r>
     </w:p>
     <w:p>
@@ -5465,18 +2924,6 @@
           <w:sz w:val="18"/>
         </w:rPr>
         <w:t>Ministério do Meio Ambiente | Notícias - Conteúdo restrito, requer autenticação para visualização.</w:t>
-      </w:r>
-    </w:p>
-    <w:p>
-      <w:pPr>
-        <w:pStyle w:val="ListBullet"/>
-      </w:pPr>
-      <w:r>
-        <w:rPr>
-          <w:color w:val="4A4A4A"/>
-          <w:sz w:val="18"/>
-        </w:rPr>
-        <w:t>SENACON | Notícias - Conteúdo restrito, requer autenticação para visualização.</w:t>
       </w:r>
     </w:p>
     <w:p>
@@ -5546,7 +2993,7 @@
           <w:color w:val="888888"/>
           <w:sz w:val="16"/>
         </w:rPr>
-        <w:t>Janela analisada: 2026-07-03T00:00 ate 2026-07-06T11:28</w:t>
+        <w:t>Janela analisada: 2026-07-06T00:00 ate 2026-07-07T10:22</w:t>
       </w:r>
     </w:p>
     <w:sectPr>

</xml_diff>

<commit_message>
📰 Atualiza boletim - 2026-07-08
</commit_message>
<xml_diff>
--- a/output/boletim.docx
+++ b/output/boletim.docx
@@ -52,7 +52,7 @@
                 <w:color w:val="FFFFFF"/>
                 <w:sz w:val="28"/>
               </w:rPr>
-              <w:t>7 de julho de 2026</w:t>
+              <w:t>8 de julho de 2026</w:t>
             </w:r>
           </w:p>
         </w:tc>
@@ -87,7 +87,7 @@
                 <w:color w:val="1A4D2E"/>
                 <w:sz w:val="56"/>
               </w:rPr>
-              <w:t>24</w:t>
+              <w:t>38</w:t>
             </w:r>
           </w:p>
         </w:tc>
@@ -106,7 +106,7 @@
                 <w:color w:val="C0392B"/>
                 <w:sz w:val="56"/>
               </w:rPr>
-              <w:t>8</w:t>
+              <w:t>14</w:t>
             </w:r>
           </w:p>
         </w:tc>
@@ -125,7 +125,7 @@
                 <w:color w:val="D68910"/>
                 <w:sz w:val="56"/>
               </w:rPr>
-              <w:t>11</w:t>
+              <w:t>14</w:t>
             </w:r>
           </w:p>
         </w:tc>
@@ -144,7 +144,7 @@
                 <w:color w:val="7F8C8D"/>
                 <w:sz w:val="56"/>
               </w:rPr>
-              <w:t>5</w:t>
+              <w:t>10</w:t>
             </w:r>
           </w:p>
         </w:tc>
@@ -293,7 +293,7 @@
                 <w:color w:val="1A4D2E"/>
                 <w:sz w:val="16"/>
               </w:rPr>
-              <w:t>PLANALTO | RESENHA DIARIA</w:t>
+              <w:t>BANCO CENTRAL | NORMAS</w:t>
             </w:r>
           </w:p>
           <w:p>
@@ -307,7 +307,7 @@
                   <w:u w:val="single"/>
                   <w:b/>
                 </w:rPr>
-                <w:t>Decreto nº 13.056, de 6.7.2026 - Altera o Decreto nº 12.301, de 9 de dezembro de 2024, que dispõe sobre a aprovação de diretrizes e de estratégias relativas à governança corporativa nas empresas estatais federais e à administração das participações societárias da União.</w:t>
+                <w:t>Comunicado n° 45.517, 8/7/2026</w:t>
               </w:r>
             </w:hyperlink>
           </w:p>
@@ -320,7 +320,7 @@
                 <w:color w:val="4A4A4A"/>
                 <w:sz w:val="18"/>
               </w:rPr>
-              <w:t>Altera decreto sobre diretrizes e estratégias de governança corporativa e administração de participações societárias em empresas estatais federais.</w:t>
+              <w:t>Divulga a Taxa Básica Financeira (TBF), o Redutor "R" e a Taxa Referencial (TR) relativos a 7 de julho de 2026.</w:t>
             </w:r>
           </w:p>
         </w:tc>
@@ -365,65 +365,7 @@
                   <w:u w:val="single"/>
                   <w:b/>
                 </w:rPr>
-                <w:t>Comunicado n° 45.511, 7/7/2026</w:t>
-              </w:r>
-            </w:hyperlink>
-          </w:p>
-          <w:p>
-            <w:pPr>
-              <w:spacing w:after="120"/>
-            </w:pPr>
-            <w:r>
-              <w:rPr>
-                <w:color w:val="4A4A4A"/>
-                <w:sz w:val="18"/>
-              </w:rPr>
-              <w:t>Divulga as Taxas Básicas Financeiras (TBF), os Redutores "R" e as Taxas Referenciais (TR) relativos a 4, 5 e 6 de julho de 2026.</w:t>
-            </w:r>
-          </w:p>
-        </w:tc>
-      </w:tr>
-    </w:tbl>
-    <w:tbl>
-      <w:tblPr>
-        <w:tblW w:type="auto" w:w="0"/>
-        <w:tblLayout w:type="fixed"/>
-        <w:tblLook w:firstColumn="1" w:firstRow="1" w:lastColumn="0" w:lastRow="0" w:noHBand="0" w:noVBand="1" w:val="04A0"/>
-      </w:tblPr>
-      <w:tblGrid>
-        <w:gridCol w:w="9638"/>
-      </w:tblGrid>
-      <w:tr>
-        <w:tc>
-          <w:tcPr>
-            <w:tcW w:type="dxa" w:w="9638"/>
-            <w:shd w:val="clear" w:color="auto" w:fill="F0F7F2"/>
-          </w:tcPr>
-          <w:p>
-            <w:pPr>
-              <w:spacing w:before="120" w:after="40"/>
-            </w:pPr>
-            <w:r>
-              <w:rPr>
-                <w:b/>
-                <w:color w:val="1A4D2E"/>
-                <w:sz w:val="16"/>
-              </w:rPr>
-              <w:t>BANCO CENTRAL | NORMAS</w:t>
-            </w:r>
-          </w:p>
-          <w:p>
-            <w:pPr>
-              <w:spacing w:after="40"/>
-            </w:pPr>
-            <w:hyperlink r:id="rId11">
-              <w:r>
-                <w:rPr>
-                  <w:color w:val="1A1A1A"/>
-                  <w:u w:val="single"/>
-                  <w:b/>
-                </w:rPr>
-                <w:t>Comunicado n° 45.510, 6/7/2026</w:t>
+                <w:t>Comunicado n° 45.516, 7/7/2026</w:t>
               </w:r>
             </w:hyperlink>
           </w:p>
@@ -474,14 +416,14 @@
             <w:pPr>
               <w:spacing w:after="40"/>
             </w:pPr>
-            <w:hyperlink r:id="rId12">
+            <w:hyperlink r:id="rId11">
               <w:r>
                 <w:rPr>
                   <w:color w:val="1A1A1A"/>
                   <w:u w:val="single"/>
                   <w:b/>
                 </w:rPr>
-                <w:t>Comunicado n° 45.507, 6/7/2026</w:t>
+                <w:t>Comunicado n° 45.515, 7/7/2026</w:t>
               </w:r>
             </w:hyperlink>
           </w:p>
@@ -494,7 +436,7 @@
                 <w:color w:val="4A4A4A"/>
                 <w:sz w:val="18"/>
               </w:rPr>
-              <w:t>Divulga a Taxa Básica Financeira (TBF), o Redutor "R" e a Taxa Referencial (TR) relativos a 3 de julho de 2026.</w:t>
+              <w:t>Divulga as condições de oferta pública para a realização de operações de swap para fins de rolagem do vencimento de 03/08/2026.</w:t>
             </w:r>
           </w:p>
         </w:tc>
@@ -525,7 +467,65 @@
                 <w:color w:val="1A4D2E"/>
                 <w:sz w:val="16"/>
               </w:rPr>
-              <w:t>MINISTÉRIO DA FAZENDA | NOTÍCIAS</w:t>
+              <w:t>BANCO CENTRAL | NORMAS</w:t>
+            </w:r>
+          </w:p>
+          <w:p>
+            <w:pPr>
+              <w:spacing w:after="40"/>
+            </w:pPr>
+            <w:hyperlink r:id="rId12">
+              <w:r>
+                <w:rPr>
+                  <w:color w:val="1A1A1A"/>
+                  <w:u w:val="single"/>
+                  <w:b/>
+                </w:rPr>
+                <w:t>Comunicado n° 45.514, 7/7/2026</w:t>
+              </w:r>
+            </w:hyperlink>
+          </w:p>
+          <w:p>
+            <w:pPr>
+              <w:spacing w:after="120"/>
+            </w:pPr>
+            <w:r>
+              <w:rPr>
+                <w:color w:val="4A4A4A"/>
+                <w:sz w:val="18"/>
+              </w:rPr>
+              <w:t>Divulga comunicado do Grupo de Ação Financeira contra a Lavagem de Dinheiro e o Financiamento do Terrorismo (GAFI/FATF).</w:t>
+            </w:r>
+          </w:p>
+        </w:tc>
+      </w:tr>
+    </w:tbl>
+    <w:tbl>
+      <w:tblPr>
+        <w:tblW w:type="auto" w:w="0"/>
+        <w:tblLayout w:type="fixed"/>
+        <w:tblLook w:firstColumn="1" w:firstRow="1" w:lastColumn="0" w:lastRow="0" w:noHBand="0" w:noVBand="1" w:val="04A0"/>
+      </w:tblPr>
+      <w:tblGrid>
+        <w:gridCol w:w="9638"/>
+      </w:tblGrid>
+      <w:tr>
+        <w:tc>
+          <w:tcPr>
+            <w:tcW w:type="dxa" w:w="9638"/>
+            <w:shd w:val="clear" w:color="auto" w:fill="F0F7F2"/>
+          </w:tcPr>
+          <w:p>
+            <w:pPr>
+              <w:spacing w:before="120" w:after="40"/>
+            </w:pPr>
+            <w:r>
+              <w:rPr>
+                <w:b/>
+                <w:color w:val="1A4D2E"/>
+                <w:sz w:val="16"/>
+              </w:rPr>
+              <w:t>BANCO CENTRAL | NORMAS</w:t>
             </w:r>
           </w:p>
           <w:p>
@@ -539,7 +539,7 @@
                   <w:u w:val="single"/>
                   <w:b/>
                 </w:rPr>
-                <w:t>Polícia Federal apura esquema de lavagem de dinheiro ligado a apostas ilegais</w:t>
+                <w:t>Comunicado n° 45.511, 7/7/2026</w:t>
               </w:r>
             </w:hyperlink>
           </w:p>
@@ -552,7 +552,7 @@
                 <w:color w:val="4A4A4A"/>
                 <w:sz w:val="18"/>
               </w:rPr>
-              <w:t>Informações da Secretaria de Prêmios e Apostas (SPA) auxiliam investigação da Polícia Federal sobre lavagem de dinheiro em apostas ilegais.</w:t>
+              <w:t>Divulga as Taxas Básicas Financeiras (TBF), os Redutores "R" e as Taxas Referenciais (TR) relativos a 4, 5 e 6 de julho de 2026.</w:t>
             </w:r>
           </w:p>
         </w:tc>
@@ -621,15 +621,15 @@
           <w:color w:val="1A1A1A"/>
           <w:sz w:val="22"/>
         </w:rPr>
-        <w:t xml:space="preserve">Decreto nº 13.056, de 6.7.2026 - Altera o Decreto nº 12.301, de 9 de dezembro de 2024, que dispõe sobre a aprovação de diretrizes e de estratégias relativas à governança corporativa nas empresas estatais federais e à administração das participações societárias da União.   </w:t>
+        <w:t xml:space="preserve">Lei nº 15.461, de 7.7.2026 - Confere o título de Capital Nacional da Maior Onda do Brasil ao Município de Jaguaruna, no Estado de Santa Catarina.   </w:t>
       </w:r>
       <w:r>
         <w:rPr>
           <w:b/>
-          <w:color w:val="C0392B"/>
+          <w:color w:val="7F8C8D"/>
           <w:sz w:val="16"/>
         </w:rPr>
-        <w:t>[ALTA]</w:t>
+        <w:t>[BAIXA]</w:t>
       </w:r>
     </w:p>
     <w:p>
@@ -641,7 +641,7 @@
           <w:color w:val="4A4A4A"/>
           <w:sz w:val="20"/>
         </w:rPr>
-        <w:t>Altera decreto sobre diretrizes e estratégias de governança corporativa e administração de participações societárias em empresas estatais federais.</w:t>
+        <w:t>Confere o título de Capital Nacional da Maior Onda do Brasil ao Município de Jaguaruna, no Estado de Santa Catarina.</w:t>
       </w:r>
     </w:p>
     <w:p>
@@ -661,9 +661,9 @@
           <w:color w:val="888888"/>
           <w:sz w:val="18"/>
         </w:rPr>
-        <w:t xml:space="preserve">2026-07-06   </w:t>
+        <w:t xml:space="preserve">2026-07-08   </w:t>
       </w:r>
-      <w:hyperlink r:id="rId9">
+      <w:hyperlink r:id="rId14">
         <w:r>
           <w:rPr>
             <w:color w:val="1A4D2E"/>
@@ -684,7 +684,7 @@
           <w:color w:val="888888"/>
           <w:sz w:val="16"/>
         </w:rPr>
-        <w:t>Legislação nova com impacto direto em governança corporativa de estatais federais.</w:t>
+        <w:t>Lei com caráter honorífico, sem impacto direto a clientes corporativos.</w:t>
       </w:r>
     </w:p>
     <w:p>
@@ -697,15 +697,15 @@
           <w:color w:val="1A1A1A"/>
           <w:sz w:val="22"/>
         </w:rPr>
-        <w:t xml:space="preserve">Lei nº 15.458, de 3.7.2026 - Abre crédito extraordinário em favor do Ministério da Integração e do Desenvolvimento Regional, no valor de R$ 266.512.000,00 (duzentos e sessenta e seis milhões quinhentos e doze mil reais), para os fins que especifica.   </w:t>
+        <w:t xml:space="preserve">Lei nº 15.460, de 7.7.2026 - Institui o Dia Nacional do Vinho, a ser comemorado no primeiro domingo do mês de junho.   </w:t>
       </w:r>
       <w:r>
         <w:rPr>
           <w:b/>
-          <w:color w:val="D68910"/>
+          <w:color w:val="7F8C8D"/>
           <w:sz w:val="16"/>
         </w:rPr>
-        <w:t>[MÉDIA]</w:t>
+        <w:t>[BAIXA]</w:t>
       </w:r>
     </w:p>
     <w:p>
@@ -717,7 +717,7 @@
           <w:color w:val="4A4A4A"/>
           <w:sz w:val="20"/>
         </w:rPr>
-        <w:t>Abre crédito extraordinário de R$ 266,5 milhões para o Ministério da Integração e do Desenvolvimento Regional.</w:t>
+        <w:t>Institui o Dia Nacional do Vinho, a ser comemorado no primeiro domingo do mês de junho.</w:t>
       </w:r>
     </w:p>
     <w:p>
@@ -737,9 +737,9 @@
           <w:color w:val="888888"/>
           <w:sz w:val="18"/>
         </w:rPr>
-        <w:t xml:space="preserve">2026-07-06   </w:t>
+        <w:t xml:space="preserve">2026-07-08   </w:t>
       </w:r>
-      <w:hyperlink r:id="rId14">
+      <w:hyperlink r:id="rId15">
         <w:r>
           <w:rPr>
             <w:color w:val="1A4D2E"/>
@@ -760,7 +760,7 @@
           <w:color w:val="888888"/>
           <w:sz w:val="16"/>
         </w:rPr>
-        <w:t>Abertura de crédito extraordinário com impacto orçamentário.</w:t>
+        <w:t>Lei com caráter comemorativo, sem impacto direto a clientes corporativos.</w:t>
       </w:r>
     </w:p>
     <w:p>
@@ -773,7 +773,7 @@
           <w:color w:val="1A1A1A"/>
           <w:sz w:val="22"/>
         </w:rPr>
-        <w:t xml:space="preserve">Decreto nº 13.055, de 3.7.2026 - Altera o Decreto nº 11.712, de 20 de setembro de 2023, que qualifica organizações militares da Marinha como Organizações Militares Prestadoras de Serviços, com autonomia de gestão.   </w:t>
+        <w:t xml:space="preserve">Lei nº 15.459, de 7.7.2026 - Altera a Lei nº 7.405, de 12 de novembro de 1985, para estabelecer a utilização do Símbolo Internacional de Acessibilidade.   </w:t>
       </w:r>
       <w:r>
         <w:rPr>
@@ -793,7 +793,7 @@
           <w:color w:val="4A4A4A"/>
           <w:sz w:val="20"/>
         </w:rPr>
-        <w:t>Altera decreto que qualifica organizações militares da Marinha como prestadoras de serviços com autonomia de gestão.</w:t>
+        <w:t>Altera a Lei nº 7.405, de 1985, para estabelecer a utilização do Símbolo Internacional de Acessibilidade.</w:t>
       </w:r>
     </w:p>
     <w:p>
@@ -813,9 +813,9 @@
           <w:color w:val="888888"/>
           <w:sz w:val="18"/>
         </w:rPr>
-        <w:t xml:space="preserve">2026-07-06   </w:t>
+        <w:t xml:space="preserve">2026-07-08   </w:t>
       </w:r>
-      <w:hyperlink r:id="rId15">
+      <w:hyperlink r:id="rId16">
         <w:r>
           <w:rPr>
             <w:color w:val="1A4D2E"/>
@@ -836,7 +836,311 @@
           <w:color w:val="888888"/>
           <w:sz w:val="16"/>
         </w:rPr>
-        <w:t>Alteração de decreto administrativo com impacto na gestão de organizações militares.</w:t>
+        <w:t>Alteração de lei que pode ter implicações para empresas em termos de acessibilidade e conformidade.</w:t>
+      </w:r>
+    </w:p>
+    <w:p>
+      <w:pPr>
+        <w:spacing w:before="160" w:after="40"/>
+      </w:pPr>
+      <w:r>
+        <w:rPr>
+          <w:b/>
+          <w:color w:val="1A1A1A"/>
+          <w:sz w:val="22"/>
+        </w:rPr>
+        <w:t xml:space="preserve">Decreto nº 13.060, de 7.7.2026 - Altera o Decreto nº 10.172, de 11 de dezembro de 2019, para alterar a composição do Conselho Fiscal do Serviço Autônomo Embratur – Agência Brasileira de Promoção Internacional do Turismo.   </w:t>
+      </w:r>
+      <w:r>
+        <w:rPr>
+          <w:b/>
+          <w:color w:val="7F8C8D"/>
+          <w:sz w:val="16"/>
+        </w:rPr>
+        <w:t>[BAIXA]</w:t>
+      </w:r>
+    </w:p>
+    <w:p>
+      <w:pPr>
+        <w:spacing w:after="40"/>
+      </w:pPr>
+      <w:r>
+        <w:rPr>
+          <w:color w:val="4A4A4A"/>
+          <w:sz w:val="20"/>
+        </w:rPr>
+        <w:t>Altera a composição do Conselho Fiscal do Serviço Autônomo Embratur – Agência Brasileira de Promoção Internacional do Turismo.</w:t>
+      </w:r>
+    </w:p>
+    <w:p>
+      <w:pPr>
+        <w:spacing w:after="40"/>
+      </w:pPr>
+      <w:r>
+        <w:rPr>
+          <w:b/>
+          <w:color w:val="888888"/>
+          <w:sz w:val="18"/>
+        </w:rPr>
+        <w:t xml:space="preserve">Publicado: </w:t>
+      </w:r>
+      <w:r>
+        <w:rPr>
+          <w:color w:val="888888"/>
+          <w:sz w:val="18"/>
+        </w:rPr>
+        <w:t xml:space="preserve">2026-07-08   </w:t>
+      </w:r>
+      <w:hyperlink r:id="rId17">
+        <w:r>
+          <w:rPr>
+            <w:color w:val="1A4D2E"/>
+            <w:u w:val="single"/>
+            <w:b/>
+          </w:rPr>
+          <w:t>Acessar materia</w:t>
+        </w:r>
+      </w:hyperlink>
+    </w:p>
+    <w:p>
+      <w:pPr>
+        <w:spacing w:after="120"/>
+      </w:pPr>
+      <w:r>
+        <w:rPr>
+          <w:i/>
+          <w:color w:val="888888"/>
+          <w:sz w:val="16"/>
+        </w:rPr>
+        <w:t>Alteração administrativa interna de órgão público, com baixo impacto corporativo direto.</w:t>
+      </w:r>
+    </w:p>
+    <w:p>
+      <w:pPr>
+        <w:spacing w:before="160" w:after="40"/>
+      </w:pPr>
+      <w:r>
+        <w:rPr>
+          <w:b/>
+          <w:color w:val="1A1A1A"/>
+          <w:sz w:val="22"/>
+        </w:rPr>
+        <w:t xml:space="preserve">Decreto nº 13.059, de 7.7.2026 - Remaneja, em caráter temporário, cargo em comissão e funções de confiança para o Ministério das Relações Exteriores.   </w:t>
+      </w:r>
+      <w:r>
+        <w:rPr>
+          <w:b/>
+          <w:color w:val="7F8C8D"/>
+          <w:sz w:val="16"/>
+        </w:rPr>
+        <w:t>[BAIXA]</w:t>
+      </w:r>
+    </w:p>
+    <w:p>
+      <w:pPr>
+        <w:spacing w:after="40"/>
+      </w:pPr>
+      <w:r>
+        <w:rPr>
+          <w:color w:val="4A4A4A"/>
+          <w:sz w:val="20"/>
+        </w:rPr>
+        <w:t>Remaneja, em caráter temporário, cargo em comissão e funções de confiança para o Ministério das Relações Exteriores.</w:t>
+      </w:r>
+    </w:p>
+    <w:p>
+      <w:pPr>
+        <w:spacing w:after="40"/>
+      </w:pPr>
+      <w:r>
+        <w:rPr>
+          <w:b/>
+          <w:color w:val="888888"/>
+          <w:sz w:val="18"/>
+        </w:rPr>
+        <w:t xml:space="preserve">Publicado: </w:t>
+      </w:r>
+      <w:r>
+        <w:rPr>
+          <w:color w:val="888888"/>
+          <w:sz w:val="18"/>
+        </w:rPr>
+        <w:t xml:space="preserve">2026-07-08   </w:t>
+      </w:r>
+      <w:hyperlink r:id="rId18">
+        <w:r>
+          <w:rPr>
+            <w:color w:val="1A4D2E"/>
+            <w:u w:val="single"/>
+            <w:b/>
+          </w:rPr>
+          <w:t>Acessar materia</w:t>
+        </w:r>
+      </w:hyperlink>
+    </w:p>
+    <w:p>
+      <w:pPr>
+        <w:spacing w:after="120"/>
+      </w:pPr>
+      <w:r>
+        <w:rPr>
+          <w:i/>
+          <w:color w:val="888888"/>
+          <w:sz w:val="16"/>
+        </w:rPr>
+        <w:t>Alteração administrativa interna de órgão público, com baixo impacto corporativo direto.</w:t>
+      </w:r>
+    </w:p>
+    <w:p>
+      <w:pPr>
+        <w:spacing w:before="160" w:after="40"/>
+      </w:pPr>
+      <w:r>
+        <w:rPr>
+          <w:b/>
+          <w:color w:val="1A1A1A"/>
+          <w:sz w:val="22"/>
+        </w:rPr>
+        <w:t xml:space="preserve">Decreto nº 13.058, de 7.7.2026 - Altera o Decreto nº 11.198, de 15 de setembro de 2022, que aprova a Estrutura Regimental e o Quadro Demonstrativo dos Cargos em Comissão e das Funções de Confiança do Departamento Nacional de Obras Contra as Secas, e remaneja e transforma cargos em comissão e funções de confiança.   </w:t>
+      </w:r>
+      <w:r>
+        <w:rPr>
+          <w:b/>
+          <w:color w:val="7F8C8D"/>
+          <w:sz w:val="16"/>
+        </w:rPr>
+        <w:t>[BAIXA]</w:t>
+      </w:r>
+    </w:p>
+    <w:p>
+      <w:pPr>
+        <w:spacing w:after="40"/>
+      </w:pPr>
+      <w:r>
+        <w:rPr>
+          <w:color w:val="4A4A4A"/>
+          <w:sz w:val="20"/>
+        </w:rPr>
+        <w:t>Altera a Estrutura Regimental e o Quadro Demonstrativo de Cargos e Funções do Departamento Nacional de Obras Contra as Secas (DNOCS).</w:t>
+      </w:r>
+    </w:p>
+    <w:p>
+      <w:pPr>
+        <w:spacing w:after="40"/>
+      </w:pPr>
+      <w:r>
+        <w:rPr>
+          <w:b/>
+          <w:color w:val="888888"/>
+          <w:sz w:val="18"/>
+        </w:rPr>
+        <w:t xml:space="preserve">Publicado: </w:t>
+      </w:r>
+      <w:r>
+        <w:rPr>
+          <w:color w:val="888888"/>
+          <w:sz w:val="18"/>
+        </w:rPr>
+        <w:t xml:space="preserve">2026-07-08   </w:t>
+      </w:r>
+      <w:hyperlink r:id="rId19">
+        <w:r>
+          <w:rPr>
+            <w:color w:val="1A4D2E"/>
+            <w:u w:val="single"/>
+            <w:b/>
+          </w:rPr>
+          <w:t>Acessar materia</w:t>
+        </w:r>
+      </w:hyperlink>
+    </w:p>
+    <w:p>
+      <w:pPr>
+        <w:spacing w:after="120"/>
+      </w:pPr>
+      <w:r>
+        <w:rPr>
+          <w:i/>
+          <w:color w:val="888888"/>
+          <w:sz w:val="16"/>
+        </w:rPr>
+        <w:t>Alteração administrativa interna de órgão público, com baixo impacto corporativo direto.</w:t>
+      </w:r>
+    </w:p>
+    <w:p>
+      <w:pPr>
+        <w:spacing w:before="160" w:after="40"/>
+      </w:pPr>
+      <w:r>
+        <w:rPr>
+          <w:b/>
+          <w:color w:val="1A1A1A"/>
+          <w:sz w:val="22"/>
+        </w:rPr>
+        <w:t xml:space="preserve">Decreto nº 13.057, de 7.7.2026 - Altera o Decreto nº 2.338, de 7 de outubro de 1997, que aprova o Regulamento da Agência Nacional de Telecomunicações, e remaneja e transforma cargos em comissão e funções de confiança.   </w:t>
+      </w:r>
+      <w:r>
+        <w:rPr>
+          <w:b/>
+          <w:color w:val="D68910"/>
+          <w:sz w:val="16"/>
+        </w:rPr>
+        <w:t>[MÉDIA]</w:t>
+      </w:r>
+    </w:p>
+    <w:p>
+      <w:pPr>
+        <w:spacing w:after="40"/>
+      </w:pPr>
+      <w:r>
+        <w:rPr>
+          <w:color w:val="4A4A4A"/>
+          <w:sz w:val="20"/>
+        </w:rPr>
+        <w:t>Altera o Regulamento da Agência Nacional de Telecomunicações (ANATEL) e remaneja cargos e funções de confiança.</w:t>
+      </w:r>
+    </w:p>
+    <w:p>
+      <w:pPr>
+        <w:spacing w:after="40"/>
+      </w:pPr>
+      <w:r>
+        <w:rPr>
+          <w:b/>
+          <w:color w:val="888888"/>
+          <w:sz w:val="18"/>
+        </w:rPr>
+        <w:t xml:space="preserve">Publicado: </w:t>
+      </w:r>
+      <w:r>
+        <w:rPr>
+          <w:color w:val="888888"/>
+          <w:sz w:val="18"/>
+        </w:rPr>
+        <w:t xml:space="preserve">2026-07-08   </w:t>
+      </w:r>
+      <w:hyperlink r:id="rId20">
+        <w:r>
+          <w:rPr>
+            <w:color w:val="1A4D2E"/>
+            <w:u w:val="single"/>
+            <w:b/>
+          </w:rPr>
+          <w:t>Acessar materia</w:t>
+        </w:r>
+      </w:hyperlink>
+    </w:p>
+    <w:p>
+      <w:pPr>
+        <w:spacing w:after="120"/>
+      </w:pPr>
+      <w:r>
+        <w:rPr>
+          <w:i/>
+          <w:color w:val="888888"/>
+          <w:sz w:val="16"/>
+        </w:rPr>
+        <w:t>Alteração no regulamento de uma agência reguladora, podendo ter impacto setorial.</w:t>
       </w:r>
     </w:p>
     <w:p/>
@@ -902,6 +1206,310 @@
           <w:color w:val="1A1A1A"/>
           <w:sz w:val="22"/>
         </w:rPr>
+        <w:t xml:space="preserve">Comunicado n° 45.517, 8/7/2026   </w:t>
+      </w:r>
+      <w:r>
+        <w:rPr>
+          <w:b/>
+          <w:color w:val="C0392B"/>
+          <w:sz w:val="16"/>
+        </w:rPr>
+        <w:t>[ALTA]</w:t>
+      </w:r>
+    </w:p>
+    <w:p>
+      <w:pPr>
+        <w:spacing w:after="40"/>
+      </w:pPr>
+      <w:r>
+        <w:rPr>
+          <w:color w:val="4A4A4A"/>
+          <w:sz w:val="20"/>
+        </w:rPr>
+        <w:t>Divulga a Taxa Básica Financeira (TBF), o Redutor "R" e a Taxa Referencial (TR) relativos a 7 de julho de 2026.</w:t>
+      </w:r>
+    </w:p>
+    <w:p>
+      <w:pPr>
+        <w:spacing w:after="40"/>
+      </w:pPr>
+      <w:r>
+        <w:rPr>
+          <w:b/>
+          <w:color w:val="888888"/>
+          <w:sz w:val="18"/>
+        </w:rPr>
+        <w:t xml:space="preserve">Publicado: </w:t>
+      </w:r>
+      <w:r>
+        <w:rPr>
+          <w:color w:val="888888"/>
+          <w:sz w:val="18"/>
+        </w:rPr>
+        <w:t xml:space="preserve">2026-07-08T09:01   </w:t>
+      </w:r>
+      <w:hyperlink r:id="rId9">
+        <w:r>
+          <w:rPr>
+            <w:color w:val="1A4D2E"/>
+            <w:u w:val="single"/>
+            <w:b/>
+          </w:rPr>
+          <w:t>Acessar materia</w:t>
+        </w:r>
+      </w:hyperlink>
+    </w:p>
+    <w:p>
+      <w:pPr>
+        <w:spacing w:after="120"/>
+      </w:pPr>
+      <w:r>
+        <w:rPr>
+          <w:i/>
+          <w:color w:val="888888"/>
+          <w:sz w:val="16"/>
+        </w:rPr>
+        <w:t>Divulgação de taxas financeiras de referência, crucial para o mercado financeiro.</w:t>
+      </w:r>
+    </w:p>
+    <w:p>
+      <w:pPr>
+        <w:spacing w:before="160" w:after="40"/>
+      </w:pPr>
+      <w:r>
+        <w:rPr>
+          <w:b/>
+          <w:color w:val="1A1A1A"/>
+          <w:sz w:val="22"/>
+        </w:rPr>
+        <w:t xml:space="preserve">Comunicado n° 45.516, 7/7/2026   </w:t>
+      </w:r>
+      <w:r>
+        <w:rPr>
+          <w:b/>
+          <w:color w:val="C0392B"/>
+          <w:sz w:val="16"/>
+        </w:rPr>
+        <w:t>[ALTA]</w:t>
+      </w:r>
+    </w:p>
+    <w:p>
+      <w:pPr>
+        <w:spacing w:after="40"/>
+      </w:pPr>
+      <w:r>
+        <w:rPr>
+          <w:color w:val="4A4A4A"/>
+          <w:sz w:val="20"/>
+        </w:rPr>
+        <w:t>Divulga condições para a realização de operações compromissadas com instituições financeiras participantes do módulo Oferta Pública (Ofpub).</w:t>
+      </w:r>
+    </w:p>
+    <w:p>
+      <w:pPr>
+        <w:spacing w:after="40"/>
+      </w:pPr>
+      <w:r>
+        <w:rPr>
+          <w:b/>
+          <w:color w:val="888888"/>
+          <w:sz w:val="18"/>
+        </w:rPr>
+        <w:t xml:space="preserve">Publicado: </w:t>
+      </w:r>
+      <w:r>
+        <w:rPr>
+          <w:color w:val="888888"/>
+          <w:sz w:val="18"/>
+        </w:rPr>
+        <w:t xml:space="preserve">2026-07-07T18:30   </w:t>
+      </w:r>
+      <w:hyperlink r:id="rId10">
+        <w:r>
+          <w:rPr>
+            <w:color w:val="1A4D2E"/>
+            <w:u w:val="single"/>
+            <w:b/>
+          </w:rPr>
+          <w:t>Acessar materia</w:t>
+        </w:r>
+      </w:hyperlink>
+    </w:p>
+    <w:p>
+      <w:pPr>
+        <w:spacing w:after="120"/>
+      </w:pPr>
+      <w:r>
+        <w:rPr>
+          <w:i/>
+          <w:color w:val="888888"/>
+          <w:sz w:val="16"/>
+        </w:rPr>
+        <w:t>Impacto direto em operações de instituições financeiras no mercado.</w:t>
+      </w:r>
+    </w:p>
+    <w:p>
+      <w:pPr>
+        <w:spacing w:before="160" w:after="40"/>
+      </w:pPr>
+      <w:r>
+        <w:rPr>
+          <w:b/>
+          <w:color w:val="1A1A1A"/>
+          <w:sz w:val="22"/>
+        </w:rPr>
+        <w:t xml:space="preserve">Comunicado n° 45.515, 7/7/2026   </w:t>
+      </w:r>
+      <w:r>
+        <w:rPr>
+          <w:b/>
+          <w:color w:val="C0392B"/>
+          <w:sz w:val="16"/>
+        </w:rPr>
+        <w:t>[ALTA]</w:t>
+      </w:r>
+    </w:p>
+    <w:p>
+      <w:pPr>
+        <w:spacing w:after="40"/>
+      </w:pPr>
+      <w:r>
+        <w:rPr>
+          <w:color w:val="4A4A4A"/>
+          <w:sz w:val="20"/>
+        </w:rPr>
+        <w:t>Divulga as condições de oferta pública para a realização de operações de swap para fins de rolagem do vencimento de 03/08/2026.</w:t>
+      </w:r>
+    </w:p>
+    <w:p>
+      <w:pPr>
+        <w:spacing w:after="40"/>
+      </w:pPr>
+      <w:r>
+        <w:rPr>
+          <w:b/>
+          <w:color w:val="888888"/>
+          <w:sz w:val="18"/>
+        </w:rPr>
+        <w:t xml:space="preserve">Publicado: </w:t>
+      </w:r>
+      <w:r>
+        <w:rPr>
+          <w:color w:val="888888"/>
+          <w:sz w:val="18"/>
+        </w:rPr>
+        <w:t xml:space="preserve">2026-07-07T18:30   </w:t>
+      </w:r>
+      <w:hyperlink r:id="rId11">
+        <w:r>
+          <w:rPr>
+            <w:color w:val="1A4D2E"/>
+            <w:u w:val="single"/>
+            <w:b/>
+          </w:rPr>
+          <w:t>Acessar materia</w:t>
+        </w:r>
+      </w:hyperlink>
+    </w:p>
+    <w:p>
+      <w:pPr>
+        <w:spacing w:after="120"/>
+      </w:pPr>
+      <w:r>
+        <w:rPr>
+          <w:i/>
+          <w:color w:val="888888"/>
+          <w:sz w:val="16"/>
+        </w:rPr>
+        <w:t>Impacto direto em operações de mercado financeiro, como swaps.</w:t>
+      </w:r>
+    </w:p>
+    <w:p>
+      <w:pPr>
+        <w:spacing w:before="160" w:after="40"/>
+      </w:pPr>
+      <w:r>
+        <w:rPr>
+          <w:b/>
+          <w:color w:val="1A1A1A"/>
+          <w:sz w:val="22"/>
+        </w:rPr>
+        <w:t xml:space="preserve">Comunicado n° 45.514, 7/7/2026   </w:t>
+      </w:r>
+      <w:r>
+        <w:rPr>
+          <w:b/>
+          <w:color w:val="C0392B"/>
+          <w:sz w:val="16"/>
+        </w:rPr>
+        <w:t>[ALTA]</w:t>
+      </w:r>
+    </w:p>
+    <w:p>
+      <w:pPr>
+        <w:spacing w:after="40"/>
+      </w:pPr>
+      <w:r>
+        <w:rPr>
+          <w:color w:val="4A4A4A"/>
+          <w:sz w:val="20"/>
+        </w:rPr>
+        <w:t>Divulga comunicado do Grupo de Ação Financeira contra a Lavagem de Dinheiro e o Financiamento do Terrorismo (GAFI/FATF).</w:t>
+      </w:r>
+    </w:p>
+    <w:p>
+      <w:pPr>
+        <w:spacing w:after="40"/>
+      </w:pPr>
+      <w:r>
+        <w:rPr>
+          <w:b/>
+          <w:color w:val="888888"/>
+          <w:sz w:val="18"/>
+        </w:rPr>
+        <w:t xml:space="preserve">Publicado: </w:t>
+      </w:r>
+      <w:r>
+        <w:rPr>
+          <w:color w:val="888888"/>
+          <w:sz w:val="18"/>
+        </w:rPr>
+        <w:t xml:space="preserve">2026-07-07T15:28   </w:t>
+      </w:r>
+      <w:hyperlink r:id="rId12">
+        <w:r>
+          <w:rPr>
+            <w:color w:val="1A4D2E"/>
+            <w:u w:val="single"/>
+            <w:b/>
+          </w:rPr>
+          <w:t>Acessar materia</w:t>
+        </w:r>
+      </w:hyperlink>
+    </w:p>
+    <w:p>
+      <w:pPr>
+        <w:spacing w:after="120"/>
+      </w:pPr>
+      <w:r>
+        <w:rPr>
+          <w:i/>
+          <w:color w:val="888888"/>
+          <w:sz w:val="16"/>
+        </w:rPr>
+        <w:t>Norma regulatória internacional com impacto em compliance de instituições financeiras.</w:t>
+      </w:r>
+    </w:p>
+    <w:p>
+      <w:pPr>
+        <w:spacing w:before="160" w:after="40"/>
+      </w:pPr>
+      <w:r>
+        <w:rPr>
+          <w:b/>
+          <w:color w:val="1A1A1A"/>
+          <w:sz w:val="22"/>
+        </w:rPr>
         <w:t xml:space="preserve">Comunicado n° 45.513, 7/7/2026   </w:t>
       </w:r>
       <w:r>
@@ -922,7 +1530,7 @@
           <w:color w:val="4A4A4A"/>
           <w:sz w:val="20"/>
         </w:rPr>
-        <w:t>Divulga nomes de pessoas eleitas ou nomeadas para cargos de administração em instituições autorizadas a funcionar, para recebimento de objeções.</w:t>
+        <w:t>Divulga nomes de pessoas eleitas ou nomeadas para cargos de administração em instituições autorizadas a funcionar, para fins de objeções.</w:t>
       </w:r>
     </w:p>
     <w:p>
@@ -944,7 +1552,7 @@
         </w:rPr>
         <w:t xml:space="preserve">2026-07-07T09:32   </w:t>
       </w:r>
-      <w:hyperlink r:id="rId16">
+      <w:hyperlink r:id="rId21">
         <w:r>
           <w:rPr>
             <w:color w:val="1A4D2E"/>
@@ -965,7 +1573,7 @@
           <w:color w:val="888888"/>
           <w:sz w:val="16"/>
         </w:rPr>
-        <w:t>Comunicado administrativo sobre nomeações em instituições financeiras.</w:t>
+        <w:t>Atualização administrativa relevante para o setor financeiro.</w:t>
       </w:r>
     </w:p>
     <w:p>
@@ -998,7 +1606,7 @@
           <w:color w:val="4A4A4A"/>
           <w:sz w:val="20"/>
         </w:rPr>
-        <w:t>Divulga nomes aprovados para cargos em órgãos estatutários ou contratuais de sociedades autorizadas a funcionar pelo Banco Central do Brasil.</w:t>
+        <w:t>Divulga nome aprovado de pessoas eleitas/nomeadas para cargos de órgãos estatutários ou contratuais de sociedades autorizadas a funcionar pelo Banco Central.</w:t>
       </w:r>
     </w:p>
     <w:p>
@@ -1020,7 +1628,7 @@
         </w:rPr>
         <w:t xml:space="preserve">2026-07-07T09:30   </w:t>
       </w:r>
-      <w:hyperlink r:id="rId17">
+      <w:hyperlink r:id="rId22">
         <w:r>
           <w:rPr>
             <w:color w:val="1A4D2E"/>
@@ -1041,7 +1649,7 @@
           <w:color w:val="888888"/>
           <w:sz w:val="16"/>
         </w:rPr>
-        <w:t>Comunicado administrativo sobre aprovação de nomes em instituições financeiras.</w:t>
+        <w:t>Atualização administrativa relevante para o setor financeiro.</w:t>
       </w:r>
     </w:p>
     <w:p>
@@ -1096,7 +1704,7 @@
         </w:rPr>
         <w:t xml:space="preserve">2026-07-07T09:06   </w:t>
       </w:r>
-      <w:hyperlink r:id="rId10">
+      <w:hyperlink r:id="rId13">
         <w:r>
           <w:rPr>
             <w:color w:val="1A4D2E"/>
@@ -1117,8 +1725,29 @@
           <w:color w:val="888888"/>
           <w:sz w:val="16"/>
         </w:rPr>
-        <w:t>Divulgação de taxas financeiras de referência com impacto no mercado.</w:t>
+        <w:t>Divulgação de taxas financeiras de referência, crucial para o mercado financeiro.</w:t>
       </w:r>
+    </w:p>
+    <w:p>
+      <w:pPr>
+        <w:spacing w:before="240" w:after="80"/>
+      </w:pPr>
+      <w:r>
+        <w:rPr>
+          <w:b/>
+          <w:color w:val="1A4D2E"/>
+          <w:sz w:val="20"/>
+        </w:rPr>
+        <w:t>CVM | NOTÍCIAS</w:t>
+      </w:r>
+    </w:p>
+    <w:p>
+      <w:pPr>
+        <w:spacing w:before="0" w:after="40"/>
+        <w:pBdr>
+          <w:bottom w:val="single" w:sz="8" w:space="1" w:color="1A4D2E"/>
+        </w:pBdr>
+      </w:pPr>
     </w:p>
     <w:p>
       <w:pPr>
@@ -1130,15 +1759,15 @@
           <w:color w:val="1A1A1A"/>
           <w:sz w:val="22"/>
         </w:rPr>
-        <w:t xml:space="preserve">Comunicado n° 45.510, 6/7/2026   </w:t>
+        <w:t xml:space="preserve">Até 14/7, participe da pesquisa do TCU sobre Termo de Compromisso   </w:t>
       </w:r>
       <w:r>
         <w:rPr>
           <w:b/>
-          <w:color w:val="C0392B"/>
+          <w:color w:val="D68910"/>
           <w:sz w:val="16"/>
         </w:rPr>
-        <w:t>[ALTA]</w:t>
+        <w:t>[MÉDIA]</w:t>
       </w:r>
     </w:p>
     <w:p>
@@ -1150,7 +1779,7 @@
           <w:color w:val="4A4A4A"/>
           <w:sz w:val="20"/>
         </w:rPr>
-        <w:t>Divulga condições para a realização de operações compromissadas com instituições financeiras participantes do módulo Oferta Pública (Ofpub).</w:t>
+        <w:t>Consulta pública do TCU sobre Termo de Compromisso no âmbito de auditoria operacional sobre a governança da CVM.</w:t>
       </w:r>
     </w:p>
     <w:p>
@@ -1170,9 +1799,9 @@
           <w:color w:val="888888"/>
           <w:sz w:val="18"/>
         </w:rPr>
-        <w:t xml:space="preserve">2026-07-06T18:30   </w:t>
+        <w:t xml:space="preserve">2026-07-07   </w:t>
       </w:r>
-      <w:hyperlink r:id="rId11">
+      <w:hyperlink r:id="rId23">
         <w:r>
           <w:rPr>
             <w:color w:val="1A4D2E"/>
@@ -1193,7 +1822,7 @@
           <w:color w:val="888888"/>
           <w:sz w:val="16"/>
         </w:rPr>
-        <w:t>Normativa sobre operações financeiras no mercado, impactando instituições financeiras.</w:t>
+        <w:t>Pesquisa sobre governança de órgão regulador, podendo influenciar futuras práticas.</w:t>
       </w:r>
     </w:p>
     <w:p>
@@ -1206,15 +1835,15 @@
           <w:color w:val="1A1A1A"/>
           <w:sz w:val="22"/>
         </w:rPr>
-        <w:t xml:space="preserve">Comunicado n° 45.509, 6/7/2026   </w:t>
+        <w:t xml:space="preserve">Colegiado da CVM aprova acordo de cooperação com ANBIMA   </w:t>
       </w:r>
       <w:r>
         <w:rPr>
           <w:b/>
-          <w:color w:val="D68910"/>
+          <w:color w:val="C0392B"/>
           <w:sz w:val="16"/>
         </w:rPr>
-        <w:t>[MÉDIA]</w:t>
+        <w:t>[ALTA]</w:t>
       </w:r>
     </w:p>
     <w:p>
@@ -1226,7 +1855,7 @@
           <w:color w:val="4A4A4A"/>
           <w:sz w:val="20"/>
         </w:rPr>
-        <w:t>Divulga nomes de pessoas eleitas ou nomeadas para cargos de administração em instituições autorizadas a funcionar, para recebimento de objeções.</w:t>
+        <w:t>CVM e ANBIMA aprovam parceria para manutenção evolutiva do sistema de registro de ofertas públicas.</w:t>
       </w:r>
     </w:p>
     <w:p>
@@ -1246,9 +1875,9 @@
           <w:color w:val="888888"/>
           <w:sz w:val="18"/>
         </w:rPr>
-        <w:t xml:space="preserve">2026-07-06T10:07   </w:t>
+        <w:t xml:space="preserve">2026-07-07   </w:t>
       </w:r>
-      <w:hyperlink r:id="rId18">
+      <w:hyperlink r:id="rId24">
         <w:r>
           <w:rPr>
             <w:color w:val="1A4D2E"/>
@@ -1269,8 +1898,29 @@
           <w:color w:val="888888"/>
           <w:sz w:val="16"/>
         </w:rPr>
-        <w:t>Comunicado administrativo sobre nomeações em instituições financeiras.</w:t>
+        <w:t>Acordo entre órgãos reguladores que afeta diretamente o funcionamento e a eficiência do mercado de capitais.</w:t>
       </w:r>
+    </w:p>
+    <w:p>
+      <w:pPr>
+        <w:spacing w:before="240" w:after="80"/>
+      </w:pPr>
+      <w:r>
+        <w:rPr>
+          <w:b/>
+          <w:color w:val="1A4D2E"/>
+          <w:sz w:val="20"/>
+        </w:rPr>
+        <w:t>B3 | OFÍCIOS E COMUNICADOS</w:t>
+      </w:r>
+    </w:p>
+    <w:p>
+      <w:pPr>
+        <w:spacing w:before="0" w:after="40"/>
+        <w:pBdr>
+          <w:bottom w:val="single" w:sz="8" w:space="1" w:color="1A4D2E"/>
+        </w:pBdr>
+      </w:pPr>
     </w:p>
     <w:p>
       <w:pPr>
@@ -1282,15 +1932,15 @@
           <w:color w:val="1A1A1A"/>
           <w:sz w:val="22"/>
         </w:rPr>
-        <w:t xml:space="preserve">Comunicado n° 45.508, 6/7/2026   </w:t>
+        <w:t xml:space="preserve">042-2026-VNC-Ofício Circular - Postergação do aprimoramento da funcionalidade de sincronização dos leilões de pré-abertura, regulares e de fechamento dos Contratos Futuros de Dólar (DOL/WDO), Futuros de Ibovespa (IND/WIN) e Futuros de S&amp;P 500 (ISP/WSP)   </w:t>
       </w:r>
       <w:r>
         <w:rPr>
           <w:b/>
-          <w:color w:val="D68910"/>
+          <w:color w:val="C0392B"/>
           <w:sz w:val="16"/>
         </w:rPr>
-        <w:t>[MÉDIA]</w:t>
+        <w:t>[ALTA]</w:t>
       </w:r>
     </w:p>
     <w:p>
@@ -1302,7 +1952,7 @@
           <w:color w:val="4A4A4A"/>
           <w:sz w:val="20"/>
         </w:rPr>
-        <w:t>Divulga nomes aprovados de pessoas eleitas/nomeadas para cargos de órgãos estatutários ou contratuais de sociedades autorizadas a funcionar pelo Banco Central do Brasil.</w:t>
+        <w:t>Postergação do aprimoramento da funcionalidade de sincronização dos leilões de contratos futuros de Dólar, Ibovespa e S&amp;P 500 na B3.</w:t>
       </w:r>
     </w:p>
     <w:p>
@@ -1322,9 +1972,9 @@
           <w:color w:val="888888"/>
           <w:sz w:val="18"/>
         </w:rPr>
-        <w:t xml:space="preserve">2026-07-06T10:06   </w:t>
+        <w:t xml:space="preserve">2026-07-07   </w:t>
       </w:r>
-      <w:hyperlink r:id="rId19">
+      <w:hyperlink r:id="rId25">
         <w:r>
           <w:rPr>
             <w:color w:val="1A4D2E"/>
@@ -1345,7 +1995,7 @@
           <w:color w:val="888888"/>
           <w:sz w:val="16"/>
         </w:rPr>
-        <w:t>Comunicado administrativo sobre aprovação de nomes em instituições financeiras.</w:t>
+        <w:t>Impacto operacional direto para participantes do mercado financeiro, afetando negociações de contratos futuros.</w:t>
       </w:r>
     </w:p>
     <w:p>
@@ -1358,7 +2008,7 @@
           <w:color w:val="1A1A1A"/>
           <w:sz w:val="22"/>
         </w:rPr>
-        <w:t xml:space="preserve">Comunicado n° 45.507, 6/7/2026   </w:t>
+        <w:t xml:space="preserve">036-2026-VPC-Ofício Circular - Soluções de Grandes Lotes - Inclusão de Fundos de Investimentos em Índices (ETFs) de renda variável   </w:t>
       </w:r>
       <w:r>
         <w:rPr>
@@ -1378,7 +2028,7 @@
           <w:color w:val="4A4A4A"/>
           <w:sz w:val="20"/>
         </w:rPr>
-        <w:t>Divulga a Taxa Básica Financeira (TBF), o Redutor "R" e a Taxa Referencial (TR) relativos a 3 de julho de 2026.</w:t>
+        <w:t>A partir de 27/07/2026, será permitida a negociação de ETFs de renda variável nas Soluções de Grandes Lotes da B3.</w:t>
       </w:r>
     </w:p>
     <w:p>
@@ -1398,9 +2048,9 @@
           <w:color w:val="888888"/>
           <w:sz w:val="18"/>
         </w:rPr>
-        <w:t xml:space="preserve">2026-07-06T09:01   </w:t>
+        <w:t xml:space="preserve">2026-07-07   </w:t>
       </w:r>
-      <w:hyperlink r:id="rId12">
+      <w:hyperlink r:id="rId26">
         <w:r>
           <w:rPr>
             <w:color w:val="1A4D2E"/>
@@ -1421,29 +2071,8 @@
           <w:color w:val="888888"/>
           <w:sz w:val="16"/>
         </w:rPr>
-        <w:t>Divulgação de taxas financeiras de referência com impacto no mercado.</w:t>
+        <w:t>Expansão de produtos e funcionalidades no mercado de capitais, relevante para investidores e gestores de fundos.</w:t>
       </w:r>
-    </w:p>
-    <w:p>
-      <w:pPr>
-        <w:spacing w:before="240" w:after="80"/>
-      </w:pPr>
-      <w:r>
-        <w:rPr>
-          <w:b/>
-          <w:color w:val="1A4D2E"/>
-          <w:sz w:val="20"/>
-        </w:rPr>
-        <w:t>CVM | NOTÍCIAS</w:t>
-      </w:r>
-    </w:p>
-    <w:p>
-      <w:pPr>
-        <w:spacing w:before="0" w:after="40"/>
-        <w:pBdr>
-          <w:bottom w:val="single" w:sz="8" w:space="1" w:color="1A4D2E"/>
-        </w:pBdr>
-      </w:pPr>
     </w:p>
     <w:p>
       <w:pPr>
@@ -1455,7 +2084,7 @@
           <w:color w:val="1A1A1A"/>
           <w:sz w:val="22"/>
         </w:rPr>
-        <w:t xml:space="preserve">Colegiado da CVM aceita proposta de Termo de Compromisso com Pátria Investimentos Ltda. e seu diretor no valor de R$ 1.890.000,00   </w:t>
+        <w:t xml:space="preserve">035-2026-VPC-Ofício Circular - Lançamento do Índice B3 Bancos   </w:t>
       </w:r>
       <w:r>
         <w:rPr>
@@ -1475,7 +2104,7 @@
           <w:color w:val="4A4A4A"/>
           <w:sz w:val="20"/>
         </w:rPr>
-        <w:t>Colegiado da CVM aceita Termo de Compromisso de R$ 1,89 milhão com Pátria Investimentos Ltda. e seu diretor.</w:t>
+        <w:t>Lançamento do Índice B3 Bancos, disponível a partir de 07/07/2026, como indicador de retorno total de carteira de ativos do segmento bancário.</w:t>
       </w:r>
     </w:p>
     <w:p>
@@ -1495,9 +2124,9 @@
           <w:color w:val="888888"/>
           <w:sz w:val="18"/>
         </w:rPr>
-        <w:t xml:space="preserve">2026-07-06   </w:t>
+        <w:t xml:space="preserve">2026-07-07   </w:t>
       </w:r>
-      <w:hyperlink r:id="rId20">
+      <w:hyperlink r:id="rId27">
         <w:r>
           <w:rPr>
             <w:color w:val="1A4D2E"/>
@@ -1518,7 +2147,7 @@
           <w:color w:val="888888"/>
           <w:sz w:val="16"/>
         </w:rPr>
-        <w:t>Decisão regulatória com valor significativo e impacto em mercado de capitais.</w:t>
+        <w:t>Novo índice de mercado relevante para investidores e analistas do setor bancário.</w:t>
       </w:r>
     </w:p>
     <w:p>
@@ -1531,15 +2160,15 @@
           <w:color w:val="1A1A1A"/>
           <w:sz w:val="22"/>
         </w:rPr>
-        <w:t xml:space="preserve">Prorrogadas inscrições para edição 2026 do Programa TOP até 13/7   </w:t>
+        <w:t xml:space="preserve">005-2026-VPE-Comunicado Externo - Atualização no catálogo de mensagens e arquivos da Clearing   </w:t>
       </w:r>
       <w:r>
         <w:rPr>
           <w:b/>
-          <w:color w:val="7F8C8D"/>
+          <w:color w:val="D68910"/>
           <w:sz w:val="16"/>
         </w:rPr>
-        <w:t>[BAIXA]</w:t>
+        <w:t>[MÉDIA]</w:t>
       </w:r>
     </w:p>
     <w:p>
@@ -1551,7 +2180,7 @@
           <w:color w:val="4A4A4A"/>
           <w:sz w:val="20"/>
         </w:rPr>
-        <w:t>Inscrições para o Programa TOP 2026, curso gratuito e online para professores, são prorrogadas até 13 de julho.</w:t>
+        <w:t>Novas versões do catálogo de mensagens e arquivos da Clearing com atualização de especificação técnica opcional em mensagens e arquivos de alocação.</w:t>
       </w:r>
     </w:p>
     <w:p>
@@ -1571,9 +2200,9 @@
           <w:color w:val="888888"/>
           <w:sz w:val="18"/>
         </w:rPr>
-        <w:t xml:space="preserve">2026-07-06   </w:t>
+        <w:t xml:space="preserve">2026-07-07   </w:t>
       </w:r>
-      <w:hyperlink r:id="rId21">
+      <w:hyperlink r:id="rId28">
         <w:r>
           <w:rPr>
             <w:color w:val="1A4D2E"/>
@@ -1594,7 +2223,7 @@
           <w:color w:val="888888"/>
           <w:sz w:val="16"/>
         </w:rPr>
-        <w:t>Notícia sobre evento/capacitação, de interesse institucional.</w:t>
+        <w:t>Atualização técnica que pode exigir adaptação de sistemas dos participantes da Clearing.</w:t>
       </w:r>
     </w:p>
     <w:p/>
@@ -1660,15 +2289,15 @@
           <w:color w:val="1A1A1A"/>
           <w:sz w:val="22"/>
         </w:rPr>
-        <w:t xml:space="preserve">Vai participar do Encontro CCEE – Operação e Tecnologia em Movimento? Confira a programação e os palestrantes confirmados   </w:t>
+        <w:t xml:space="preserve">CT PMO/PLD abre Consulta Externa sobre aprimoramento dos modelos do setor elétrico   </w:t>
       </w:r>
       <w:r>
         <w:rPr>
           <w:b/>
-          <w:color w:val="7F8C8D"/>
+          <w:color w:val="D68910"/>
           <w:sz w:val="16"/>
         </w:rPr>
-        <w:t>[BAIXA]</w:t>
+        <w:t>[MÉDIA]</w:t>
       </w:r>
     </w:p>
     <w:p>
@@ -1680,7 +2309,7 @@
           <w:color w:val="4A4A4A"/>
           <w:sz w:val="20"/>
         </w:rPr>
-        <w:t>Evento reúne especialistas para discutir o futuro do setor elétrico.</w:t>
+        <w:t>Consulta externa para aprimoramento dos modelos do setor elétrico, com contribuições para a agenda de trabalho do CT.</w:t>
       </w:r>
     </w:p>
     <w:p>
@@ -1700,9 +2329,9 @@
           <w:color w:val="888888"/>
           <w:sz w:val="18"/>
         </w:rPr>
-        <w:t xml:space="preserve">2026-07-06   </w:t>
+        <w:t xml:space="preserve">2026-07-07   </w:t>
       </w:r>
-      <w:hyperlink r:id="rId22">
+      <w:hyperlink r:id="rId29">
         <w:r>
           <w:rPr>
             <w:color w:val="1A4D2E"/>
@@ -1723,29 +2352,8 @@
           <w:color w:val="888888"/>
           <w:sz w:val="16"/>
         </w:rPr>
-        <w:t>Notícia institucional sobre evento, de interesse geral mas sem impacto regulatório direto.</w:t>
+        <w:t>Consulta pública setorial que pode levar a mudanças regulatórias no setor elétrico.</w:t>
       </w:r>
-    </w:p>
-    <w:p>
-      <w:pPr>
-        <w:spacing w:before="240" w:after="80"/>
-      </w:pPr>
-      <w:r>
-        <w:rPr>
-          <w:b/>
-          <w:color w:val="1A4D2E"/>
-          <w:sz w:val="20"/>
-        </w:rPr>
-        <w:t>ANP | NOTÍCIAS</w:t>
-      </w:r>
-    </w:p>
-    <w:p>
-      <w:pPr>
-        <w:spacing w:before="0" w:after="40"/>
-        <w:pBdr>
-          <w:bottom w:val="single" w:sz="8" w:space="1" w:color="1A4D2E"/>
-        </w:pBdr>
-      </w:pPr>
     </w:p>
     <w:p>
       <w:pPr>
@@ -1757,7 +2365,7 @@
           <w:color w:val="1A1A1A"/>
           <w:sz w:val="22"/>
         </w:rPr>
-        <w:t xml:space="preserve">Período eleitoral: ANP já utiliza os perfis temporários nas redes sociais   </w:t>
+        <w:t xml:space="preserve">Encontro CCEE: evolução das operações e abertura do mercado são destaques dos painéis da manhã   </w:t>
       </w:r>
       <w:r>
         <w:rPr>
@@ -1777,7 +2385,7 @@
           <w:color w:val="4A4A4A"/>
           <w:sz w:val="20"/>
         </w:rPr>
-        <w:t>A ANP informa que já está utilizando perfis temporários nas redes sociais devido ao período eleitoral.</w:t>
+        <w:t>Encontro da CCEE reuniu especialistas para debater desafios, avanços da Câmara e perspectivas para o setor elétrico até 2030.</w:t>
       </w:r>
     </w:p>
     <w:p>
@@ -1797,9 +2405,9 @@
           <w:color w:val="888888"/>
           <w:sz w:val="18"/>
         </w:rPr>
-        <w:t xml:space="preserve">2026-07-06   </w:t>
+        <w:t xml:space="preserve">2026-07-07   </w:t>
       </w:r>
-      <w:hyperlink r:id="rId23">
+      <w:hyperlink r:id="rId30">
         <w:r>
           <w:rPr>
             <w:color w:val="1A4D2E"/>
@@ -1820,7 +2428,547 @@
           <w:color w:val="888888"/>
           <w:sz w:val="16"/>
         </w:rPr>
-        <w:t>Notícia institucional sobre adequação a normas eleitorais, sem impacto regulatório direto.</w:t>
+        <w:t>Notícia institucional sobre um evento, com baixo impacto direto.</w:t>
+      </w:r>
+    </w:p>
+    <w:p>
+      <w:pPr>
+        <w:spacing w:before="240" w:after="80"/>
+      </w:pPr>
+      <w:r>
+        <w:rPr>
+          <w:b/>
+          <w:color w:val="1A4D2E"/>
+          <w:sz w:val="20"/>
+        </w:rPr>
+        <w:t>ANP | NOTÍCIAS</w:t>
+      </w:r>
+    </w:p>
+    <w:p>
+      <w:pPr>
+        <w:spacing w:before="0" w:after="40"/>
+        <w:pBdr>
+          <w:bottom w:val="single" w:sz="8" w:space="1" w:color="1A4D2E"/>
+        </w:pBdr>
+      </w:pPr>
+    </w:p>
+    <w:p>
+      <w:pPr>
+        <w:spacing w:before="160" w:after="40"/>
+      </w:pPr>
+      <w:r>
+        <w:rPr>
+          <w:b/>
+          <w:color w:val="1A1A1A"/>
+          <w:sz w:val="22"/>
+        </w:rPr>
+        <w:t xml:space="preserve">Aviso: não haverá expediente nem protocolo no Escritório ANP SP no dia 9 de julho   </w:t>
+      </w:r>
+      <w:r>
+        <w:rPr>
+          <w:b/>
+          <w:color w:val="7F8C8D"/>
+          <w:sz w:val="16"/>
+        </w:rPr>
+        <w:t>[BAIXA]</w:t>
+      </w:r>
+    </w:p>
+    <w:p>
+      <w:pPr>
+        <w:spacing w:after="40"/>
+      </w:pPr>
+      <w:r>
+        <w:rPr>
+          <w:color w:val="4A4A4A"/>
+          <w:sz w:val="20"/>
+        </w:rPr>
+        <w:t>Aviso sobre a suspensão de expediente e protocolo no Escritório da ANP em São Paulo no dia 9 de julho.</w:t>
+      </w:r>
+    </w:p>
+    <w:p>
+      <w:pPr>
+        <w:spacing w:after="40"/>
+      </w:pPr>
+      <w:r>
+        <w:rPr>
+          <w:b/>
+          <w:color w:val="888888"/>
+          <w:sz w:val="18"/>
+        </w:rPr>
+        <w:t xml:space="preserve">Publicado: </w:t>
+      </w:r>
+      <w:r>
+        <w:rPr>
+          <w:color w:val="888888"/>
+          <w:sz w:val="18"/>
+        </w:rPr>
+        <w:t xml:space="preserve">2026-07-07   </w:t>
+      </w:r>
+      <w:hyperlink r:id="rId31">
+        <w:r>
+          <w:rPr>
+            <w:color w:val="1A4D2E"/>
+            <w:u w:val="single"/>
+            <w:b/>
+          </w:rPr>
+          <w:t>Acessar materia</w:t>
+        </w:r>
+      </w:hyperlink>
+    </w:p>
+    <w:p>
+      <w:pPr>
+        <w:spacing w:after="120"/>
+      </w:pPr>
+      <w:r>
+        <w:rPr>
+          <w:i/>
+          <w:color w:val="888888"/>
+          <w:sz w:val="16"/>
+        </w:rPr>
+        <w:t>Aviso administrativo de funcionamento, com impacto limitado.</w:t>
+      </w:r>
+    </w:p>
+    <w:p>
+      <w:pPr>
+        <w:spacing w:before="160" w:after="40"/>
+      </w:pPr>
+      <w:r>
+        <w:rPr>
+          <w:b/>
+          <w:color w:val="1A1A1A"/>
+          <w:sz w:val="22"/>
+        </w:rPr>
+        <w:t xml:space="preserve">ANP e Petrobras assinam acordo para adequação de 335 poços marítimos às regras de segurança operacional   </w:t>
+      </w:r>
+      <w:r>
+        <w:rPr>
+          <w:b/>
+          <w:color w:val="C0392B"/>
+          <w:sz w:val="16"/>
+        </w:rPr>
+        <w:t>[ALTA]</w:t>
+      </w:r>
+    </w:p>
+    <w:p>
+      <w:pPr>
+        <w:spacing w:after="40"/>
+      </w:pPr>
+      <w:r>
+        <w:rPr>
+          <w:color w:val="4A4A4A"/>
+          <w:sz w:val="20"/>
+        </w:rPr>
+        <w:t>Termo de Conciliação celebrado na AGU estabelece compromissos técnicos para fortalecer a prevenção e a resposta a emergências em poços marítimos.</w:t>
+      </w:r>
+    </w:p>
+    <w:p>
+      <w:pPr>
+        <w:spacing w:after="40"/>
+      </w:pPr>
+      <w:r>
+        <w:rPr>
+          <w:b/>
+          <w:color w:val="888888"/>
+          <w:sz w:val="18"/>
+        </w:rPr>
+        <w:t xml:space="preserve">Publicado: </w:t>
+      </w:r>
+      <w:r>
+        <w:rPr>
+          <w:color w:val="888888"/>
+          <w:sz w:val="18"/>
+        </w:rPr>
+        <w:t xml:space="preserve">2026-07-07   </w:t>
+      </w:r>
+      <w:hyperlink r:id="rId32">
+        <w:r>
+          <w:rPr>
+            <w:color w:val="1A4D2E"/>
+            <w:u w:val="single"/>
+            <w:b/>
+          </w:rPr>
+          <w:t>Acessar materia</w:t>
+        </w:r>
+      </w:hyperlink>
+    </w:p>
+    <w:p>
+      <w:pPr>
+        <w:spacing w:after="120"/>
+      </w:pPr>
+      <w:r>
+        <w:rPr>
+          <w:i/>
+          <w:color w:val="888888"/>
+          <w:sz w:val="16"/>
+        </w:rPr>
+        <w:t>Acordo com grande empresa estatal sobre segurança operacional, com impacto regulatório e ambiental no setor de energia.</w:t>
+      </w:r>
+    </w:p>
+    <w:p>
+      <w:pPr>
+        <w:spacing w:before="240" w:after="80"/>
+      </w:pPr>
+      <w:r>
+        <w:rPr>
+          <w:b/>
+          <w:color w:val="1A4D2E"/>
+          <w:sz w:val="20"/>
+        </w:rPr>
+        <w:t>ANEEL | ÚLTIMAS NOTÍCIAS</w:t>
+      </w:r>
+    </w:p>
+    <w:p>
+      <w:pPr>
+        <w:spacing w:before="0" w:after="40"/>
+        <w:pBdr>
+          <w:bottom w:val="single" w:sz="8" w:space="1" w:color="1A4D2E"/>
+        </w:pBdr>
+      </w:pPr>
+    </w:p>
+    <w:p>
+      <w:pPr>
+        <w:spacing w:before="160" w:after="40"/>
+      </w:pPr>
+      <w:r>
+        <w:rPr>
+          <w:b/>
+          <w:color w:val="1A1A1A"/>
+          <w:sz w:val="22"/>
+        </w:rPr>
+        <w:t xml:space="preserve">ANEEL aprova abertura de consulta pública sobre o edital dos Leilões de Energia Existente A-1, A-2 e A-3   </w:t>
+      </w:r>
+      <w:r>
+        <w:rPr>
+          <w:b/>
+          <w:color w:val="C0392B"/>
+          <w:sz w:val="16"/>
+        </w:rPr>
+        <w:t>[ALTA]</w:t>
+      </w:r>
+    </w:p>
+    <w:p>
+      <w:pPr>
+        <w:spacing w:after="40"/>
+      </w:pPr>
+      <w:r>
+        <w:rPr>
+          <w:color w:val="4A4A4A"/>
+          <w:sz w:val="20"/>
+        </w:rPr>
+        <w:t>ANEEL aprova abertura de consulta pública sobre o edital dos Leilões de Energia Existente A-1, A-2 e A-3, com contribuições até 24 de agosto de 2026.</w:t>
+      </w:r>
+    </w:p>
+    <w:p>
+      <w:pPr>
+        <w:spacing w:after="40"/>
+      </w:pPr>
+      <w:r>
+        <w:rPr>
+          <w:b/>
+          <w:color w:val="888888"/>
+          <w:sz w:val="18"/>
+        </w:rPr>
+        <w:t xml:space="preserve">Publicado: </w:t>
+      </w:r>
+      <w:r>
+        <w:rPr>
+          <w:color w:val="888888"/>
+          <w:sz w:val="18"/>
+        </w:rPr>
+        <w:t xml:space="preserve">2026-07-07   </w:t>
+      </w:r>
+      <w:hyperlink r:id="rId33">
+        <w:r>
+          <w:rPr>
+            <w:color w:val="1A4D2E"/>
+            <w:u w:val="single"/>
+            <w:b/>
+          </w:rPr>
+          <w:t>Acessar materia</w:t>
+        </w:r>
+      </w:hyperlink>
+    </w:p>
+    <w:p>
+      <w:pPr>
+        <w:spacing w:after="120"/>
+      </w:pPr>
+      <w:r>
+        <w:rPr>
+          <w:i/>
+          <w:color w:val="888888"/>
+          <w:sz w:val="16"/>
+        </w:rPr>
+        <w:t>Abertura de consulta pública para leilões de energia, com impacto direto no setor elétrico e para empresas do ramo.</w:t>
+      </w:r>
+    </w:p>
+    <w:p>
+      <w:pPr>
+        <w:spacing w:before="240" w:after="80"/>
+      </w:pPr>
+      <w:r>
+        <w:rPr>
+          <w:b/>
+          <w:color w:val="1A4D2E"/>
+          <w:sz w:val="20"/>
+        </w:rPr>
+        <w:t>ANM | NOTÍCIAS</w:t>
+      </w:r>
+    </w:p>
+    <w:p>
+      <w:pPr>
+        <w:spacing w:before="0" w:after="40"/>
+        <w:pBdr>
+          <w:bottom w:val="single" w:sz="8" w:space="1" w:color="1A4D2E"/>
+        </w:pBdr>
+      </w:pPr>
+    </w:p>
+    <w:p>
+      <w:pPr>
+        <w:spacing w:before="160" w:after="40"/>
+      </w:pPr>
+      <w:r>
+        <w:rPr>
+          <w:b/>
+          <w:color w:val="1A1A1A"/>
+          <w:sz w:val="22"/>
+        </w:rPr>
+        <w:t xml:space="preserve">Recolhimento da CFEM tem nova plataforma digital   </w:t>
+      </w:r>
+      <w:r>
+        <w:rPr>
+          <w:b/>
+          <w:color w:val="C0392B"/>
+          <w:sz w:val="16"/>
+        </w:rPr>
+        <w:t>[ALTA]</w:t>
+      </w:r>
+    </w:p>
+    <w:p>
+      <w:pPr>
+        <w:spacing w:after="40"/>
+      </w:pPr>
+      <w:r>
+        <w:rPr>
+          <w:color w:val="4A4A4A"/>
+          <w:sz w:val="20"/>
+        </w:rPr>
+        <w:t>Nova plataforma digital para recolhimento da Compensação Financeira pela Exploração de Recursos Minerais (CFEM), exigindo login gov.br e ampliando formas de pagamento.</w:t>
+      </w:r>
+    </w:p>
+    <w:p>
+      <w:pPr>
+        <w:spacing w:after="40"/>
+      </w:pPr>
+      <w:r>
+        <w:rPr>
+          <w:b/>
+          <w:color w:val="888888"/>
+          <w:sz w:val="18"/>
+        </w:rPr>
+        <w:t xml:space="preserve">Publicado: </w:t>
+      </w:r>
+      <w:r>
+        <w:rPr>
+          <w:color w:val="888888"/>
+          <w:sz w:val="18"/>
+        </w:rPr>
+        <w:t xml:space="preserve">2026-07-07T15:04   </w:t>
+      </w:r>
+      <w:hyperlink r:id="rId34">
+        <w:r>
+          <w:rPr>
+            <w:color w:val="1A4D2E"/>
+            <w:u w:val="single"/>
+            <w:b/>
+          </w:rPr>
+          <w:t>Acessar materia</w:t>
+        </w:r>
+      </w:hyperlink>
+    </w:p>
+    <w:p>
+      <w:pPr>
+        <w:spacing w:after="120"/>
+      </w:pPr>
+      <w:r>
+        <w:rPr>
+          <w:i/>
+          <w:color w:val="888888"/>
+          <w:sz w:val="16"/>
+        </w:rPr>
+        <w:t>Mudança no processo de recolhimento de royalties da mineração, com impacto direto para empresas do setor.</w:t>
+      </w:r>
+    </w:p>
+    <w:p>
+      <w:pPr>
+        <w:spacing w:before="240" w:after="80"/>
+      </w:pPr>
+      <w:r>
+        <w:rPr>
+          <w:b/>
+          <w:color w:val="1A4D2E"/>
+          <w:sz w:val="20"/>
+        </w:rPr>
+        <w:t>EPE | NOTÍCIAS</w:t>
+      </w:r>
+    </w:p>
+    <w:p>
+      <w:pPr>
+        <w:spacing w:before="0" w:after="40"/>
+        <w:pBdr>
+          <w:bottom w:val="single" w:sz="8" w:space="1" w:color="1A4D2E"/>
+        </w:pBdr>
+      </w:pPr>
+    </w:p>
+    <w:p>
+      <w:pPr>
+        <w:spacing w:before="160" w:after="40"/>
+      </w:pPr>
+      <w:r>
+        <w:rPr>
+          <w:b/>
+          <w:color w:val="1A1A1A"/>
+          <w:sz w:val="22"/>
+        </w:rPr>
+        <w:t xml:space="preserve">Em parceria com a EPE, curso de Mercados de Energia para Futuros Líderes terá nova turma em agosto   </w:t>
+      </w:r>
+      <w:r>
+        <w:rPr>
+          <w:b/>
+          <w:color w:val="7F8C8D"/>
+          <w:sz w:val="16"/>
+        </w:rPr>
+        <w:t>[BAIXA]</w:t>
+      </w:r>
+    </w:p>
+    <w:p>
+      <w:pPr>
+        <w:spacing w:after="40"/>
+      </w:pPr>
+      <w:r>
+        <w:rPr>
+          <w:color w:val="4A4A4A"/>
+          <w:sz w:val="20"/>
+        </w:rPr>
+        <w:t>A Fundação Carlos Alberto Vanzolini abriu inscrições para a segunda turma do curso de atualização em Mercados de Energia para Futuros Líderes, em parceria com a EPE.</w:t>
+      </w:r>
+    </w:p>
+    <w:p>
+      <w:pPr>
+        <w:spacing w:after="40"/>
+      </w:pPr>
+      <w:r>
+        <w:rPr>
+          <w:b/>
+          <w:color w:val="888888"/>
+          <w:sz w:val="18"/>
+        </w:rPr>
+        <w:t xml:space="preserve">Publicado: </w:t>
+      </w:r>
+      <w:r>
+        <w:rPr>
+          <w:color w:val="888888"/>
+          <w:sz w:val="18"/>
+        </w:rPr>
+        <w:t xml:space="preserve">2026-07-07   </w:t>
+      </w:r>
+      <w:hyperlink r:id="rId35">
+        <w:r>
+          <w:rPr>
+            <w:color w:val="1A4D2E"/>
+            <w:u w:val="single"/>
+            <w:b/>
+          </w:rPr>
+          <w:t>Acessar materia</w:t>
+        </w:r>
+      </w:hyperlink>
+    </w:p>
+    <w:p>
+      <w:pPr>
+        <w:spacing w:after="120"/>
+      </w:pPr>
+      <w:r>
+        <w:rPr>
+          <w:i/>
+          <w:color w:val="888888"/>
+          <w:sz w:val="16"/>
+        </w:rPr>
+        <w:t>Notícia sobre capacitação e evento, com baixo impacto direto a clientes corporativos.</w:t>
+      </w:r>
+    </w:p>
+    <w:p>
+      <w:pPr>
+        <w:spacing w:before="160" w:after="40"/>
+      </w:pPr>
+      <w:r>
+        <w:rPr>
+          <w:b/>
+          <w:color w:val="1A1A1A"/>
+          <w:sz w:val="22"/>
+        </w:rPr>
+        <w:t xml:space="preserve">EPE atualiza ferramentas interativas do Balanço Energético Nacional (BEN) 2026   </w:t>
+      </w:r>
+      <w:r>
+        <w:rPr>
+          <w:b/>
+          <w:color w:val="D68910"/>
+          <w:sz w:val="16"/>
+        </w:rPr>
+        <w:t>[MÉDIA]</w:t>
+      </w:r>
+    </w:p>
+    <w:p>
+      <w:pPr>
+        <w:spacing w:after="40"/>
+      </w:pPr>
+      <w:r>
+        <w:rPr>
+          <w:color w:val="4A4A4A"/>
+          <w:sz w:val="20"/>
+        </w:rPr>
+        <w:t>A Empresa de Pesquisa Energética (EPE) atualiza as ferramentas interativas do Balanço Energético Nacional (BEN) 2026 para ampliar o acesso à informação e inovar na disponibilização de dados energéticos.</w:t>
+      </w:r>
+    </w:p>
+    <w:p>
+      <w:pPr>
+        <w:spacing w:after="40"/>
+      </w:pPr>
+      <w:r>
+        <w:rPr>
+          <w:b/>
+          <w:color w:val="888888"/>
+          <w:sz w:val="18"/>
+        </w:rPr>
+        <w:t xml:space="preserve">Publicado: </w:t>
+      </w:r>
+      <w:r>
+        <w:rPr>
+          <w:color w:val="888888"/>
+          <w:sz w:val="18"/>
+        </w:rPr>
+        <w:t xml:space="preserve">2026-07-07   </w:t>
+      </w:r>
+      <w:hyperlink r:id="rId36">
+        <w:r>
+          <w:rPr>
+            <w:color w:val="1A4D2E"/>
+            <w:u w:val="single"/>
+            <w:b/>
+          </w:rPr>
+          <w:t>Acessar materia</w:t>
+        </w:r>
+      </w:hyperlink>
+    </w:p>
+    <w:p>
+      <w:pPr>
+        <w:spacing w:after="120"/>
+      </w:pPr>
+      <w:r>
+        <w:rPr>
+          <w:i/>
+          <w:color w:val="888888"/>
+          <w:sz w:val="16"/>
+        </w:rPr>
+        <w:t>Atualização de ferramenta de dados setoriais, importante para análise e planejamento no setor de energia.</w:t>
       </w:r>
     </w:p>
     <w:p/>
@@ -1886,7 +3034,7 @@
           <w:color w:val="1A1A1A"/>
           <w:sz w:val="22"/>
         </w:rPr>
-        <w:t xml:space="preserve">Polícia Federal apura esquema de lavagem de dinheiro ligado a apostas ilegais   </w:t>
+        <w:t xml:space="preserve">Workshop debate Governança dos Gastos Tributários   </w:t>
       </w:r>
       <w:r>
         <w:rPr>
@@ -1906,7 +3054,7 @@
           <w:color w:val="4A4A4A"/>
           <w:sz w:val="20"/>
         </w:rPr>
-        <w:t>Informações da Secretaria de Prêmios e Apostas (SPA) auxiliam investigação da Polícia Federal sobre lavagem de dinheiro em apostas ilegais.</w:t>
+        <w:t>Evento reuniu representantes para discutir contribuições à regulamentação da Lei Complementar nº 224/2025 e ao fortalecimento da governança dos gastos tributários.</w:t>
       </w:r>
     </w:p>
     <w:p>
@@ -1926,9 +3074,9 @@
           <w:color w:val="888888"/>
           <w:sz w:val="18"/>
         </w:rPr>
-        <w:t xml:space="preserve">2026-07-06   </w:t>
+        <w:t xml:space="preserve">2026-07-07   </w:t>
       </w:r>
-      <w:hyperlink r:id="rId13">
+      <w:hyperlink r:id="rId37">
         <w:r>
           <w:rPr>
             <w:color w:val="1A4D2E"/>
@@ -1949,29 +3097,8 @@
           <w:color w:val="888888"/>
           <w:sz w:val="16"/>
         </w:rPr>
-        <w:t>Notícia sobre investigação criminal e regulatória com potencial impacto no setor de apostas e lavagem de dinheiro.</w:t>
+        <w:t>Discussão sobre regulamentação de lei complementar e governança tributária, com potencial impacto em políticas fiscais.</w:t>
       </w:r>
-    </w:p>
-    <w:p>
-      <w:pPr>
-        <w:spacing w:before="240" w:after="80"/>
-      </w:pPr>
-      <w:r>
-        <w:rPr>
-          <w:b/>
-          <w:color w:val="1A4D2E"/>
-          <w:sz w:val="20"/>
-        </w:rPr>
-        <w:t>COAF | NOTÍCIAS</w:t>
-      </w:r>
-    </w:p>
-    <w:p>
-      <w:pPr>
-        <w:spacing w:before="0" w:after="40"/>
-        <w:pBdr>
-          <w:bottom w:val="single" w:sz="8" w:space="1" w:color="1A4D2E"/>
-        </w:pBdr>
-      </w:pPr>
     </w:p>
     <w:p>
       <w:pPr>
@@ -1983,7 +3110,7 @@
           <w:color w:val="1A1A1A"/>
           <w:sz w:val="22"/>
         </w:rPr>
-        <w:t xml:space="preserve">Atenção! O Coaf não bloqueia, libera ou retém dinheiro, bens ou qualquer outro tipo de recurso financeiro   </w:t>
+        <w:t xml:space="preserve">Consulta sobre a restituição automática (cashback) pode ser feita a partir desta quarta (8/7) no site da Receita   </w:t>
       </w:r>
       <w:r>
         <w:rPr>
@@ -2003,7 +3130,7 @@
           <w:color w:val="4A4A4A"/>
           <w:sz w:val="20"/>
         </w:rPr>
-        <w:t>O Coaf alerta a população sobre falsas comunicações, esclarecendo que não realiza bloqueio, liberação ou retenção de recursos financeiros.</w:t>
+        <w:t>Informação sobre a consulta da restituição automática (cashback) do IRPF, com pagamento previsto para 15/7.</w:t>
       </w:r>
     </w:p>
     <w:p>
@@ -2023,9 +3150,9 @@
           <w:color w:val="888888"/>
           <w:sz w:val="18"/>
         </w:rPr>
-        <w:t xml:space="preserve">2026-07-06T18:21   </w:t>
+        <w:t xml:space="preserve">2026-07-07   </w:t>
       </w:r>
-      <w:hyperlink r:id="rId24">
+      <w:hyperlink r:id="rId38">
         <w:r>
           <w:rPr>
             <w:color w:val="1A4D2E"/>
@@ -2046,7 +3173,7 @@
           <w:color w:val="888888"/>
           <w:sz w:val="16"/>
         </w:rPr>
-        <w:t>Esclarecimento público importante para evitar golpes e desinformação sobre a atuação do órgão.</w:t>
+        <w:t>Comunicado sobre serviço público com impacto direto em contribuintes e empresas.</w:t>
       </w:r>
     </w:p>
     <w:p/>
@@ -2091,7 +3218,7 @@
           <w:color w:val="1A4D2E"/>
           <w:sz w:val="20"/>
         </w:rPr>
-        <w:t>ANVISA | NOTÍCIAS</w:t>
+        <w:t>ANPD | NOTÍCIAS</w:t>
       </w:r>
     </w:p>
     <w:p>
@@ -2112,7 +3239,7 @@
           <w:color w:val="1A1A1A"/>
           <w:sz w:val="22"/>
         </w:rPr>
-        <w:t xml:space="preserve">Canetas do Paraguai NÃO demonstraram equivalência com medicamentos registrados no Brasil   </w:t>
+        <w:t xml:space="preserve">ANPD e PNUD selecionam consultores para realização de estudos sobre IA, proteção de dados e publicidade digital voltada a crianças e adolescentes   </w:t>
       </w:r>
       <w:r>
         <w:rPr>
@@ -2132,7 +3259,7 @@
           <w:color w:val="4A4A4A"/>
           <w:sz w:val="20"/>
         </w:rPr>
-        <w:t>Anvisa alerta que canetas do Paraguai não têm equivalência comprovada com medicamentos registrados no Brasil, exigindo testes específicos.</w:t>
+        <w:t>ANPD e PNUD abrem seleção para consultores para estudos sobre IA, proteção de dados e publicidade digital para crianças e adolescentes.</w:t>
       </w:r>
     </w:p>
     <w:p>
@@ -2152,9 +3279,9 @@
           <w:color w:val="888888"/>
           <w:sz w:val="18"/>
         </w:rPr>
-        <w:t xml:space="preserve">2026-07-06   </w:t>
+        <w:t xml:space="preserve">2026-07-07T13:49   </w:t>
       </w:r>
-      <w:hyperlink r:id="rId25">
+      <w:hyperlink r:id="rId39">
         <w:r>
           <w:rPr>
             <w:color w:val="1A4D2E"/>
@@ -2175,8 +3302,29 @@
           <w:color w:val="888888"/>
           <w:sz w:val="16"/>
         </w:rPr>
-        <w:t>Alerta sanitário e checagem de fatos sobre produtos de saúde, relevante para consumidores e setor farmacêutico.</w:t>
+        <w:t>Iniciativa de pesquisa e desenvolvimento em temas regulatórios importantes para proteção de dados e IA.</w:t>
       </w:r>
+    </w:p>
+    <w:p>
+      <w:pPr>
+        <w:spacing w:before="240" w:after="80"/>
+      </w:pPr>
+      <w:r>
+        <w:rPr>
+          <w:b/>
+          <w:color w:val="1A4D2E"/>
+          <w:sz w:val="20"/>
+        </w:rPr>
+        <w:t>INPI | NOTÍCIAS</w:t>
+      </w:r>
+    </w:p>
+    <w:p>
+      <w:pPr>
+        <w:spacing w:before="0" w:after="40"/>
+        <w:pBdr>
+          <w:bottom w:val="single" w:sz="8" w:space="1" w:color="1A4D2E"/>
+        </w:pBdr>
+      </w:pPr>
     </w:p>
     <w:p>
       <w:pPr>
@@ -2188,15 +3336,15 @@
           <w:color w:val="1A1A1A"/>
           <w:sz w:val="22"/>
         </w:rPr>
-        <w:t xml:space="preserve">Anvisa aprova nova indicação terapêutica para medicamento que trata câncer de mama   </w:t>
+        <w:t xml:space="preserve">Sistema de peticionamento de programa de computador volta a funcionar   </w:t>
       </w:r>
       <w:r>
         <w:rPr>
           <w:b/>
-          <w:color w:val="C0392B"/>
+          <w:color w:val="D68910"/>
           <w:sz w:val="16"/>
         </w:rPr>
-        <w:t>[ALTA]</w:t>
+        <w:t>[MÉDIA]</w:t>
       </w:r>
     </w:p>
     <w:p>
@@ -2208,7 +3356,7 @@
           <w:color w:val="4A4A4A"/>
           <w:sz w:val="20"/>
         </w:rPr>
-        <w:t>Anvisa aprova nova indicação terapêutica para medicamento de câncer de mama, beneficiando pacientes com doença invasiva residual.</w:t>
+        <w:t>O sistema de peticionamento de programa de computador do INPI foi restabelecido, permitindo novamente o registro de propriedade intelectual.</w:t>
       </w:r>
     </w:p>
     <w:p>
@@ -2228,9 +3376,9 @@
           <w:color w:val="888888"/>
           <w:sz w:val="18"/>
         </w:rPr>
-        <w:t xml:space="preserve">2026-07-06   </w:t>
+        <w:t xml:space="preserve">2026-07-07T16:00   </w:t>
       </w:r>
-      <w:hyperlink r:id="rId26">
+      <w:hyperlink r:id="rId40">
         <w:r>
           <w:rPr>
             <w:color w:val="1A4D2E"/>
@@ -2251,7 +3399,7 @@
           <w:color w:val="888888"/>
           <w:sz w:val="16"/>
         </w:rPr>
-        <w:t>Aprovação de nova indicação terapêutica para medicamento, com impacto direto na saúde pública e indústria farmacêutica.</w:t>
+        <w:t>Restabelecimento de serviço essencial para o registro de propriedade intelectual, importante para empresas de tecnologia.</w:t>
       </w:r>
     </w:p>
     <w:p>
@@ -2264,7 +3412,7 @@
           <w:color w:val="1A1A1A"/>
           <w:sz w:val="22"/>
         </w:rPr>
-        <w:t xml:space="preserve">Anvisa disponibiliza nova ferramenta para consulta de alertas sanitários   </w:t>
+        <w:t xml:space="preserve">Sistema de restituição de taxas está disponível   </w:t>
       </w:r>
       <w:r>
         <w:rPr>
@@ -2284,7 +3432,7 @@
           <w:color w:val="4A4A4A"/>
           <w:sz w:val="20"/>
         </w:rPr>
-        <w:t>Anvisa lança nova ferramenta no portal de consultas para facilitar o acesso a alertas sanitários, substituindo o Sistec.</w:t>
+        <w:t>O sistema de restituição de taxas do INPI agora está disponível, facilitando o processo para os usuários.</w:t>
       </w:r>
     </w:p>
     <w:p>
@@ -2304,9 +3452,9 @@
           <w:color w:val="888888"/>
           <w:sz w:val="18"/>
         </w:rPr>
-        <w:t xml:space="preserve">2026-07-06   </w:t>
+        <w:t xml:space="preserve">2026-07-07T13:07   </w:t>
       </w:r>
-      <w:hyperlink r:id="rId27">
+      <w:hyperlink r:id="rId41">
         <w:r>
           <w:rPr>
             <w:color w:val="1A4D2E"/>
@@ -2327,7 +3475,7 @@
           <w:color w:val="888888"/>
           <w:sz w:val="16"/>
         </w:rPr>
-        <w:t>Melhoria em ferramenta de consulta pública de alertas sanitários, facilitando o acesso à informação regulatória.</w:t>
+        <w:t>Disponibilização de serviço para restituição de taxas, relevante para empresas que interagem com o INPI.</w:t>
       </w:r>
     </w:p>
     <w:p>
@@ -2340,15 +3488,15 @@
           <w:color w:val="1A1A1A"/>
           <w:sz w:val="22"/>
         </w:rPr>
-        <w:t xml:space="preserve">Entram em vigor os novos compêndios da Farmacopeia Brasileira   </w:t>
+        <w:t xml:space="preserve">Tomada pública de subsídios sobre Indicações Geográficas argentinas está aberta   </w:t>
       </w:r>
       <w:r>
         <w:rPr>
           <w:b/>
-          <w:color w:val="C0392B"/>
+          <w:color w:val="D68910"/>
           <w:sz w:val="16"/>
         </w:rPr>
-        <w:t>[ALTA]</w:t>
+        <w:t>[MÉDIA]</w:t>
       </w:r>
     </w:p>
     <w:p>
@@ -2360,7 +3508,7 @@
           <w:color w:val="4A4A4A"/>
           <w:sz w:val="20"/>
         </w:rPr>
-        <w:t>Novos compêndios da Farmacopeia Brasileira, aprovados em junho, entram em vigor, estabelecendo padrões para medicamentos.</w:t>
+        <w:t>O INPI abriu tomada pública de subsídios sobre Indicações Geográficas argentinas, buscando contribuições da sociedade.</w:t>
       </w:r>
     </w:p>
     <w:p>
@@ -2380,9 +3528,9 @@
           <w:color w:val="888888"/>
           <w:sz w:val="18"/>
         </w:rPr>
-        <w:t xml:space="preserve">2026-07-06   </w:t>
+        <w:t xml:space="preserve">2026-07-07T13:04   </w:t>
       </w:r>
-      <w:hyperlink r:id="rId28">
+      <w:hyperlink r:id="rId42">
         <w:r>
           <w:rPr>
             <w:color w:val="1A4D2E"/>
@@ -2403,29 +3551,8 @@
           <w:color w:val="888888"/>
           <w:sz w:val="16"/>
         </w:rPr>
-        <w:t>Entrada em vigor de normas que estabelecem padrões para medicamentos, com impacto direto na indústria farmacêutica.</w:t>
+        <w:t>Consulta pública sobre propriedade intelectual internacional, relevante para empresas com interesses em mercados externos.</w:t>
       </w:r>
-    </w:p>
-    <w:p>
-      <w:pPr>
-        <w:spacing w:before="240" w:after="80"/>
-      </w:pPr>
-      <w:r>
-        <w:rPr>
-          <w:b/>
-          <w:color w:val="1A4D2E"/>
-          <w:sz w:val="20"/>
-        </w:rPr>
-        <w:t>INPI | NOTÍCIAS</w:t>
-      </w:r>
-    </w:p>
-    <w:p>
-      <w:pPr>
-        <w:spacing w:before="0" w:after="40"/>
-        <w:pBdr>
-          <w:bottom w:val="single" w:sz="8" w:space="1" w:color="1A4D2E"/>
-        </w:pBdr>
-      </w:pPr>
     </w:p>
     <w:p>
       <w:pPr>
@@ -2437,7 +3564,7 @@
           <w:color w:val="1A1A1A"/>
           <w:sz w:val="22"/>
         </w:rPr>
-        <w:t xml:space="preserve">INPI esclarece dúvidas sobre acesso com CNPJ na conta Gov.br   </w:t>
+        <w:t xml:space="preserve">Consulta pública sobre marcas de posição recebe contribuições até 24/7   </w:t>
       </w:r>
       <w:r>
         <w:rPr>
@@ -2457,7 +3584,7 @@
           <w:color w:val="4A4A4A"/>
           <w:sz w:val="20"/>
         </w:rPr>
-        <w:t>O INPI publica esclarecimentos sobre o acesso de pessoas jurídicas (CNPJ) aos serviços da conta Gov.br.</w:t>
+        <w:t>O INPI abriu consulta pública para receber contribuições sobre marcas de posição até 24 de julho.</w:t>
       </w:r>
     </w:p>
     <w:p>
@@ -2477,9 +3604,9 @@
           <w:color w:val="888888"/>
           <w:sz w:val="18"/>
         </w:rPr>
-        <w:t xml:space="preserve">2026-07-06T16:59   </w:t>
+        <w:t xml:space="preserve">2026-07-07T13:01   </w:t>
       </w:r>
-      <w:hyperlink r:id="rId29">
+      <w:hyperlink r:id="rId43">
         <w:r>
           <w:rPr>
             <w:color w:val="1A4D2E"/>
@@ -2500,7 +3627,7 @@
           <w:color w:val="888888"/>
           <w:sz w:val="16"/>
         </w:rPr>
-        <w:t>Esclarecimento administrativo sobre acesso a serviços públicos, relevante para empresas.</w:t>
+        <w:t>Consulta pública sobre regulamentação de marcas, importante para empresas que buscam proteção de propriedade intelectual.</w:t>
       </w:r>
     </w:p>
     <w:p>
@@ -2513,7 +3640,7 @@
           <w:color w:val="1A1A1A"/>
           <w:sz w:val="22"/>
         </w:rPr>
-        <w:t xml:space="preserve">Encerradas as inscrições para a Oficina de PCT em julho   </w:t>
+        <w:t xml:space="preserve">INPI realiza seleção com duas vagas para atuar na área de promoção e eventos   </w:t>
       </w:r>
       <w:r>
         <w:rPr>
@@ -2533,7 +3660,7 @@
           <w:color w:val="4A4A4A"/>
           <w:sz w:val="20"/>
         </w:rPr>
-        <w:t>As inscrições para a Oficina de PCT (Tratado de Cooperação em Matéria de Patentes) de julho foram encerradas.</w:t>
+        <w:t>O INPI está realizando um processo seletivo para preencher duas vagas na área de promoção e eventos.</w:t>
       </w:r>
     </w:p>
     <w:p>
@@ -2553,9 +3680,9 @@
           <w:color w:val="888888"/>
           <w:sz w:val="18"/>
         </w:rPr>
-        <w:t xml:space="preserve">2026-07-06T15:11   </w:t>
+        <w:t xml:space="preserve">2026-07-07T12:59   </w:t>
       </w:r>
-      <w:hyperlink r:id="rId30">
+      <w:hyperlink r:id="rId44">
         <w:r>
           <w:rPr>
             <w:color w:val="1A4D2E"/>
@@ -2576,7 +3703,7 @@
           <w:color w:val="888888"/>
           <w:sz w:val="16"/>
         </w:rPr>
-        <w:t>Notícia sobre o encerramento de inscrições para um evento de capacitação.</w:t>
+        <w:t>Notícia institucional de recrutamento, com baixo impacto direto a clientes corporativos.</w:t>
       </w:r>
     </w:p>
     <w:p>
@@ -2589,7 +3716,7 @@
           <w:color w:val="1A1A1A"/>
           <w:sz w:val="22"/>
         </w:rPr>
-        <w:t xml:space="preserve">Inscrições para Chamamento Público sobre casos de sucesso vão até 31/7   </w:t>
+        <w:t xml:space="preserve">INPI seleciona bolsista na área de direito da Propriedade Intelectual   </w:t>
       </w:r>
       <w:r>
         <w:rPr>
@@ -2609,7 +3736,7 @@
           <w:color w:val="4A4A4A"/>
           <w:sz w:val="20"/>
         </w:rPr>
-        <w:t>O INPI abriu inscrições para um chamamento público de casos de sucesso, com prazo até 31 de julho.</w:t>
+        <w:t>O INPI está selecionando um bolsista para atuar na área de direito da Propriedade Intelectual.</w:t>
       </w:r>
     </w:p>
     <w:p>
@@ -2629,9 +3756,9 @@
           <w:color w:val="888888"/>
           <w:sz w:val="18"/>
         </w:rPr>
-        <w:t xml:space="preserve">2026-07-06T13:04   </w:t>
+        <w:t xml:space="preserve">2026-07-07T10:46   </w:t>
       </w:r>
-      <w:hyperlink r:id="rId31">
+      <w:hyperlink r:id="rId45">
         <w:r>
           <w:rPr>
             <w:color w:val="1A4D2E"/>
@@ -2652,7 +3779,7 @@
           <w:color w:val="888888"/>
           <w:sz w:val="16"/>
         </w:rPr>
-        <w:t>Chamamento público para coleta de informações, de interesse institucional.</w:t>
+        <w:t>Notícia institucional de recrutamento, com baixo impacto direto a clientes corporativos.</w:t>
       </w:r>
     </w:p>
     <w:p>
@@ -2665,15 +3792,15 @@
           <w:color w:val="1A1A1A"/>
           <w:sz w:val="22"/>
         </w:rPr>
-        <w:t xml:space="preserve">Edital de credenciamento para buscas de anterioridades de patentes está aberto   </w:t>
+        <w:t xml:space="preserve">INPI publica atualização da Agenda Regulatória 2026-2028   </w:t>
       </w:r>
       <w:r>
         <w:rPr>
           <w:b/>
-          <w:color w:val="D68910"/>
+          <w:color w:val="C0392B"/>
           <w:sz w:val="16"/>
         </w:rPr>
-        <w:t>[MÉDIA]</w:t>
+        <w:t>[ALTA]</w:t>
       </w:r>
     </w:p>
     <w:p>
@@ -2685,7 +3812,7 @@
           <w:color w:val="4A4A4A"/>
           <w:sz w:val="20"/>
         </w:rPr>
-        <w:t>Edital de credenciamento para profissionais realizarem buscas de anterioridades de patentes está aberto no INPI.</w:t>
+        <w:t>O INPI publicou a atualização de sua Agenda Regulatória para o período de 2026-2028, detalhando as prioridades do órgão.</w:t>
       </w:r>
     </w:p>
     <w:p>
@@ -2705,9 +3832,9 @@
           <w:color w:val="888888"/>
           <w:sz w:val="18"/>
         </w:rPr>
-        <w:t xml:space="preserve">2026-07-06T12:49   </w:t>
+        <w:t xml:space="preserve">2026-07-07T15:33   </w:t>
       </w:r>
-      <w:hyperlink r:id="rId32">
+      <w:hyperlink r:id="rId46">
         <w:r>
           <w:rPr>
             <w:color w:val="1A4D2E"/>
@@ -2728,7 +3855,7 @@
           <w:color w:val="888888"/>
           <w:sz w:val="16"/>
         </w:rPr>
-        <w:t>Edital de credenciamento para serviço técnico, relevante para profissionais da área de patentes.</w:t>
+        <w:t>Documento estratégico que define as prioridades regulatórias do órgão, com impacto potencial em futuras normas e procedimentos.</w:t>
       </w:r>
     </w:p>
     <w:p/>
@@ -2781,7 +3908,7 @@
           <w:color w:val="4A4A4A"/>
           <w:sz w:val="18"/>
         </w:rPr>
-        <w:t>ANPD | Notícias - Nenhum resultado foi encontrado na janela temporal.</w:t>
+        <w:t>MME | Notícias - Nenhuma publicação encontrada na janela temporal.</w:t>
       </w:r>
     </w:p>
     <w:p>
@@ -2793,7 +3920,7 @@
           <w:color w:val="4A4A4A"/>
           <w:sz w:val="18"/>
         </w:rPr>
-        <w:t>B3 | Ofícios e Comunicados - Todos os itens encontrados estão fora da janela temporal.</w:t>
+        <w:t>ONS | Notícias - A fonte explicitamente indica 'Nenhum item encontrado' para o período.</w:t>
       </w:r>
     </w:p>
     <w:p>
@@ -2805,7 +3932,7 @@
           <w:color w:val="4A4A4A"/>
           <w:sz w:val="18"/>
         </w:rPr>
-        <w:t>MME | Notícias - Todos os itens encontrados estão fora da janela temporal.</w:t>
+        <w:t>Secretaria de Prêmios e Apostas | Notícias - A fonte explicitamente indica 'Nenhum resultado foi encontrado'.</w:t>
       </w:r>
     </w:p>
     <w:p>
@@ -2817,7 +3944,7 @@
           <w:color w:val="4A4A4A"/>
           <w:sz w:val="18"/>
         </w:rPr>
-        <w:t>ONS | Notícias - Nenhum item encontrado na janela temporal.</w:t>
+        <w:t>Ministério da Agricultura | Notícias - Nenhuma publicação encontrada na janela temporal.</w:t>
       </w:r>
     </w:p>
     <w:p>
@@ -2829,55 +3956,7 @@
           <w:color w:val="4A4A4A"/>
           <w:sz w:val="18"/>
         </w:rPr>
-        <w:t>ANEEL | Últimas Notícias - Todos os itens encontrados estão fora da janela temporal.</w:t>
-      </w:r>
-    </w:p>
-    <w:p>
-      <w:pPr>
-        <w:pStyle w:val="ListBullet"/>
-      </w:pPr>
-      <w:r>
-        <w:rPr>
-          <w:color w:val="4A4A4A"/>
-          <w:sz w:val="18"/>
-        </w:rPr>
-        <w:t>Secretaria de Prêmios e Apostas | Notícias - Nenhum resultado foi encontrado na janela temporal.</w:t>
-      </w:r>
-    </w:p>
-    <w:p>
-      <w:pPr>
-        <w:pStyle w:val="ListBullet"/>
-      </w:pPr>
-      <w:r>
-        <w:rPr>
-          <w:color w:val="4A4A4A"/>
-          <w:sz w:val="18"/>
-        </w:rPr>
-        <w:t>Ministério da Agricultura | Notícias - Todos os itens encontrados estão fora da janela temporal.</w:t>
-      </w:r>
-    </w:p>
-    <w:p>
-      <w:pPr>
-        <w:pStyle w:val="ListBullet"/>
-      </w:pPr>
-      <w:r>
-        <w:rPr>
-          <w:color w:val="4A4A4A"/>
-          <w:sz w:val="18"/>
-        </w:rPr>
-        <w:t>ANM | Notícias - Todos os itens encontrados estão fora da janela temporal.</w:t>
-      </w:r>
-    </w:p>
-    <w:p>
-      <w:pPr>
-        <w:pStyle w:val="ListBullet"/>
-      </w:pPr>
-      <w:r>
-        <w:rPr>
-          <w:color w:val="4A4A4A"/>
-          <w:sz w:val="18"/>
-        </w:rPr>
-        <w:t>EPE | Notícias - Todos os itens encontrados estão fora da janela temporal.</w:t>
+        <w:t>COAF | Notícias - Nenhuma publicação encontrada na janela temporal.</w:t>
       </w:r>
     </w:p>
     <w:p>
@@ -2899,31 +3978,7 @@
           <w:color w:val="4A4A4A"/>
           <w:sz w:val="18"/>
         </w:rPr>
-        <w:t>Receita Federal | Normas - Conteúdo da fonte é um formulário de busca, não listagem de normas recentes.</w:t>
-      </w:r>
-    </w:p>
-    <w:p>
-      <w:pPr>
-        <w:pStyle w:val="ListBullet"/>
-      </w:pPr>
-      <w:r>
-        <w:rPr>
-          <w:color w:val="4A4A4A"/>
-          <w:sz w:val="18"/>
-        </w:rPr>
-        <w:t>CGU | Notícias - Conteúdo restrito, requer autenticação para visualização.</w:t>
-      </w:r>
-    </w:p>
-    <w:p>
-      <w:pPr>
-        <w:pStyle w:val="ListBullet"/>
-      </w:pPr>
-      <w:r>
-        <w:rPr>
-          <w:color w:val="4A4A4A"/>
-          <w:sz w:val="18"/>
-        </w:rPr>
-        <w:t>Ministério do Meio Ambiente | Notícias - Conteúdo restrito, requer autenticação para visualização.</w:t>
+        <w:t>Receita Federal | Normas - A página contém apenas filtros de busca e não exibe resultados de normas diretamente.</w:t>
       </w:r>
     </w:p>
     <w:p>
@@ -2945,7 +4000,31 @@
           <w:color w:val="4A4A4A"/>
           <w:sz w:val="18"/>
         </w:rPr>
-        <w:t>Destaques do D.O.U. - Conteudo muito curto (15 chars) - pagina possivelmente vazia, fora do ar ou bloqueando scraping</w:t>
+        <w:t>CGU | Notícias - Conteúdo restrito, requer autenticação para visualização.</w:t>
+      </w:r>
+    </w:p>
+    <w:p>
+      <w:pPr>
+        <w:pStyle w:val="ListBullet"/>
+      </w:pPr>
+      <w:r>
+        <w:rPr>
+          <w:color w:val="4A4A4A"/>
+          <w:sz w:val="18"/>
+        </w:rPr>
+        <w:t>Ministério do Meio Ambiente | Notícias - Conteúdo restrito, requer autenticação para visualização.</w:t>
+      </w:r>
+    </w:p>
+    <w:p>
+      <w:pPr>
+        <w:pStyle w:val="ListBullet"/>
+      </w:pPr>
+      <w:r>
+        <w:rPr>
+          <w:color w:val="4A4A4A"/>
+          <w:sz w:val="18"/>
+        </w:rPr>
+        <w:t>SENACON | Notícias - Conteúdo restrito, requer autenticação para visualização.</w:t>
       </w:r>
     </w:p>
     <w:p/>
@@ -2993,7 +4072,7 @@
           <w:color w:val="888888"/>
           <w:sz w:val="16"/>
         </w:rPr>
-        <w:t>Janela analisada: 2026-07-06T00:00 ate 2026-07-07T10:22</w:t>
+        <w:t>Janela analisada: 2026-07-07T00:00 ate 2026-07-08T09:22</w:t>
       </w:r>
     </w:p>
     <w:sectPr>

</xml_diff>

<commit_message>
📰 Atualiza boletim - 2026-07-09
</commit_message>
<xml_diff>
--- a/output/boletim.docx
+++ b/output/boletim.docx
@@ -52,7 +52,7 @@
                 <w:color w:val="FFFFFF"/>
                 <w:sz w:val="28"/>
               </w:rPr>
-              <w:t>8 de julho de 2026</w:t>
+              <w:t>9 de julho de 2026</w:t>
             </w:r>
           </w:p>
         </w:tc>
@@ -87,7 +87,7 @@
                 <w:color w:val="1A4D2E"/>
                 <w:sz w:val="56"/>
               </w:rPr>
-              <w:t>38</w:t>
+              <w:t>36</w:t>
             </w:r>
           </w:p>
         </w:tc>
@@ -106,7 +106,7 @@
                 <w:color w:val="C0392B"/>
                 <w:sz w:val="56"/>
               </w:rPr>
-              <w:t>14</w:t>
+              <w:t>9</w:t>
             </w:r>
           </w:p>
         </w:tc>
@@ -125,7 +125,7 @@
                 <w:color w:val="D68910"/>
                 <w:sz w:val="56"/>
               </w:rPr>
-              <w:t>14</w:t>
+              <w:t>17</w:t>
             </w:r>
           </w:p>
         </w:tc>
@@ -307,7 +307,7 @@
                   <w:u w:val="single"/>
                   <w:b/>
                 </w:rPr>
-                <w:t>Comunicado n° 45.517, 8/7/2026</w:t>
+                <w:t>Comunicado n° 45.526, 9/7/2026</w:t>
               </w:r>
             </w:hyperlink>
           </w:p>
@@ -320,7 +320,7 @@
                 <w:color w:val="4A4A4A"/>
                 <w:sz w:val="18"/>
               </w:rPr>
-              <w:t>Divulga a Taxa Básica Financeira (TBF), o Redutor "R" e a Taxa Referencial (TR) relativos a 7 de julho de 2026.</w:t>
+              <w:t>Divulga a Taxa Básica Financeira (TBF), o Redutor 'R' e a Taxa Referencial (TR) relativos a 8 de julho de 2026.</w:t>
             </w:r>
           </w:p>
         </w:tc>
@@ -365,7 +365,65 @@
                   <w:u w:val="single"/>
                   <w:b/>
                 </w:rPr>
-                <w:t>Comunicado n° 45.516, 7/7/2026</w:t>
+                <w:t>Comunicado n° 45.525, 8/7/2026</w:t>
+              </w:r>
+            </w:hyperlink>
+          </w:p>
+          <w:p>
+            <w:pPr>
+              <w:spacing w:after="120"/>
+            </w:pPr>
+            <w:r>
+              <w:rPr>
+                <w:color w:val="4A4A4A"/>
+                <w:sz w:val="18"/>
+              </w:rPr>
+              <w:t>Divulga as condições de oferta pública para a realização de operações de swap para fins de rolagem do vencimento de 03/08/2026.</w:t>
+            </w:r>
+          </w:p>
+        </w:tc>
+      </w:tr>
+    </w:tbl>
+    <w:tbl>
+      <w:tblPr>
+        <w:tblW w:type="auto" w:w="0"/>
+        <w:tblLayout w:type="fixed"/>
+        <w:tblLook w:firstColumn="1" w:firstRow="1" w:lastColumn="0" w:lastRow="0" w:noHBand="0" w:noVBand="1" w:val="04A0"/>
+      </w:tblPr>
+      <w:tblGrid>
+        <w:gridCol w:w="9638"/>
+      </w:tblGrid>
+      <w:tr>
+        <w:tc>
+          <w:tcPr>
+            <w:tcW w:type="dxa" w:w="9638"/>
+            <w:shd w:val="clear" w:color="auto" w:fill="F0F7F2"/>
+          </w:tcPr>
+          <w:p>
+            <w:pPr>
+              <w:spacing w:before="120" w:after="40"/>
+            </w:pPr>
+            <w:r>
+              <w:rPr>
+                <w:b/>
+                <w:color w:val="1A4D2E"/>
+                <w:sz w:val="16"/>
+              </w:rPr>
+              <w:t>BANCO CENTRAL | NORMAS</w:t>
+            </w:r>
+          </w:p>
+          <w:p>
+            <w:pPr>
+              <w:spacing w:after="40"/>
+            </w:pPr>
+            <w:hyperlink r:id="rId11">
+              <w:r>
+                <w:rPr>
+                  <w:color w:val="1A1A1A"/>
+                  <w:u w:val="single"/>
+                  <w:b/>
+                </w:rPr>
+                <w:t>Comunicado n° 45.524, 8/7/2026</w:t>
               </w:r>
             </w:hyperlink>
           </w:p>
@@ -416,14 +474,14 @@
             <w:pPr>
               <w:spacing w:after="40"/>
             </w:pPr>
-            <w:hyperlink r:id="rId11">
+            <w:hyperlink r:id="rId12">
               <w:r>
                 <w:rPr>
                   <w:color w:val="1A1A1A"/>
                   <w:u w:val="single"/>
                   <w:b/>
                 </w:rPr>
-                <w:t>Comunicado n° 45.515, 7/7/2026</w:t>
+                <w:t>Instrução Normativa BCB n° 758, 8/7/2026</w:t>
               </w:r>
             </w:hyperlink>
           </w:p>
@@ -436,65 +494,7 @@
                 <w:color w:val="4A4A4A"/>
                 <w:sz w:val="18"/>
               </w:rPr>
-              <w:t>Divulga as condições de oferta pública para a realização de operações de swap para fins de rolagem do vencimento de 03/08/2026.</w:t>
-            </w:r>
-          </w:p>
-        </w:tc>
-      </w:tr>
-    </w:tbl>
-    <w:tbl>
-      <w:tblPr>
-        <w:tblW w:type="auto" w:w="0"/>
-        <w:tblLayout w:type="fixed"/>
-        <w:tblLook w:firstColumn="1" w:firstRow="1" w:lastColumn="0" w:lastRow="0" w:noHBand="0" w:noVBand="1" w:val="04A0"/>
-      </w:tblPr>
-      <w:tblGrid>
-        <w:gridCol w:w="9638"/>
-      </w:tblGrid>
-      <w:tr>
-        <w:tc>
-          <w:tcPr>
-            <w:tcW w:type="dxa" w:w="9638"/>
-            <w:shd w:val="clear" w:color="auto" w:fill="F0F7F2"/>
-          </w:tcPr>
-          <w:p>
-            <w:pPr>
-              <w:spacing w:before="120" w:after="40"/>
-            </w:pPr>
-            <w:r>
-              <w:rPr>
-                <w:b/>
-                <w:color w:val="1A4D2E"/>
-                <w:sz w:val="16"/>
-              </w:rPr>
-              <w:t>BANCO CENTRAL | NORMAS</w:t>
-            </w:r>
-          </w:p>
-          <w:p>
-            <w:pPr>
-              <w:spacing w:after="40"/>
-            </w:pPr>
-            <w:hyperlink r:id="rId12">
-              <w:r>
-                <w:rPr>
-                  <w:color w:val="1A1A1A"/>
-                  <w:u w:val="single"/>
-                  <w:b/>
-                </w:rPr>
-                <w:t>Comunicado n° 45.514, 7/7/2026</w:t>
-              </w:r>
-            </w:hyperlink>
-          </w:p>
-          <w:p>
-            <w:pPr>
-              <w:spacing w:after="120"/>
-            </w:pPr>
-            <w:r>
-              <w:rPr>
-                <w:color w:val="4A4A4A"/>
-                <w:sz w:val="18"/>
-              </w:rPr>
-              <w:t>Divulga comunicado do Grupo de Ação Financeira contra a Lavagem de Dinheiro e o Financiamento do Terrorismo (GAFI/FATF).</w:t>
+              <w:t>Altera o Manual de Crédito Rural (MCR) para ajustar prazos e orientar instituições financeiras sobre procedimentos de reversão de desclassificação no Sicor.</w:t>
             </w:r>
           </w:p>
         </w:tc>
@@ -539,7 +539,7 @@
                   <w:u w:val="single"/>
                   <w:b/>
                 </w:rPr>
-                <w:t>Comunicado n° 45.511, 7/7/2026</w:t>
+                <w:t>Instrução Normativa BCB n° 757, 8/7/2026</w:t>
               </w:r>
             </w:hyperlink>
           </w:p>
@@ -552,7 +552,7 @@
                 <w:color w:val="4A4A4A"/>
                 <w:sz w:val="18"/>
               </w:rPr>
-              <w:t>Divulga as Taxas Básicas Financeiras (TBF), os Redutores "R" e as Taxas Referenciais (TR) relativos a 4, 5 e 6 de julho de 2026.</w:t>
+              <w:t>Estabelece procedimentos para a prestação de informações ao Banco Central do Brasil relativas a contas de depósito em moeda estrangeira.</w:t>
             </w:r>
           </w:p>
         </w:tc>
@@ -621,7 +621,7 @@
           <w:color w:val="1A1A1A"/>
           <w:sz w:val="22"/>
         </w:rPr>
-        <w:t xml:space="preserve">Lei nº 15.461, de 7.7.2026 - Confere o título de Capital Nacional da Maior Onda do Brasil ao Município de Jaguaruna, no Estado de Santa Catarina.   </w:t>
+        <w:t xml:space="preserve">Lei nº 15.463, de 8.7.2026   </w:t>
       </w:r>
       <w:r>
         <w:rPr>
@@ -641,7 +641,7 @@
           <w:color w:val="4A4A4A"/>
           <w:sz w:val="20"/>
         </w:rPr>
-        <w:t>Confere o título de Capital Nacional da Maior Onda do Brasil ao Município de Jaguaruna, no Estado de Santa Catarina.</w:t>
+        <w:t>Institui o Dia Nacional dos Congados e Reinados, a ser comemorado anualmente em 7 de outubro.</w:t>
       </w:r>
     </w:p>
     <w:p>
@@ -661,7 +661,7 @@
           <w:color w:val="888888"/>
           <w:sz w:val="18"/>
         </w:rPr>
-        <w:t xml:space="preserve">2026-07-08   </w:t>
+        <w:t xml:space="preserve">2026-07-09   </w:t>
       </w:r>
       <w:hyperlink r:id="rId14">
         <w:r>
@@ -684,7 +684,7 @@
           <w:color w:val="888888"/>
           <w:sz w:val="16"/>
         </w:rPr>
-        <w:t>Lei com caráter honorífico, sem impacto direto a clientes corporativos.</w:t>
+        <w:t>Institui data comemorativa, sem impacto direto a clientes corporativos.</w:t>
       </w:r>
     </w:p>
     <w:p>
@@ -697,15 +697,15 @@
           <w:color w:val="1A1A1A"/>
           <w:sz w:val="22"/>
         </w:rPr>
-        <w:t xml:space="preserve">Lei nº 15.460, de 7.7.2026 - Institui o Dia Nacional do Vinho, a ser comemorado no primeiro domingo do mês de junho.   </w:t>
+        <w:t xml:space="preserve">Lei nº 15.462, de 8.7.2026   </w:t>
       </w:r>
       <w:r>
         <w:rPr>
           <w:b/>
-          <w:color w:val="7F8C8D"/>
+          <w:color w:val="D68910"/>
           <w:sz w:val="16"/>
         </w:rPr>
-        <w:t>[BAIXA]</w:t>
+        <w:t>[MÉDIA]</w:t>
       </w:r>
     </w:p>
     <w:p>
@@ -717,7 +717,7 @@
           <w:color w:val="4A4A4A"/>
           <w:sz w:val="20"/>
         </w:rPr>
-        <w:t>Institui o Dia Nacional do Vinho, a ser comemorado no primeiro domingo do mês de junho.</w:t>
+        <w:t>Altera a Lei de Diretrizes e Bases da Educação Nacional (Lei nº 9.394/1996) para especificar atividades de aperfeiçoamento profissional continuado dos profissionais da educação básica pública.</w:t>
       </w:r>
     </w:p>
     <w:p>
@@ -737,7 +737,7 @@
           <w:color w:val="888888"/>
           <w:sz w:val="18"/>
         </w:rPr>
-        <w:t xml:space="preserve">2026-07-08   </w:t>
+        <w:t xml:space="preserve">2026-07-09   </w:t>
       </w:r>
       <w:hyperlink r:id="rId15">
         <w:r>
@@ -760,7 +760,7 @@
           <w:color w:val="888888"/>
           <w:sz w:val="16"/>
         </w:rPr>
-        <w:t>Lei com caráter comemorativo, sem impacto direto a clientes corporativos.</w:t>
+        <w:t>Alteração de legislação educacional com impacto em profissionais da educação.</w:t>
       </w:r>
     </w:p>
     <w:p>
@@ -773,15 +773,15 @@
           <w:color w:val="1A1A1A"/>
           <w:sz w:val="22"/>
         </w:rPr>
-        <w:t xml:space="preserve">Lei nº 15.459, de 7.7.2026 - Altera a Lei nº 7.405, de 12 de novembro de 1985, para estabelecer a utilização do Símbolo Internacional de Acessibilidade.   </w:t>
+        <w:t xml:space="preserve">Lei nº 15.461, de 7.7.2026   </w:t>
       </w:r>
       <w:r>
         <w:rPr>
           <w:b/>
-          <w:color w:val="D68910"/>
+          <w:color w:val="7F8C8D"/>
           <w:sz w:val="16"/>
         </w:rPr>
-        <w:t>[MÉDIA]</w:t>
+        <w:t>[BAIXA]</w:t>
       </w:r>
     </w:p>
     <w:p>
@@ -793,7 +793,7 @@
           <w:color w:val="4A4A4A"/>
           <w:sz w:val="20"/>
         </w:rPr>
-        <w:t>Altera a Lei nº 7.405, de 1985, para estabelecer a utilização do Símbolo Internacional de Acessibilidade.</w:t>
+        <w:t>Confere o título de Capital Nacional da Maior Onda do Brasil ao Município de Jaguaruna, no Estado de Santa Catarina.</w:t>
       </w:r>
     </w:p>
     <w:p>
@@ -836,7 +836,7 @@
           <w:color w:val="888888"/>
           <w:sz w:val="16"/>
         </w:rPr>
-        <w:t>Alteração de lei que pode ter implicações para empresas em termos de acessibilidade e conformidade.</w:t>
+        <w:t>Confere título honorífico a município, sem impacto direto a clientes corporativos.</w:t>
       </w:r>
     </w:p>
     <w:p>
@@ -849,7 +849,7 @@
           <w:color w:val="1A1A1A"/>
           <w:sz w:val="22"/>
         </w:rPr>
-        <w:t xml:space="preserve">Decreto nº 13.060, de 7.7.2026 - Altera o Decreto nº 10.172, de 11 de dezembro de 2019, para alterar a composição do Conselho Fiscal do Serviço Autônomo Embratur – Agência Brasileira de Promoção Internacional do Turismo.   </w:t>
+        <w:t xml:space="preserve">Lei nº 15.460, de 7.7.2026   </w:t>
       </w:r>
       <w:r>
         <w:rPr>
@@ -869,7 +869,7 @@
           <w:color w:val="4A4A4A"/>
           <w:sz w:val="20"/>
         </w:rPr>
-        <w:t>Altera a composição do Conselho Fiscal do Serviço Autônomo Embratur – Agência Brasileira de Promoção Internacional do Turismo.</w:t>
+        <w:t>Institui o Dia Nacional do Vinho, a ser comemorado no primeiro domingo do mês de junho.</w:t>
       </w:r>
     </w:p>
     <w:p>
@@ -912,7 +912,7 @@
           <w:color w:val="888888"/>
           <w:sz w:val="16"/>
         </w:rPr>
-        <w:t>Alteração administrativa interna de órgão público, com baixo impacto corporativo direto.</w:t>
+        <w:t>Institui data comemorativa, sem impacto direto a clientes corporativos.</w:t>
       </w:r>
     </w:p>
     <w:p>
@@ -925,15 +925,15 @@
           <w:color w:val="1A1A1A"/>
           <w:sz w:val="22"/>
         </w:rPr>
-        <w:t xml:space="preserve">Decreto nº 13.059, de 7.7.2026 - Remaneja, em caráter temporário, cargo em comissão e funções de confiança para o Ministério das Relações Exteriores.   </w:t>
+        <w:t xml:space="preserve">Lei nº 15.459, de 7.7.2026   </w:t>
       </w:r>
       <w:r>
         <w:rPr>
           <w:b/>
-          <w:color w:val="7F8C8D"/>
+          <w:color w:val="D68910"/>
           <w:sz w:val="16"/>
         </w:rPr>
-        <w:t>[BAIXA]</w:t>
+        <w:t>[MÉDIA]</w:t>
       </w:r>
     </w:p>
     <w:p>
@@ -945,7 +945,7 @@
           <w:color w:val="4A4A4A"/>
           <w:sz w:val="20"/>
         </w:rPr>
-        <w:t>Remaneja, em caráter temporário, cargo em comissão e funções de confiança para o Ministério das Relações Exteriores.</w:t>
+        <w:t>Altera a Lei nº 7.405, de 12 de novembro de 1985, para estabelecer a utilização do Símbolo Internacional de Acessibilidade.</w:t>
       </w:r>
     </w:p>
     <w:p>
@@ -988,7 +988,7 @@
           <w:color w:val="888888"/>
           <w:sz w:val="16"/>
         </w:rPr>
-        <w:t>Alteração administrativa interna de órgão público, com baixo impacto corporativo direto.</w:t>
+        <w:t>Alteração de lei para estabelecer símbolo de acessibilidade, com potencial impacto em infraestrutura e serviços.</w:t>
       </w:r>
     </w:p>
     <w:p>
@@ -1001,7 +1001,7 @@
           <w:color w:val="1A1A1A"/>
           <w:sz w:val="22"/>
         </w:rPr>
-        <w:t xml:space="preserve">Decreto nº 13.058, de 7.7.2026 - Altera o Decreto nº 11.198, de 15 de setembro de 2022, que aprova a Estrutura Regimental e o Quadro Demonstrativo dos Cargos em Comissão e das Funções de Confiança do Departamento Nacional de Obras Contra as Secas, e remaneja e transforma cargos em comissão e funções de confiança.   </w:t>
+        <w:t xml:space="preserve">Decreto nº 13.060, de 7.7.2026   </w:t>
       </w:r>
       <w:r>
         <w:rPr>
@@ -1021,7 +1021,7 @@
           <w:color w:val="4A4A4A"/>
           <w:sz w:val="20"/>
         </w:rPr>
-        <w:t>Altera a Estrutura Regimental e o Quadro Demonstrativo de Cargos e Funções do Departamento Nacional de Obras Contra as Secas (DNOCS).</w:t>
+        <w:t>Altera o Decreto nº 10.172/2019 para modificar a composição do Conselho Fiscal do Serviço Autônomo Embratur – Agência Brasileira de Promoção Internacional do Turismo.</w:t>
       </w:r>
     </w:p>
     <w:p>
@@ -1064,7 +1064,7 @@
           <w:color w:val="888888"/>
           <w:sz w:val="16"/>
         </w:rPr>
-        <w:t>Alteração administrativa interna de órgão público, com baixo impacto corporativo direto.</w:t>
+        <w:t>Alteração de composição de conselho fiscal de autarquia, de natureza administrativa interna.</w:t>
       </w:r>
     </w:p>
     <w:p>
@@ -1077,15 +1077,15 @@
           <w:color w:val="1A1A1A"/>
           <w:sz w:val="22"/>
         </w:rPr>
-        <w:t xml:space="preserve">Decreto nº 13.057, de 7.7.2026 - Altera o Decreto nº 2.338, de 7 de outubro de 1997, que aprova o Regulamento da Agência Nacional de Telecomunicações, e remaneja e transforma cargos em comissão e funções de confiança.   </w:t>
+        <w:t xml:space="preserve">Decreto nº 13.059, de 7.7.2026   </w:t>
       </w:r>
       <w:r>
         <w:rPr>
           <w:b/>
-          <w:color w:val="D68910"/>
+          <w:color w:val="7F8C8D"/>
           <w:sz w:val="16"/>
         </w:rPr>
-        <w:t>[MÉDIA]</w:t>
+        <w:t>[BAIXA]</w:t>
       </w:r>
     </w:p>
     <w:p>
@@ -1097,7 +1097,7 @@
           <w:color w:val="4A4A4A"/>
           <w:sz w:val="20"/>
         </w:rPr>
-        <w:t>Altera o Regulamento da Agência Nacional de Telecomunicações (ANATEL) e remaneja cargos e funções de confiança.</w:t>
+        <w:t>Remaneja, em caráter temporário, cargo em comissão e funções de confiança para o Ministério das Relações Exteriores.</w:t>
       </w:r>
     </w:p>
     <w:p>
@@ -1140,7 +1140,159 @@
           <w:color w:val="888888"/>
           <w:sz w:val="16"/>
         </w:rPr>
-        <w:t>Alteração no regulamento de uma agência reguladora, podendo ter impacto setorial.</w:t>
+        <w:t>Remanejamento de cargos administrativos, de natureza interna.</w:t>
+      </w:r>
+    </w:p>
+    <w:p>
+      <w:pPr>
+        <w:spacing w:before="160" w:after="40"/>
+      </w:pPr>
+      <w:r>
+        <w:rPr>
+          <w:b/>
+          <w:color w:val="1A1A1A"/>
+          <w:sz w:val="22"/>
+        </w:rPr>
+        <w:t xml:space="preserve">Decreto nº 13.058, de 7.7.2026   </w:t>
+      </w:r>
+      <w:r>
+        <w:rPr>
+          <w:b/>
+          <w:color w:val="7F8C8D"/>
+          <w:sz w:val="16"/>
+        </w:rPr>
+        <w:t>[BAIXA]</w:t>
+      </w:r>
+    </w:p>
+    <w:p>
+      <w:pPr>
+        <w:spacing w:after="40"/>
+      </w:pPr>
+      <w:r>
+        <w:rPr>
+          <w:color w:val="4A4A4A"/>
+          <w:sz w:val="20"/>
+        </w:rPr>
+        <w:t>Altera o Decreto nº 11.198/2022, que aprova a Estrutura Regimental e o Quadro Demonstrativo de Cargos e Funções do Departamento Nacional de Obras Contra as Secas (DNOCS), e remaneja e transforma cargos.</w:t>
+      </w:r>
+    </w:p>
+    <w:p>
+      <w:pPr>
+        <w:spacing w:after="40"/>
+      </w:pPr>
+      <w:r>
+        <w:rPr>
+          <w:b/>
+          <w:color w:val="888888"/>
+          <w:sz w:val="18"/>
+        </w:rPr>
+        <w:t xml:space="preserve">Publicado: </w:t>
+      </w:r>
+      <w:r>
+        <w:rPr>
+          <w:color w:val="888888"/>
+          <w:sz w:val="18"/>
+        </w:rPr>
+        <w:t xml:space="preserve">2026-07-08   </w:t>
+      </w:r>
+      <w:hyperlink r:id="rId21">
+        <w:r>
+          <w:rPr>
+            <w:color w:val="1A4D2E"/>
+            <w:u w:val="single"/>
+            <w:b/>
+          </w:rPr>
+          <w:t>Acessar materia</w:t>
+        </w:r>
+      </w:hyperlink>
+    </w:p>
+    <w:p>
+      <w:pPr>
+        <w:spacing w:after="120"/>
+      </w:pPr>
+      <w:r>
+        <w:rPr>
+          <w:i/>
+          <w:color w:val="888888"/>
+          <w:sz w:val="16"/>
+        </w:rPr>
+        <w:t>Alteração de estrutura regimental e remanejamento de cargos, de natureza administrativa interna.</w:t>
+      </w:r>
+    </w:p>
+    <w:p>
+      <w:pPr>
+        <w:spacing w:before="160" w:after="40"/>
+      </w:pPr>
+      <w:r>
+        <w:rPr>
+          <w:b/>
+          <w:color w:val="1A1A1A"/>
+          <w:sz w:val="22"/>
+        </w:rPr>
+        <w:t xml:space="preserve">Decreto nº 13.057, de 7.7.2026   </w:t>
+      </w:r>
+      <w:r>
+        <w:rPr>
+          <w:b/>
+          <w:color w:val="D68910"/>
+          <w:sz w:val="16"/>
+        </w:rPr>
+        <w:t>[MÉDIA]</w:t>
+      </w:r>
+    </w:p>
+    <w:p>
+      <w:pPr>
+        <w:spacing w:after="40"/>
+      </w:pPr>
+      <w:r>
+        <w:rPr>
+          <w:color w:val="4A4A4A"/>
+          <w:sz w:val="20"/>
+        </w:rPr>
+        <w:t>Altera o Decreto nº 2.338/1997, que aprova o Regulamento da Agência Nacional de Telecomunicações (Anatel), e remaneja e transforma cargos em comissão e funções de confiança.</w:t>
+      </w:r>
+    </w:p>
+    <w:p>
+      <w:pPr>
+        <w:spacing w:after="40"/>
+      </w:pPr>
+      <w:r>
+        <w:rPr>
+          <w:b/>
+          <w:color w:val="888888"/>
+          <w:sz w:val="18"/>
+        </w:rPr>
+        <w:t xml:space="preserve">Publicado: </w:t>
+      </w:r>
+      <w:r>
+        <w:rPr>
+          <w:color w:val="888888"/>
+          <w:sz w:val="18"/>
+        </w:rPr>
+        <w:t xml:space="preserve">2026-07-08   </w:t>
+      </w:r>
+      <w:hyperlink r:id="rId22">
+        <w:r>
+          <w:rPr>
+            <w:color w:val="1A4D2E"/>
+            <w:u w:val="single"/>
+            <w:b/>
+          </w:rPr>
+          <w:t>Acessar materia</w:t>
+        </w:r>
+      </w:hyperlink>
+    </w:p>
+    <w:p>
+      <w:pPr>
+        <w:spacing w:after="120"/>
+      </w:pPr>
+      <w:r>
+        <w:rPr>
+          <w:i/>
+          <w:color w:val="888888"/>
+          <w:sz w:val="16"/>
+        </w:rPr>
+        <w:t>Alteração de regulamento de agência reguladora (Anatel) e remanejamento de cargos, com potencial impacto setorial.</w:t>
       </w:r>
     </w:p>
     <w:p/>
@@ -1206,15 +1358,15 @@
           <w:color w:val="1A1A1A"/>
           <w:sz w:val="22"/>
         </w:rPr>
-        <w:t xml:space="preserve">Comunicado n° 45.517, 8/7/2026   </w:t>
+        <w:t xml:space="preserve">Comunicado n° 45.529, 9/7/2026   </w:t>
       </w:r>
       <w:r>
         <w:rPr>
           <w:b/>
-          <w:color w:val="C0392B"/>
+          <w:color w:val="D68910"/>
           <w:sz w:val="16"/>
         </w:rPr>
-        <w:t>[ALTA]</w:t>
+        <w:t>[MÉDIA]</w:t>
       </w:r>
     </w:p>
     <w:p>
@@ -1226,7 +1378,7 @@
           <w:color w:val="4A4A4A"/>
           <w:sz w:val="20"/>
         </w:rPr>
-        <w:t>Divulga a Taxa Básica Financeira (TBF), o Redutor "R" e a Taxa Referencial (TR) relativos a 7 de julho de 2026.</w:t>
+        <w:t>Divulga nome de pessoa com interesse em participar do controle de Instituição de Pagamento.</w:t>
       </w:r>
     </w:p>
     <w:p>
@@ -1246,7 +1398,235 @@
           <w:color w:val="888888"/>
           <w:sz w:val="18"/>
         </w:rPr>
-        <w:t xml:space="preserve">2026-07-08T09:01   </w:t>
+        <w:t xml:space="preserve">2026-07-09T10:21   </w:t>
+      </w:r>
+      <w:hyperlink r:id="rId23">
+        <w:r>
+          <w:rPr>
+            <w:color w:val="1A4D2E"/>
+            <w:u w:val="single"/>
+            <w:b/>
+          </w:rPr>
+          <w:t>Acessar materia</w:t>
+        </w:r>
+      </w:hyperlink>
+    </w:p>
+    <w:p>
+      <w:pPr>
+        <w:spacing w:after="120"/>
+      </w:pPr>
+      <w:r>
+        <w:rPr>
+          <w:i/>
+          <w:color w:val="888888"/>
+          <w:sz w:val="16"/>
+        </w:rPr>
+        <w:t>Divulgação de interesse em controle de instituição de pagamento, relevante para o setor financeiro.</w:t>
+      </w:r>
+    </w:p>
+    <w:p>
+      <w:pPr>
+        <w:spacing w:before="160" w:after="40"/>
+      </w:pPr>
+      <w:r>
+        <w:rPr>
+          <w:b/>
+          <w:color w:val="1A1A1A"/>
+          <w:sz w:val="22"/>
+        </w:rPr>
+        <w:t xml:space="preserve">Comunicado n° 45.528, 9/7/2026   </w:t>
+      </w:r>
+      <w:r>
+        <w:rPr>
+          <w:b/>
+          <w:color w:val="D68910"/>
+          <w:sz w:val="16"/>
+        </w:rPr>
+        <w:t>[MÉDIA]</w:t>
+      </w:r>
+    </w:p>
+    <w:p>
+      <w:pPr>
+        <w:spacing w:after="40"/>
+      </w:pPr>
+      <w:r>
+        <w:rPr>
+          <w:color w:val="4A4A4A"/>
+          <w:sz w:val="20"/>
+        </w:rPr>
+        <w:t>Divulga, para fins de recebimento de eventuais objeções, nomes de pessoas eleitas ou nomeadas para ocupar cargos de administração em instituições autorizadas a funcionar.</w:t>
+      </w:r>
+    </w:p>
+    <w:p>
+      <w:pPr>
+        <w:spacing w:after="40"/>
+      </w:pPr>
+      <w:r>
+        <w:rPr>
+          <w:b/>
+          <w:color w:val="888888"/>
+          <w:sz w:val="18"/>
+        </w:rPr>
+        <w:t xml:space="preserve">Publicado: </w:t>
+      </w:r>
+      <w:r>
+        <w:rPr>
+          <w:color w:val="888888"/>
+          <w:sz w:val="18"/>
+        </w:rPr>
+        <w:t xml:space="preserve">2026-07-09T09:36   </w:t>
+      </w:r>
+      <w:hyperlink r:id="rId24">
+        <w:r>
+          <w:rPr>
+            <w:color w:val="1A4D2E"/>
+            <w:u w:val="single"/>
+            <w:b/>
+          </w:rPr>
+          <w:t>Acessar materia</w:t>
+        </w:r>
+      </w:hyperlink>
+    </w:p>
+    <w:p>
+      <w:pPr>
+        <w:spacing w:after="120"/>
+      </w:pPr>
+      <w:r>
+        <w:rPr>
+          <w:i/>
+          <w:color w:val="888888"/>
+          <w:sz w:val="16"/>
+        </w:rPr>
+        <w:t>Divulgação de nomes para cargos de administração em instituições financeiras, importante para governança corporativa.</w:t>
+      </w:r>
+    </w:p>
+    <w:p>
+      <w:pPr>
+        <w:spacing w:before="160" w:after="40"/>
+      </w:pPr>
+      <w:r>
+        <w:rPr>
+          <w:b/>
+          <w:color w:val="1A1A1A"/>
+          <w:sz w:val="22"/>
+        </w:rPr>
+        <w:t xml:space="preserve">Comunicado n° 45.527, 9/7/2026   </w:t>
+      </w:r>
+      <w:r>
+        <w:rPr>
+          <w:b/>
+          <w:color w:val="D68910"/>
+          <w:sz w:val="16"/>
+        </w:rPr>
+        <w:t>[MÉDIA]</w:t>
+      </w:r>
+    </w:p>
+    <w:p>
+      <w:pPr>
+        <w:spacing w:after="40"/>
+      </w:pPr>
+      <w:r>
+        <w:rPr>
+          <w:color w:val="4A4A4A"/>
+          <w:sz w:val="20"/>
+        </w:rPr>
+        <w:t>Divulga nome aprovado de pessoas eleitas/nomeadas para cargos de órgãos estatutários ou contratuais de sociedades autorizadas a funcionar pelo Banco Central do Brasil.</w:t>
+      </w:r>
+    </w:p>
+    <w:p>
+      <w:pPr>
+        <w:spacing w:after="40"/>
+      </w:pPr>
+      <w:r>
+        <w:rPr>
+          <w:b/>
+          <w:color w:val="888888"/>
+          <w:sz w:val="18"/>
+        </w:rPr>
+        <w:t xml:space="preserve">Publicado: </w:t>
+      </w:r>
+      <w:r>
+        <w:rPr>
+          <w:color w:val="888888"/>
+          <w:sz w:val="18"/>
+        </w:rPr>
+        <w:t xml:space="preserve">2026-07-09T09:35   </w:t>
+      </w:r>
+      <w:hyperlink r:id="rId25">
+        <w:r>
+          <w:rPr>
+            <w:color w:val="1A4D2E"/>
+            <w:u w:val="single"/>
+            <w:b/>
+          </w:rPr>
+          <w:t>Acessar materia</w:t>
+        </w:r>
+      </w:hyperlink>
+    </w:p>
+    <w:p>
+      <w:pPr>
+        <w:spacing w:after="120"/>
+      </w:pPr>
+      <w:r>
+        <w:rPr>
+          <w:i/>
+          <w:color w:val="888888"/>
+          <w:sz w:val="16"/>
+        </w:rPr>
+        <w:t>Divulgação de nomes aprovados para cargos em instituições financeiras, importante para governança corporativa.</w:t>
+      </w:r>
+    </w:p>
+    <w:p>
+      <w:pPr>
+        <w:spacing w:before="160" w:after="40"/>
+      </w:pPr>
+      <w:r>
+        <w:rPr>
+          <w:b/>
+          <w:color w:val="1A1A1A"/>
+          <w:sz w:val="22"/>
+        </w:rPr>
+        <w:t xml:space="preserve">Comunicado n° 45.526, 9/7/2026   </w:t>
+      </w:r>
+      <w:r>
+        <w:rPr>
+          <w:b/>
+          <w:color w:val="C0392B"/>
+          <w:sz w:val="16"/>
+        </w:rPr>
+        <w:t>[ALTA]</w:t>
+      </w:r>
+    </w:p>
+    <w:p>
+      <w:pPr>
+        <w:spacing w:after="40"/>
+      </w:pPr>
+      <w:r>
+        <w:rPr>
+          <w:color w:val="4A4A4A"/>
+          <w:sz w:val="20"/>
+        </w:rPr>
+        <w:t>Divulga a Taxa Básica Financeira (TBF), o Redutor 'R' e a Taxa Referencial (TR) relativos a 8 de julho de 2026.</w:t>
+      </w:r>
+    </w:p>
+    <w:p>
+      <w:pPr>
+        <w:spacing w:after="40"/>
+      </w:pPr>
+      <w:r>
+        <w:rPr>
+          <w:b/>
+          <w:color w:val="888888"/>
+          <w:sz w:val="18"/>
+        </w:rPr>
+        <w:t xml:space="preserve">Publicado: </w:t>
+      </w:r>
+      <w:r>
+        <w:rPr>
+          <w:color w:val="888888"/>
+          <w:sz w:val="18"/>
+        </w:rPr>
+        <w:t xml:space="preserve">2026-07-09T09:02   </w:t>
       </w:r>
       <w:hyperlink r:id="rId9">
         <w:r>
@@ -1269,7 +1649,7 @@
           <w:color w:val="888888"/>
           <w:sz w:val="16"/>
         </w:rPr>
-        <w:t>Divulgação de taxas financeiras de referência, crucial para o mercado financeiro.</w:t>
+        <w:t>Divulgação de taxas financeiras de referência, com impacto direto no mercado e operações financeiras.</w:t>
       </w:r>
     </w:p>
     <w:p>
@@ -1282,7 +1662,7 @@
           <w:color w:val="1A1A1A"/>
           <w:sz w:val="22"/>
         </w:rPr>
-        <w:t xml:space="preserve">Comunicado n° 45.516, 7/7/2026   </w:t>
+        <w:t xml:space="preserve">Comunicado n° 45.525, 8/7/2026   </w:t>
       </w:r>
       <w:r>
         <w:rPr>
@@ -1302,7 +1682,7 @@
           <w:color w:val="4A4A4A"/>
           <w:sz w:val="20"/>
         </w:rPr>
-        <w:t>Divulga condições para a realização de operações compromissadas com instituições financeiras participantes do módulo Oferta Pública (Ofpub).</w:t>
+        <w:t>Divulga as condições de oferta pública para a realização de operações de swap para fins de rolagem do vencimento de 03/08/2026.</w:t>
       </w:r>
     </w:p>
     <w:p>
@@ -1322,7 +1702,7 @@
           <w:color w:val="888888"/>
           <w:sz w:val="18"/>
         </w:rPr>
-        <w:t xml:space="preserve">2026-07-07T18:30   </w:t>
+        <w:t xml:space="preserve">2026-07-08T18:31   </w:t>
       </w:r>
       <w:hyperlink r:id="rId10">
         <w:r>
@@ -1345,7 +1725,7 @@
           <w:color w:val="888888"/>
           <w:sz w:val="16"/>
         </w:rPr>
-        <w:t>Impacto direto em operações de instituições financeiras no mercado.</w:t>
+        <w:t>Condições de oferta pública para operações de swap, relevante para o mercado financeiro e gestão de dívida.</w:t>
       </w:r>
     </w:p>
     <w:p>
@@ -1358,7 +1738,7 @@
           <w:color w:val="1A1A1A"/>
           <w:sz w:val="22"/>
         </w:rPr>
-        <w:t xml:space="preserve">Comunicado n° 45.515, 7/7/2026   </w:t>
+        <w:t xml:space="preserve">Comunicado n° 45.524, 8/7/2026   </w:t>
       </w:r>
       <w:r>
         <w:rPr>
@@ -1378,7 +1758,7 @@
           <w:color w:val="4A4A4A"/>
           <w:sz w:val="20"/>
         </w:rPr>
-        <w:t>Divulga as condições de oferta pública para a realização de operações de swap para fins de rolagem do vencimento de 03/08/2026.</w:t>
+        <w:t>Divulga condições para a realização de operações compromissadas com instituições financeiras participantes do módulo Oferta Pública (Ofpub).</w:t>
       </w:r>
     </w:p>
     <w:p>
@@ -1398,7 +1778,7 @@
           <w:color w:val="888888"/>
           <w:sz w:val="18"/>
         </w:rPr>
-        <w:t xml:space="preserve">2026-07-07T18:30   </w:t>
+        <w:t xml:space="preserve">2026-07-08T18:30   </w:t>
       </w:r>
       <w:hyperlink r:id="rId11">
         <w:r>
@@ -1421,7 +1801,7 @@
           <w:color w:val="888888"/>
           <w:sz w:val="16"/>
         </w:rPr>
-        <w:t>Impacto direto em operações de mercado financeiro, como swaps.</w:t>
+        <w:t>Condições para operações compromissadas, com impacto direto nas instituições financeiras e no mercado.</w:t>
       </w:r>
     </w:p>
     <w:p>
@@ -1434,15 +1814,15 @@
           <w:color w:val="1A1A1A"/>
           <w:sz w:val="22"/>
         </w:rPr>
-        <w:t xml:space="preserve">Comunicado n° 45.514, 7/7/2026   </w:t>
+        <w:t xml:space="preserve">Comunicado n° 45.523, 8/7/2026   </w:t>
       </w:r>
       <w:r>
         <w:rPr>
           <w:b/>
-          <w:color w:val="C0392B"/>
+          <w:color w:val="D68910"/>
           <w:sz w:val="16"/>
         </w:rPr>
-        <w:t>[ALTA]</w:t>
+        <w:t>[MÉDIA]</w:t>
       </w:r>
     </w:p>
     <w:p>
@@ -1454,7 +1834,7 @@
           <w:color w:val="4A4A4A"/>
           <w:sz w:val="20"/>
         </w:rPr>
-        <w:t>Divulga comunicado do Grupo de Ação Financeira contra a Lavagem de Dinheiro e o Financiamento do Terrorismo (GAFI/FATF).</w:t>
+        <w:t>Divulga nome de pessoas com interesse em exercer o controle de Instituição de Pagamento.</w:t>
       </w:r>
     </w:p>
     <w:p>
@@ -1474,7 +1854,83 @@
           <w:color w:val="888888"/>
           <w:sz w:val="18"/>
         </w:rPr>
-        <w:t xml:space="preserve">2026-07-07T15:28   </w:t>
+        <w:t xml:space="preserve">2026-07-08T17:40   </w:t>
+      </w:r>
+      <w:hyperlink r:id="rId26">
+        <w:r>
+          <w:rPr>
+            <w:color w:val="1A4D2E"/>
+            <w:u w:val="single"/>
+            <w:b/>
+          </w:rPr>
+          <w:t>Acessar materia</w:t>
+        </w:r>
+      </w:hyperlink>
+    </w:p>
+    <w:p>
+      <w:pPr>
+        <w:spacing w:after="120"/>
+      </w:pPr>
+      <w:r>
+        <w:rPr>
+          <w:i/>
+          <w:color w:val="888888"/>
+          <w:sz w:val="16"/>
+        </w:rPr>
+        <w:t>Divulgação de interesse em controle de instituição de pagamento, relevante para o setor financeiro.</w:t>
+      </w:r>
+    </w:p>
+    <w:p>
+      <w:pPr>
+        <w:spacing w:before="160" w:after="40"/>
+      </w:pPr>
+      <w:r>
+        <w:rPr>
+          <w:b/>
+          <w:color w:val="1A1A1A"/>
+          <w:sz w:val="22"/>
+        </w:rPr>
+        <w:t xml:space="preserve">Instrução Normativa BCB n° 758, 8/7/2026   </w:t>
+      </w:r>
+      <w:r>
+        <w:rPr>
+          <w:b/>
+          <w:color w:val="C0392B"/>
+          <w:sz w:val="16"/>
+        </w:rPr>
+        <w:t>[ALTA]</w:t>
+      </w:r>
+    </w:p>
+    <w:p>
+      <w:pPr>
+        <w:spacing w:after="40"/>
+      </w:pPr>
+      <w:r>
+        <w:rPr>
+          <w:color w:val="4A4A4A"/>
+          <w:sz w:val="20"/>
+        </w:rPr>
+        <w:t>Altera o Manual de Crédito Rural (MCR) para ajustar prazos e orientar instituições financeiras sobre procedimentos de reversão de desclassificação no Sicor.</w:t>
+      </w:r>
+    </w:p>
+    <w:p>
+      <w:pPr>
+        <w:spacing w:after="40"/>
+      </w:pPr>
+      <w:r>
+        <w:rPr>
+          <w:b/>
+          <w:color w:val="888888"/>
+          <w:sz w:val="18"/>
+        </w:rPr>
+        <w:t xml:space="preserve">Publicado: </w:t>
+      </w:r>
+      <w:r>
+        <w:rPr>
+          <w:color w:val="888888"/>
+          <w:sz w:val="18"/>
+        </w:rPr>
+        <w:t xml:space="preserve">2026-07-08T16:43   </w:t>
       </w:r>
       <w:hyperlink r:id="rId12">
         <w:r>
@@ -1497,7 +1953,7 @@
           <w:color w:val="888888"/>
           <w:sz w:val="16"/>
         </w:rPr>
-        <w:t>Norma regulatória internacional com impacto em compliance de instituições financeiras.</w:t>
+        <w:t>Alteração de norma que afeta o crédito rural, com impacto direto em instituições financeiras e produtores.</w:t>
       </w:r>
     </w:p>
     <w:p>
@@ -1510,7 +1966,7 @@
           <w:color w:val="1A1A1A"/>
           <w:sz w:val="22"/>
         </w:rPr>
-        <w:t xml:space="preserve">Comunicado n° 45.513, 7/7/2026   </w:t>
+        <w:t xml:space="preserve">Comunicado n° 45.522, 8/7/2026   </w:t>
       </w:r>
       <w:r>
         <w:rPr>
@@ -1530,7 +1986,7 @@
           <w:color w:val="4A4A4A"/>
           <w:sz w:val="20"/>
         </w:rPr>
-        <w:t>Divulga nomes de pessoas eleitas ou nomeadas para cargos de administração em instituições autorizadas a funcionar, para fins de objeções.</w:t>
+        <w:t>Divulga o resultado de leilões de swap.</w:t>
       </w:r>
     </w:p>
     <w:p>
@@ -1550,9 +2006,9 @@
           <w:color w:val="888888"/>
           <w:sz w:val="18"/>
         </w:rPr>
-        <w:t xml:space="preserve">2026-07-07T09:32   </w:t>
+        <w:t xml:space="preserve">2026-07-08T11:46   </w:t>
       </w:r>
-      <w:hyperlink r:id="rId21">
+      <w:hyperlink r:id="rId27">
         <w:r>
           <w:rPr>
             <w:color w:val="1A4D2E"/>
@@ -1573,7 +2029,7 @@
           <w:color w:val="888888"/>
           <w:sz w:val="16"/>
         </w:rPr>
-        <w:t>Atualização administrativa relevante para o setor financeiro.</w:t>
+        <w:t>Divulgação de resultados de leilões de swap, com relevância para o mercado financeiro.</w:t>
       </w:r>
     </w:p>
     <w:p>
@@ -1586,7 +2042,7 @@
           <w:color w:val="1A1A1A"/>
           <w:sz w:val="22"/>
         </w:rPr>
-        <w:t xml:space="preserve">Comunicado n° 45.512, 7/7/2026   </w:t>
+        <w:t xml:space="preserve">Comunicado n° 45.521, 8/7/2026   </w:t>
       </w:r>
       <w:r>
         <w:rPr>
@@ -1606,7 +2062,7 @@
           <w:color w:val="4A4A4A"/>
           <w:sz w:val="20"/>
         </w:rPr>
-        <w:t>Divulga nome aprovado de pessoas eleitas/nomeadas para cargos de órgãos estatutários ou contratuais de sociedades autorizadas a funcionar pelo Banco Central.</w:t>
+        <w:t>Divulga a realização de leilão de Swap Cambial Tradicional para fins de rolagem.</w:t>
       </w:r>
     </w:p>
     <w:p>
@@ -1626,9 +2082,9 @@
           <w:color w:val="888888"/>
           <w:sz w:val="18"/>
         </w:rPr>
-        <w:t xml:space="preserve">2026-07-07T09:30   </w:t>
+        <w:t xml:space="preserve">2026-07-08T11:30   </w:t>
       </w:r>
-      <w:hyperlink r:id="rId22">
+      <w:hyperlink r:id="rId28">
         <w:r>
           <w:rPr>
             <w:color w:val="1A4D2E"/>
@@ -1649,7 +2105,7 @@
           <w:color w:val="888888"/>
           <w:sz w:val="16"/>
         </w:rPr>
-        <w:t>Atualização administrativa relevante para o setor financeiro.</w:t>
+        <w:t>Divulgação de leilão de swap cambial, com impacto no mercado de câmbio.</w:t>
       </w:r>
     </w:p>
     <w:p>
@@ -1662,15 +2118,15 @@
           <w:color w:val="1A1A1A"/>
           <w:sz w:val="22"/>
         </w:rPr>
-        <w:t xml:space="preserve">Comunicado n° 45.511, 7/7/2026   </w:t>
+        <w:t xml:space="preserve">Comunicado n° 45.520, 8/7/2026   </w:t>
       </w:r>
       <w:r>
         <w:rPr>
           <w:b/>
-          <w:color w:val="C0392B"/>
+          <w:color w:val="D68910"/>
           <w:sz w:val="16"/>
         </w:rPr>
-        <w:t>[ALTA]</w:t>
+        <w:t>[MÉDIA]</w:t>
       </w:r>
     </w:p>
     <w:p>
@@ -1682,7 +2138,7 @@
           <w:color w:val="4A4A4A"/>
           <w:sz w:val="20"/>
         </w:rPr>
-        <w:t>Divulga as Taxas Básicas Financeiras (TBF), os Redutores "R" e as Taxas Referenciais (TR) relativos a 4, 5 e 6 de julho de 2026.</w:t>
+        <w:t>Divulga a realização de leilão de Swap Cambial Tradicional para fins de rolagem.</w:t>
       </w:r>
     </w:p>
     <w:p>
@@ -1702,7 +2158,83 @@
           <w:color w:val="888888"/>
           <w:sz w:val="18"/>
         </w:rPr>
-        <w:t xml:space="preserve">2026-07-07T09:06   </w:t>
+        <w:t xml:space="preserve">2026-07-08T11:30   </w:t>
+      </w:r>
+      <w:hyperlink r:id="rId29">
+        <w:r>
+          <w:rPr>
+            <w:color w:val="1A4D2E"/>
+            <w:u w:val="single"/>
+            <w:b/>
+          </w:rPr>
+          <w:t>Acessar materia</w:t>
+        </w:r>
+      </w:hyperlink>
+    </w:p>
+    <w:p>
+      <w:pPr>
+        <w:spacing w:after="120"/>
+      </w:pPr>
+      <w:r>
+        <w:rPr>
+          <w:i/>
+          <w:color w:val="888888"/>
+          <w:sz w:val="16"/>
+        </w:rPr>
+        <w:t>Divulgação de leilão de swap cambial, com impacto no mercado de câmbio.</w:t>
+      </w:r>
+    </w:p>
+    <w:p>
+      <w:pPr>
+        <w:spacing w:before="160" w:after="40"/>
+      </w:pPr>
+      <w:r>
+        <w:rPr>
+          <w:b/>
+          <w:color w:val="1A1A1A"/>
+          <w:sz w:val="22"/>
+        </w:rPr>
+        <w:t xml:space="preserve">Instrução Normativa BCB n° 757, 8/7/2026   </w:t>
+      </w:r>
+      <w:r>
+        <w:rPr>
+          <w:b/>
+          <w:color w:val="C0392B"/>
+          <w:sz w:val="16"/>
+        </w:rPr>
+        <w:t>[ALTA]</w:t>
+      </w:r>
+    </w:p>
+    <w:p>
+      <w:pPr>
+        <w:spacing w:after="40"/>
+      </w:pPr>
+      <w:r>
+        <w:rPr>
+          <w:color w:val="4A4A4A"/>
+          <w:sz w:val="20"/>
+        </w:rPr>
+        <w:t>Estabelece procedimentos para a prestação de informações ao Banco Central do Brasil relativas a contas de depósito em moeda estrangeira.</w:t>
+      </w:r>
+    </w:p>
+    <w:p>
+      <w:pPr>
+        <w:spacing w:after="40"/>
+      </w:pPr>
+      <w:r>
+        <w:rPr>
+          <w:b/>
+          <w:color w:val="888888"/>
+          <w:sz w:val="18"/>
+        </w:rPr>
+        <w:t xml:space="preserve">Publicado: </w:t>
+      </w:r>
+      <w:r>
+        <w:rPr>
+          <w:color w:val="888888"/>
+          <w:sz w:val="18"/>
+        </w:rPr>
+        <w:t xml:space="preserve">2026-07-08T10:39   </w:t>
       </w:r>
       <w:hyperlink r:id="rId13">
         <w:r>
@@ -1725,29 +2257,8 @@
           <w:color w:val="888888"/>
           <w:sz w:val="16"/>
         </w:rPr>
-        <w:t>Divulgação de taxas financeiras de referência, crucial para o mercado financeiro.</w:t>
+        <w:t>Norma que estabelece procedimentos para informações sobre contas em moeda estrangeira, com impacto em instituições financeiras e compliance.</w:t>
       </w:r>
-    </w:p>
-    <w:p>
-      <w:pPr>
-        <w:spacing w:before="240" w:after="80"/>
-      </w:pPr>
-      <w:r>
-        <w:rPr>
-          <w:b/>
-          <w:color w:val="1A4D2E"/>
-          <w:sz w:val="20"/>
-        </w:rPr>
-        <w:t>CVM | NOTÍCIAS</w:t>
-      </w:r>
-    </w:p>
-    <w:p>
-      <w:pPr>
-        <w:spacing w:before="0" w:after="40"/>
-        <w:pBdr>
-          <w:bottom w:val="single" w:sz="8" w:space="1" w:color="1A4D2E"/>
-        </w:pBdr>
-      </w:pPr>
     </w:p>
     <w:p>
       <w:pPr>
@@ -1759,7 +2270,7 @@
           <w:color w:val="1A1A1A"/>
           <w:sz w:val="22"/>
         </w:rPr>
-        <w:t xml:space="preserve">Até 14/7, participe da pesquisa do TCU sobre Termo de Compromisso   </w:t>
+        <w:t xml:space="preserve">Comunicado n° 45.519, 8/7/2026   </w:t>
       </w:r>
       <w:r>
         <w:rPr>
@@ -1779,7 +2290,7 @@
           <w:color w:val="4A4A4A"/>
           <w:sz w:val="20"/>
         </w:rPr>
-        <w:t>Consulta pública do TCU sobre Termo de Compromisso no âmbito de auditoria operacional sobre a governança da CVM.</w:t>
+        <w:t>Divulga, para fins de recebimento de eventuais objeções, nomes de pessoas eleitas ou nomeadas para ocupar cargos de administração em instituições autorizadas a funcionar.</w:t>
       </w:r>
     </w:p>
     <w:p>
@@ -1799,9 +2310,9 @@
           <w:color w:val="888888"/>
           <w:sz w:val="18"/>
         </w:rPr>
-        <w:t xml:space="preserve">2026-07-07   </w:t>
+        <w:t xml:space="preserve">2026-07-08T09:53   </w:t>
       </w:r>
-      <w:hyperlink r:id="rId23">
+      <w:hyperlink r:id="rId30">
         <w:r>
           <w:rPr>
             <w:color w:val="1A4D2E"/>
@@ -1822,7 +2333,7 @@
           <w:color w:val="888888"/>
           <w:sz w:val="16"/>
         </w:rPr>
-        <w:t>Pesquisa sobre governança de órgão regulador, podendo influenciar futuras práticas.</w:t>
+        <w:t>Divulgação de nomes para cargos de administração em instituições financeiras, importante para governança corporativa.</w:t>
       </w:r>
     </w:p>
     <w:p>
@@ -1835,15 +2346,15 @@
           <w:color w:val="1A1A1A"/>
           <w:sz w:val="22"/>
         </w:rPr>
-        <w:t xml:space="preserve">Colegiado da CVM aprova acordo de cooperação com ANBIMA   </w:t>
+        <w:t xml:space="preserve">Comunicado n° 45.518, 8/7/2026   </w:t>
       </w:r>
       <w:r>
         <w:rPr>
           <w:b/>
-          <w:color w:val="C0392B"/>
+          <w:color w:val="D68910"/>
           <w:sz w:val="16"/>
         </w:rPr>
-        <w:t>[ALTA]</w:t>
+        <w:t>[MÉDIA]</w:t>
       </w:r>
     </w:p>
     <w:p>
@@ -1855,7 +2366,7 @@
           <w:color w:val="4A4A4A"/>
           <w:sz w:val="20"/>
         </w:rPr>
-        <w:t>CVM e ANBIMA aprovam parceria para manutenção evolutiva do sistema de registro de ofertas públicas.</w:t>
+        <w:t>Divulga nome aprovado de pessoas eleitas/nomeadas para cargos de órgãos estatutários ou contratuais de sociedades autorizadas a funcionar pelo Banco Central do Brasil.</w:t>
       </w:r>
     </w:p>
     <w:p>
@@ -1875,9 +2386,9 @@
           <w:color w:val="888888"/>
           <w:sz w:val="18"/>
         </w:rPr>
-        <w:t xml:space="preserve">2026-07-07   </w:t>
+        <w:t xml:space="preserve">2026-07-08T09:46   </w:t>
       </w:r>
-      <w:hyperlink r:id="rId24">
+      <w:hyperlink r:id="rId31">
         <w:r>
           <w:rPr>
             <w:color w:val="1A4D2E"/>
@@ -1898,7 +2409,7 @@
           <w:color w:val="888888"/>
           <w:sz w:val="16"/>
         </w:rPr>
-        <w:t>Acordo entre órgãos reguladores que afeta diretamente o funcionamento e a eficiência do mercado de capitais.</w:t>
+        <w:t>Divulgação de nomes aprovados para cargos em instituições financeiras, importante para governança corporativa.</w:t>
       </w:r>
     </w:p>
     <w:p>
@@ -1911,7 +2422,7 @@
           <w:color w:val="1A4D2E"/>
           <w:sz w:val="20"/>
         </w:rPr>
-        <w:t>B3 | OFÍCIOS E COMUNICADOS</w:t>
+        <w:t>CVM | NOTÍCIAS</w:t>
       </w:r>
     </w:p>
     <w:p>
@@ -1932,15 +2443,15 @@
           <w:color w:val="1A1A1A"/>
           <w:sz w:val="22"/>
         </w:rPr>
-        <w:t xml:space="preserve">042-2026-VNC-Ofício Circular - Postergação do aprimoramento da funcionalidade de sincronização dos leilões de pré-abertura, regulares e de fechamento dos Contratos Futuros de Dólar (DOL/WDO), Futuros de Ibovespa (IND/WIN) e Futuros de S&amp;P 500 (ISP/WSP)   </w:t>
+        <w:t xml:space="preserve">Presidente da CVM participa de reunião com representantes da Abrasca   </w:t>
       </w:r>
       <w:r>
         <w:rPr>
           <w:b/>
-          <w:color w:val="C0392B"/>
+          <w:color w:val="D68910"/>
           <w:sz w:val="16"/>
         </w:rPr>
-        <w:t>[ALTA]</w:t>
+        <w:t>[MÉDIA]</w:t>
       </w:r>
     </w:p>
     <w:p>
@@ -1952,7 +2463,7 @@
           <w:color w:val="4A4A4A"/>
           <w:sz w:val="20"/>
         </w:rPr>
-        <w:t>Postergação do aprimoramento da funcionalidade de sincronização dos leilões de contratos futuros de Dólar, Ibovespa e S&amp;P 500 na B3.</w:t>
+        <w:t>Reunião abordou temas relacionados ao mercado de capitais, com a participação do presidente da CVM e representantes da Abrasca.</w:t>
       </w:r>
     </w:p>
     <w:p>
@@ -1972,9 +2483,9 @@
           <w:color w:val="888888"/>
           <w:sz w:val="18"/>
         </w:rPr>
-        <w:t xml:space="preserve">2026-07-07   </w:t>
+        <w:t xml:space="preserve">2026-07-08   </w:t>
       </w:r>
-      <w:hyperlink r:id="rId25">
+      <w:hyperlink r:id="rId32">
         <w:r>
           <w:rPr>
             <w:color w:val="1A4D2E"/>
@@ -1995,235 +2506,7 @@
           <w:color w:val="888888"/>
           <w:sz w:val="16"/>
         </w:rPr>
-        <w:t>Impacto operacional direto para participantes do mercado financeiro, afetando negociações de contratos futuros.</w:t>
-      </w:r>
-    </w:p>
-    <w:p>
-      <w:pPr>
-        <w:spacing w:before="160" w:after="40"/>
-      </w:pPr>
-      <w:r>
-        <w:rPr>
-          <w:b/>
-          <w:color w:val="1A1A1A"/>
-          <w:sz w:val="22"/>
-        </w:rPr>
-        <w:t xml:space="preserve">036-2026-VPC-Ofício Circular - Soluções de Grandes Lotes - Inclusão de Fundos de Investimentos em Índices (ETFs) de renda variável   </w:t>
-      </w:r>
-      <w:r>
-        <w:rPr>
-          <w:b/>
-          <w:color w:val="C0392B"/>
-          <w:sz w:val="16"/>
-        </w:rPr>
-        <w:t>[ALTA]</w:t>
-      </w:r>
-    </w:p>
-    <w:p>
-      <w:pPr>
-        <w:spacing w:after="40"/>
-      </w:pPr>
-      <w:r>
-        <w:rPr>
-          <w:color w:val="4A4A4A"/>
-          <w:sz w:val="20"/>
-        </w:rPr>
-        <w:t>A partir de 27/07/2026, será permitida a negociação de ETFs de renda variável nas Soluções de Grandes Lotes da B3.</w:t>
-      </w:r>
-    </w:p>
-    <w:p>
-      <w:pPr>
-        <w:spacing w:after="40"/>
-      </w:pPr>
-      <w:r>
-        <w:rPr>
-          <w:b/>
-          <w:color w:val="888888"/>
-          <w:sz w:val="18"/>
-        </w:rPr>
-        <w:t xml:space="preserve">Publicado: </w:t>
-      </w:r>
-      <w:r>
-        <w:rPr>
-          <w:color w:val="888888"/>
-          <w:sz w:val="18"/>
-        </w:rPr>
-        <w:t xml:space="preserve">2026-07-07   </w:t>
-      </w:r>
-      <w:hyperlink r:id="rId26">
-        <w:r>
-          <w:rPr>
-            <w:color w:val="1A4D2E"/>
-            <w:u w:val="single"/>
-            <w:b/>
-          </w:rPr>
-          <w:t>Acessar materia</w:t>
-        </w:r>
-      </w:hyperlink>
-    </w:p>
-    <w:p>
-      <w:pPr>
-        <w:spacing w:after="120"/>
-      </w:pPr>
-      <w:r>
-        <w:rPr>
-          <w:i/>
-          <w:color w:val="888888"/>
-          <w:sz w:val="16"/>
-        </w:rPr>
-        <w:t>Expansão de produtos e funcionalidades no mercado de capitais, relevante para investidores e gestores de fundos.</w:t>
-      </w:r>
-    </w:p>
-    <w:p>
-      <w:pPr>
-        <w:spacing w:before="160" w:after="40"/>
-      </w:pPr>
-      <w:r>
-        <w:rPr>
-          <w:b/>
-          <w:color w:val="1A1A1A"/>
-          <w:sz w:val="22"/>
-        </w:rPr>
-        <w:t xml:space="preserve">035-2026-VPC-Ofício Circular - Lançamento do Índice B3 Bancos   </w:t>
-      </w:r>
-      <w:r>
-        <w:rPr>
-          <w:b/>
-          <w:color w:val="C0392B"/>
-          <w:sz w:val="16"/>
-        </w:rPr>
-        <w:t>[ALTA]</w:t>
-      </w:r>
-    </w:p>
-    <w:p>
-      <w:pPr>
-        <w:spacing w:after="40"/>
-      </w:pPr>
-      <w:r>
-        <w:rPr>
-          <w:color w:val="4A4A4A"/>
-          <w:sz w:val="20"/>
-        </w:rPr>
-        <w:t>Lançamento do Índice B3 Bancos, disponível a partir de 07/07/2026, como indicador de retorno total de carteira de ativos do segmento bancário.</w:t>
-      </w:r>
-    </w:p>
-    <w:p>
-      <w:pPr>
-        <w:spacing w:after="40"/>
-      </w:pPr>
-      <w:r>
-        <w:rPr>
-          <w:b/>
-          <w:color w:val="888888"/>
-          <w:sz w:val="18"/>
-        </w:rPr>
-        <w:t xml:space="preserve">Publicado: </w:t>
-      </w:r>
-      <w:r>
-        <w:rPr>
-          <w:color w:val="888888"/>
-          <w:sz w:val="18"/>
-        </w:rPr>
-        <w:t xml:space="preserve">2026-07-07   </w:t>
-      </w:r>
-      <w:hyperlink r:id="rId27">
-        <w:r>
-          <w:rPr>
-            <w:color w:val="1A4D2E"/>
-            <w:u w:val="single"/>
-            <w:b/>
-          </w:rPr>
-          <w:t>Acessar materia</w:t>
-        </w:r>
-      </w:hyperlink>
-    </w:p>
-    <w:p>
-      <w:pPr>
-        <w:spacing w:after="120"/>
-      </w:pPr>
-      <w:r>
-        <w:rPr>
-          <w:i/>
-          <w:color w:val="888888"/>
-          <w:sz w:val="16"/>
-        </w:rPr>
-        <w:t>Novo índice de mercado relevante para investidores e analistas do setor bancário.</w:t>
-      </w:r>
-    </w:p>
-    <w:p>
-      <w:pPr>
-        <w:spacing w:before="160" w:after="40"/>
-      </w:pPr>
-      <w:r>
-        <w:rPr>
-          <w:b/>
-          <w:color w:val="1A1A1A"/>
-          <w:sz w:val="22"/>
-        </w:rPr>
-        <w:t xml:space="preserve">005-2026-VPE-Comunicado Externo - Atualização no catálogo de mensagens e arquivos da Clearing   </w:t>
-      </w:r>
-      <w:r>
-        <w:rPr>
-          <w:b/>
-          <w:color w:val="D68910"/>
-          <w:sz w:val="16"/>
-        </w:rPr>
-        <w:t>[MÉDIA]</w:t>
-      </w:r>
-    </w:p>
-    <w:p>
-      <w:pPr>
-        <w:spacing w:after="40"/>
-      </w:pPr>
-      <w:r>
-        <w:rPr>
-          <w:color w:val="4A4A4A"/>
-          <w:sz w:val="20"/>
-        </w:rPr>
-        <w:t>Novas versões do catálogo de mensagens e arquivos da Clearing com atualização de especificação técnica opcional em mensagens e arquivos de alocação.</w:t>
-      </w:r>
-    </w:p>
-    <w:p>
-      <w:pPr>
-        <w:spacing w:after="40"/>
-      </w:pPr>
-      <w:r>
-        <w:rPr>
-          <w:b/>
-          <w:color w:val="888888"/>
-          <w:sz w:val="18"/>
-        </w:rPr>
-        <w:t xml:space="preserve">Publicado: </w:t>
-      </w:r>
-      <w:r>
-        <w:rPr>
-          <w:color w:val="888888"/>
-          <w:sz w:val="18"/>
-        </w:rPr>
-        <w:t xml:space="preserve">2026-07-07   </w:t>
-      </w:r>
-      <w:hyperlink r:id="rId28">
-        <w:r>
-          <w:rPr>
-            <w:color w:val="1A4D2E"/>
-            <w:u w:val="single"/>
-            <w:b/>
-          </w:rPr>
-          <w:t>Acessar materia</w:t>
-        </w:r>
-      </w:hyperlink>
-    </w:p>
-    <w:p>
-      <w:pPr>
-        <w:spacing w:after="120"/>
-      </w:pPr>
-      <w:r>
-        <w:rPr>
-          <w:i/>
-          <w:color w:val="888888"/>
-          <w:sz w:val="16"/>
-        </w:rPr>
-        <w:t>Atualização técnica que pode exigir adaptação de sistemas dos participantes da Clearing.</w:t>
+        <w:t>Notícia institucional sobre reunião com representantes do mercado de capitais, indicando discussões relevantes para o setor.</w:t>
       </w:r>
     </w:p>
     <w:p/>
@@ -2289,15 +2572,15 @@
           <w:color w:val="1A1A1A"/>
           <w:sz w:val="22"/>
         </w:rPr>
-        <w:t xml:space="preserve">CT PMO/PLD abre Consulta Externa sobre aprimoramento dos modelos do setor elétrico   </w:t>
+        <w:t xml:space="preserve">Encontro CCEE: Tecnologia, inovação e inteligência artificial marcam programação da tarde do evento   </w:t>
       </w:r>
       <w:r>
         <w:rPr>
           <w:b/>
-          <w:color w:val="D68910"/>
+          <w:color w:val="7F8C8D"/>
           <w:sz w:val="16"/>
         </w:rPr>
-        <w:t>[MÉDIA]</w:t>
+        <w:t>[BAIXA]</w:t>
       </w:r>
     </w:p>
     <w:p>
@@ -2309,7 +2592,7 @@
           <w:color w:val="4A4A4A"/>
           <w:sz w:val="20"/>
         </w:rPr>
-        <w:t>Consulta externa para aprimoramento dos modelos do setor elétrico, com contribuições para a agenda de trabalho do CT.</w:t>
+        <w:t>Especialistas apresentaram soluções que apoiam a transformação digital do mercado de energia e preparam a infraestrutura tecnológica para a abertura do setor.</w:t>
       </w:r>
     </w:p>
     <w:p>
@@ -2329,9 +2612,9 @@
           <w:color w:val="888888"/>
           <w:sz w:val="18"/>
         </w:rPr>
-        <w:t xml:space="preserve">2026-07-07   </w:t>
+        <w:t xml:space="preserve">2026-07-08   </w:t>
       </w:r>
-      <w:hyperlink r:id="rId29">
+      <w:hyperlink r:id="rId33">
         <w:r>
           <w:rPr>
             <w:color w:val="1A4D2E"/>
@@ -2352,8 +2635,29 @@
           <w:color w:val="888888"/>
           <w:sz w:val="16"/>
         </w:rPr>
-        <w:t>Consulta pública setorial que pode levar a mudanças regulatórias no setor elétrico.</w:t>
+        <w:t>Notícia institucional sobre evento, sem impacto regulatório ou legislativo direto.</w:t>
       </w:r>
+    </w:p>
+    <w:p>
+      <w:pPr>
+        <w:spacing w:before="240" w:after="80"/>
+      </w:pPr>
+      <w:r>
+        <w:rPr>
+          <w:b/>
+          <w:color w:val="1A4D2E"/>
+          <w:sz w:val="20"/>
+        </w:rPr>
+        <w:t>MME | NOTÍCIAS</w:t>
+      </w:r>
+    </w:p>
+    <w:p>
+      <w:pPr>
+        <w:spacing w:before="0" w:after="40"/>
+        <w:pBdr>
+          <w:bottom w:val="single" w:sz="8" w:space="1" w:color="1A4D2E"/>
+        </w:pBdr>
+      </w:pPr>
     </w:p>
     <w:p>
       <w:pPr>
@@ -2365,7 +2669,7 @@
           <w:color w:val="1A1A1A"/>
           <w:sz w:val="22"/>
         </w:rPr>
-        <w:t xml:space="preserve">Encontro CCEE: evolução das operações e abertura do mercado são destaques dos painéis da manhã   </w:t>
+        <w:t xml:space="preserve">Sistema Interligado Nacional: saiba como a rede conecta a geração e o consumo de energia elétrica no Brasil   </w:t>
       </w:r>
       <w:r>
         <w:rPr>
@@ -2385,7 +2689,7 @@
           <w:color w:val="4A4A4A"/>
           <w:sz w:val="20"/>
         </w:rPr>
-        <w:t>Encontro da CCEE reuniu especialistas para debater desafios, avanços da Câmara e perspectivas para o setor elétrico até 2030.</w:t>
+        <w:t>Entenda como a rede que conecta usinas, linhas de transmissão e distribuidoras ajuda a garantir o abastecimento de energia elétrica no país.</w:t>
       </w:r>
     </w:p>
     <w:p>
@@ -2405,9 +2709,9 @@
           <w:color w:val="888888"/>
           <w:sz w:val="18"/>
         </w:rPr>
-        <w:t xml:space="preserve">2026-07-07   </w:t>
+        <w:t xml:space="preserve">2026-07-08   </w:t>
       </w:r>
-      <w:hyperlink r:id="rId30">
+      <w:hyperlink r:id="rId34">
         <w:r>
           <w:rPr>
             <w:color w:val="1A4D2E"/>
@@ -2428,7 +2732,7 @@
           <w:color w:val="888888"/>
           <w:sz w:val="16"/>
         </w:rPr>
-        <w:t>Notícia institucional sobre um evento, com baixo impacto direto.</w:t>
+        <w:t>Notícia explicativa sobre o funcionamento do Sistema Interligado Nacional, de caráter informativo.</w:t>
       </w:r>
     </w:p>
     <w:p>
@@ -2441,7 +2745,7 @@
           <w:color w:val="1A4D2E"/>
           <w:sz w:val="20"/>
         </w:rPr>
-        <w:t>ANP | NOTÍCIAS</w:t>
+        <w:t>EPE | NOTÍCIAS</w:t>
       </w:r>
     </w:p>
     <w:p>
@@ -2462,15 +2766,15 @@
           <w:color w:val="1A1A1A"/>
           <w:sz w:val="22"/>
         </w:rPr>
-        <w:t xml:space="preserve">Aviso: não haverá expediente nem protocolo no Escritório ANP SP no dia 9 de julho   </w:t>
+        <w:t xml:space="preserve">Em webinário, EPE apresenta base integrada de geração e transmissão de energia   </w:t>
       </w:r>
       <w:r>
         <w:rPr>
           <w:b/>
-          <w:color w:val="7F8C8D"/>
+          <w:color w:val="D68910"/>
           <w:sz w:val="16"/>
         </w:rPr>
-        <w:t>[BAIXA]</w:t>
+        <w:t>[MÉDIA]</w:t>
       </w:r>
     </w:p>
     <w:p>
@@ -2482,7 +2786,7 @@
           <w:color w:val="4A4A4A"/>
           <w:sz w:val="20"/>
         </w:rPr>
-        <w:t>Aviso sobre a suspensão de expediente e protocolo no Escritório da ANP em São Paulo no dia 9 de julho.</w:t>
+        <w:t>A EPE lançou em webinário uma base de dados integrada de geração e transmissão de energia, resultado de cooperação técnica para detalhar a rede elétrica.</w:t>
       </w:r>
     </w:p>
     <w:p>
@@ -2502,9 +2806,9 @@
           <w:color w:val="888888"/>
           <w:sz w:val="18"/>
         </w:rPr>
-        <w:t xml:space="preserve">2026-07-07   </w:t>
+        <w:t xml:space="preserve">2026-07-08   </w:t>
       </w:r>
-      <w:hyperlink r:id="rId31">
+      <w:hyperlink r:id="rId35">
         <w:r>
           <w:rPr>
             <w:color w:val="1A4D2E"/>
@@ -2525,8 +2829,61 @@
           <w:color w:val="888888"/>
           <w:sz w:val="16"/>
         </w:rPr>
-        <w:t>Aviso administrativo de funcionamento, com impacto limitado.</w:t>
+        <w:t>Lançamento de ferramenta de dados para o setor de energia, relevante para planejamento e análise de mercado.</w:t>
       </w:r>
+    </w:p>
+    <w:p/>
+    <w:tbl>
+      <w:tblPr>
+        <w:tblW w:type="auto" w:w="0"/>
+        <w:tblLayout w:type="fixed"/>
+        <w:tblLook w:firstColumn="1" w:firstRow="1" w:lastColumn="0" w:lastRow="0" w:noHBand="0" w:noVBand="1" w:val="04A0"/>
+      </w:tblPr>
+      <w:tblGrid>
+        <w:gridCol w:w="9638"/>
+      </w:tblGrid>
+      <w:tr>
+        <w:tc>
+          <w:tcPr>
+            <w:tcW w:type="dxa" w:w="9638"/>
+            <w:shd w:val="clear" w:color="auto" w:fill="1A4D2E"/>
+          </w:tcPr>
+          <w:p>
+            <w:pPr>
+              <w:spacing w:before="120" w:after="40"/>
+            </w:pPr>
+            <w:r>
+              <w:rPr>
+                <w:b w:val="0"/>
+                <w:color w:val="FFFFFF"/>
+                <w:sz w:val="32"/>
+              </w:rPr>
+              <w:t>Legislação Federal</w:t>
+            </w:r>
+          </w:p>
+        </w:tc>
+      </w:tr>
+    </w:tbl>
+    <w:p>
+      <w:pPr>
+        <w:spacing w:before="240" w:after="80"/>
+      </w:pPr>
+      <w:r>
+        <w:rPr>
+          <w:b/>
+          <w:color w:val="1A4D2E"/>
+          <w:sz w:val="20"/>
+        </w:rPr>
+        <w:t>DESTAQUES DO D.O.U.</w:t>
+      </w:r>
+    </w:p>
+    <w:p>
+      <w:pPr>
+        <w:spacing w:before="0" w:after="40"/>
+        <w:pBdr>
+          <w:bottom w:val="single" w:sz="8" w:space="1" w:color="1A4D2E"/>
+        </w:pBdr>
+      </w:pPr>
     </w:p>
     <w:p>
       <w:pPr>
@@ -2538,15 +2895,15 @@
           <w:color w:val="1A1A1A"/>
           <w:sz w:val="22"/>
         </w:rPr>
-        <w:t xml:space="preserve">ANP e Petrobras assinam acordo para adequação de 335 poços marítimos às regras de segurança operacional   </w:t>
+        <w:t xml:space="preserve">RETIFICAÇÃO   </w:t>
       </w:r>
       <w:r>
         <w:rPr>
           <w:b/>
-          <w:color w:val="C0392B"/>
+          <w:color w:val="7F8C8D"/>
           <w:sz w:val="16"/>
         </w:rPr>
-        <w:t>[ALTA]</w:t>
+        <w:t>[BAIXA]</w:t>
       </w:r>
     </w:p>
     <w:p>
@@ -2558,7 +2915,7 @@
           <w:color w:val="4A4A4A"/>
           <w:sz w:val="20"/>
         </w:rPr>
-        <w:t>Termo de Conciliação celebrado na AGU estabelece compromissos técnicos para fortalecer a prevenção e a resposta a emergências em poços marítimos.</w:t>
+        <w:t>Retificação no Decreto nº 13.015, de 10 de junho de 2026, referente às assinaturas.</w:t>
       </w:r>
     </w:p>
     <w:p>
@@ -2578,9 +2935,9 @@
           <w:color w:val="888888"/>
           <w:sz w:val="18"/>
         </w:rPr>
-        <w:t xml:space="preserve">2026-07-07   </w:t>
+        <w:t xml:space="preserve">2026-07-09   </w:t>
       </w:r>
-      <w:hyperlink r:id="rId32">
+      <w:hyperlink r:id="rId36">
         <w:r>
           <w:rPr>
             <w:color w:val="1A4D2E"/>
@@ -2601,29 +2958,8 @@
           <w:color w:val="888888"/>
           <w:sz w:val="16"/>
         </w:rPr>
-        <w:t>Acordo com grande empresa estatal sobre segurança operacional, com impacto regulatório e ambiental no setor de energia.</w:t>
+        <w:t>Retificação de decreto anterior, de natureza administrativa.</w:t>
       </w:r>
-    </w:p>
-    <w:p>
-      <w:pPr>
-        <w:spacing w:before="240" w:after="80"/>
-      </w:pPr>
-      <w:r>
-        <w:rPr>
-          <w:b/>
-          <w:color w:val="1A4D2E"/>
-          <w:sz w:val="20"/>
-        </w:rPr>
-        <w:t>ANEEL | ÚLTIMAS NOTÍCIAS</w:t>
-      </w:r>
-    </w:p>
-    <w:p>
-      <w:pPr>
-        <w:spacing w:before="0" w:after="40"/>
-        <w:pBdr>
-          <w:bottom w:val="single" w:sz="8" w:space="1" w:color="1A4D2E"/>
-        </w:pBdr>
-      </w:pPr>
     </w:p>
     <w:p>
       <w:pPr>
@@ -2635,15 +2971,15 @@
           <w:color w:val="1A1A1A"/>
           <w:sz w:val="22"/>
         </w:rPr>
-        <w:t xml:space="preserve">ANEEL aprova abertura de consulta pública sobre o edital dos Leilões de Energia Existente A-1, A-2 e A-3   </w:t>
+        <w:t xml:space="preserve">DESPACHOS DO PRESIDENTE DA REPÚBLICA   </w:t>
       </w:r>
       <w:r>
         <w:rPr>
           <w:b/>
-          <w:color w:val="C0392B"/>
+          <w:color w:val="7F8C8D"/>
           <w:sz w:val="16"/>
         </w:rPr>
-        <w:t>[ALTA]</w:t>
+        <w:t>[BAIXA]</w:t>
       </w:r>
     </w:p>
     <w:p>
@@ -2655,7 +2991,7 @@
           <w:color w:val="4A4A4A"/>
           <w:sz w:val="20"/>
         </w:rPr>
-        <w:t>ANEEL aprova abertura de consulta pública sobre o edital dos Leilões de Energia Existente A-1, A-2 e A-3, com contribuições até 24 de agosto de 2026.</w:t>
+        <w:t>Despachos presidenciais referentes à restituição de autógrafos de Projetos de Lei ao Congresso Nacional, que se transformam nas Leis nº 15.462 e nº 15.463, de 8 de julho de 2026.</w:t>
       </w:r>
     </w:p>
     <w:p>
@@ -2675,9 +3011,9 @@
           <w:color w:val="888888"/>
           <w:sz w:val="18"/>
         </w:rPr>
-        <w:t xml:space="preserve">2026-07-07   </w:t>
+        <w:t xml:space="preserve">2026-07-09   </w:t>
       </w:r>
-      <w:hyperlink r:id="rId33">
+      <w:hyperlink r:id="rId37">
         <w:r>
           <w:rPr>
             <w:color w:val="1A4D2E"/>
@@ -2698,277 +3034,7 @@
           <w:color w:val="888888"/>
           <w:sz w:val="16"/>
         </w:rPr>
-        <w:t>Abertura de consulta pública para leilões de energia, com impacto direto no setor elétrico e para empresas do ramo.</w:t>
-      </w:r>
-    </w:p>
-    <w:p>
-      <w:pPr>
-        <w:spacing w:before="240" w:after="80"/>
-      </w:pPr>
-      <w:r>
-        <w:rPr>
-          <w:b/>
-          <w:color w:val="1A4D2E"/>
-          <w:sz w:val="20"/>
-        </w:rPr>
-        <w:t>ANM | NOTÍCIAS</w:t>
-      </w:r>
-    </w:p>
-    <w:p>
-      <w:pPr>
-        <w:spacing w:before="0" w:after="40"/>
-        <w:pBdr>
-          <w:bottom w:val="single" w:sz="8" w:space="1" w:color="1A4D2E"/>
-        </w:pBdr>
-      </w:pPr>
-    </w:p>
-    <w:p>
-      <w:pPr>
-        <w:spacing w:before="160" w:after="40"/>
-      </w:pPr>
-      <w:r>
-        <w:rPr>
-          <w:b/>
-          <w:color w:val="1A1A1A"/>
-          <w:sz w:val="22"/>
-        </w:rPr>
-        <w:t xml:space="preserve">Recolhimento da CFEM tem nova plataforma digital   </w:t>
-      </w:r>
-      <w:r>
-        <w:rPr>
-          <w:b/>
-          <w:color w:val="C0392B"/>
-          <w:sz w:val="16"/>
-        </w:rPr>
-        <w:t>[ALTA]</w:t>
-      </w:r>
-    </w:p>
-    <w:p>
-      <w:pPr>
-        <w:spacing w:after="40"/>
-      </w:pPr>
-      <w:r>
-        <w:rPr>
-          <w:color w:val="4A4A4A"/>
-          <w:sz w:val="20"/>
-        </w:rPr>
-        <w:t>Nova plataforma digital para recolhimento da Compensação Financeira pela Exploração de Recursos Minerais (CFEM), exigindo login gov.br e ampliando formas de pagamento.</w:t>
-      </w:r>
-    </w:p>
-    <w:p>
-      <w:pPr>
-        <w:spacing w:after="40"/>
-      </w:pPr>
-      <w:r>
-        <w:rPr>
-          <w:b/>
-          <w:color w:val="888888"/>
-          <w:sz w:val="18"/>
-        </w:rPr>
-        <w:t xml:space="preserve">Publicado: </w:t>
-      </w:r>
-      <w:r>
-        <w:rPr>
-          <w:color w:val="888888"/>
-          <w:sz w:val="18"/>
-        </w:rPr>
-        <w:t xml:space="preserve">2026-07-07T15:04   </w:t>
-      </w:r>
-      <w:hyperlink r:id="rId34">
-        <w:r>
-          <w:rPr>
-            <w:color w:val="1A4D2E"/>
-            <w:u w:val="single"/>
-            <w:b/>
-          </w:rPr>
-          <w:t>Acessar materia</w:t>
-        </w:r>
-      </w:hyperlink>
-    </w:p>
-    <w:p>
-      <w:pPr>
-        <w:spacing w:after="120"/>
-      </w:pPr>
-      <w:r>
-        <w:rPr>
-          <w:i/>
-          <w:color w:val="888888"/>
-          <w:sz w:val="16"/>
-        </w:rPr>
-        <w:t>Mudança no processo de recolhimento de royalties da mineração, com impacto direto para empresas do setor.</w:t>
-      </w:r>
-    </w:p>
-    <w:p>
-      <w:pPr>
-        <w:spacing w:before="240" w:after="80"/>
-      </w:pPr>
-      <w:r>
-        <w:rPr>
-          <w:b/>
-          <w:color w:val="1A4D2E"/>
-          <w:sz w:val="20"/>
-        </w:rPr>
-        <w:t>EPE | NOTÍCIAS</w:t>
-      </w:r>
-    </w:p>
-    <w:p>
-      <w:pPr>
-        <w:spacing w:before="0" w:after="40"/>
-        <w:pBdr>
-          <w:bottom w:val="single" w:sz="8" w:space="1" w:color="1A4D2E"/>
-        </w:pBdr>
-      </w:pPr>
-    </w:p>
-    <w:p>
-      <w:pPr>
-        <w:spacing w:before="160" w:after="40"/>
-      </w:pPr>
-      <w:r>
-        <w:rPr>
-          <w:b/>
-          <w:color w:val="1A1A1A"/>
-          <w:sz w:val="22"/>
-        </w:rPr>
-        <w:t xml:space="preserve">Em parceria com a EPE, curso de Mercados de Energia para Futuros Líderes terá nova turma em agosto   </w:t>
-      </w:r>
-      <w:r>
-        <w:rPr>
-          <w:b/>
-          <w:color w:val="7F8C8D"/>
-          <w:sz w:val="16"/>
-        </w:rPr>
-        <w:t>[BAIXA]</w:t>
-      </w:r>
-    </w:p>
-    <w:p>
-      <w:pPr>
-        <w:spacing w:after="40"/>
-      </w:pPr>
-      <w:r>
-        <w:rPr>
-          <w:color w:val="4A4A4A"/>
-          <w:sz w:val="20"/>
-        </w:rPr>
-        <w:t>A Fundação Carlos Alberto Vanzolini abriu inscrições para a segunda turma do curso de atualização em Mercados de Energia para Futuros Líderes, em parceria com a EPE.</w:t>
-      </w:r>
-    </w:p>
-    <w:p>
-      <w:pPr>
-        <w:spacing w:after="40"/>
-      </w:pPr>
-      <w:r>
-        <w:rPr>
-          <w:b/>
-          <w:color w:val="888888"/>
-          <w:sz w:val="18"/>
-        </w:rPr>
-        <w:t xml:space="preserve">Publicado: </w:t>
-      </w:r>
-      <w:r>
-        <w:rPr>
-          <w:color w:val="888888"/>
-          <w:sz w:val="18"/>
-        </w:rPr>
-        <w:t xml:space="preserve">2026-07-07   </w:t>
-      </w:r>
-      <w:hyperlink r:id="rId35">
-        <w:r>
-          <w:rPr>
-            <w:color w:val="1A4D2E"/>
-            <w:u w:val="single"/>
-            <w:b/>
-          </w:rPr>
-          <w:t>Acessar materia</w:t>
-        </w:r>
-      </w:hyperlink>
-    </w:p>
-    <w:p>
-      <w:pPr>
-        <w:spacing w:after="120"/>
-      </w:pPr>
-      <w:r>
-        <w:rPr>
-          <w:i/>
-          <w:color w:val="888888"/>
-          <w:sz w:val="16"/>
-        </w:rPr>
-        <w:t>Notícia sobre capacitação e evento, com baixo impacto direto a clientes corporativos.</w:t>
-      </w:r>
-    </w:p>
-    <w:p>
-      <w:pPr>
-        <w:spacing w:before="160" w:after="40"/>
-      </w:pPr>
-      <w:r>
-        <w:rPr>
-          <w:b/>
-          <w:color w:val="1A1A1A"/>
-          <w:sz w:val="22"/>
-        </w:rPr>
-        <w:t xml:space="preserve">EPE atualiza ferramentas interativas do Balanço Energético Nacional (BEN) 2026   </w:t>
-      </w:r>
-      <w:r>
-        <w:rPr>
-          <w:b/>
-          <w:color w:val="D68910"/>
-          <w:sz w:val="16"/>
-        </w:rPr>
-        <w:t>[MÉDIA]</w:t>
-      </w:r>
-    </w:p>
-    <w:p>
-      <w:pPr>
-        <w:spacing w:after="40"/>
-      </w:pPr>
-      <w:r>
-        <w:rPr>
-          <w:color w:val="4A4A4A"/>
-          <w:sz w:val="20"/>
-        </w:rPr>
-        <w:t>A Empresa de Pesquisa Energética (EPE) atualiza as ferramentas interativas do Balanço Energético Nacional (BEN) 2026 para ampliar o acesso à informação e inovar na disponibilização de dados energéticos.</w:t>
-      </w:r>
-    </w:p>
-    <w:p>
-      <w:pPr>
-        <w:spacing w:after="40"/>
-      </w:pPr>
-      <w:r>
-        <w:rPr>
-          <w:b/>
-          <w:color w:val="888888"/>
-          <w:sz w:val="18"/>
-        </w:rPr>
-        <w:t xml:space="preserve">Publicado: </w:t>
-      </w:r>
-      <w:r>
-        <w:rPr>
-          <w:color w:val="888888"/>
-          <w:sz w:val="18"/>
-        </w:rPr>
-        <w:t xml:space="preserve">2026-07-07   </w:t>
-      </w:r>
-      <w:hyperlink r:id="rId36">
-        <w:r>
-          <w:rPr>
-            <w:color w:val="1A4D2E"/>
-            <w:u w:val="single"/>
-            <w:b/>
-          </w:rPr>
-          <w:t>Acessar materia</w:t>
-        </w:r>
-      </w:hyperlink>
-    </w:p>
-    <w:p>
-      <w:pPr>
-        <w:spacing w:after="120"/>
-      </w:pPr>
-      <w:r>
-        <w:rPr>
-          <w:i/>
-          <w:color w:val="888888"/>
-          <w:sz w:val="16"/>
-        </w:rPr>
-        <w:t>Atualização de ferramenta de dados setoriais, importante para análise e planejamento no setor de energia.</w:t>
+        <w:t>Despachos administrativos sobre o processo legislativo, sem impacto direto a clientes corporativos.</w:t>
       </w:r>
     </w:p>
     <w:p/>
@@ -3034,15 +3100,15 @@
           <w:color w:val="1A1A1A"/>
           <w:sz w:val="22"/>
         </w:rPr>
-        <w:t xml:space="preserve">Workshop debate Governança dos Gastos Tributários   </w:t>
+        <w:t xml:space="preserve">Receita Federal envia comunicações a contribuintes com Selo Sintonia A+   </w:t>
       </w:r>
       <w:r>
         <w:rPr>
           <w:b/>
-          <w:color w:val="C0392B"/>
+          <w:color w:val="D68910"/>
           <w:sz w:val="16"/>
         </w:rPr>
-        <w:t>[ALTA]</w:t>
+        <w:t>[MÉDIA]</w:t>
       </w:r>
     </w:p>
     <w:p>
@@ -3054,7 +3120,7 @@
           <w:color w:val="4A4A4A"/>
           <w:sz w:val="20"/>
         </w:rPr>
-        <w:t>Evento reuniu representantes para discutir contribuições à regulamentação da Lei Complementar nº 224/2025 e ao fortalecimento da governança dos gastos tributários.</w:t>
+        <w:t>Público com essa classificação será informado sobre eventual existência de débitos em aberto pela Receita Federal.</w:t>
       </w:r>
     </w:p>
     <w:p>
@@ -3074,9 +3140,9 @@
           <w:color w:val="888888"/>
           <w:sz w:val="18"/>
         </w:rPr>
-        <w:t xml:space="preserve">2026-07-07   </w:t>
+        <w:t xml:space="preserve">2026-07-08   </w:t>
       </w:r>
-      <w:hyperlink r:id="rId37">
+      <w:hyperlink r:id="rId38">
         <w:r>
           <w:rPr>
             <w:color w:val="1A4D2E"/>
@@ -3097,7 +3163,7 @@
           <w:color w:val="888888"/>
           <w:sz w:val="16"/>
         </w:rPr>
-        <w:t>Discussão sobre regulamentação de lei complementar e governança tributária, com potencial impacto em políticas fiscais.</w:t>
+        <w:t>Comunicações da Receita Federal sobre débitos, relevante para compliance fiscal de empresas.</w:t>
       </w:r>
     </w:p>
     <w:p>
@@ -3110,15 +3176,15 @@
           <w:color w:val="1A1A1A"/>
           <w:sz w:val="22"/>
         </w:rPr>
-        <w:t xml:space="preserve">Consulta sobre a restituição automática (cashback) pode ser feita a partir desta quarta (8/7) no site da Receita   </w:t>
+        <w:t xml:space="preserve">Receita Federal divulga orientações sobre Adicional da CSLL prevista nas Regras GloBE   </w:t>
       </w:r>
       <w:r>
         <w:rPr>
           <w:b/>
-          <w:color w:val="D68910"/>
+          <w:color w:val="C0392B"/>
           <w:sz w:val="16"/>
         </w:rPr>
-        <w:t>[MÉDIA]</w:t>
+        <w:t>[ALTA]</w:t>
       </w:r>
     </w:p>
     <w:p>
@@ -3130,7 +3196,7 @@
           <w:color w:val="4A4A4A"/>
           <w:sz w:val="20"/>
         </w:rPr>
-        <w:t>Informação sobre a consulta da restituição automática (cashback) do IRPF, com pagamento previsto para 15/7.</w:t>
+        <w:t>Entidades constituintes devem atentar para normas sobre o pagamento, prestação de informações na DCTFWeb e entrega da obrigação acessória, conforme as Regras GloBE.</w:t>
       </w:r>
     </w:p>
     <w:p>
@@ -3150,9 +3216,9 @@
           <w:color w:val="888888"/>
           <w:sz w:val="18"/>
         </w:rPr>
-        <w:t xml:space="preserve">2026-07-07   </w:t>
+        <w:t xml:space="preserve">2026-07-08   </w:t>
       </w:r>
-      <w:hyperlink r:id="rId38">
+      <w:hyperlink r:id="rId39">
         <w:r>
           <w:rPr>
             <w:color w:val="1A4D2E"/>
@@ -3173,7 +3239,83 @@
           <w:color w:val="888888"/>
           <w:sz w:val="16"/>
         </w:rPr>
-        <w:t>Comunicado sobre serviço público com impacto direto em contribuintes e empresas.</w:t>
+        <w:t>Orientações sobre adicional da CSLL e regras GloBE, com impacto direto em empresas e obrigações fiscais.</w:t>
+      </w:r>
+    </w:p>
+    <w:p>
+      <w:pPr>
+        <w:spacing w:before="160" w:after="40"/>
+      </w:pPr>
+      <w:r>
+        <w:rPr>
+          <w:b/>
+          <w:color w:val="1A1A1A"/>
+          <w:sz w:val="22"/>
+        </w:rPr>
+        <w:t xml:space="preserve">Ação integrada combate organização criminosa responsável pela exploração de bets ilegais na Paraíba   </w:t>
+      </w:r>
+      <w:r>
+        <w:rPr>
+          <w:b/>
+          <w:color w:val="D68910"/>
+          <w:sz w:val="16"/>
+        </w:rPr>
+        <w:t>[MÉDIA]</w:t>
+      </w:r>
+    </w:p>
+    <w:p>
+      <w:pPr>
+        <w:spacing w:after="40"/>
+      </w:pPr>
+      <w:r>
+        <w:rPr>
+          <w:color w:val="4A4A4A"/>
+          <w:sz w:val="20"/>
+        </w:rPr>
+        <w:t>Operação conjunta resultou no bloqueio de R$ 100 milhões em combate à exploração de apostas ilegais na Paraíba.</w:t>
+      </w:r>
+    </w:p>
+    <w:p>
+      <w:pPr>
+        <w:spacing w:after="40"/>
+      </w:pPr>
+      <w:r>
+        <w:rPr>
+          <w:b/>
+          <w:color w:val="888888"/>
+          <w:sz w:val="18"/>
+        </w:rPr>
+        <w:t xml:space="preserve">Publicado: </w:t>
+      </w:r>
+      <w:r>
+        <w:rPr>
+          <w:color w:val="888888"/>
+          <w:sz w:val="18"/>
+        </w:rPr>
+        <w:t xml:space="preserve">2026-07-08   </w:t>
+      </w:r>
+      <w:hyperlink r:id="rId40">
+        <w:r>
+          <w:rPr>
+            <w:color w:val="1A4D2E"/>
+            <w:u w:val="single"/>
+            <w:b/>
+          </w:rPr>
+          <w:t>Acessar materia</w:t>
+        </w:r>
+      </w:hyperlink>
+    </w:p>
+    <w:p>
+      <w:pPr>
+        <w:spacing w:after="120"/>
+      </w:pPr>
+      <w:r>
+        <w:rPr>
+          <w:i/>
+          <w:color w:val="888888"/>
+          <w:sz w:val="16"/>
+        </w:rPr>
+        <w:t>Notícia sobre operação de combate a crimes financeiros, relevante para o ambiente de negócios e compliance.</w:t>
       </w:r>
     </w:p>
     <w:p/>
@@ -3239,15 +3381,15 @@
           <w:color w:val="1A1A1A"/>
           <w:sz w:val="22"/>
         </w:rPr>
-        <w:t xml:space="preserve">ANPD e PNUD selecionam consultores para realização de estudos sobre IA, proteção de dados e publicidade digital voltada a crianças e adolescentes   </w:t>
+        <w:t xml:space="preserve">ANPD instaura processo de sanção contra OS por falha na proteção de dados de 500 mil pacientes   </w:t>
       </w:r>
       <w:r>
         <w:rPr>
           <w:b/>
-          <w:color w:val="D68910"/>
+          <w:color w:val="C0392B"/>
           <w:sz w:val="16"/>
         </w:rPr>
-        <w:t>[MÉDIA]</w:t>
+        <w:t>[ALTA]</w:t>
       </w:r>
     </w:p>
     <w:p>
@@ -3259,7 +3401,7 @@
           <w:color w:val="4A4A4A"/>
           <w:sz w:val="20"/>
         </w:rPr>
-        <w:t>ANPD e PNUD abrem seleção para consultores para estudos sobre IA, proteção de dados e publicidade digital para crianças e adolescentes.</w:t>
+        <w:t>Ataque cibernético expôs dados sensíveis de pacientes de unidades geridas pelo Instituto Saúde e Cidadania (Isac), levando à instauração de processo de sanção pela ANPD.</w:t>
       </w:r>
     </w:p>
     <w:p>
@@ -3279,9 +3421,9 @@
           <w:color w:val="888888"/>
           <w:sz w:val="18"/>
         </w:rPr>
-        <w:t xml:space="preserve">2026-07-07T13:49   </w:t>
+        <w:t xml:space="preserve">2026-07-08T10:40   </w:t>
       </w:r>
-      <w:hyperlink r:id="rId39">
+      <w:hyperlink r:id="rId41">
         <w:r>
           <w:rPr>
             <w:color w:val="1A4D2E"/>
@@ -3302,7 +3444,7 @@
           <w:color w:val="888888"/>
           <w:sz w:val="16"/>
         </w:rPr>
-        <w:t>Iniciativa de pesquisa e desenvolvimento em temas regulatórios importantes para proteção de dados e IA.</w:t>
+        <w:t>Instauração de processo de sanção por falha grave na proteção de dados sensíveis, com repercussão para empresas que tratam dados pessoais.</w:t>
       </w:r>
     </w:p>
     <w:p>
@@ -3315,7 +3457,7 @@
           <w:color w:val="1A4D2E"/>
           <w:sz w:val="20"/>
         </w:rPr>
-        <w:t>INPI | NOTÍCIAS</w:t>
+        <w:t>MINISTÉRIO DA AGRICULTURA | NOTÍCIAS</w:t>
       </w:r>
     </w:p>
     <w:p>
@@ -3336,7 +3478,7 @@
           <w:color w:val="1A1A1A"/>
           <w:sz w:val="22"/>
         </w:rPr>
-        <w:t xml:space="preserve">Sistema de peticionamento de programa de computador volta a funcionar   </w:t>
+        <w:t xml:space="preserve">Aberturas de mercado para o Brasil na Nigéria e na Mauritânia   </w:t>
       </w:r>
       <w:r>
         <w:rPr>
@@ -3356,7 +3498,7 @@
           <w:color w:val="4A4A4A"/>
           <w:sz w:val="20"/>
         </w:rPr>
-        <w:t>O sistema de peticionamento de programa de computador do INPI foi restabelecido, permitindo novamente o registro de propriedade intelectual.</w:t>
+        <w:t>O Ministério da Agricultura e o Ministério das Relações Exteriores anunciam a abertura de novos mercados para produtos brasileiros na Nigéria e na Mauritânia.</w:t>
       </w:r>
     </w:p>
     <w:p>
@@ -3376,9 +3518,9 @@
           <w:color w:val="888888"/>
           <w:sz w:val="18"/>
         </w:rPr>
-        <w:t xml:space="preserve">2026-07-07T16:00   </w:t>
+        <w:t xml:space="preserve">2026-07-08   </w:t>
       </w:r>
-      <w:hyperlink r:id="rId40">
+      <w:hyperlink r:id="rId42">
         <w:r>
           <w:rPr>
             <w:color w:val="1A4D2E"/>
@@ -3399,8 +3541,29 @@
           <w:color w:val="888888"/>
           <w:sz w:val="16"/>
         </w:rPr>
-        <w:t>Restabelecimento de serviço essencial para o registro de propriedade intelectual, importante para empresas de tecnologia.</w:t>
+        <w:t>Abertura de novos mercados para exportações brasileiras, com impacto no agronegócio.</w:t>
       </w:r>
+    </w:p>
+    <w:p>
+      <w:pPr>
+        <w:spacing w:before="240" w:after="80"/>
+      </w:pPr>
+      <w:r>
+        <w:rPr>
+          <w:b/>
+          <w:color w:val="1A4D2E"/>
+          <w:sz w:val="20"/>
+        </w:rPr>
+        <w:t>ANVISA | NOTÍCIAS</w:t>
+      </w:r>
+    </w:p>
+    <w:p>
+      <w:pPr>
+        <w:spacing w:before="0" w:after="40"/>
+        <w:pBdr>
+          <w:bottom w:val="single" w:sz="8" w:space="1" w:color="1A4D2E"/>
+        </w:pBdr>
+      </w:pPr>
     </w:p>
     <w:p>
       <w:pPr>
@@ -3412,15 +3575,15 @@
           <w:color w:val="1A1A1A"/>
           <w:sz w:val="22"/>
         </w:rPr>
-        <w:t xml:space="preserve">Sistema de restituição de taxas está disponível   </w:t>
+        <w:t xml:space="preserve">Confira os destaques da 12ª Reunião Ordinária Pública da Diretoria da Anvisa   </w:t>
       </w:r>
       <w:r>
         <w:rPr>
           <w:b/>
-          <w:color w:val="D68910"/>
+          <w:color w:val="C0392B"/>
           <w:sz w:val="16"/>
         </w:rPr>
-        <w:t>[MÉDIA]</w:t>
+        <w:t>[ALTA]</w:t>
       </w:r>
     </w:p>
     <w:p>
@@ -3432,7 +3595,7 @@
           <w:color w:val="4A4A4A"/>
           <w:sz w:val="20"/>
         </w:rPr>
-        <w:t>O sistema de restituição de taxas do INPI agora está disponível, facilitando o processo para os usuários.</w:t>
+        <w:t>A atualização da composição das vacinas contra a Covid-19 em uso no Brasil foi um dos itens aprovados na 12ª Reunião Ordinária Pública da Diretoria da Anvisa.</w:t>
       </w:r>
     </w:p>
     <w:p>
@@ -3452,9 +3615,9 @@
           <w:color w:val="888888"/>
           <w:sz w:val="18"/>
         </w:rPr>
-        <w:t xml:space="preserve">2026-07-07T13:07   </w:t>
+        <w:t xml:space="preserve">2026-07-08   </w:t>
       </w:r>
-      <w:hyperlink r:id="rId41">
+      <w:hyperlink r:id="rId43">
         <w:r>
           <w:rPr>
             <w:color w:val="1A4D2E"/>
@@ -3475,7 +3638,7 @@
           <w:color w:val="888888"/>
           <w:sz w:val="16"/>
         </w:rPr>
-        <w:t>Disponibilização de serviço para restituição de taxas, relevante para empresas que interagem com o INPI.</w:t>
+        <w:t>Destaques de reunião da diretoria com aprovação de atualização de vacinas, com impacto na saúde pública e setor farmacêutico.</w:t>
       </w:r>
     </w:p>
     <w:p>
@@ -3488,15 +3651,15 @@
           <w:color w:val="1A1A1A"/>
           <w:sz w:val="22"/>
         </w:rPr>
-        <w:t xml:space="preserve">Tomada pública de subsídios sobre Indicações Geográficas argentinas está aberta   </w:t>
+        <w:t xml:space="preserve">Anvisa aprova medicamento para tratar doença de Chagas em pacientes pediátricos   </w:t>
       </w:r>
       <w:r>
         <w:rPr>
           <w:b/>
-          <w:color w:val="D68910"/>
+          <w:color w:val="C0392B"/>
           <w:sz w:val="16"/>
         </w:rPr>
-        <w:t>[MÉDIA]</w:t>
+        <w:t>[ALTA]</w:t>
       </w:r>
     </w:p>
     <w:p>
@@ -3508,7 +3671,7 @@
           <w:color w:val="4A4A4A"/>
           <w:sz w:val="20"/>
         </w:rPr>
-        <w:t>O INPI abriu tomada pública de subsídios sobre Indicações Geográficas argentinas, buscando contribuições da sociedade.</w:t>
+        <w:t>A Anvisa aprovou um novo medicamento indicado para o tratamento da doença de Chagas em pacientes pediátricos, na faixa etária de 0 a 17 anos.</w:t>
       </w:r>
     </w:p>
     <w:p>
@@ -3528,159 +3691,7 @@
           <w:color w:val="888888"/>
           <w:sz w:val="18"/>
         </w:rPr>
-        <w:t xml:space="preserve">2026-07-07T13:04   </w:t>
-      </w:r>
-      <w:hyperlink r:id="rId42">
-        <w:r>
-          <w:rPr>
-            <w:color w:val="1A4D2E"/>
-            <w:u w:val="single"/>
-            <w:b/>
-          </w:rPr>
-          <w:t>Acessar materia</w:t>
-        </w:r>
-      </w:hyperlink>
-    </w:p>
-    <w:p>
-      <w:pPr>
-        <w:spacing w:after="120"/>
-      </w:pPr>
-      <w:r>
-        <w:rPr>
-          <w:i/>
-          <w:color w:val="888888"/>
-          <w:sz w:val="16"/>
-        </w:rPr>
-        <w:t>Consulta pública sobre propriedade intelectual internacional, relevante para empresas com interesses em mercados externos.</w:t>
-      </w:r>
-    </w:p>
-    <w:p>
-      <w:pPr>
-        <w:spacing w:before="160" w:after="40"/>
-      </w:pPr>
-      <w:r>
-        <w:rPr>
-          <w:b/>
-          <w:color w:val="1A1A1A"/>
-          <w:sz w:val="22"/>
-        </w:rPr>
-        <w:t xml:space="preserve">Consulta pública sobre marcas de posição recebe contribuições até 24/7   </w:t>
-      </w:r>
-      <w:r>
-        <w:rPr>
-          <w:b/>
-          <w:color w:val="D68910"/>
-          <w:sz w:val="16"/>
-        </w:rPr>
-        <w:t>[MÉDIA]</w:t>
-      </w:r>
-    </w:p>
-    <w:p>
-      <w:pPr>
-        <w:spacing w:after="40"/>
-      </w:pPr>
-      <w:r>
-        <w:rPr>
-          <w:color w:val="4A4A4A"/>
-          <w:sz w:val="20"/>
-        </w:rPr>
-        <w:t>O INPI abriu consulta pública para receber contribuições sobre marcas de posição até 24 de julho.</w:t>
-      </w:r>
-    </w:p>
-    <w:p>
-      <w:pPr>
-        <w:spacing w:after="40"/>
-      </w:pPr>
-      <w:r>
-        <w:rPr>
-          <w:b/>
-          <w:color w:val="888888"/>
-          <w:sz w:val="18"/>
-        </w:rPr>
-        <w:t xml:space="preserve">Publicado: </w:t>
-      </w:r>
-      <w:r>
-        <w:rPr>
-          <w:color w:val="888888"/>
-          <w:sz w:val="18"/>
-        </w:rPr>
-        <w:t xml:space="preserve">2026-07-07T13:01   </w:t>
-      </w:r>
-      <w:hyperlink r:id="rId43">
-        <w:r>
-          <w:rPr>
-            <w:color w:val="1A4D2E"/>
-            <w:u w:val="single"/>
-            <w:b/>
-          </w:rPr>
-          <w:t>Acessar materia</w:t>
-        </w:r>
-      </w:hyperlink>
-    </w:p>
-    <w:p>
-      <w:pPr>
-        <w:spacing w:after="120"/>
-      </w:pPr>
-      <w:r>
-        <w:rPr>
-          <w:i/>
-          <w:color w:val="888888"/>
-          <w:sz w:val="16"/>
-        </w:rPr>
-        <w:t>Consulta pública sobre regulamentação de marcas, importante para empresas que buscam proteção de propriedade intelectual.</w:t>
-      </w:r>
-    </w:p>
-    <w:p>
-      <w:pPr>
-        <w:spacing w:before="160" w:after="40"/>
-      </w:pPr>
-      <w:r>
-        <w:rPr>
-          <w:b/>
-          <w:color w:val="1A1A1A"/>
-          <w:sz w:val="22"/>
-        </w:rPr>
-        <w:t xml:space="preserve">INPI realiza seleção com duas vagas para atuar na área de promoção e eventos   </w:t>
-      </w:r>
-      <w:r>
-        <w:rPr>
-          <w:b/>
-          <w:color w:val="7F8C8D"/>
-          <w:sz w:val="16"/>
-        </w:rPr>
-        <w:t>[BAIXA]</w:t>
-      </w:r>
-    </w:p>
-    <w:p>
-      <w:pPr>
-        <w:spacing w:after="40"/>
-      </w:pPr>
-      <w:r>
-        <w:rPr>
-          <w:color w:val="4A4A4A"/>
-          <w:sz w:val="20"/>
-        </w:rPr>
-        <w:t>O INPI está realizando um processo seletivo para preencher duas vagas na área de promoção e eventos.</w:t>
-      </w:r>
-    </w:p>
-    <w:p>
-      <w:pPr>
-        <w:spacing w:after="40"/>
-      </w:pPr>
-      <w:r>
-        <w:rPr>
-          <w:b/>
-          <w:color w:val="888888"/>
-          <w:sz w:val="18"/>
-        </w:rPr>
-        <w:t xml:space="preserve">Publicado: </w:t>
-      </w:r>
-      <w:r>
-        <w:rPr>
-          <w:color w:val="888888"/>
-          <w:sz w:val="18"/>
-        </w:rPr>
-        <w:t xml:space="preserve">2026-07-07T12:59   </w:t>
+        <w:t xml:space="preserve">2026-07-08   </w:t>
       </w:r>
       <w:hyperlink r:id="rId44">
         <w:r>
@@ -3703,159 +3714,7 @@
           <w:color w:val="888888"/>
           <w:sz w:val="16"/>
         </w:rPr>
-        <w:t>Notícia institucional de recrutamento, com baixo impacto direto a clientes corporativos.</w:t>
-      </w:r>
-    </w:p>
-    <w:p>
-      <w:pPr>
-        <w:spacing w:before="160" w:after="40"/>
-      </w:pPr>
-      <w:r>
-        <w:rPr>
-          <w:b/>
-          <w:color w:val="1A1A1A"/>
-          <w:sz w:val="22"/>
-        </w:rPr>
-        <w:t xml:space="preserve">INPI seleciona bolsista na área de direito da Propriedade Intelectual   </w:t>
-      </w:r>
-      <w:r>
-        <w:rPr>
-          <w:b/>
-          <w:color w:val="7F8C8D"/>
-          <w:sz w:val="16"/>
-        </w:rPr>
-        <w:t>[BAIXA]</w:t>
-      </w:r>
-    </w:p>
-    <w:p>
-      <w:pPr>
-        <w:spacing w:after="40"/>
-      </w:pPr>
-      <w:r>
-        <w:rPr>
-          <w:color w:val="4A4A4A"/>
-          <w:sz w:val="20"/>
-        </w:rPr>
-        <w:t>O INPI está selecionando um bolsista para atuar na área de direito da Propriedade Intelectual.</w:t>
-      </w:r>
-    </w:p>
-    <w:p>
-      <w:pPr>
-        <w:spacing w:after="40"/>
-      </w:pPr>
-      <w:r>
-        <w:rPr>
-          <w:b/>
-          <w:color w:val="888888"/>
-          <w:sz w:val="18"/>
-        </w:rPr>
-        <w:t xml:space="preserve">Publicado: </w:t>
-      </w:r>
-      <w:r>
-        <w:rPr>
-          <w:color w:val="888888"/>
-          <w:sz w:val="18"/>
-        </w:rPr>
-        <w:t xml:space="preserve">2026-07-07T10:46   </w:t>
-      </w:r>
-      <w:hyperlink r:id="rId45">
-        <w:r>
-          <w:rPr>
-            <w:color w:val="1A4D2E"/>
-            <w:u w:val="single"/>
-            <w:b/>
-          </w:rPr>
-          <w:t>Acessar materia</w:t>
-        </w:r>
-      </w:hyperlink>
-    </w:p>
-    <w:p>
-      <w:pPr>
-        <w:spacing w:after="120"/>
-      </w:pPr>
-      <w:r>
-        <w:rPr>
-          <w:i/>
-          <w:color w:val="888888"/>
-          <w:sz w:val="16"/>
-        </w:rPr>
-        <w:t>Notícia institucional de recrutamento, com baixo impacto direto a clientes corporativos.</w:t>
-      </w:r>
-    </w:p>
-    <w:p>
-      <w:pPr>
-        <w:spacing w:before="160" w:after="40"/>
-      </w:pPr>
-      <w:r>
-        <w:rPr>
-          <w:b/>
-          <w:color w:val="1A1A1A"/>
-          <w:sz w:val="22"/>
-        </w:rPr>
-        <w:t xml:space="preserve">INPI publica atualização da Agenda Regulatória 2026-2028   </w:t>
-      </w:r>
-      <w:r>
-        <w:rPr>
-          <w:b/>
-          <w:color w:val="C0392B"/>
-          <w:sz w:val="16"/>
-        </w:rPr>
-        <w:t>[ALTA]</w:t>
-      </w:r>
-    </w:p>
-    <w:p>
-      <w:pPr>
-        <w:spacing w:after="40"/>
-      </w:pPr>
-      <w:r>
-        <w:rPr>
-          <w:color w:val="4A4A4A"/>
-          <w:sz w:val="20"/>
-        </w:rPr>
-        <w:t>O INPI publicou a atualização de sua Agenda Regulatória para o período de 2026-2028, detalhando as prioridades do órgão.</w:t>
-      </w:r>
-    </w:p>
-    <w:p>
-      <w:pPr>
-        <w:spacing w:after="40"/>
-      </w:pPr>
-      <w:r>
-        <w:rPr>
-          <w:b/>
-          <w:color w:val="888888"/>
-          <w:sz w:val="18"/>
-        </w:rPr>
-        <w:t xml:space="preserve">Publicado: </w:t>
-      </w:r>
-      <w:r>
-        <w:rPr>
-          <w:color w:val="888888"/>
-          <w:sz w:val="18"/>
-        </w:rPr>
-        <w:t xml:space="preserve">2026-07-07T15:33   </w:t>
-      </w:r>
-      <w:hyperlink r:id="rId46">
-        <w:r>
-          <w:rPr>
-            <w:color w:val="1A4D2E"/>
-            <w:u w:val="single"/>
-            <w:b/>
-          </w:rPr>
-          <w:t>Acessar materia</w:t>
-        </w:r>
-      </w:hyperlink>
-    </w:p>
-    <w:p>
-      <w:pPr>
-        <w:spacing w:after="120"/>
-      </w:pPr>
-      <w:r>
-        <w:rPr>
-          <w:i/>
-          <w:color w:val="888888"/>
-          <w:sz w:val="16"/>
-        </w:rPr>
-        <w:t>Documento estratégico que define as prioridades regulatórias do órgão, com impacto potencial em futuras normas e procedimentos.</w:t>
+        <w:t>Aprovação de novo medicamento para doença de Chagas em pediatria, com impacto na saúde pública e setor farmacêutico.</w:t>
       </w:r>
     </w:p>
     <w:p/>
@@ -3908,7 +3767,7 @@
           <w:color w:val="4A4A4A"/>
           <w:sz w:val="18"/>
         </w:rPr>
-        <w:t>MME | Notícias - Nenhuma publicação encontrada na janela temporal.</w:t>
+        <w:t>B3 | Ofícios e Comunicados - Nenhuma publicação encontrada na janela temporal.</w:t>
       </w:r>
     </w:p>
     <w:p>
@@ -3920,7 +3779,31 @@
           <w:color w:val="4A4A4A"/>
           <w:sz w:val="18"/>
         </w:rPr>
-        <w:t>ONS | Notícias - A fonte explicitamente indica 'Nenhum item encontrado' para o período.</w:t>
+        <w:t>ANP | Notícias - Nenhuma publicação encontrada na janela temporal.</w:t>
+      </w:r>
+    </w:p>
+    <w:p>
+      <w:pPr>
+        <w:pStyle w:val="ListBullet"/>
+      </w:pPr>
+      <w:r>
+        <w:rPr>
+          <w:color w:val="4A4A4A"/>
+          <w:sz w:val="18"/>
+        </w:rPr>
+        <w:t>ONS | Notícias - Nenhuma publicação encontrada na janela temporal.</w:t>
+      </w:r>
+    </w:p>
+    <w:p>
+      <w:pPr>
+        <w:pStyle w:val="ListBullet"/>
+      </w:pPr>
+      <w:r>
+        <w:rPr>
+          <w:color w:val="4A4A4A"/>
+          <w:sz w:val="18"/>
+        </w:rPr>
+        <w:t>ANEEL | Últimas Notícias - Nenhuma publicação encontrada na janela temporal.</w:t>
       </w:r>
     </w:p>
     <w:p>
@@ -3944,7 +3827,7 @@
           <w:color w:val="4A4A4A"/>
           <w:sz w:val="18"/>
         </w:rPr>
-        <w:t>Ministério da Agricultura | Notícias - Nenhuma publicação encontrada na janela temporal.</w:t>
+        <w:t>COAF | Notícias - Nenhuma publicação encontrada na janela temporal.</w:t>
       </w:r>
     </w:p>
     <w:p>
@@ -3956,7 +3839,19 @@
           <w:color w:val="4A4A4A"/>
           <w:sz w:val="18"/>
         </w:rPr>
-        <w:t>COAF | Notícias - Nenhuma publicação encontrada na janela temporal.</w:t>
+        <w:t>INPI | Notícias - A única publicação recente está fora da janela temporal (após 2026-07-09T10:51).</w:t>
+      </w:r>
+    </w:p>
+    <w:p>
+      <w:pPr>
+        <w:pStyle w:val="ListBullet"/>
+      </w:pPr>
+      <w:r>
+        <w:rPr>
+          <w:color w:val="4A4A4A"/>
+          <w:sz w:val="18"/>
+        </w:rPr>
+        <w:t>ANM | Notícias - A única publicação recente está fora da janela temporal (após 2026-07-09T10:51).</w:t>
       </w:r>
     </w:p>
     <w:p>
@@ -3978,7 +3873,7 @@
           <w:color w:val="4A4A4A"/>
           <w:sz w:val="18"/>
         </w:rPr>
-        <w:t>Receita Federal | Normas - A página contém apenas filtros de busca e não exibe resultados de normas diretamente.</w:t>
+        <w:t>Receita Federal | Normas - A fonte é uma interface de busca e não apresenta conteúdo recente diretamente extraível.</w:t>
       </w:r>
     </w:p>
     <w:p>
@@ -4000,7 +3895,7 @@
           <w:color w:val="4A4A4A"/>
           <w:sz w:val="18"/>
         </w:rPr>
-        <w:t>CGU | Notícias - Conteúdo restrito, requer autenticação para visualização.</w:t>
+        <w:t>CGU | Notícias - Conteúdo restrito, requer autenticação.</w:t>
       </w:r>
     </w:p>
     <w:p>
@@ -4012,19 +3907,7 @@
           <w:color w:val="4A4A4A"/>
           <w:sz w:val="18"/>
         </w:rPr>
-        <w:t>Ministério do Meio Ambiente | Notícias - Conteúdo restrito, requer autenticação para visualização.</w:t>
-      </w:r>
-    </w:p>
-    <w:p>
-      <w:pPr>
-        <w:pStyle w:val="ListBullet"/>
-      </w:pPr>
-      <w:r>
-        <w:rPr>
-          <w:color w:val="4A4A4A"/>
-          <w:sz w:val="18"/>
-        </w:rPr>
-        <w:t>SENACON | Notícias - Conteúdo restrito, requer autenticação para visualização.</w:t>
+        <w:t>Ministério do Meio Ambiente | Notícias - Conteúdo restrito, requer autenticação.</w:t>
       </w:r>
     </w:p>
     <w:p/>
@@ -4072,7 +3955,7 @@
           <w:color w:val="888888"/>
           <w:sz w:val="16"/>
         </w:rPr>
-        <w:t>Janela analisada: 2026-07-07T00:00 ate 2026-07-08T09:22</w:t>
+        <w:t>Janela analisada: 2026-07-08T00:00 ate 2026-07-09T10:51</w:t>
       </w:r>
     </w:p>
     <w:sectPr>

</xml_diff>

<commit_message>
📰 Atualiza boletim - 2026-07-10
</commit_message>
<xml_diff>
--- a/output/boletim.docx
+++ b/output/boletim.docx
@@ -52,7 +52,7 @@
                 <w:color w:val="FFFFFF"/>
                 <w:sz w:val="28"/>
               </w:rPr>
-              <w:t>9 de julho de 2026</w:t>
+              <w:t>10 de julho de 2026</w:t>
             </w:r>
           </w:p>
         </w:tc>
@@ -87,7 +87,7 @@
                 <w:color w:val="1A4D2E"/>
                 <w:sz w:val="56"/>
               </w:rPr>
-              <w:t>36</w:t>
+              <w:t>27</w:t>
             </w:r>
           </w:p>
         </w:tc>
@@ -125,7 +125,7 @@
                 <w:color w:val="D68910"/>
                 <w:sz w:val="56"/>
               </w:rPr>
-              <w:t>17</w:t>
+              <w:t>16</w:t>
             </w:r>
           </w:p>
         </w:tc>
@@ -144,7 +144,7 @@
                 <w:color w:val="7F8C8D"/>
                 <w:sz w:val="56"/>
               </w:rPr>
-              <w:t>10</w:t>
+              <w:t>2</w:t>
             </w:r>
           </w:p>
         </w:tc>
@@ -307,7 +307,7 @@
                   <w:u w:val="single"/>
                   <w:b/>
                 </w:rPr>
-                <w:t>Comunicado n° 45.526, 9/7/2026</w:t>
+                <w:t>Comunicado n° 45.535, 10/7/2026</w:t>
               </w:r>
             </w:hyperlink>
           </w:p>
@@ -320,7 +320,7 @@
                 <w:color w:val="4A4A4A"/>
                 <w:sz w:val="18"/>
               </w:rPr>
-              <w:t>Divulga a Taxa Básica Financeira (TBF), o Redutor 'R' e a Taxa Referencial (TR) relativos a 8 de julho de 2026.</w:t>
+              <w:t>Divulga a Taxa Básica Financeira (TBF), o Redutor "R" e a Taxa Referencial (TR) relativos a 9 de julho de 2026.</w:t>
             </w:r>
           </w:p>
         </w:tc>
@@ -365,7 +365,65 @@
                   <w:u w:val="single"/>
                   <w:b/>
                 </w:rPr>
-                <w:t>Comunicado n° 45.525, 8/7/2026</w:t>
+                <w:t>Comunicado n° 45.534, 9/7/2026</w:t>
+              </w:r>
+            </w:hyperlink>
+          </w:p>
+          <w:p>
+            <w:pPr>
+              <w:spacing w:after="120"/>
+            </w:pPr>
+            <w:r>
+              <w:rPr>
+                <w:color w:val="4A4A4A"/>
+                <w:sz w:val="18"/>
+              </w:rPr>
+              <w:t>Divulga condições para a realização de operações compromissadas com instituições financeiras participantes do módulo Oferta Pública (Ofpub).</w:t>
+            </w:r>
+          </w:p>
+        </w:tc>
+      </w:tr>
+    </w:tbl>
+    <w:tbl>
+      <w:tblPr>
+        <w:tblW w:type="auto" w:w="0"/>
+        <w:tblLayout w:type="fixed"/>
+        <w:tblLook w:firstColumn="1" w:firstRow="1" w:lastColumn="0" w:lastRow="0" w:noHBand="0" w:noVBand="1" w:val="04A0"/>
+      </w:tblPr>
+      <w:tblGrid>
+        <w:gridCol w:w="9638"/>
+      </w:tblGrid>
+      <w:tr>
+        <w:tc>
+          <w:tcPr>
+            <w:tcW w:type="dxa" w:w="9638"/>
+            <w:shd w:val="clear" w:color="auto" w:fill="F0F7F2"/>
+          </w:tcPr>
+          <w:p>
+            <w:pPr>
+              <w:spacing w:before="120" w:after="40"/>
+            </w:pPr>
+            <w:r>
+              <w:rPr>
+                <w:b/>
+                <w:color w:val="1A4D2E"/>
+                <w:sz w:val="16"/>
+              </w:rPr>
+              <w:t>BANCO CENTRAL | NORMAS</w:t>
+            </w:r>
+          </w:p>
+          <w:p>
+            <w:pPr>
+              <w:spacing w:after="40"/>
+            </w:pPr>
+            <w:hyperlink r:id="rId11">
+              <w:r>
+                <w:rPr>
+                  <w:color w:val="1A1A1A"/>
+                  <w:u w:val="single"/>
+                  <w:b/>
+                </w:rPr>
+                <w:t>Comunicado n° 45.533, 9/7/2026</w:t>
               </w:r>
             </w:hyperlink>
           </w:p>
@@ -416,14 +474,14 @@
             <w:pPr>
               <w:spacing w:after="40"/>
             </w:pPr>
-            <w:hyperlink r:id="rId11">
+            <w:hyperlink r:id="rId12">
               <w:r>
                 <w:rPr>
                   <w:color w:val="1A1A1A"/>
                   <w:u w:val="single"/>
                   <w:b/>
                 </w:rPr>
-                <w:t>Comunicado n° 45.524, 8/7/2026</w:t>
+                <w:t>Instrução Normativa BCB n° 761, 9/7/2026</w:t>
               </w:r>
             </w:hyperlink>
           </w:p>
@@ -436,7 +494,7 @@
                 <w:color w:val="4A4A4A"/>
                 <w:sz w:val="18"/>
               </w:rPr>
-              <w:t>Divulga condições para a realização de operações compromissadas com instituições financeiras participantes do módulo Oferta Pública (Ofpub).</w:t>
+              <w:t>Divulga orientações sobre medidas reforçadas para instituições financeiras em operações com países com deficiências nas recomendações do Gafi.</w:t>
             </w:r>
           </w:p>
         </w:tc>
@@ -467,65 +525,7 @@
                 <w:color w:val="1A4D2E"/>
                 <w:sz w:val="16"/>
               </w:rPr>
-              <w:t>BANCO CENTRAL | NORMAS</w:t>
-            </w:r>
-          </w:p>
-          <w:p>
-            <w:pPr>
-              <w:spacing w:after="40"/>
-            </w:pPr>
-            <w:hyperlink r:id="rId12">
-              <w:r>
-                <w:rPr>
-                  <w:color w:val="1A1A1A"/>
-                  <w:u w:val="single"/>
-                  <w:b/>
-                </w:rPr>
-                <w:t>Instrução Normativa BCB n° 758, 8/7/2026</w:t>
-              </w:r>
-            </w:hyperlink>
-          </w:p>
-          <w:p>
-            <w:pPr>
-              <w:spacing w:after="120"/>
-            </w:pPr>
-            <w:r>
-              <w:rPr>
-                <w:color w:val="4A4A4A"/>
-                <w:sz w:val="18"/>
-              </w:rPr>
-              <w:t>Altera o Manual de Crédito Rural (MCR) para ajustar prazos e orientar instituições financeiras sobre procedimentos de reversão de desclassificação no Sicor.</w:t>
-            </w:r>
-          </w:p>
-        </w:tc>
-      </w:tr>
-    </w:tbl>
-    <w:tbl>
-      <w:tblPr>
-        <w:tblW w:type="auto" w:w="0"/>
-        <w:tblLayout w:type="fixed"/>
-        <w:tblLook w:firstColumn="1" w:firstRow="1" w:lastColumn="0" w:lastRow="0" w:noHBand="0" w:noVBand="1" w:val="04A0"/>
-      </w:tblPr>
-      <w:tblGrid>
-        <w:gridCol w:w="9638"/>
-      </w:tblGrid>
-      <w:tr>
-        <w:tc>
-          <w:tcPr>
-            <w:tcW w:type="dxa" w:w="9638"/>
-            <w:shd w:val="clear" w:color="auto" w:fill="F0F7F2"/>
-          </w:tcPr>
-          <w:p>
-            <w:pPr>
-              <w:spacing w:before="120" w:after="40"/>
-            </w:pPr>
-            <w:r>
-              <w:rPr>
-                <w:b/>
-                <w:color w:val="1A4D2E"/>
-                <w:sz w:val="16"/>
-              </w:rPr>
-              <w:t>BANCO CENTRAL | NORMAS</w:t>
+              <w:t>MME | NOTÍCIAS</w:t>
             </w:r>
           </w:p>
           <w:p>
@@ -539,7 +539,7 @@
                   <w:u w:val="single"/>
                   <w:b/>
                 </w:rPr>
-                <w:t>Instrução Normativa BCB n° 757, 8/7/2026</w:t>
+                <w:t>Resolução do CMSE estabelece novas diretrizes para despacho de geração térmica</w:t>
               </w:r>
             </w:hyperlink>
           </w:p>
@@ -552,749 +552,12 @@
                 <w:color w:val="4A4A4A"/>
                 <w:sz w:val="18"/>
               </w:rPr>
-              <w:t>Estabelece procedimentos para a prestação de informações ao Banco Central do Brasil relativas a contas de depósito em moeda estrangeira.</w:t>
+              <w:t>Resolução do Comitê de Monitoramento do Setor Elétrico (CMSE) publicada no DOU estabelece novas diretrizes para despacho de geração térmica.</w:t>
             </w:r>
           </w:p>
         </w:tc>
       </w:tr>
     </w:tbl>
-    <w:p/>
-    <w:tbl>
-      <w:tblPr>
-        <w:tblW w:type="auto" w:w="0"/>
-        <w:tblLayout w:type="fixed"/>
-        <w:tblLook w:firstColumn="1" w:firstRow="1" w:lastColumn="0" w:lastRow="0" w:noHBand="0" w:noVBand="1" w:val="04A0"/>
-      </w:tblPr>
-      <w:tblGrid>
-        <w:gridCol w:w="9638"/>
-      </w:tblGrid>
-      <w:tr>
-        <w:tc>
-          <w:tcPr>
-            <w:tcW w:type="dxa" w:w="9638"/>
-            <w:shd w:val="clear" w:color="auto" w:fill="1A4D2E"/>
-          </w:tcPr>
-          <w:p>
-            <w:pPr>
-              <w:spacing w:before="120" w:after="40"/>
-            </w:pPr>
-            <w:r>
-              <w:rPr>
-                <w:b w:val="0"/>
-                <w:color w:val="FFFFFF"/>
-                <w:sz w:val="32"/>
-              </w:rPr>
-              <w:t>Legislacao Federal</w:t>
-            </w:r>
-          </w:p>
-        </w:tc>
-      </w:tr>
-    </w:tbl>
-    <w:p>
-      <w:pPr>
-        <w:spacing w:before="240" w:after="80"/>
-      </w:pPr>
-      <w:r>
-        <w:rPr>
-          <w:b/>
-          <w:color w:val="1A4D2E"/>
-          <w:sz w:val="20"/>
-        </w:rPr>
-        <w:t>PLANALTO | RESENHA DIARIA</w:t>
-      </w:r>
-    </w:p>
-    <w:p>
-      <w:pPr>
-        <w:spacing w:before="0" w:after="40"/>
-        <w:pBdr>
-          <w:bottom w:val="single" w:sz="8" w:space="1" w:color="1A4D2E"/>
-        </w:pBdr>
-      </w:pPr>
-    </w:p>
-    <w:p>
-      <w:pPr>
-        <w:spacing w:before="160" w:after="40"/>
-      </w:pPr>
-      <w:r>
-        <w:rPr>
-          <w:b/>
-          <w:color w:val="1A1A1A"/>
-          <w:sz w:val="22"/>
-        </w:rPr>
-        <w:t xml:space="preserve">Lei nº 15.463, de 8.7.2026   </w:t>
-      </w:r>
-      <w:r>
-        <w:rPr>
-          <w:b/>
-          <w:color w:val="7F8C8D"/>
-          <w:sz w:val="16"/>
-        </w:rPr>
-        <w:t>[BAIXA]</w:t>
-      </w:r>
-    </w:p>
-    <w:p>
-      <w:pPr>
-        <w:spacing w:after="40"/>
-      </w:pPr>
-      <w:r>
-        <w:rPr>
-          <w:color w:val="4A4A4A"/>
-          <w:sz w:val="20"/>
-        </w:rPr>
-        <w:t>Institui o Dia Nacional dos Congados e Reinados, a ser comemorado anualmente em 7 de outubro.</w:t>
-      </w:r>
-    </w:p>
-    <w:p>
-      <w:pPr>
-        <w:spacing w:after="40"/>
-      </w:pPr>
-      <w:r>
-        <w:rPr>
-          <w:b/>
-          <w:color w:val="888888"/>
-          <w:sz w:val="18"/>
-        </w:rPr>
-        <w:t xml:space="preserve">Publicado: </w:t>
-      </w:r>
-      <w:r>
-        <w:rPr>
-          <w:color w:val="888888"/>
-          <w:sz w:val="18"/>
-        </w:rPr>
-        <w:t xml:space="preserve">2026-07-09   </w:t>
-      </w:r>
-      <w:hyperlink r:id="rId14">
-        <w:r>
-          <w:rPr>
-            <w:color w:val="1A4D2E"/>
-            <w:u w:val="single"/>
-            <w:b/>
-          </w:rPr>
-          <w:t>Acessar materia</w:t>
-        </w:r>
-      </w:hyperlink>
-    </w:p>
-    <w:p>
-      <w:pPr>
-        <w:spacing w:after="120"/>
-      </w:pPr>
-      <w:r>
-        <w:rPr>
-          <w:i/>
-          <w:color w:val="888888"/>
-          <w:sz w:val="16"/>
-        </w:rPr>
-        <w:t>Institui data comemorativa, sem impacto direto a clientes corporativos.</w:t>
-      </w:r>
-    </w:p>
-    <w:p>
-      <w:pPr>
-        <w:spacing w:before="160" w:after="40"/>
-      </w:pPr>
-      <w:r>
-        <w:rPr>
-          <w:b/>
-          <w:color w:val="1A1A1A"/>
-          <w:sz w:val="22"/>
-        </w:rPr>
-        <w:t xml:space="preserve">Lei nº 15.462, de 8.7.2026   </w:t>
-      </w:r>
-      <w:r>
-        <w:rPr>
-          <w:b/>
-          <w:color w:val="D68910"/>
-          <w:sz w:val="16"/>
-        </w:rPr>
-        <w:t>[MÉDIA]</w:t>
-      </w:r>
-    </w:p>
-    <w:p>
-      <w:pPr>
-        <w:spacing w:after="40"/>
-      </w:pPr>
-      <w:r>
-        <w:rPr>
-          <w:color w:val="4A4A4A"/>
-          <w:sz w:val="20"/>
-        </w:rPr>
-        <w:t>Altera a Lei de Diretrizes e Bases da Educação Nacional (Lei nº 9.394/1996) para especificar atividades de aperfeiçoamento profissional continuado dos profissionais da educação básica pública.</w:t>
-      </w:r>
-    </w:p>
-    <w:p>
-      <w:pPr>
-        <w:spacing w:after="40"/>
-      </w:pPr>
-      <w:r>
-        <w:rPr>
-          <w:b/>
-          <w:color w:val="888888"/>
-          <w:sz w:val="18"/>
-        </w:rPr>
-        <w:t xml:space="preserve">Publicado: </w:t>
-      </w:r>
-      <w:r>
-        <w:rPr>
-          <w:color w:val="888888"/>
-          <w:sz w:val="18"/>
-        </w:rPr>
-        <w:t xml:space="preserve">2026-07-09   </w:t>
-      </w:r>
-      <w:hyperlink r:id="rId15">
-        <w:r>
-          <w:rPr>
-            <w:color w:val="1A4D2E"/>
-            <w:u w:val="single"/>
-            <w:b/>
-          </w:rPr>
-          <w:t>Acessar materia</w:t>
-        </w:r>
-      </w:hyperlink>
-    </w:p>
-    <w:p>
-      <w:pPr>
-        <w:spacing w:after="120"/>
-      </w:pPr>
-      <w:r>
-        <w:rPr>
-          <w:i/>
-          <w:color w:val="888888"/>
-          <w:sz w:val="16"/>
-        </w:rPr>
-        <w:t>Alteração de legislação educacional com impacto em profissionais da educação.</w:t>
-      </w:r>
-    </w:p>
-    <w:p>
-      <w:pPr>
-        <w:spacing w:before="160" w:after="40"/>
-      </w:pPr>
-      <w:r>
-        <w:rPr>
-          <w:b/>
-          <w:color w:val="1A1A1A"/>
-          <w:sz w:val="22"/>
-        </w:rPr>
-        <w:t xml:space="preserve">Lei nº 15.461, de 7.7.2026   </w:t>
-      </w:r>
-      <w:r>
-        <w:rPr>
-          <w:b/>
-          <w:color w:val="7F8C8D"/>
-          <w:sz w:val="16"/>
-        </w:rPr>
-        <w:t>[BAIXA]</w:t>
-      </w:r>
-    </w:p>
-    <w:p>
-      <w:pPr>
-        <w:spacing w:after="40"/>
-      </w:pPr>
-      <w:r>
-        <w:rPr>
-          <w:color w:val="4A4A4A"/>
-          <w:sz w:val="20"/>
-        </w:rPr>
-        <w:t>Confere o título de Capital Nacional da Maior Onda do Brasil ao Município de Jaguaruna, no Estado de Santa Catarina.</w:t>
-      </w:r>
-    </w:p>
-    <w:p>
-      <w:pPr>
-        <w:spacing w:after="40"/>
-      </w:pPr>
-      <w:r>
-        <w:rPr>
-          <w:b/>
-          <w:color w:val="888888"/>
-          <w:sz w:val="18"/>
-        </w:rPr>
-        <w:t xml:space="preserve">Publicado: </w:t>
-      </w:r>
-      <w:r>
-        <w:rPr>
-          <w:color w:val="888888"/>
-          <w:sz w:val="18"/>
-        </w:rPr>
-        <w:t xml:space="preserve">2026-07-08   </w:t>
-      </w:r>
-      <w:hyperlink r:id="rId16">
-        <w:r>
-          <w:rPr>
-            <w:color w:val="1A4D2E"/>
-            <w:u w:val="single"/>
-            <w:b/>
-          </w:rPr>
-          <w:t>Acessar materia</w:t>
-        </w:r>
-      </w:hyperlink>
-    </w:p>
-    <w:p>
-      <w:pPr>
-        <w:spacing w:after="120"/>
-      </w:pPr>
-      <w:r>
-        <w:rPr>
-          <w:i/>
-          <w:color w:val="888888"/>
-          <w:sz w:val="16"/>
-        </w:rPr>
-        <w:t>Confere título honorífico a município, sem impacto direto a clientes corporativos.</w:t>
-      </w:r>
-    </w:p>
-    <w:p>
-      <w:pPr>
-        <w:spacing w:before="160" w:after="40"/>
-      </w:pPr>
-      <w:r>
-        <w:rPr>
-          <w:b/>
-          <w:color w:val="1A1A1A"/>
-          <w:sz w:val="22"/>
-        </w:rPr>
-        <w:t xml:space="preserve">Lei nº 15.460, de 7.7.2026   </w:t>
-      </w:r>
-      <w:r>
-        <w:rPr>
-          <w:b/>
-          <w:color w:val="7F8C8D"/>
-          <w:sz w:val="16"/>
-        </w:rPr>
-        <w:t>[BAIXA]</w:t>
-      </w:r>
-    </w:p>
-    <w:p>
-      <w:pPr>
-        <w:spacing w:after="40"/>
-      </w:pPr>
-      <w:r>
-        <w:rPr>
-          <w:color w:val="4A4A4A"/>
-          <w:sz w:val="20"/>
-        </w:rPr>
-        <w:t>Institui o Dia Nacional do Vinho, a ser comemorado no primeiro domingo do mês de junho.</w:t>
-      </w:r>
-    </w:p>
-    <w:p>
-      <w:pPr>
-        <w:spacing w:after="40"/>
-      </w:pPr>
-      <w:r>
-        <w:rPr>
-          <w:b/>
-          <w:color w:val="888888"/>
-          <w:sz w:val="18"/>
-        </w:rPr>
-        <w:t xml:space="preserve">Publicado: </w:t>
-      </w:r>
-      <w:r>
-        <w:rPr>
-          <w:color w:val="888888"/>
-          <w:sz w:val="18"/>
-        </w:rPr>
-        <w:t xml:space="preserve">2026-07-08   </w:t>
-      </w:r>
-      <w:hyperlink r:id="rId17">
-        <w:r>
-          <w:rPr>
-            <w:color w:val="1A4D2E"/>
-            <w:u w:val="single"/>
-            <w:b/>
-          </w:rPr>
-          <w:t>Acessar materia</w:t>
-        </w:r>
-      </w:hyperlink>
-    </w:p>
-    <w:p>
-      <w:pPr>
-        <w:spacing w:after="120"/>
-      </w:pPr>
-      <w:r>
-        <w:rPr>
-          <w:i/>
-          <w:color w:val="888888"/>
-          <w:sz w:val="16"/>
-        </w:rPr>
-        <w:t>Institui data comemorativa, sem impacto direto a clientes corporativos.</w:t>
-      </w:r>
-    </w:p>
-    <w:p>
-      <w:pPr>
-        <w:spacing w:before="160" w:after="40"/>
-      </w:pPr>
-      <w:r>
-        <w:rPr>
-          <w:b/>
-          <w:color w:val="1A1A1A"/>
-          <w:sz w:val="22"/>
-        </w:rPr>
-        <w:t xml:space="preserve">Lei nº 15.459, de 7.7.2026   </w:t>
-      </w:r>
-      <w:r>
-        <w:rPr>
-          <w:b/>
-          <w:color w:val="D68910"/>
-          <w:sz w:val="16"/>
-        </w:rPr>
-        <w:t>[MÉDIA]</w:t>
-      </w:r>
-    </w:p>
-    <w:p>
-      <w:pPr>
-        <w:spacing w:after="40"/>
-      </w:pPr>
-      <w:r>
-        <w:rPr>
-          <w:color w:val="4A4A4A"/>
-          <w:sz w:val="20"/>
-        </w:rPr>
-        <w:t>Altera a Lei nº 7.405, de 12 de novembro de 1985, para estabelecer a utilização do Símbolo Internacional de Acessibilidade.</w:t>
-      </w:r>
-    </w:p>
-    <w:p>
-      <w:pPr>
-        <w:spacing w:after="40"/>
-      </w:pPr>
-      <w:r>
-        <w:rPr>
-          <w:b/>
-          <w:color w:val="888888"/>
-          <w:sz w:val="18"/>
-        </w:rPr>
-        <w:t xml:space="preserve">Publicado: </w:t>
-      </w:r>
-      <w:r>
-        <w:rPr>
-          <w:color w:val="888888"/>
-          <w:sz w:val="18"/>
-        </w:rPr>
-        <w:t xml:space="preserve">2026-07-08   </w:t>
-      </w:r>
-      <w:hyperlink r:id="rId18">
-        <w:r>
-          <w:rPr>
-            <w:color w:val="1A4D2E"/>
-            <w:u w:val="single"/>
-            <w:b/>
-          </w:rPr>
-          <w:t>Acessar materia</w:t>
-        </w:r>
-      </w:hyperlink>
-    </w:p>
-    <w:p>
-      <w:pPr>
-        <w:spacing w:after="120"/>
-      </w:pPr>
-      <w:r>
-        <w:rPr>
-          <w:i/>
-          <w:color w:val="888888"/>
-          <w:sz w:val="16"/>
-        </w:rPr>
-        <w:t>Alteração de lei para estabelecer símbolo de acessibilidade, com potencial impacto em infraestrutura e serviços.</w:t>
-      </w:r>
-    </w:p>
-    <w:p>
-      <w:pPr>
-        <w:spacing w:before="160" w:after="40"/>
-      </w:pPr>
-      <w:r>
-        <w:rPr>
-          <w:b/>
-          <w:color w:val="1A1A1A"/>
-          <w:sz w:val="22"/>
-        </w:rPr>
-        <w:t xml:space="preserve">Decreto nº 13.060, de 7.7.2026   </w:t>
-      </w:r>
-      <w:r>
-        <w:rPr>
-          <w:b/>
-          <w:color w:val="7F8C8D"/>
-          <w:sz w:val="16"/>
-        </w:rPr>
-        <w:t>[BAIXA]</w:t>
-      </w:r>
-    </w:p>
-    <w:p>
-      <w:pPr>
-        <w:spacing w:after="40"/>
-      </w:pPr>
-      <w:r>
-        <w:rPr>
-          <w:color w:val="4A4A4A"/>
-          <w:sz w:val="20"/>
-        </w:rPr>
-        <w:t>Altera o Decreto nº 10.172/2019 para modificar a composição do Conselho Fiscal do Serviço Autônomo Embratur – Agência Brasileira de Promoção Internacional do Turismo.</w:t>
-      </w:r>
-    </w:p>
-    <w:p>
-      <w:pPr>
-        <w:spacing w:after="40"/>
-      </w:pPr>
-      <w:r>
-        <w:rPr>
-          <w:b/>
-          <w:color w:val="888888"/>
-          <w:sz w:val="18"/>
-        </w:rPr>
-        <w:t xml:space="preserve">Publicado: </w:t>
-      </w:r>
-      <w:r>
-        <w:rPr>
-          <w:color w:val="888888"/>
-          <w:sz w:val="18"/>
-        </w:rPr>
-        <w:t xml:space="preserve">2026-07-08   </w:t>
-      </w:r>
-      <w:hyperlink r:id="rId19">
-        <w:r>
-          <w:rPr>
-            <w:color w:val="1A4D2E"/>
-            <w:u w:val="single"/>
-            <w:b/>
-          </w:rPr>
-          <w:t>Acessar materia</w:t>
-        </w:r>
-      </w:hyperlink>
-    </w:p>
-    <w:p>
-      <w:pPr>
-        <w:spacing w:after="120"/>
-      </w:pPr>
-      <w:r>
-        <w:rPr>
-          <w:i/>
-          <w:color w:val="888888"/>
-          <w:sz w:val="16"/>
-        </w:rPr>
-        <w:t>Alteração de composição de conselho fiscal de autarquia, de natureza administrativa interna.</w:t>
-      </w:r>
-    </w:p>
-    <w:p>
-      <w:pPr>
-        <w:spacing w:before="160" w:after="40"/>
-      </w:pPr>
-      <w:r>
-        <w:rPr>
-          <w:b/>
-          <w:color w:val="1A1A1A"/>
-          <w:sz w:val="22"/>
-        </w:rPr>
-        <w:t xml:space="preserve">Decreto nº 13.059, de 7.7.2026   </w:t>
-      </w:r>
-      <w:r>
-        <w:rPr>
-          <w:b/>
-          <w:color w:val="7F8C8D"/>
-          <w:sz w:val="16"/>
-        </w:rPr>
-        <w:t>[BAIXA]</w:t>
-      </w:r>
-    </w:p>
-    <w:p>
-      <w:pPr>
-        <w:spacing w:after="40"/>
-      </w:pPr>
-      <w:r>
-        <w:rPr>
-          <w:color w:val="4A4A4A"/>
-          <w:sz w:val="20"/>
-        </w:rPr>
-        <w:t>Remaneja, em caráter temporário, cargo em comissão e funções de confiança para o Ministério das Relações Exteriores.</w:t>
-      </w:r>
-    </w:p>
-    <w:p>
-      <w:pPr>
-        <w:spacing w:after="40"/>
-      </w:pPr>
-      <w:r>
-        <w:rPr>
-          <w:b/>
-          <w:color w:val="888888"/>
-          <w:sz w:val="18"/>
-        </w:rPr>
-        <w:t xml:space="preserve">Publicado: </w:t>
-      </w:r>
-      <w:r>
-        <w:rPr>
-          <w:color w:val="888888"/>
-          <w:sz w:val="18"/>
-        </w:rPr>
-        <w:t xml:space="preserve">2026-07-08   </w:t>
-      </w:r>
-      <w:hyperlink r:id="rId20">
-        <w:r>
-          <w:rPr>
-            <w:color w:val="1A4D2E"/>
-            <w:u w:val="single"/>
-            <w:b/>
-          </w:rPr>
-          <w:t>Acessar materia</w:t>
-        </w:r>
-      </w:hyperlink>
-    </w:p>
-    <w:p>
-      <w:pPr>
-        <w:spacing w:after="120"/>
-      </w:pPr>
-      <w:r>
-        <w:rPr>
-          <w:i/>
-          <w:color w:val="888888"/>
-          <w:sz w:val="16"/>
-        </w:rPr>
-        <w:t>Remanejamento de cargos administrativos, de natureza interna.</w:t>
-      </w:r>
-    </w:p>
-    <w:p>
-      <w:pPr>
-        <w:spacing w:before="160" w:after="40"/>
-      </w:pPr>
-      <w:r>
-        <w:rPr>
-          <w:b/>
-          <w:color w:val="1A1A1A"/>
-          <w:sz w:val="22"/>
-        </w:rPr>
-        <w:t xml:space="preserve">Decreto nº 13.058, de 7.7.2026   </w:t>
-      </w:r>
-      <w:r>
-        <w:rPr>
-          <w:b/>
-          <w:color w:val="7F8C8D"/>
-          <w:sz w:val="16"/>
-        </w:rPr>
-        <w:t>[BAIXA]</w:t>
-      </w:r>
-    </w:p>
-    <w:p>
-      <w:pPr>
-        <w:spacing w:after="40"/>
-      </w:pPr>
-      <w:r>
-        <w:rPr>
-          <w:color w:val="4A4A4A"/>
-          <w:sz w:val="20"/>
-        </w:rPr>
-        <w:t>Altera o Decreto nº 11.198/2022, que aprova a Estrutura Regimental e o Quadro Demonstrativo de Cargos e Funções do Departamento Nacional de Obras Contra as Secas (DNOCS), e remaneja e transforma cargos.</w:t>
-      </w:r>
-    </w:p>
-    <w:p>
-      <w:pPr>
-        <w:spacing w:after="40"/>
-      </w:pPr>
-      <w:r>
-        <w:rPr>
-          <w:b/>
-          <w:color w:val="888888"/>
-          <w:sz w:val="18"/>
-        </w:rPr>
-        <w:t xml:space="preserve">Publicado: </w:t>
-      </w:r>
-      <w:r>
-        <w:rPr>
-          <w:color w:val="888888"/>
-          <w:sz w:val="18"/>
-        </w:rPr>
-        <w:t xml:space="preserve">2026-07-08   </w:t>
-      </w:r>
-      <w:hyperlink r:id="rId21">
-        <w:r>
-          <w:rPr>
-            <w:color w:val="1A4D2E"/>
-            <w:u w:val="single"/>
-            <w:b/>
-          </w:rPr>
-          <w:t>Acessar materia</w:t>
-        </w:r>
-      </w:hyperlink>
-    </w:p>
-    <w:p>
-      <w:pPr>
-        <w:spacing w:after="120"/>
-      </w:pPr>
-      <w:r>
-        <w:rPr>
-          <w:i/>
-          <w:color w:val="888888"/>
-          <w:sz w:val="16"/>
-        </w:rPr>
-        <w:t>Alteração de estrutura regimental e remanejamento de cargos, de natureza administrativa interna.</w:t>
-      </w:r>
-    </w:p>
-    <w:p>
-      <w:pPr>
-        <w:spacing w:before="160" w:after="40"/>
-      </w:pPr>
-      <w:r>
-        <w:rPr>
-          <w:b/>
-          <w:color w:val="1A1A1A"/>
-          <w:sz w:val="22"/>
-        </w:rPr>
-        <w:t xml:space="preserve">Decreto nº 13.057, de 7.7.2026   </w:t>
-      </w:r>
-      <w:r>
-        <w:rPr>
-          <w:b/>
-          <w:color w:val="D68910"/>
-          <w:sz w:val="16"/>
-        </w:rPr>
-        <w:t>[MÉDIA]</w:t>
-      </w:r>
-    </w:p>
-    <w:p>
-      <w:pPr>
-        <w:spacing w:after="40"/>
-      </w:pPr>
-      <w:r>
-        <w:rPr>
-          <w:color w:val="4A4A4A"/>
-          <w:sz w:val="20"/>
-        </w:rPr>
-        <w:t>Altera o Decreto nº 2.338/1997, que aprova o Regulamento da Agência Nacional de Telecomunicações (Anatel), e remaneja e transforma cargos em comissão e funções de confiança.</w:t>
-      </w:r>
-    </w:p>
-    <w:p>
-      <w:pPr>
-        <w:spacing w:after="40"/>
-      </w:pPr>
-      <w:r>
-        <w:rPr>
-          <w:b/>
-          <w:color w:val="888888"/>
-          <w:sz w:val="18"/>
-        </w:rPr>
-        <w:t xml:space="preserve">Publicado: </w:t>
-      </w:r>
-      <w:r>
-        <w:rPr>
-          <w:color w:val="888888"/>
-          <w:sz w:val="18"/>
-        </w:rPr>
-        <w:t xml:space="preserve">2026-07-08   </w:t>
-      </w:r>
-      <w:hyperlink r:id="rId22">
-        <w:r>
-          <w:rPr>
-            <w:color w:val="1A4D2E"/>
-            <w:u w:val="single"/>
-            <w:b/>
-          </w:rPr>
-          <w:t>Acessar materia</w:t>
-        </w:r>
-      </w:hyperlink>
-    </w:p>
-    <w:p>
-      <w:pPr>
-        <w:spacing w:after="120"/>
-      </w:pPr>
-      <w:r>
-        <w:rPr>
-          <w:i/>
-          <w:color w:val="888888"/>
-          <w:sz w:val="16"/>
-        </w:rPr>
-        <w:t>Alteração de regulamento de agência reguladora (Anatel) e remanejamento de cargos, com potencial impacto setorial.</w:t>
-      </w:r>
-    </w:p>
     <w:p/>
     <w:tbl>
       <w:tblPr>
@@ -1358,6 +621,918 @@
           <w:color w:val="1A1A1A"/>
           <w:sz w:val="22"/>
         </w:rPr>
+        <w:t xml:space="preserve">Comunicado n° 45.538, 10/7/2026   </w:t>
+      </w:r>
+      <w:r>
+        <w:rPr>
+          <w:b/>
+          <w:color w:val="D68910"/>
+          <w:sz w:val="16"/>
+        </w:rPr>
+        <w:t>[MÉDIA]</w:t>
+      </w:r>
+    </w:p>
+    <w:p>
+      <w:pPr>
+        <w:spacing w:after="40"/>
+      </w:pPr>
+      <w:r>
+        <w:rPr>
+          <w:color w:val="4A4A4A"/>
+          <w:sz w:val="20"/>
+        </w:rPr>
+        <w:t>Divulga nome de pessoas com interesse em exercer o controle de Instituição de Pagamento.</w:t>
+      </w:r>
+    </w:p>
+    <w:p>
+      <w:pPr>
+        <w:spacing w:after="40"/>
+      </w:pPr>
+      <w:r>
+        <w:rPr>
+          <w:b/>
+          <w:color w:val="888888"/>
+          <w:sz w:val="18"/>
+        </w:rPr>
+        <w:t xml:space="preserve">Publicado: </w:t>
+      </w:r>
+      <w:r>
+        <w:rPr>
+          <w:color w:val="888888"/>
+          <w:sz w:val="18"/>
+        </w:rPr>
+        <w:t xml:space="preserve">2026-07-10T09:42   </w:t>
+      </w:r>
+      <w:hyperlink r:id="rId14">
+        <w:r>
+          <w:rPr>
+            <w:color w:val="1A4D2E"/>
+            <w:u w:val="single"/>
+            <w:b/>
+          </w:rPr>
+          <w:t>Acessar materia</w:t>
+        </w:r>
+      </w:hyperlink>
+    </w:p>
+    <w:p>
+      <w:pPr>
+        <w:spacing w:after="120"/>
+      </w:pPr>
+      <w:r>
+        <w:rPr>
+          <w:i/>
+          <w:color w:val="888888"/>
+          <w:sz w:val="16"/>
+        </w:rPr>
+        <w:t>Divulgação de nomes de interessados em controle de Instituição de Pagamento, relevante para o mercado financeiro.</w:t>
+      </w:r>
+    </w:p>
+    <w:p>
+      <w:pPr>
+        <w:spacing w:before="160" w:after="40"/>
+      </w:pPr>
+      <w:r>
+        <w:rPr>
+          <w:b/>
+          <w:color w:val="1A1A1A"/>
+          <w:sz w:val="22"/>
+        </w:rPr>
+        <w:t xml:space="preserve">Comunicado n° 45.537, 10/7/2026   </w:t>
+      </w:r>
+      <w:r>
+        <w:rPr>
+          <w:b/>
+          <w:color w:val="D68910"/>
+          <w:sz w:val="16"/>
+        </w:rPr>
+        <w:t>[MÉDIA]</w:t>
+      </w:r>
+    </w:p>
+    <w:p>
+      <w:pPr>
+        <w:spacing w:after="40"/>
+      </w:pPr>
+      <w:r>
+        <w:rPr>
+          <w:color w:val="4A4A4A"/>
+          <w:sz w:val="20"/>
+        </w:rPr>
+        <w:t>Divulga nome de pessoas com interesse em exercer o controle de Instituição de Pagamento.</w:t>
+      </w:r>
+    </w:p>
+    <w:p>
+      <w:pPr>
+        <w:spacing w:after="40"/>
+      </w:pPr>
+      <w:r>
+        <w:rPr>
+          <w:b/>
+          <w:color w:val="888888"/>
+          <w:sz w:val="18"/>
+        </w:rPr>
+        <w:t xml:space="preserve">Publicado: </w:t>
+      </w:r>
+      <w:r>
+        <w:rPr>
+          <w:color w:val="888888"/>
+          <w:sz w:val="18"/>
+        </w:rPr>
+        <w:t xml:space="preserve">2026-07-10T09:39   </w:t>
+      </w:r>
+      <w:hyperlink r:id="rId15">
+        <w:r>
+          <w:rPr>
+            <w:color w:val="1A4D2E"/>
+            <w:u w:val="single"/>
+            <w:b/>
+          </w:rPr>
+          <w:t>Acessar materia</w:t>
+        </w:r>
+      </w:hyperlink>
+    </w:p>
+    <w:p>
+      <w:pPr>
+        <w:spacing w:after="120"/>
+      </w:pPr>
+      <w:r>
+        <w:rPr>
+          <w:i/>
+          <w:color w:val="888888"/>
+          <w:sz w:val="16"/>
+        </w:rPr>
+        <w:t>Divulgação de nomes de interessados em controle de Instituição de Pagamento, relevante para o mercado financeiro.</w:t>
+      </w:r>
+    </w:p>
+    <w:p>
+      <w:pPr>
+        <w:spacing w:before="160" w:after="40"/>
+      </w:pPr>
+      <w:r>
+        <w:rPr>
+          <w:b/>
+          <w:color w:val="1A1A1A"/>
+          <w:sz w:val="22"/>
+        </w:rPr>
+        <w:t xml:space="preserve">Comunicado n° 45.536, 10/7/2026   </w:t>
+      </w:r>
+      <w:r>
+        <w:rPr>
+          <w:b/>
+          <w:color w:val="D68910"/>
+          <w:sz w:val="16"/>
+        </w:rPr>
+        <w:t>[MÉDIA]</w:t>
+      </w:r>
+    </w:p>
+    <w:p>
+      <w:pPr>
+        <w:spacing w:after="40"/>
+      </w:pPr>
+      <w:r>
+        <w:rPr>
+          <w:color w:val="4A4A4A"/>
+          <w:sz w:val="20"/>
+        </w:rPr>
+        <w:t>Divulga nomes de pessoas eleitas ou nomeadas para cargos de administração em instituições autorizadas a funcionar, para fins de objeções.</w:t>
+      </w:r>
+    </w:p>
+    <w:p>
+      <w:pPr>
+        <w:spacing w:after="40"/>
+      </w:pPr>
+      <w:r>
+        <w:rPr>
+          <w:b/>
+          <w:color w:val="888888"/>
+          <w:sz w:val="18"/>
+        </w:rPr>
+        <w:t xml:space="preserve">Publicado: </w:t>
+      </w:r>
+      <w:r>
+        <w:rPr>
+          <w:color w:val="888888"/>
+          <w:sz w:val="18"/>
+        </w:rPr>
+        <w:t xml:space="preserve">2026-07-10T09:34   </w:t>
+      </w:r>
+      <w:hyperlink r:id="rId16">
+        <w:r>
+          <w:rPr>
+            <w:color w:val="1A4D2E"/>
+            <w:u w:val="single"/>
+            <w:b/>
+          </w:rPr>
+          <w:t>Acessar materia</w:t>
+        </w:r>
+      </w:hyperlink>
+    </w:p>
+    <w:p>
+      <w:pPr>
+        <w:spacing w:after="120"/>
+      </w:pPr>
+      <w:r>
+        <w:rPr>
+          <w:i/>
+          <w:color w:val="888888"/>
+          <w:sz w:val="16"/>
+        </w:rPr>
+        <w:t>Divulgação de nomes para cargos de administração em instituições financeiras, relevante para o setor regulado.</w:t>
+      </w:r>
+    </w:p>
+    <w:p>
+      <w:pPr>
+        <w:spacing w:before="160" w:after="40"/>
+      </w:pPr>
+      <w:r>
+        <w:rPr>
+          <w:b/>
+          <w:color w:val="1A1A1A"/>
+          <w:sz w:val="22"/>
+        </w:rPr>
+        <w:t xml:space="preserve">Comunicado n° 45.535, 10/7/2026   </w:t>
+      </w:r>
+      <w:r>
+        <w:rPr>
+          <w:b/>
+          <w:color w:val="C0392B"/>
+          <w:sz w:val="16"/>
+        </w:rPr>
+        <w:t>[ALTA]</w:t>
+      </w:r>
+    </w:p>
+    <w:p>
+      <w:pPr>
+        <w:spacing w:after="40"/>
+      </w:pPr>
+      <w:r>
+        <w:rPr>
+          <w:color w:val="4A4A4A"/>
+          <w:sz w:val="20"/>
+        </w:rPr>
+        <w:t>Divulga a Taxa Básica Financeira (TBF), o Redutor "R" e a Taxa Referencial (TR) relativos a 9 de julho de 2026.</w:t>
+      </w:r>
+    </w:p>
+    <w:p>
+      <w:pPr>
+        <w:spacing w:after="40"/>
+      </w:pPr>
+      <w:r>
+        <w:rPr>
+          <w:b/>
+          <w:color w:val="888888"/>
+          <w:sz w:val="18"/>
+        </w:rPr>
+        <w:t xml:space="preserve">Publicado: </w:t>
+      </w:r>
+      <w:r>
+        <w:rPr>
+          <w:color w:val="888888"/>
+          <w:sz w:val="18"/>
+        </w:rPr>
+        <w:t xml:space="preserve">2026-07-10T09:06   </w:t>
+      </w:r>
+      <w:hyperlink r:id="rId9">
+        <w:r>
+          <w:rPr>
+            <w:color w:val="1A4D2E"/>
+            <w:u w:val="single"/>
+            <w:b/>
+          </w:rPr>
+          <w:t>Acessar materia</w:t>
+        </w:r>
+      </w:hyperlink>
+    </w:p>
+    <w:p>
+      <w:pPr>
+        <w:spacing w:after="120"/>
+      </w:pPr>
+      <w:r>
+        <w:rPr>
+          <w:i/>
+          <w:color w:val="888888"/>
+          <w:sz w:val="16"/>
+        </w:rPr>
+        <w:t>Divulgação de taxas de referência importantes para o mercado financeiro.</w:t>
+      </w:r>
+    </w:p>
+    <w:p>
+      <w:pPr>
+        <w:spacing w:before="160" w:after="40"/>
+      </w:pPr>
+      <w:r>
+        <w:rPr>
+          <w:b/>
+          <w:color w:val="1A1A1A"/>
+          <w:sz w:val="22"/>
+        </w:rPr>
+        <w:t xml:space="preserve">Comunicado n° 45.534, 9/7/2026   </w:t>
+      </w:r>
+      <w:r>
+        <w:rPr>
+          <w:b/>
+          <w:color w:val="C0392B"/>
+          <w:sz w:val="16"/>
+        </w:rPr>
+        <w:t>[ALTA]</w:t>
+      </w:r>
+    </w:p>
+    <w:p>
+      <w:pPr>
+        <w:spacing w:after="40"/>
+      </w:pPr>
+      <w:r>
+        <w:rPr>
+          <w:color w:val="4A4A4A"/>
+          <w:sz w:val="20"/>
+        </w:rPr>
+        <w:t>Divulga condições para a realização de operações compromissadas com instituições financeiras participantes do módulo Oferta Pública (Ofpub).</w:t>
+      </w:r>
+    </w:p>
+    <w:p>
+      <w:pPr>
+        <w:spacing w:after="40"/>
+      </w:pPr>
+      <w:r>
+        <w:rPr>
+          <w:b/>
+          <w:color w:val="888888"/>
+          <w:sz w:val="18"/>
+        </w:rPr>
+        <w:t xml:space="preserve">Publicado: </w:t>
+      </w:r>
+      <w:r>
+        <w:rPr>
+          <w:color w:val="888888"/>
+          <w:sz w:val="18"/>
+        </w:rPr>
+        <w:t xml:space="preserve">2026-07-09T18:31   </w:t>
+      </w:r>
+      <w:hyperlink r:id="rId10">
+        <w:r>
+          <w:rPr>
+            <w:color w:val="1A4D2E"/>
+            <w:u w:val="single"/>
+            <w:b/>
+          </w:rPr>
+          <w:t>Acessar materia</w:t>
+        </w:r>
+      </w:hyperlink>
+    </w:p>
+    <w:p>
+      <w:pPr>
+        <w:spacing w:after="120"/>
+      </w:pPr>
+      <w:r>
+        <w:rPr>
+          <w:i/>
+          <w:color w:val="888888"/>
+          <w:sz w:val="16"/>
+        </w:rPr>
+        <w:t>Estabelece condições para operações financeiras, com impacto direto em instituições do mercado.</w:t>
+      </w:r>
+    </w:p>
+    <w:p>
+      <w:pPr>
+        <w:spacing w:before="160" w:after="40"/>
+      </w:pPr>
+      <w:r>
+        <w:rPr>
+          <w:b/>
+          <w:color w:val="1A1A1A"/>
+          <w:sz w:val="22"/>
+        </w:rPr>
+        <w:t xml:space="preserve">Comunicado n° 45.533, 9/7/2026   </w:t>
+      </w:r>
+      <w:r>
+        <w:rPr>
+          <w:b/>
+          <w:color w:val="C0392B"/>
+          <w:sz w:val="16"/>
+        </w:rPr>
+        <w:t>[ALTA]</w:t>
+      </w:r>
+    </w:p>
+    <w:p>
+      <w:pPr>
+        <w:spacing w:after="40"/>
+      </w:pPr>
+      <w:r>
+        <w:rPr>
+          <w:color w:val="4A4A4A"/>
+          <w:sz w:val="20"/>
+        </w:rPr>
+        <w:t>Divulga as condições de oferta pública para a realização de operações de swap para fins de rolagem do vencimento de 03/08/2026.</w:t>
+      </w:r>
+    </w:p>
+    <w:p>
+      <w:pPr>
+        <w:spacing w:after="40"/>
+      </w:pPr>
+      <w:r>
+        <w:rPr>
+          <w:b/>
+          <w:color w:val="888888"/>
+          <w:sz w:val="18"/>
+        </w:rPr>
+        <w:t xml:space="preserve">Publicado: </w:t>
+      </w:r>
+      <w:r>
+        <w:rPr>
+          <w:color w:val="888888"/>
+          <w:sz w:val="18"/>
+        </w:rPr>
+        <w:t xml:space="preserve">2026-07-09T18:30   </w:t>
+      </w:r>
+      <w:hyperlink r:id="rId11">
+        <w:r>
+          <w:rPr>
+            <w:color w:val="1A4D2E"/>
+            <w:u w:val="single"/>
+            <w:b/>
+          </w:rPr>
+          <w:t>Acessar materia</w:t>
+        </w:r>
+      </w:hyperlink>
+    </w:p>
+    <w:p>
+      <w:pPr>
+        <w:spacing w:after="120"/>
+      </w:pPr>
+      <w:r>
+        <w:rPr>
+          <w:i/>
+          <w:color w:val="888888"/>
+          <w:sz w:val="16"/>
+        </w:rPr>
+        <w:t>Define condições para operações de swap, impactando o mercado de câmbio e derivativos.</w:t>
+      </w:r>
+    </w:p>
+    <w:p>
+      <w:pPr>
+        <w:spacing w:before="160" w:after="40"/>
+      </w:pPr>
+      <w:r>
+        <w:rPr>
+          <w:b/>
+          <w:color w:val="1A1A1A"/>
+          <w:sz w:val="22"/>
+        </w:rPr>
+        <w:t xml:space="preserve">Instrução Normativa BCB n° 761, 9/7/2026   </w:t>
+      </w:r>
+      <w:r>
+        <w:rPr>
+          <w:b/>
+          <w:color w:val="C0392B"/>
+          <w:sz w:val="16"/>
+        </w:rPr>
+        <w:t>[ALTA]</w:t>
+      </w:r>
+    </w:p>
+    <w:p>
+      <w:pPr>
+        <w:spacing w:after="40"/>
+      </w:pPr>
+      <w:r>
+        <w:rPr>
+          <w:color w:val="4A4A4A"/>
+          <w:sz w:val="20"/>
+        </w:rPr>
+        <w:t>Divulga orientações sobre medidas reforçadas para instituições financeiras em operações com países com deficiências nas recomendações do Gafi.</w:t>
+      </w:r>
+    </w:p>
+    <w:p>
+      <w:pPr>
+        <w:spacing w:after="40"/>
+      </w:pPr>
+      <w:r>
+        <w:rPr>
+          <w:b/>
+          <w:color w:val="888888"/>
+          <w:sz w:val="18"/>
+        </w:rPr>
+        <w:t xml:space="preserve">Publicado: </w:t>
+      </w:r>
+      <w:r>
+        <w:rPr>
+          <w:color w:val="888888"/>
+          <w:sz w:val="18"/>
+        </w:rPr>
+        <w:t xml:space="preserve">2026-07-09T16:33   </w:t>
+      </w:r>
+      <w:hyperlink r:id="rId12">
+        <w:r>
+          <w:rPr>
+            <w:color w:val="1A4D2E"/>
+            <w:u w:val="single"/>
+            <w:b/>
+          </w:rPr>
+          <w:t>Acessar materia</w:t>
+        </w:r>
+      </w:hyperlink>
+    </w:p>
+    <w:p>
+      <w:pPr>
+        <w:spacing w:after="120"/>
+      </w:pPr>
+      <w:r>
+        <w:rPr>
+          <w:i/>
+          <w:color w:val="888888"/>
+          <w:sz w:val="16"/>
+        </w:rPr>
+        <w:t>Instrução normativa com impacto regulatório direto sobre compliance e prevenção à lavagem de dinheiro para instituições financeiras.</w:t>
+      </w:r>
+    </w:p>
+    <w:p>
+      <w:pPr>
+        <w:spacing w:before="160" w:after="40"/>
+      </w:pPr>
+      <w:r>
+        <w:rPr>
+          <w:b/>
+          <w:color w:val="1A1A1A"/>
+          <w:sz w:val="22"/>
+        </w:rPr>
+        <w:t xml:space="preserve">Instrução Normativa BCB n° 760, 9/7/2026   </w:t>
+      </w:r>
+      <w:r>
+        <w:rPr>
+          <w:b/>
+          <w:color w:val="D68910"/>
+          <w:sz w:val="16"/>
+        </w:rPr>
+        <w:t>[MÉDIA]</w:t>
+      </w:r>
+    </w:p>
+    <w:p>
+      <w:pPr>
+        <w:spacing w:after="40"/>
+      </w:pPr>
+      <w:r>
+        <w:rPr>
+          <w:color w:val="4A4A4A"/>
+          <w:sz w:val="20"/>
+        </w:rPr>
+        <w:t>Divulga a versão 9.0 do Manual de Experiência do Cliente no Open Finance.</w:t>
+      </w:r>
+    </w:p>
+    <w:p>
+      <w:pPr>
+        <w:spacing w:after="40"/>
+      </w:pPr>
+      <w:r>
+        <w:rPr>
+          <w:b/>
+          <w:color w:val="888888"/>
+          <w:sz w:val="18"/>
+        </w:rPr>
+        <w:t xml:space="preserve">Publicado: </w:t>
+      </w:r>
+      <w:r>
+        <w:rPr>
+          <w:color w:val="888888"/>
+          <w:sz w:val="18"/>
+        </w:rPr>
+        <w:t xml:space="preserve">2026-07-09T13:46   </w:t>
+      </w:r>
+      <w:hyperlink r:id="rId17">
+        <w:r>
+          <w:rPr>
+            <w:color w:val="1A4D2E"/>
+            <w:u w:val="single"/>
+            <w:b/>
+          </w:rPr>
+          <w:t>Acessar materia</w:t>
+        </w:r>
+      </w:hyperlink>
+    </w:p>
+    <w:p>
+      <w:pPr>
+        <w:spacing w:after="120"/>
+      </w:pPr>
+      <w:r>
+        <w:rPr>
+          <w:i/>
+          <w:color w:val="888888"/>
+          <w:sz w:val="16"/>
+        </w:rPr>
+        <w:t>Atualização de manual técnico do Open Finance, com impacto operacional para as instituições.</w:t>
+      </w:r>
+    </w:p>
+    <w:p>
+      <w:pPr>
+        <w:spacing w:before="160" w:after="40"/>
+      </w:pPr>
+      <w:r>
+        <w:rPr>
+          <w:b/>
+          <w:color w:val="1A1A1A"/>
+          <w:sz w:val="22"/>
+        </w:rPr>
+        <w:t xml:space="preserve">Instrução Normativa BCB n° 759, 9/7/2026   </w:t>
+      </w:r>
+      <w:r>
+        <w:rPr>
+          <w:b/>
+          <w:color w:val="D68910"/>
+          <w:sz w:val="16"/>
+        </w:rPr>
+        <w:t>[MÉDIA]</w:t>
+      </w:r>
+    </w:p>
+    <w:p>
+      <w:pPr>
+        <w:spacing w:after="40"/>
+      </w:pPr>
+      <w:r>
+        <w:rPr>
+          <w:color w:val="4A4A4A"/>
+          <w:sz w:val="20"/>
+        </w:rPr>
+        <w:t>Divulga a versão 8.0 do Manual de Escopo de Dados e Serviços do Open Finance.</w:t>
+      </w:r>
+    </w:p>
+    <w:p>
+      <w:pPr>
+        <w:spacing w:after="40"/>
+      </w:pPr>
+      <w:r>
+        <w:rPr>
+          <w:b/>
+          <w:color w:val="888888"/>
+          <w:sz w:val="18"/>
+        </w:rPr>
+        <w:t xml:space="preserve">Publicado: </w:t>
+      </w:r>
+      <w:r>
+        <w:rPr>
+          <w:color w:val="888888"/>
+          <w:sz w:val="18"/>
+        </w:rPr>
+        <w:t xml:space="preserve">2026-07-09T13:26   </w:t>
+      </w:r>
+      <w:hyperlink r:id="rId18">
+        <w:r>
+          <w:rPr>
+            <w:color w:val="1A4D2E"/>
+            <w:u w:val="single"/>
+            <w:b/>
+          </w:rPr>
+          <w:t>Acessar materia</w:t>
+        </w:r>
+      </w:hyperlink>
+    </w:p>
+    <w:p>
+      <w:pPr>
+        <w:spacing w:after="120"/>
+      </w:pPr>
+      <w:r>
+        <w:rPr>
+          <w:i/>
+          <w:color w:val="888888"/>
+          <w:sz w:val="16"/>
+        </w:rPr>
+        <w:t>Atualização de manual técnico do Open Finance, com impacto operacional para as instituições.</w:t>
+      </w:r>
+    </w:p>
+    <w:p>
+      <w:pPr>
+        <w:spacing w:before="160" w:after="40"/>
+      </w:pPr>
+      <w:r>
+        <w:rPr>
+          <w:b/>
+          <w:color w:val="1A1A1A"/>
+          <w:sz w:val="22"/>
+        </w:rPr>
+        <w:t xml:space="preserve">Comunicado n° 45.532, 9/7/2026   </w:t>
+      </w:r>
+      <w:r>
+        <w:rPr>
+          <w:b/>
+          <w:color w:val="D68910"/>
+          <w:sz w:val="16"/>
+        </w:rPr>
+        <w:t>[MÉDIA]</w:t>
+      </w:r>
+    </w:p>
+    <w:p>
+      <w:pPr>
+        <w:spacing w:after="40"/>
+      </w:pPr>
+      <w:r>
+        <w:rPr>
+          <w:color w:val="4A4A4A"/>
+          <w:sz w:val="20"/>
+        </w:rPr>
+        <w:t>Divulga o resultado de leilões de swap.</w:t>
+      </w:r>
+    </w:p>
+    <w:p>
+      <w:pPr>
+        <w:spacing w:after="40"/>
+      </w:pPr>
+      <w:r>
+        <w:rPr>
+          <w:b/>
+          <w:color w:val="888888"/>
+          <w:sz w:val="18"/>
+        </w:rPr>
+        <w:t xml:space="preserve">Publicado: </w:t>
+      </w:r>
+      <w:r>
+        <w:rPr>
+          <w:color w:val="888888"/>
+          <w:sz w:val="18"/>
+        </w:rPr>
+        <w:t xml:space="preserve">2026-07-09T11:44   </w:t>
+      </w:r>
+      <w:hyperlink r:id="rId19">
+        <w:r>
+          <w:rPr>
+            <w:color w:val="1A4D2E"/>
+            <w:u w:val="single"/>
+            <w:b/>
+          </w:rPr>
+          <w:t>Acessar materia</w:t>
+        </w:r>
+      </w:hyperlink>
+    </w:p>
+    <w:p>
+      <w:pPr>
+        <w:spacing w:after="120"/>
+      </w:pPr>
+      <w:r>
+        <w:rPr>
+          <w:i/>
+          <w:color w:val="888888"/>
+          <w:sz w:val="16"/>
+        </w:rPr>
+        <w:t>Informação sobre o resultado de leilões de swap, relevante para o mercado financeiro.</w:t>
+      </w:r>
+    </w:p>
+    <w:p>
+      <w:pPr>
+        <w:spacing w:before="160" w:after="40"/>
+      </w:pPr>
+      <w:r>
+        <w:rPr>
+          <w:b/>
+          <w:color w:val="1A1A1A"/>
+          <w:sz w:val="22"/>
+        </w:rPr>
+        <w:t xml:space="preserve">Comunicado n° 45.531, 9/7/2026   </w:t>
+      </w:r>
+      <w:r>
+        <w:rPr>
+          <w:b/>
+          <w:color w:val="D68910"/>
+          <w:sz w:val="16"/>
+        </w:rPr>
+        <w:t>[MÉDIA]</w:t>
+      </w:r>
+    </w:p>
+    <w:p>
+      <w:pPr>
+        <w:spacing w:after="40"/>
+      </w:pPr>
+      <w:r>
+        <w:rPr>
+          <w:color w:val="4A4A4A"/>
+          <w:sz w:val="20"/>
+        </w:rPr>
+        <w:t>Divulga a realização de leilão de Swap Cambial Tradicional para fins de rolagem.</w:t>
+      </w:r>
+    </w:p>
+    <w:p>
+      <w:pPr>
+        <w:spacing w:after="40"/>
+      </w:pPr>
+      <w:r>
+        <w:rPr>
+          <w:b/>
+          <w:color w:val="888888"/>
+          <w:sz w:val="18"/>
+        </w:rPr>
+        <w:t xml:space="preserve">Publicado: </w:t>
+      </w:r>
+      <w:r>
+        <w:rPr>
+          <w:color w:val="888888"/>
+          <w:sz w:val="18"/>
+        </w:rPr>
+        <w:t xml:space="preserve">2026-07-09T11:30   </w:t>
+      </w:r>
+      <w:hyperlink r:id="rId20">
+        <w:r>
+          <w:rPr>
+            <w:color w:val="1A4D2E"/>
+            <w:u w:val="single"/>
+            <w:b/>
+          </w:rPr>
+          <w:t>Acessar materia</w:t>
+        </w:r>
+      </w:hyperlink>
+    </w:p>
+    <w:p>
+      <w:pPr>
+        <w:spacing w:after="120"/>
+      </w:pPr>
+      <w:r>
+        <w:rPr>
+          <w:i/>
+          <w:color w:val="888888"/>
+          <w:sz w:val="16"/>
+        </w:rPr>
+        <w:t>Anúncio de leilão de swap cambial, relevante para o mercado financeiro.</w:t>
+      </w:r>
+    </w:p>
+    <w:p>
+      <w:pPr>
+        <w:spacing w:before="160" w:after="40"/>
+      </w:pPr>
+      <w:r>
+        <w:rPr>
+          <w:b/>
+          <w:color w:val="1A1A1A"/>
+          <w:sz w:val="22"/>
+        </w:rPr>
+        <w:t xml:space="preserve">Comunicado n° 45.530, 9/7/2026   </w:t>
+      </w:r>
+      <w:r>
+        <w:rPr>
+          <w:b/>
+          <w:color w:val="D68910"/>
+          <w:sz w:val="16"/>
+        </w:rPr>
+        <w:t>[MÉDIA]</w:t>
+      </w:r>
+    </w:p>
+    <w:p>
+      <w:pPr>
+        <w:spacing w:after="40"/>
+      </w:pPr>
+      <w:r>
+        <w:rPr>
+          <w:color w:val="4A4A4A"/>
+          <w:sz w:val="20"/>
+        </w:rPr>
+        <w:t>Divulga a realização de leilão de Swap Cambial Tradicional para fins de rolagem.</w:t>
+      </w:r>
+    </w:p>
+    <w:p>
+      <w:pPr>
+        <w:spacing w:after="40"/>
+      </w:pPr>
+      <w:r>
+        <w:rPr>
+          <w:b/>
+          <w:color w:val="888888"/>
+          <w:sz w:val="18"/>
+        </w:rPr>
+        <w:t xml:space="preserve">Publicado: </w:t>
+      </w:r>
+      <w:r>
+        <w:rPr>
+          <w:color w:val="888888"/>
+          <w:sz w:val="18"/>
+        </w:rPr>
+        <w:t xml:space="preserve">2026-07-09T11:30   </w:t>
+      </w:r>
+      <w:hyperlink r:id="rId21">
+        <w:r>
+          <w:rPr>
+            <w:color w:val="1A4D2E"/>
+            <w:u w:val="single"/>
+            <w:b/>
+          </w:rPr>
+          <w:t>Acessar materia</w:t>
+        </w:r>
+      </w:hyperlink>
+    </w:p>
+    <w:p>
+      <w:pPr>
+        <w:spacing w:after="120"/>
+      </w:pPr>
+      <w:r>
+        <w:rPr>
+          <w:i/>
+          <w:color w:val="888888"/>
+          <w:sz w:val="16"/>
+        </w:rPr>
+        <w:t>Anúncio de leilão de swap cambial, relevante para o mercado financeiro.</w:t>
+      </w:r>
+    </w:p>
+    <w:p>
+      <w:pPr>
+        <w:spacing w:before="160" w:after="40"/>
+      </w:pPr>
+      <w:r>
+        <w:rPr>
+          <w:b/>
+          <w:color w:val="1A1A1A"/>
+          <w:sz w:val="22"/>
+        </w:rPr>
         <w:t xml:space="preserve">Comunicado n° 45.529, 9/7/2026   </w:t>
       </w:r>
       <w:r>
@@ -1400,7 +1575,7 @@
         </w:rPr>
         <w:t xml:space="preserve">2026-07-09T10:21   </w:t>
       </w:r>
-      <w:hyperlink r:id="rId23">
+      <w:hyperlink r:id="rId22">
         <w:r>
           <w:rPr>
             <w:color w:val="1A4D2E"/>
@@ -1421,7 +1596,7 @@
           <w:color w:val="888888"/>
           <w:sz w:val="16"/>
         </w:rPr>
-        <w:t>Divulgação de interesse em controle de instituição de pagamento, relevante para o setor financeiro.</w:t>
+        <w:t>Divulgação de nome de interessado em controle de Instituição de Pagamento, relevante para o mercado financeiro.</w:t>
       </w:r>
     </w:p>
     <w:p>
@@ -1476,7 +1651,7 @@
         </w:rPr>
         <w:t xml:space="preserve">2026-07-09T09:36   </w:t>
       </w:r>
-      <w:hyperlink r:id="rId24">
+      <w:hyperlink r:id="rId23">
         <w:r>
           <w:rPr>
             <w:color w:val="1A4D2E"/>
@@ -1497,1016 +1672,7 @@
           <w:color w:val="888888"/>
           <w:sz w:val="16"/>
         </w:rPr>
-        <w:t>Divulgação de nomes para cargos de administração em instituições financeiras, importante para governança corporativa.</w:t>
-      </w:r>
-    </w:p>
-    <w:p>
-      <w:pPr>
-        <w:spacing w:before="160" w:after="40"/>
-      </w:pPr>
-      <w:r>
-        <w:rPr>
-          <w:b/>
-          <w:color w:val="1A1A1A"/>
-          <w:sz w:val="22"/>
-        </w:rPr>
-        <w:t xml:space="preserve">Comunicado n° 45.527, 9/7/2026   </w:t>
-      </w:r>
-      <w:r>
-        <w:rPr>
-          <w:b/>
-          <w:color w:val="D68910"/>
-          <w:sz w:val="16"/>
-        </w:rPr>
-        <w:t>[MÉDIA]</w:t>
-      </w:r>
-    </w:p>
-    <w:p>
-      <w:pPr>
-        <w:spacing w:after="40"/>
-      </w:pPr>
-      <w:r>
-        <w:rPr>
-          <w:color w:val="4A4A4A"/>
-          <w:sz w:val="20"/>
-        </w:rPr>
-        <w:t>Divulga nome aprovado de pessoas eleitas/nomeadas para cargos de órgãos estatutários ou contratuais de sociedades autorizadas a funcionar pelo Banco Central do Brasil.</w:t>
-      </w:r>
-    </w:p>
-    <w:p>
-      <w:pPr>
-        <w:spacing w:after="40"/>
-      </w:pPr>
-      <w:r>
-        <w:rPr>
-          <w:b/>
-          <w:color w:val="888888"/>
-          <w:sz w:val="18"/>
-        </w:rPr>
-        <w:t xml:space="preserve">Publicado: </w:t>
-      </w:r>
-      <w:r>
-        <w:rPr>
-          <w:color w:val="888888"/>
-          <w:sz w:val="18"/>
-        </w:rPr>
-        <w:t xml:space="preserve">2026-07-09T09:35   </w:t>
-      </w:r>
-      <w:hyperlink r:id="rId25">
-        <w:r>
-          <w:rPr>
-            <w:color w:val="1A4D2E"/>
-            <w:u w:val="single"/>
-            <w:b/>
-          </w:rPr>
-          <w:t>Acessar materia</w:t>
-        </w:r>
-      </w:hyperlink>
-    </w:p>
-    <w:p>
-      <w:pPr>
-        <w:spacing w:after="120"/>
-      </w:pPr>
-      <w:r>
-        <w:rPr>
-          <w:i/>
-          <w:color w:val="888888"/>
-          <w:sz w:val="16"/>
-        </w:rPr>
-        <w:t>Divulgação de nomes aprovados para cargos em instituições financeiras, importante para governança corporativa.</w:t>
-      </w:r>
-    </w:p>
-    <w:p>
-      <w:pPr>
-        <w:spacing w:before="160" w:after="40"/>
-      </w:pPr>
-      <w:r>
-        <w:rPr>
-          <w:b/>
-          <w:color w:val="1A1A1A"/>
-          <w:sz w:val="22"/>
-        </w:rPr>
-        <w:t xml:space="preserve">Comunicado n° 45.526, 9/7/2026   </w:t>
-      </w:r>
-      <w:r>
-        <w:rPr>
-          <w:b/>
-          <w:color w:val="C0392B"/>
-          <w:sz w:val="16"/>
-        </w:rPr>
-        <w:t>[ALTA]</w:t>
-      </w:r>
-    </w:p>
-    <w:p>
-      <w:pPr>
-        <w:spacing w:after="40"/>
-      </w:pPr>
-      <w:r>
-        <w:rPr>
-          <w:color w:val="4A4A4A"/>
-          <w:sz w:val="20"/>
-        </w:rPr>
-        <w:t>Divulga a Taxa Básica Financeira (TBF), o Redutor 'R' e a Taxa Referencial (TR) relativos a 8 de julho de 2026.</w:t>
-      </w:r>
-    </w:p>
-    <w:p>
-      <w:pPr>
-        <w:spacing w:after="40"/>
-      </w:pPr>
-      <w:r>
-        <w:rPr>
-          <w:b/>
-          <w:color w:val="888888"/>
-          <w:sz w:val="18"/>
-        </w:rPr>
-        <w:t xml:space="preserve">Publicado: </w:t>
-      </w:r>
-      <w:r>
-        <w:rPr>
-          <w:color w:val="888888"/>
-          <w:sz w:val="18"/>
-        </w:rPr>
-        <w:t xml:space="preserve">2026-07-09T09:02   </w:t>
-      </w:r>
-      <w:hyperlink r:id="rId9">
-        <w:r>
-          <w:rPr>
-            <w:color w:val="1A4D2E"/>
-            <w:u w:val="single"/>
-            <w:b/>
-          </w:rPr>
-          <w:t>Acessar materia</w:t>
-        </w:r>
-      </w:hyperlink>
-    </w:p>
-    <w:p>
-      <w:pPr>
-        <w:spacing w:after="120"/>
-      </w:pPr>
-      <w:r>
-        <w:rPr>
-          <w:i/>
-          <w:color w:val="888888"/>
-          <w:sz w:val="16"/>
-        </w:rPr>
-        <w:t>Divulgação de taxas financeiras de referência, com impacto direto no mercado e operações financeiras.</w:t>
-      </w:r>
-    </w:p>
-    <w:p>
-      <w:pPr>
-        <w:spacing w:before="160" w:after="40"/>
-      </w:pPr>
-      <w:r>
-        <w:rPr>
-          <w:b/>
-          <w:color w:val="1A1A1A"/>
-          <w:sz w:val="22"/>
-        </w:rPr>
-        <w:t xml:space="preserve">Comunicado n° 45.525, 8/7/2026   </w:t>
-      </w:r>
-      <w:r>
-        <w:rPr>
-          <w:b/>
-          <w:color w:val="C0392B"/>
-          <w:sz w:val="16"/>
-        </w:rPr>
-        <w:t>[ALTA]</w:t>
-      </w:r>
-    </w:p>
-    <w:p>
-      <w:pPr>
-        <w:spacing w:after="40"/>
-      </w:pPr>
-      <w:r>
-        <w:rPr>
-          <w:color w:val="4A4A4A"/>
-          <w:sz w:val="20"/>
-        </w:rPr>
-        <w:t>Divulga as condições de oferta pública para a realização de operações de swap para fins de rolagem do vencimento de 03/08/2026.</w:t>
-      </w:r>
-    </w:p>
-    <w:p>
-      <w:pPr>
-        <w:spacing w:after="40"/>
-      </w:pPr>
-      <w:r>
-        <w:rPr>
-          <w:b/>
-          <w:color w:val="888888"/>
-          <w:sz w:val="18"/>
-        </w:rPr>
-        <w:t xml:space="preserve">Publicado: </w:t>
-      </w:r>
-      <w:r>
-        <w:rPr>
-          <w:color w:val="888888"/>
-          <w:sz w:val="18"/>
-        </w:rPr>
-        <w:t xml:space="preserve">2026-07-08T18:31   </w:t>
-      </w:r>
-      <w:hyperlink r:id="rId10">
-        <w:r>
-          <w:rPr>
-            <w:color w:val="1A4D2E"/>
-            <w:u w:val="single"/>
-            <w:b/>
-          </w:rPr>
-          <w:t>Acessar materia</w:t>
-        </w:r>
-      </w:hyperlink>
-    </w:p>
-    <w:p>
-      <w:pPr>
-        <w:spacing w:after="120"/>
-      </w:pPr>
-      <w:r>
-        <w:rPr>
-          <w:i/>
-          <w:color w:val="888888"/>
-          <w:sz w:val="16"/>
-        </w:rPr>
-        <w:t>Condições de oferta pública para operações de swap, relevante para o mercado financeiro e gestão de dívida.</w:t>
-      </w:r>
-    </w:p>
-    <w:p>
-      <w:pPr>
-        <w:spacing w:before="160" w:after="40"/>
-      </w:pPr>
-      <w:r>
-        <w:rPr>
-          <w:b/>
-          <w:color w:val="1A1A1A"/>
-          <w:sz w:val="22"/>
-        </w:rPr>
-        <w:t xml:space="preserve">Comunicado n° 45.524, 8/7/2026   </w:t>
-      </w:r>
-      <w:r>
-        <w:rPr>
-          <w:b/>
-          <w:color w:val="C0392B"/>
-          <w:sz w:val="16"/>
-        </w:rPr>
-        <w:t>[ALTA]</w:t>
-      </w:r>
-    </w:p>
-    <w:p>
-      <w:pPr>
-        <w:spacing w:after="40"/>
-      </w:pPr>
-      <w:r>
-        <w:rPr>
-          <w:color w:val="4A4A4A"/>
-          <w:sz w:val="20"/>
-        </w:rPr>
-        <w:t>Divulga condições para a realização de operações compromissadas com instituições financeiras participantes do módulo Oferta Pública (Ofpub).</w:t>
-      </w:r>
-    </w:p>
-    <w:p>
-      <w:pPr>
-        <w:spacing w:after="40"/>
-      </w:pPr>
-      <w:r>
-        <w:rPr>
-          <w:b/>
-          <w:color w:val="888888"/>
-          <w:sz w:val="18"/>
-        </w:rPr>
-        <w:t xml:space="preserve">Publicado: </w:t>
-      </w:r>
-      <w:r>
-        <w:rPr>
-          <w:color w:val="888888"/>
-          <w:sz w:val="18"/>
-        </w:rPr>
-        <w:t xml:space="preserve">2026-07-08T18:30   </w:t>
-      </w:r>
-      <w:hyperlink r:id="rId11">
-        <w:r>
-          <w:rPr>
-            <w:color w:val="1A4D2E"/>
-            <w:u w:val="single"/>
-            <w:b/>
-          </w:rPr>
-          <w:t>Acessar materia</w:t>
-        </w:r>
-      </w:hyperlink>
-    </w:p>
-    <w:p>
-      <w:pPr>
-        <w:spacing w:after="120"/>
-      </w:pPr>
-      <w:r>
-        <w:rPr>
-          <w:i/>
-          <w:color w:val="888888"/>
-          <w:sz w:val="16"/>
-        </w:rPr>
-        <w:t>Condições para operações compromissadas, com impacto direto nas instituições financeiras e no mercado.</w:t>
-      </w:r>
-    </w:p>
-    <w:p>
-      <w:pPr>
-        <w:spacing w:before="160" w:after="40"/>
-      </w:pPr>
-      <w:r>
-        <w:rPr>
-          <w:b/>
-          <w:color w:val="1A1A1A"/>
-          <w:sz w:val="22"/>
-        </w:rPr>
-        <w:t xml:space="preserve">Comunicado n° 45.523, 8/7/2026   </w:t>
-      </w:r>
-      <w:r>
-        <w:rPr>
-          <w:b/>
-          <w:color w:val="D68910"/>
-          <w:sz w:val="16"/>
-        </w:rPr>
-        <w:t>[MÉDIA]</w:t>
-      </w:r>
-    </w:p>
-    <w:p>
-      <w:pPr>
-        <w:spacing w:after="40"/>
-      </w:pPr>
-      <w:r>
-        <w:rPr>
-          <w:color w:val="4A4A4A"/>
-          <w:sz w:val="20"/>
-        </w:rPr>
-        <w:t>Divulga nome de pessoas com interesse em exercer o controle de Instituição de Pagamento.</w:t>
-      </w:r>
-    </w:p>
-    <w:p>
-      <w:pPr>
-        <w:spacing w:after="40"/>
-      </w:pPr>
-      <w:r>
-        <w:rPr>
-          <w:b/>
-          <w:color w:val="888888"/>
-          <w:sz w:val="18"/>
-        </w:rPr>
-        <w:t xml:space="preserve">Publicado: </w:t>
-      </w:r>
-      <w:r>
-        <w:rPr>
-          <w:color w:val="888888"/>
-          <w:sz w:val="18"/>
-        </w:rPr>
-        <w:t xml:space="preserve">2026-07-08T17:40   </w:t>
-      </w:r>
-      <w:hyperlink r:id="rId26">
-        <w:r>
-          <w:rPr>
-            <w:color w:val="1A4D2E"/>
-            <w:u w:val="single"/>
-            <w:b/>
-          </w:rPr>
-          <w:t>Acessar materia</w:t>
-        </w:r>
-      </w:hyperlink>
-    </w:p>
-    <w:p>
-      <w:pPr>
-        <w:spacing w:after="120"/>
-      </w:pPr>
-      <w:r>
-        <w:rPr>
-          <w:i/>
-          <w:color w:val="888888"/>
-          <w:sz w:val="16"/>
-        </w:rPr>
-        <w:t>Divulgação de interesse em controle de instituição de pagamento, relevante para o setor financeiro.</w:t>
-      </w:r>
-    </w:p>
-    <w:p>
-      <w:pPr>
-        <w:spacing w:before="160" w:after="40"/>
-      </w:pPr>
-      <w:r>
-        <w:rPr>
-          <w:b/>
-          <w:color w:val="1A1A1A"/>
-          <w:sz w:val="22"/>
-        </w:rPr>
-        <w:t xml:space="preserve">Instrução Normativa BCB n° 758, 8/7/2026   </w:t>
-      </w:r>
-      <w:r>
-        <w:rPr>
-          <w:b/>
-          <w:color w:val="C0392B"/>
-          <w:sz w:val="16"/>
-        </w:rPr>
-        <w:t>[ALTA]</w:t>
-      </w:r>
-    </w:p>
-    <w:p>
-      <w:pPr>
-        <w:spacing w:after="40"/>
-      </w:pPr>
-      <w:r>
-        <w:rPr>
-          <w:color w:val="4A4A4A"/>
-          <w:sz w:val="20"/>
-        </w:rPr>
-        <w:t>Altera o Manual de Crédito Rural (MCR) para ajustar prazos e orientar instituições financeiras sobre procedimentos de reversão de desclassificação no Sicor.</w:t>
-      </w:r>
-    </w:p>
-    <w:p>
-      <w:pPr>
-        <w:spacing w:after="40"/>
-      </w:pPr>
-      <w:r>
-        <w:rPr>
-          <w:b/>
-          <w:color w:val="888888"/>
-          <w:sz w:val="18"/>
-        </w:rPr>
-        <w:t xml:space="preserve">Publicado: </w:t>
-      </w:r>
-      <w:r>
-        <w:rPr>
-          <w:color w:val="888888"/>
-          <w:sz w:val="18"/>
-        </w:rPr>
-        <w:t xml:space="preserve">2026-07-08T16:43   </w:t>
-      </w:r>
-      <w:hyperlink r:id="rId12">
-        <w:r>
-          <w:rPr>
-            <w:color w:val="1A4D2E"/>
-            <w:u w:val="single"/>
-            <w:b/>
-          </w:rPr>
-          <w:t>Acessar materia</w:t>
-        </w:r>
-      </w:hyperlink>
-    </w:p>
-    <w:p>
-      <w:pPr>
-        <w:spacing w:after="120"/>
-      </w:pPr>
-      <w:r>
-        <w:rPr>
-          <w:i/>
-          <w:color w:val="888888"/>
-          <w:sz w:val="16"/>
-        </w:rPr>
-        <w:t>Alteração de norma que afeta o crédito rural, com impacto direto em instituições financeiras e produtores.</w:t>
-      </w:r>
-    </w:p>
-    <w:p>
-      <w:pPr>
-        <w:spacing w:before="160" w:after="40"/>
-      </w:pPr>
-      <w:r>
-        <w:rPr>
-          <w:b/>
-          <w:color w:val="1A1A1A"/>
-          <w:sz w:val="22"/>
-        </w:rPr>
-        <w:t xml:space="preserve">Comunicado n° 45.522, 8/7/2026   </w:t>
-      </w:r>
-      <w:r>
-        <w:rPr>
-          <w:b/>
-          <w:color w:val="D68910"/>
-          <w:sz w:val="16"/>
-        </w:rPr>
-        <w:t>[MÉDIA]</w:t>
-      </w:r>
-    </w:p>
-    <w:p>
-      <w:pPr>
-        <w:spacing w:after="40"/>
-      </w:pPr>
-      <w:r>
-        <w:rPr>
-          <w:color w:val="4A4A4A"/>
-          <w:sz w:val="20"/>
-        </w:rPr>
-        <w:t>Divulga o resultado de leilões de swap.</w:t>
-      </w:r>
-    </w:p>
-    <w:p>
-      <w:pPr>
-        <w:spacing w:after="40"/>
-      </w:pPr>
-      <w:r>
-        <w:rPr>
-          <w:b/>
-          <w:color w:val="888888"/>
-          <w:sz w:val="18"/>
-        </w:rPr>
-        <w:t xml:space="preserve">Publicado: </w:t>
-      </w:r>
-      <w:r>
-        <w:rPr>
-          <w:color w:val="888888"/>
-          <w:sz w:val="18"/>
-        </w:rPr>
-        <w:t xml:space="preserve">2026-07-08T11:46   </w:t>
-      </w:r>
-      <w:hyperlink r:id="rId27">
-        <w:r>
-          <w:rPr>
-            <w:color w:val="1A4D2E"/>
-            <w:u w:val="single"/>
-            <w:b/>
-          </w:rPr>
-          <w:t>Acessar materia</w:t>
-        </w:r>
-      </w:hyperlink>
-    </w:p>
-    <w:p>
-      <w:pPr>
-        <w:spacing w:after="120"/>
-      </w:pPr>
-      <w:r>
-        <w:rPr>
-          <w:i/>
-          <w:color w:val="888888"/>
-          <w:sz w:val="16"/>
-        </w:rPr>
-        <w:t>Divulgação de resultados de leilões de swap, com relevância para o mercado financeiro.</w:t>
-      </w:r>
-    </w:p>
-    <w:p>
-      <w:pPr>
-        <w:spacing w:before="160" w:after="40"/>
-      </w:pPr>
-      <w:r>
-        <w:rPr>
-          <w:b/>
-          <w:color w:val="1A1A1A"/>
-          <w:sz w:val="22"/>
-        </w:rPr>
-        <w:t xml:space="preserve">Comunicado n° 45.521, 8/7/2026   </w:t>
-      </w:r>
-      <w:r>
-        <w:rPr>
-          <w:b/>
-          <w:color w:val="D68910"/>
-          <w:sz w:val="16"/>
-        </w:rPr>
-        <w:t>[MÉDIA]</w:t>
-      </w:r>
-    </w:p>
-    <w:p>
-      <w:pPr>
-        <w:spacing w:after="40"/>
-      </w:pPr>
-      <w:r>
-        <w:rPr>
-          <w:color w:val="4A4A4A"/>
-          <w:sz w:val="20"/>
-        </w:rPr>
-        <w:t>Divulga a realização de leilão de Swap Cambial Tradicional para fins de rolagem.</w:t>
-      </w:r>
-    </w:p>
-    <w:p>
-      <w:pPr>
-        <w:spacing w:after="40"/>
-      </w:pPr>
-      <w:r>
-        <w:rPr>
-          <w:b/>
-          <w:color w:val="888888"/>
-          <w:sz w:val="18"/>
-        </w:rPr>
-        <w:t xml:space="preserve">Publicado: </w:t>
-      </w:r>
-      <w:r>
-        <w:rPr>
-          <w:color w:val="888888"/>
-          <w:sz w:val="18"/>
-        </w:rPr>
-        <w:t xml:space="preserve">2026-07-08T11:30   </w:t>
-      </w:r>
-      <w:hyperlink r:id="rId28">
-        <w:r>
-          <w:rPr>
-            <w:color w:val="1A4D2E"/>
-            <w:u w:val="single"/>
-            <w:b/>
-          </w:rPr>
-          <w:t>Acessar materia</w:t>
-        </w:r>
-      </w:hyperlink>
-    </w:p>
-    <w:p>
-      <w:pPr>
-        <w:spacing w:after="120"/>
-      </w:pPr>
-      <w:r>
-        <w:rPr>
-          <w:i/>
-          <w:color w:val="888888"/>
-          <w:sz w:val="16"/>
-        </w:rPr>
-        <w:t>Divulgação de leilão de swap cambial, com impacto no mercado de câmbio.</w:t>
-      </w:r>
-    </w:p>
-    <w:p>
-      <w:pPr>
-        <w:spacing w:before="160" w:after="40"/>
-      </w:pPr>
-      <w:r>
-        <w:rPr>
-          <w:b/>
-          <w:color w:val="1A1A1A"/>
-          <w:sz w:val="22"/>
-        </w:rPr>
-        <w:t xml:space="preserve">Comunicado n° 45.520, 8/7/2026   </w:t>
-      </w:r>
-      <w:r>
-        <w:rPr>
-          <w:b/>
-          <w:color w:val="D68910"/>
-          <w:sz w:val="16"/>
-        </w:rPr>
-        <w:t>[MÉDIA]</w:t>
-      </w:r>
-    </w:p>
-    <w:p>
-      <w:pPr>
-        <w:spacing w:after="40"/>
-      </w:pPr>
-      <w:r>
-        <w:rPr>
-          <w:color w:val="4A4A4A"/>
-          <w:sz w:val="20"/>
-        </w:rPr>
-        <w:t>Divulga a realização de leilão de Swap Cambial Tradicional para fins de rolagem.</w:t>
-      </w:r>
-    </w:p>
-    <w:p>
-      <w:pPr>
-        <w:spacing w:after="40"/>
-      </w:pPr>
-      <w:r>
-        <w:rPr>
-          <w:b/>
-          <w:color w:val="888888"/>
-          <w:sz w:val="18"/>
-        </w:rPr>
-        <w:t xml:space="preserve">Publicado: </w:t>
-      </w:r>
-      <w:r>
-        <w:rPr>
-          <w:color w:val="888888"/>
-          <w:sz w:val="18"/>
-        </w:rPr>
-        <w:t xml:space="preserve">2026-07-08T11:30   </w:t>
-      </w:r>
-      <w:hyperlink r:id="rId29">
-        <w:r>
-          <w:rPr>
-            <w:color w:val="1A4D2E"/>
-            <w:u w:val="single"/>
-            <w:b/>
-          </w:rPr>
-          <w:t>Acessar materia</w:t>
-        </w:r>
-      </w:hyperlink>
-    </w:p>
-    <w:p>
-      <w:pPr>
-        <w:spacing w:after="120"/>
-      </w:pPr>
-      <w:r>
-        <w:rPr>
-          <w:i/>
-          <w:color w:val="888888"/>
-          <w:sz w:val="16"/>
-        </w:rPr>
-        <w:t>Divulgação de leilão de swap cambial, com impacto no mercado de câmbio.</w:t>
-      </w:r>
-    </w:p>
-    <w:p>
-      <w:pPr>
-        <w:spacing w:before="160" w:after="40"/>
-      </w:pPr>
-      <w:r>
-        <w:rPr>
-          <w:b/>
-          <w:color w:val="1A1A1A"/>
-          <w:sz w:val="22"/>
-        </w:rPr>
-        <w:t xml:space="preserve">Instrução Normativa BCB n° 757, 8/7/2026   </w:t>
-      </w:r>
-      <w:r>
-        <w:rPr>
-          <w:b/>
-          <w:color w:val="C0392B"/>
-          <w:sz w:val="16"/>
-        </w:rPr>
-        <w:t>[ALTA]</w:t>
-      </w:r>
-    </w:p>
-    <w:p>
-      <w:pPr>
-        <w:spacing w:after="40"/>
-      </w:pPr>
-      <w:r>
-        <w:rPr>
-          <w:color w:val="4A4A4A"/>
-          <w:sz w:val="20"/>
-        </w:rPr>
-        <w:t>Estabelece procedimentos para a prestação de informações ao Banco Central do Brasil relativas a contas de depósito em moeda estrangeira.</w:t>
-      </w:r>
-    </w:p>
-    <w:p>
-      <w:pPr>
-        <w:spacing w:after="40"/>
-      </w:pPr>
-      <w:r>
-        <w:rPr>
-          <w:b/>
-          <w:color w:val="888888"/>
-          <w:sz w:val="18"/>
-        </w:rPr>
-        <w:t xml:space="preserve">Publicado: </w:t>
-      </w:r>
-      <w:r>
-        <w:rPr>
-          <w:color w:val="888888"/>
-          <w:sz w:val="18"/>
-        </w:rPr>
-        <w:t xml:space="preserve">2026-07-08T10:39   </w:t>
-      </w:r>
-      <w:hyperlink r:id="rId13">
-        <w:r>
-          <w:rPr>
-            <w:color w:val="1A4D2E"/>
-            <w:u w:val="single"/>
-            <w:b/>
-          </w:rPr>
-          <w:t>Acessar materia</w:t>
-        </w:r>
-      </w:hyperlink>
-    </w:p>
-    <w:p>
-      <w:pPr>
-        <w:spacing w:after="120"/>
-      </w:pPr>
-      <w:r>
-        <w:rPr>
-          <w:i/>
-          <w:color w:val="888888"/>
-          <w:sz w:val="16"/>
-        </w:rPr>
-        <w:t>Norma que estabelece procedimentos para informações sobre contas em moeda estrangeira, com impacto em instituições financeiras e compliance.</w:t>
-      </w:r>
-    </w:p>
-    <w:p>
-      <w:pPr>
-        <w:spacing w:before="160" w:after="40"/>
-      </w:pPr>
-      <w:r>
-        <w:rPr>
-          <w:b/>
-          <w:color w:val="1A1A1A"/>
-          <w:sz w:val="22"/>
-        </w:rPr>
-        <w:t xml:space="preserve">Comunicado n° 45.519, 8/7/2026   </w:t>
-      </w:r>
-      <w:r>
-        <w:rPr>
-          <w:b/>
-          <w:color w:val="D68910"/>
-          <w:sz w:val="16"/>
-        </w:rPr>
-        <w:t>[MÉDIA]</w:t>
-      </w:r>
-    </w:p>
-    <w:p>
-      <w:pPr>
-        <w:spacing w:after="40"/>
-      </w:pPr>
-      <w:r>
-        <w:rPr>
-          <w:color w:val="4A4A4A"/>
-          <w:sz w:val="20"/>
-        </w:rPr>
-        <w:t>Divulga, para fins de recebimento de eventuais objeções, nomes de pessoas eleitas ou nomeadas para ocupar cargos de administração em instituições autorizadas a funcionar.</w:t>
-      </w:r>
-    </w:p>
-    <w:p>
-      <w:pPr>
-        <w:spacing w:after="40"/>
-      </w:pPr>
-      <w:r>
-        <w:rPr>
-          <w:b/>
-          <w:color w:val="888888"/>
-          <w:sz w:val="18"/>
-        </w:rPr>
-        <w:t xml:space="preserve">Publicado: </w:t>
-      </w:r>
-      <w:r>
-        <w:rPr>
-          <w:color w:val="888888"/>
-          <w:sz w:val="18"/>
-        </w:rPr>
-        <w:t xml:space="preserve">2026-07-08T09:53   </w:t>
-      </w:r>
-      <w:hyperlink r:id="rId30">
-        <w:r>
-          <w:rPr>
-            <w:color w:val="1A4D2E"/>
-            <w:u w:val="single"/>
-            <w:b/>
-          </w:rPr>
-          <w:t>Acessar materia</w:t>
-        </w:r>
-      </w:hyperlink>
-    </w:p>
-    <w:p>
-      <w:pPr>
-        <w:spacing w:after="120"/>
-      </w:pPr>
-      <w:r>
-        <w:rPr>
-          <w:i/>
-          <w:color w:val="888888"/>
-          <w:sz w:val="16"/>
-        </w:rPr>
-        <w:t>Divulgação de nomes para cargos de administração em instituições financeiras, importante para governança corporativa.</w:t>
-      </w:r>
-    </w:p>
-    <w:p>
-      <w:pPr>
-        <w:spacing w:before="160" w:after="40"/>
-      </w:pPr>
-      <w:r>
-        <w:rPr>
-          <w:b/>
-          <w:color w:val="1A1A1A"/>
-          <w:sz w:val="22"/>
-        </w:rPr>
-        <w:t xml:space="preserve">Comunicado n° 45.518, 8/7/2026   </w:t>
-      </w:r>
-      <w:r>
-        <w:rPr>
-          <w:b/>
-          <w:color w:val="D68910"/>
-          <w:sz w:val="16"/>
-        </w:rPr>
-        <w:t>[MÉDIA]</w:t>
-      </w:r>
-    </w:p>
-    <w:p>
-      <w:pPr>
-        <w:spacing w:after="40"/>
-      </w:pPr>
-      <w:r>
-        <w:rPr>
-          <w:color w:val="4A4A4A"/>
-          <w:sz w:val="20"/>
-        </w:rPr>
-        <w:t>Divulga nome aprovado de pessoas eleitas/nomeadas para cargos de órgãos estatutários ou contratuais de sociedades autorizadas a funcionar pelo Banco Central do Brasil.</w:t>
-      </w:r>
-    </w:p>
-    <w:p>
-      <w:pPr>
-        <w:spacing w:after="40"/>
-      </w:pPr>
-      <w:r>
-        <w:rPr>
-          <w:b/>
-          <w:color w:val="888888"/>
-          <w:sz w:val="18"/>
-        </w:rPr>
-        <w:t xml:space="preserve">Publicado: </w:t>
-      </w:r>
-      <w:r>
-        <w:rPr>
-          <w:color w:val="888888"/>
-          <w:sz w:val="18"/>
-        </w:rPr>
-        <w:t xml:space="preserve">2026-07-08T09:46   </w:t>
-      </w:r>
-      <w:hyperlink r:id="rId31">
-        <w:r>
-          <w:rPr>
-            <w:color w:val="1A4D2E"/>
-            <w:u w:val="single"/>
-            <w:b/>
-          </w:rPr>
-          <w:t>Acessar materia</w:t>
-        </w:r>
-      </w:hyperlink>
-    </w:p>
-    <w:p>
-      <w:pPr>
-        <w:spacing w:after="120"/>
-      </w:pPr>
-      <w:r>
-        <w:rPr>
-          <w:i/>
-          <w:color w:val="888888"/>
-          <w:sz w:val="16"/>
-        </w:rPr>
-        <w:t>Divulgação de nomes aprovados para cargos em instituições financeiras, importante para governança corporativa.</w:t>
-      </w:r>
-    </w:p>
-    <w:p>
-      <w:pPr>
-        <w:spacing w:before="240" w:after="80"/>
-      </w:pPr>
-      <w:r>
-        <w:rPr>
-          <w:b/>
-          <w:color w:val="1A4D2E"/>
-          <w:sz w:val="20"/>
-        </w:rPr>
-        <w:t>CVM | NOTÍCIAS</w:t>
-      </w:r>
-    </w:p>
-    <w:p>
-      <w:pPr>
-        <w:spacing w:before="0" w:after="40"/>
-        <w:pBdr>
-          <w:bottom w:val="single" w:sz="8" w:space="1" w:color="1A4D2E"/>
-        </w:pBdr>
-      </w:pPr>
-    </w:p>
-    <w:p>
-      <w:pPr>
-        <w:spacing w:before="160" w:after="40"/>
-      </w:pPr>
-      <w:r>
-        <w:rPr>
-          <w:b/>
-          <w:color w:val="1A1A1A"/>
-          <w:sz w:val="22"/>
-        </w:rPr>
-        <w:t xml:space="preserve">Presidente da CVM participa de reunião com representantes da Abrasca   </w:t>
-      </w:r>
-      <w:r>
-        <w:rPr>
-          <w:b/>
-          <w:color w:val="D68910"/>
-          <w:sz w:val="16"/>
-        </w:rPr>
-        <w:t>[MÉDIA]</w:t>
-      </w:r>
-    </w:p>
-    <w:p>
-      <w:pPr>
-        <w:spacing w:after="40"/>
-      </w:pPr>
-      <w:r>
-        <w:rPr>
-          <w:color w:val="4A4A4A"/>
-          <w:sz w:val="20"/>
-        </w:rPr>
-        <w:t>Reunião abordou temas relacionados ao mercado de capitais, com a participação do presidente da CVM e representantes da Abrasca.</w:t>
-      </w:r>
-    </w:p>
-    <w:p>
-      <w:pPr>
-        <w:spacing w:after="40"/>
-      </w:pPr>
-      <w:r>
-        <w:rPr>
-          <w:b/>
-          <w:color w:val="888888"/>
-          <w:sz w:val="18"/>
-        </w:rPr>
-        <w:t xml:space="preserve">Publicado: </w:t>
-      </w:r>
-      <w:r>
-        <w:rPr>
-          <w:color w:val="888888"/>
-          <w:sz w:val="18"/>
-        </w:rPr>
-        <w:t xml:space="preserve">2026-07-08   </w:t>
-      </w:r>
-      <w:hyperlink r:id="rId32">
-        <w:r>
-          <w:rPr>
-            <w:color w:val="1A4D2E"/>
-            <w:u w:val="single"/>
-            <w:b/>
-          </w:rPr>
-          <w:t>Acessar materia</w:t>
-        </w:r>
-      </w:hyperlink>
-    </w:p>
-    <w:p>
-      <w:pPr>
-        <w:spacing w:after="120"/>
-      </w:pPr>
-      <w:r>
-        <w:rPr>
-          <w:i/>
-          <w:color w:val="888888"/>
-          <w:sz w:val="16"/>
-        </w:rPr>
-        <w:t>Notícia institucional sobre reunião com representantes do mercado de capitais, indicando discussões relevantes para o setor.</w:t>
+        <w:t>Divulgação de nomes para cargos de administração em instituições financeiras, relevante para o setor regulado.</w:t>
       </w:r>
     </w:p>
     <w:p/>
@@ -2551,7 +1717,7 @@
           <w:color w:val="1A4D2E"/>
           <w:sz w:val="20"/>
         </w:rPr>
-        <w:t>CCEE | NOTICIAS</w:t>
+        <w:t>ANP | NOTÍCIAS</w:t>
       </w:r>
     </w:p>
     <w:p>
@@ -2572,7 +1738,7 @@
           <w:color w:val="1A1A1A"/>
           <w:sz w:val="22"/>
         </w:rPr>
-        <w:t xml:space="preserve">Encontro CCEE: Tecnologia, inovação e inteligência artificial marcam programação da tarde do evento   </w:t>
+        <w:t xml:space="preserve">Inscrições para Jornada Empreendedora PRH-ANP 2026 podem ser feitas até 17 de julho   </w:t>
       </w:r>
       <w:r>
         <w:rPr>
@@ -2592,330 +1758,7 @@
           <w:color w:val="4A4A4A"/>
           <w:sz w:val="20"/>
         </w:rPr>
-        <w:t>Especialistas apresentaram soluções que apoiam a transformação digital do mercado de energia e preparam a infraestrutura tecnológica para a abertura do setor.</w:t>
-      </w:r>
-    </w:p>
-    <w:p>
-      <w:pPr>
-        <w:spacing w:after="40"/>
-      </w:pPr>
-      <w:r>
-        <w:rPr>
-          <w:b/>
-          <w:color w:val="888888"/>
-          <w:sz w:val="18"/>
-        </w:rPr>
-        <w:t xml:space="preserve">Publicado: </w:t>
-      </w:r>
-      <w:r>
-        <w:rPr>
-          <w:color w:val="888888"/>
-          <w:sz w:val="18"/>
-        </w:rPr>
-        <w:t xml:space="preserve">2026-07-08   </w:t>
-      </w:r>
-      <w:hyperlink r:id="rId33">
-        <w:r>
-          <w:rPr>
-            <w:color w:val="1A4D2E"/>
-            <w:u w:val="single"/>
-            <w:b/>
-          </w:rPr>
-          <w:t>Acessar materia</w:t>
-        </w:r>
-      </w:hyperlink>
-    </w:p>
-    <w:p>
-      <w:pPr>
-        <w:spacing w:after="120"/>
-      </w:pPr>
-      <w:r>
-        <w:rPr>
-          <w:i/>
-          <w:color w:val="888888"/>
-          <w:sz w:val="16"/>
-        </w:rPr>
-        <w:t>Notícia institucional sobre evento, sem impacto regulatório ou legislativo direto.</w:t>
-      </w:r>
-    </w:p>
-    <w:p>
-      <w:pPr>
-        <w:spacing w:before="240" w:after="80"/>
-      </w:pPr>
-      <w:r>
-        <w:rPr>
-          <w:b/>
-          <w:color w:val="1A4D2E"/>
-          <w:sz w:val="20"/>
-        </w:rPr>
-        <w:t>MME | NOTÍCIAS</w:t>
-      </w:r>
-    </w:p>
-    <w:p>
-      <w:pPr>
-        <w:spacing w:before="0" w:after="40"/>
-        <w:pBdr>
-          <w:bottom w:val="single" w:sz="8" w:space="1" w:color="1A4D2E"/>
-        </w:pBdr>
-      </w:pPr>
-    </w:p>
-    <w:p>
-      <w:pPr>
-        <w:spacing w:before="160" w:after="40"/>
-      </w:pPr>
-      <w:r>
-        <w:rPr>
-          <w:b/>
-          <w:color w:val="1A1A1A"/>
-          <w:sz w:val="22"/>
-        </w:rPr>
-        <w:t xml:space="preserve">Sistema Interligado Nacional: saiba como a rede conecta a geração e o consumo de energia elétrica no Brasil   </w:t>
-      </w:r>
-      <w:r>
-        <w:rPr>
-          <w:b/>
-          <w:color w:val="7F8C8D"/>
-          <w:sz w:val="16"/>
-        </w:rPr>
-        <w:t>[BAIXA]</w:t>
-      </w:r>
-    </w:p>
-    <w:p>
-      <w:pPr>
-        <w:spacing w:after="40"/>
-      </w:pPr>
-      <w:r>
-        <w:rPr>
-          <w:color w:val="4A4A4A"/>
-          <w:sz w:val="20"/>
-        </w:rPr>
-        <w:t>Entenda como a rede que conecta usinas, linhas de transmissão e distribuidoras ajuda a garantir o abastecimento de energia elétrica no país.</w:t>
-      </w:r>
-    </w:p>
-    <w:p>
-      <w:pPr>
-        <w:spacing w:after="40"/>
-      </w:pPr>
-      <w:r>
-        <w:rPr>
-          <w:b/>
-          <w:color w:val="888888"/>
-          <w:sz w:val="18"/>
-        </w:rPr>
-        <w:t xml:space="preserve">Publicado: </w:t>
-      </w:r>
-      <w:r>
-        <w:rPr>
-          <w:color w:val="888888"/>
-          <w:sz w:val="18"/>
-        </w:rPr>
-        <w:t xml:space="preserve">2026-07-08   </w:t>
-      </w:r>
-      <w:hyperlink r:id="rId34">
-        <w:r>
-          <w:rPr>
-            <w:color w:val="1A4D2E"/>
-            <w:u w:val="single"/>
-            <w:b/>
-          </w:rPr>
-          <w:t>Acessar materia</w:t>
-        </w:r>
-      </w:hyperlink>
-    </w:p>
-    <w:p>
-      <w:pPr>
-        <w:spacing w:after="120"/>
-      </w:pPr>
-      <w:r>
-        <w:rPr>
-          <w:i/>
-          <w:color w:val="888888"/>
-          <w:sz w:val="16"/>
-        </w:rPr>
-        <w:t>Notícia explicativa sobre o funcionamento do Sistema Interligado Nacional, de caráter informativo.</w:t>
-      </w:r>
-    </w:p>
-    <w:p>
-      <w:pPr>
-        <w:spacing w:before="240" w:after="80"/>
-      </w:pPr>
-      <w:r>
-        <w:rPr>
-          <w:b/>
-          <w:color w:val="1A4D2E"/>
-          <w:sz w:val="20"/>
-        </w:rPr>
-        <w:t>EPE | NOTÍCIAS</w:t>
-      </w:r>
-    </w:p>
-    <w:p>
-      <w:pPr>
-        <w:spacing w:before="0" w:after="40"/>
-        <w:pBdr>
-          <w:bottom w:val="single" w:sz="8" w:space="1" w:color="1A4D2E"/>
-        </w:pBdr>
-      </w:pPr>
-    </w:p>
-    <w:p>
-      <w:pPr>
-        <w:spacing w:before="160" w:after="40"/>
-      </w:pPr>
-      <w:r>
-        <w:rPr>
-          <w:b/>
-          <w:color w:val="1A1A1A"/>
-          <w:sz w:val="22"/>
-        </w:rPr>
-        <w:t xml:space="preserve">Em webinário, EPE apresenta base integrada de geração e transmissão de energia   </w:t>
-      </w:r>
-      <w:r>
-        <w:rPr>
-          <w:b/>
-          <w:color w:val="D68910"/>
-          <w:sz w:val="16"/>
-        </w:rPr>
-        <w:t>[MÉDIA]</w:t>
-      </w:r>
-    </w:p>
-    <w:p>
-      <w:pPr>
-        <w:spacing w:after="40"/>
-      </w:pPr>
-      <w:r>
-        <w:rPr>
-          <w:color w:val="4A4A4A"/>
-          <w:sz w:val="20"/>
-        </w:rPr>
-        <w:t>A EPE lançou em webinário uma base de dados integrada de geração e transmissão de energia, resultado de cooperação técnica para detalhar a rede elétrica.</w:t>
-      </w:r>
-    </w:p>
-    <w:p>
-      <w:pPr>
-        <w:spacing w:after="40"/>
-      </w:pPr>
-      <w:r>
-        <w:rPr>
-          <w:b/>
-          <w:color w:val="888888"/>
-          <w:sz w:val="18"/>
-        </w:rPr>
-        <w:t xml:space="preserve">Publicado: </w:t>
-      </w:r>
-      <w:r>
-        <w:rPr>
-          <w:color w:val="888888"/>
-          <w:sz w:val="18"/>
-        </w:rPr>
-        <w:t xml:space="preserve">2026-07-08   </w:t>
-      </w:r>
-      <w:hyperlink r:id="rId35">
-        <w:r>
-          <w:rPr>
-            <w:color w:val="1A4D2E"/>
-            <w:u w:val="single"/>
-            <w:b/>
-          </w:rPr>
-          <w:t>Acessar materia</w:t>
-        </w:r>
-      </w:hyperlink>
-    </w:p>
-    <w:p>
-      <w:pPr>
-        <w:spacing w:after="120"/>
-      </w:pPr>
-      <w:r>
-        <w:rPr>
-          <w:i/>
-          <w:color w:val="888888"/>
-          <w:sz w:val="16"/>
-        </w:rPr>
-        <w:t>Lançamento de ferramenta de dados para o setor de energia, relevante para planejamento e análise de mercado.</w:t>
-      </w:r>
-    </w:p>
-    <w:p/>
-    <w:tbl>
-      <w:tblPr>
-        <w:tblW w:type="auto" w:w="0"/>
-        <w:tblLayout w:type="fixed"/>
-        <w:tblLook w:firstColumn="1" w:firstRow="1" w:lastColumn="0" w:lastRow="0" w:noHBand="0" w:noVBand="1" w:val="04A0"/>
-      </w:tblPr>
-      <w:tblGrid>
-        <w:gridCol w:w="9638"/>
-      </w:tblGrid>
-      <w:tr>
-        <w:tc>
-          <w:tcPr>
-            <w:tcW w:type="dxa" w:w="9638"/>
-            <w:shd w:val="clear" w:color="auto" w:fill="1A4D2E"/>
-          </w:tcPr>
-          <w:p>
-            <w:pPr>
-              <w:spacing w:before="120" w:after="40"/>
-            </w:pPr>
-            <w:r>
-              <w:rPr>
-                <w:b w:val="0"/>
-                <w:color w:val="FFFFFF"/>
-                <w:sz w:val="32"/>
-              </w:rPr>
-              <w:t>Legislação Federal</w:t>
-            </w:r>
-          </w:p>
-        </w:tc>
-      </w:tr>
-    </w:tbl>
-    <w:p>
-      <w:pPr>
-        <w:spacing w:before="240" w:after="80"/>
-      </w:pPr>
-      <w:r>
-        <w:rPr>
-          <w:b/>
-          <w:color w:val="1A4D2E"/>
-          <w:sz w:val="20"/>
-        </w:rPr>
-        <w:t>DESTAQUES DO D.O.U.</w:t>
-      </w:r>
-    </w:p>
-    <w:p>
-      <w:pPr>
-        <w:spacing w:before="0" w:after="40"/>
-        <w:pBdr>
-          <w:bottom w:val="single" w:sz="8" w:space="1" w:color="1A4D2E"/>
-        </w:pBdr>
-      </w:pPr>
-    </w:p>
-    <w:p>
-      <w:pPr>
-        <w:spacing w:before="160" w:after="40"/>
-      </w:pPr>
-      <w:r>
-        <w:rPr>
-          <w:b/>
-          <w:color w:val="1A1A1A"/>
-          <w:sz w:val="22"/>
-        </w:rPr>
-        <w:t xml:space="preserve">RETIFICAÇÃO   </w:t>
-      </w:r>
-      <w:r>
-        <w:rPr>
-          <w:b/>
-          <w:color w:val="7F8C8D"/>
-          <w:sz w:val="16"/>
-        </w:rPr>
-        <w:t>[BAIXA]</w:t>
-      </w:r>
-    </w:p>
-    <w:p>
-      <w:pPr>
-        <w:spacing w:after="40"/>
-      </w:pPr>
-      <w:r>
-        <w:rPr>
-          <w:color w:val="4A4A4A"/>
-          <w:sz w:val="20"/>
-        </w:rPr>
-        <w:t>Retificação no Decreto nº 13.015, de 10 de junho de 2026, referente às assinaturas.</w:t>
+        <w:t>Inscrições abertas para a Jornada Empreendedora do PRH-ANP 2026, com prazo até 17 de julho.</w:t>
       </w:r>
     </w:p>
     <w:p>
@@ -2937,7 +1780,7 @@
         </w:rPr>
         <w:t xml:space="preserve">2026-07-09   </w:t>
       </w:r>
-      <w:hyperlink r:id="rId36">
+      <w:hyperlink r:id="rId24">
         <w:r>
           <w:rPr>
             <w:color w:val="1A4D2E"/>
@@ -2958,7 +1801,7 @@
           <w:color w:val="888888"/>
           <w:sz w:val="16"/>
         </w:rPr>
-        <w:t>Retificação de decreto anterior, de natureza administrativa.</w:t>
+        <w:t>Notícia sobre evento de capacitação, de interesse geral mas com baixo impacto regulatório direto.</w:t>
       </w:r>
     </w:p>
     <w:p>
@@ -2971,7 +1814,7 @@
           <w:color w:val="1A1A1A"/>
           <w:sz w:val="22"/>
         </w:rPr>
-        <w:t xml:space="preserve">DESPACHOS DO PRESIDENTE DA REPÚBLICA   </w:t>
+        <w:t xml:space="preserve">ANP estará presente na Rio Innovation Week   </w:t>
       </w:r>
       <w:r>
         <w:rPr>
@@ -2991,7 +1834,7 @@
           <w:color w:val="4A4A4A"/>
           <w:sz w:val="20"/>
         </w:rPr>
-        <w:t>Despachos presidenciais referentes à restituição de autógrafos de Projetos de Lei ao Congresso Nacional, que se transformam nas Leis nº 15.462 e nº 15.463, de 8 de julho de 2026.</w:t>
+        <w:t>A Agência Nacional do Petróleo, Gás Natural e Biocombustíveis (ANP) participará da Rio Innovation Week, realizando dois seminários.</w:t>
       </w:r>
     </w:p>
     <w:p>
@@ -3013,7 +1856,7 @@
         </w:rPr>
         <w:t xml:space="preserve">2026-07-09   </w:t>
       </w:r>
-      <w:hyperlink r:id="rId37">
+      <w:hyperlink r:id="rId25">
         <w:r>
           <w:rPr>
             <w:color w:val="1A4D2E"/>
@@ -3034,61 +1877,8 @@
           <w:color w:val="888888"/>
           <w:sz w:val="16"/>
         </w:rPr>
-        <w:t>Despachos administrativos sobre o processo legislativo, sem impacto direto a clientes corporativos.</w:t>
+        <w:t>Notícia sobre participação em evento, de caráter institucional.</w:t>
       </w:r>
-    </w:p>
-    <w:p/>
-    <w:tbl>
-      <w:tblPr>
-        <w:tblW w:type="auto" w:w="0"/>
-        <w:tblLayout w:type="fixed"/>
-        <w:tblLook w:firstColumn="1" w:firstRow="1" w:lastColumn="0" w:lastRow="0" w:noHBand="0" w:noVBand="1" w:val="04A0"/>
-      </w:tblPr>
-      <w:tblGrid>
-        <w:gridCol w:w="9638"/>
-      </w:tblGrid>
-      <w:tr>
-        <w:tc>
-          <w:tcPr>
-            <w:tcW w:type="dxa" w:w="9638"/>
-            <w:shd w:val="clear" w:color="auto" w:fill="1A4D2E"/>
-          </w:tcPr>
-          <w:p>
-            <w:pPr>
-              <w:spacing w:before="120" w:after="40"/>
-            </w:pPr>
-            <w:r>
-              <w:rPr>
-                <w:b w:val="0"/>
-                <w:color w:val="FFFFFF"/>
-                <w:sz w:val="32"/>
-              </w:rPr>
-              <w:t>Tributário</w:t>
-            </w:r>
-          </w:p>
-        </w:tc>
-      </w:tr>
-    </w:tbl>
-    <w:p>
-      <w:pPr>
-        <w:spacing w:before="240" w:after="80"/>
-      </w:pPr>
-      <w:r>
-        <w:rPr>
-          <w:b/>
-          <w:color w:val="1A4D2E"/>
-          <w:sz w:val="20"/>
-        </w:rPr>
-        <w:t>MINISTÉRIO DA FAZENDA | NOTÍCIAS</w:t>
-      </w:r>
-    </w:p>
-    <w:p>
-      <w:pPr>
-        <w:spacing w:before="0" w:after="40"/>
-        <w:pBdr>
-          <w:bottom w:val="single" w:sz="8" w:space="1" w:color="1A4D2E"/>
-        </w:pBdr>
-      </w:pPr>
     </w:p>
     <w:p>
       <w:pPr>
@@ -3100,7 +1890,7 @@
           <w:color w:val="1A1A1A"/>
           <w:sz w:val="22"/>
         </w:rPr>
-        <w:t xml:space="preserve">Receita Federal envia comunicações a contribuintes com Selo Sintonia A+   </w:t>
+        <w:t xml:space="preserve">ANP publica cartilha com orientações para postos de combustíveis   </w:t>
       </w:r>
       <w:r>
         <w:rPr>
@@ -3120,7 +1910,7 @@
           <w:color w:val="4A4A4A"/>
           <w:sz w:val="20"/>
         </w:rPr>
-        <w:t>Público com essa classificação será informado sobre eventual existência de débitos em aberto pela Receita Federal.</w:t>
+        <w:t>A ANP atualizou e publicou uma cartilha com orientações para postos de combustíveis, detalhando procedimentos da legislação vigente.</w:t>
       </w:r>
     </w:p>
     <w:p>
@@ -3140,9 +1930,9 @@
           <w:color w:val="888888"/>
           <w:sz w:val="18"/>
         </w:rPr>
-        <w:t xml:space="preserve">2026-07-08   </w:t>
+        <w:t xml:space="preserve">2026-07-09   </w:t>
       </w:r>
-      <w:hyperlink r:id="rId38">
+      <w:hyperlink r:id="rId26">
         <w:r>
           <w:rPr>
             <w:color w:val="1A4D2E"/>
@@ -3163,7 +1953,7 @@
           <w:color w:val="888888"/>
           <w:sz w:val="16"/>
         </w:rPr>
-        <w:t>Comunicações da Receita Federal sobre débitos, relevante para compliance fiscal de empresas.</w:t>
+        <w:t>Publicação de orientações regulatórias para o setor de combustíveis, impactando operadores.</w:t>
       </w:r>
     </w:p>
     <w:p>
@@ -3176,15 +1966,15 @@
           <w:color w:val="1A1A1A"/>
           <w:sz w:val="22"/>
         </w:rPr>
-        <w:t xml:space="preserve">Receita Federal divulga orientações sobre Adicional da CSLL prevista nas Regras GloBE   </w:t>
+        <w:t xml:space="preserve">ANP realiza 2ª edição do workshop Net Zero ANP, sobre hidrogênio de bai   </w:t>
       </w:r>
       <w:r>
         <w:rPr>
           <w:b/>
-          <w:color w:val="C0392B"/>
+          <w:color w:val="D68910"/>
           <w:sz w:val="16"/>
         </w:rPr>
-        <w:t>[ALTA]</w:t>
+        <w:t>[MÉDIA]</w:t>
       </w:r>
     </w:p>
     <w:p>
@@ -3196,7 +1986,7 @@
           <w:color w:val="4A4A4A"/>
           <w:sz w:val="20"/>
         </w:rPr>
-        <w:t>Entidades constituintes devem atentar para normas sobre o pagamento, prestação de informações na DCTFWeb e entrega da obrigação acessória, conforme as Regras GloBE.</w:t>
+        <w:t>A ANP realiza a segunda edição do workshop Net Zero ANP, focado em hidrogênio de baixo carbono.</w:t>
       </w:r>
     </w:p>
     <w:p>
@@ -3216,9 +2006,9 @@
           <w:color w:val="888888"/>
           <w:sz w:val="18"/>
         </w:rPr>
-        <w:t xml:space="preserve">2026-07-08   </w:t>
+        <w:t xml:space="preserve">data nao identificada   </w:t>
       </w:r>
-      <w:hyperlink r:id="rId39">
+      <w:hyperlink r:id="rId27">
         <w:r>
           <w:rPr>
             <w:color w:val="1A4D2E"/>
@@ -3239,8 +2029,29 @@
           <w:color w:val="888888"/>
           <w:sz w:val="16"/>
         </w:rPr>
-        <w:t>Orientações sobre adicional da CSLL e regras GloBE, com impacto direto em empresas e obrigações fiscais.</w:t>
+        <w:t>Workshop sobre tema estratégico (hidrogênio de baixo carbono) para o setor de energia. Data não clara, incluído por padrão.</w:t>
       </w:r>
+    </w:p>
+    <w:p>
+      <w:pPr>
+        <w:spacing w:before="240" w:after="80"/>
+      </w:pPr>
+      <w:r>
+        <w:rPr>
+          <w:b/>
+          <w:color w:val="1A4D2E"/>
+          <w:sz w:val="20"/>
+        </w:rPr>
+        <w:t>MME | NOTÍCIAS</w:t>
+      </w:r>
+    </w:p>
+    <w:p>
+      <w:pPr>
+        <w:spacing w:before="0" w:after="40"/>
+        <w:pBdr>
+          <w:bottom w:val="single" w:sz="8" w:space="1" w:color="1A4D2E"/>
+        </w:pBdr>
+      </w:pPr>
     </w:p>
     <w:p>
       <w:pPr>
@@ -3252,15 +2063,15 @@
           <w:color w:val="1A1A1A"/>
           <w:sz w:val="22"/>
         </w:rPr>
-        <w:t xml:space="preserve">Ação integrada combate organização criminosa responsável pela exploração de bets ilegais na Paraíba   </w:t>
+        <w:t xml:space="preserve">Resolução do CMSE estabelece novas diretrizes para despacho de geração térmica   </w:t>
       </w:r>
       <w:r>
         <w:rPr>
           <w:b/>
-          <w:color w:val="D68910"/>
+          <w:color w:val="C0392B"/>
           <w:sz w:val="16"/>
         </w:rPr>
-        <w:t>[MÉDIA]</w:t>
+        <w:t>[ALTA]</w:t>
       </w:r>
     </w:p>
     <w:p>
@@ -3272,7 +2083,7 @@
           <w:color w:val="4A4A4A"/>
           <w:sz w:val="20"/>
         </w:rPr>
-        <w:t>Operação conjunta resultou no bloqueio de R$ 100 milhões em combate à exploração de apostas ilegais na Paraíba.</w:t>
+        <w:t>Resolução do Comitê de Monitoramento do Setor Elétrico (CMSE) publicada no DOU estabelece novas diretrizes para despacho de geração térmica.</w:t>
       </w:r>
     </w:p>
     <w:p>
@@ -3292,9 +2103,9 @@
           <w:color w:val="888888"/>
           <w:sz w:val="18"/>
         </w:rPr>
-        <w:t xml:space="preserve">2026-07-08   </w:t>
+        <w:t xml:space="preserve">2026-07-09   </w:t>
       </w:r>
-      <w:hyperlink r:id="rId40">
+      <w:hyperlink r:id="rId13">
         <w:r>
           <w:rPr>
             <w:color w:val="1A4D2E"/>
@@ -3315,7 +2126,353 @@
           <w:color w:val="888888"/>
           <w:sz w:val="16"/>
         </w:rPr>
-        <w:t>Notícia sobre operação de combate a crimes financeiros, relevante para o ambiente de negócios e compliance.</w:t>
+        <w:t>Nova resolução com diretrizes para o despacho de geração térmica, impactando o setor elétrico.</w:t>
+      </w:r>
+    </w:p>
+    <w:p>
+      <w:pPr>
+        <w:spacing w:before="160" w:after="40"/>
+      </w:pPr>
+      <w:r>
+        <w:rPr>
+          <w:b/>
+          <w:color w:val="1A1A1A"/>
+          <w:sz w:val="22"/>
+        </w:rPr>
+        <w:t xml:space="preserve">MME abre consulta pública sobre Plano de Ação Nacional para a Mineração Artesanal e em Pequena Escala de Ouro   </w:t>
+      </w:r>
+      <w:r>
+        <w:rPr>
+          <w:b/>
+          <w:color w:val="D68910"/>
+          <w:sz w:val="16"/>
+        </w:rPr>
+        <w:t>[MÉDIA]</w:t>
+      </w:r>
+    </w:p>
+    <w:p>
+      <w:pPr>
+        <w:spacing w:after="40"/>
+      </w:pPr>
+      <w:r>
+        <w:rPr>
+          <w:color w:val="4A4A4A"/>
+          <w:sz w:val="20"/>
+        </w:rPr>
+        <w:t>O Ministério de Minas e Energia (MME) abriu consulta pública para o Plano de Ação Nacional para a Mineração Artesanal e em Pequena Escala de Ouro.</w:t>
+      </w:r>
+    </w:p>
+    <w:p>
+      <w:pPr>
+        <w:spacing w:after="40"/>
+      </w:pPr>
+      <w:r>
+        <w:rPr>
+          <w:b/>
+          <w:color w:val="888888"/>
+          <w:sz w:val="18"/>
+        </w:rPr>
+        <w:t xml:space="preserve">Publicado: </w:t>
+      </w:r>
+      <w:r>
+        <w:rPr>
+          <w:color w:val="888888"/>
+          <w:sz w:val="18"/>
+        </w:rPr>
+        <w:t xml:space="preserve">2026-07-09   </w:t>
+      </w:r>
+      <w:hyperlink r:id="rId28">
+        <w:r>
+          <w:rPr>
+            <w:color w:val="1A4D2E"/>
+            <w:u w:val="single"/>
+            <w:b/>
+          </w:rPr>
+          <w:t>Acessar materia</w:t>
+        </w:r>
+      </w:hyperlink>
+    </w:p>
+    <w:p>
+      <w:pPr>
+        <w:spacing w:after="120"/>
+      </w:pPr>
+      <w:r>
+        <w:rPr>
+          <w:i/>
+          <w:color w:val="888888"/>
+          <w:sz w:val="16"/>
+        </w:rPr>
+        <w:t>Abertura de consulta pública sobre plano de ação para mineração, relevante para o setor.</w:t>
+      </w:r>
+    </w:p>
+    <w:p>
+      <w:pPr>
+        <w:spacing w:before="160" w:after="40"/>
+      </w:pPr>
+      <w:r>
+        <w:rPr>
+          <w:b/>
+          <w:color w:val="1A1A1A"/>
+          <w:sz w:val="22"/>
+        </w:rPr>
+        <w:t xml:space="preserve">EPE e MME publicam Caderno de Requisitos de Energia e Potência do PDE 2032   </w:t>
+      </w:r>
+      <w:r>
+        <w:rPr>
+          <w:b/>
+          <w:color w:val="D68910"/>
+          <w:sz w:val="16"/>
+        </w:rPr>
+        <w:t>[MÉDIA]</w:t>
+      </w:r>
+    </w:p>
+    <w:p>
+      <w:pPr>
+        <w:spacing w:after="40"/>
+      </w:pPr>
+      <w:r>
+        <w:rPr>
+          <w:color w:val="4A4A4A"/>
+          <w:sz w:val="20"/>
+        </w:rPr>
+        <w:t>A EPE e o MME publicam o Caderno de Requisitos de Energia e Potência do Plano Decenal de Expansão de Energia (PDE) 2032.</w:t>
+      </w:r>
+    </w:p>
+    <w:p>
+      <w:pPr>
+        <w:spacing w:after="40"/>
+      </w:pPr>
+      <w:r>
+        <w:rPr>
+          <w:b/>
+          <w:color w:val="888888"/>
+          <w:sz w:val="18"/>
+        </w:rPr>
+        <w:t xml:space="preserve">Publicado: </w:t>
+      </w:r>
+      <w:r>
+        <w:rPr>
+          <w:color w:val="888888"/>
+          <w:sz w:val="18"/>
+        </w:rPr>
+        <w:t xml:space="preserve">data nao identificada   </w:t>
+      </w:r>
+      <w:hyperlink r:id="rId29">
+        <w:r>
+          <w:rPr>
+            <w:color w:val="1A4D2E"/>
+            <w:u w:val="single"/>
+            <w:b/>
+          </w:rPr>
+          <w:t>Acessar materia</w:t>
+        </w:r>
+      </w:hyperlink>
+    </w:p>
+    <w:p>
+      <w:pPr>
+        <w:spacing w:after="120"/>
+      </w:pPr>
+      <w:r>
+        <w:rPr>
+          <w:i/>
+          <w:color w:val="888888"/>
+          <w:sz w:val="16"/>
+        </w:rPr>
+        <w:t>Publicação de caderno técnico sobre planejamento energético, relevante para o setor. Data não clara, incluído por padrão.</w:t>
+      </w:r>
+    </w:p>
+    <w:p>
+      <w:pPr>
+        <w:spacing w:before="240" w:after="80"/>
+      </w:pPr>
+      <w:r>
+        <w:rPr>
+          <w:b/>
+          <w:color w:val="1A4D2E"/>
+          <w:sz w:val="20"/>
+        </w:rPr>
+        <w:t>EPE | NOTÍCIAS</w:t>
+      </w:r>
+    </w:p>
+    <w:p>
+      <w:pPr>
+        <w:spacing w:before="0" w:after="40"/>
+        <w:pBdr>
+          <w:bottom w:val="single" w:sz="8" w:space="1" w:color="1A4D2E"/>
+        </w:pBdr>
+      </w:pPr>
+    </w:p>
+    <w:p>
+      <w:pPr>
+        <w:spacing w:before="160" w:after="40"/>
+      </w:pPr>
+      <w:r>
+        <w:rPr>
+          <w:b/>
+          <w:color w:val="1A1A1A"/>
+          <w:sz w:val="22"/>
+        </w:rPr>
+        <w:t xml:space="preserve">EPE prevê expansões do Sistema Interligado Nacional no PET/PELP do 1º semestre de 2026   </w:t>
+      </w:r>
+      <w:r>
+        <w:rPr>
+          <w:b/>
+          <w:color w:val="C0392B"/>
+          <w:sz w:val="16"/>
+        </w:rPr>
+        <w:t>[ALTA]</w:t>
+      </w:r>
+    </w:p>
+    <w:p>
+      <w:pPr>
+        <w:spacing w:after="40"/>
+      </w:pPr>
+      <w:r>
+        <w:rPr>
+          <w:color w:val="4A4A4A"/>
+          <w:sz w:val="20"/>
+        </w:rPr>
+        <w:t>O PET/PELP apresenta estatísticas referentes à expansão planejada, contextualizando os principais destaques dos estados, com informações sobre as próximas obras a serem licitadas e seus investimentos e benefícios, bem como proporciona uma visão geral sobre os estudos de planejamento em andamento, a serem contemplados nas próximas edições do documento.</w:t>
+      </w:r>
+    </w:p>
+    <w:p>
+      <w:pPr>
+        <w:spacing w:after="40"/>
+      </w:pPr>
+      <w:r>
+        <w:rPr>
+          <w:b/>
+          <w:color w:val="888888"/>
+          <w:sz w:val="18"/>
+        </w:rPr>
+        <w:t xml:space="preserve">Publicado: </w:t>
+      </w:r>
+      <w:r>
+        <w:rPr>
+          <w:color w:val="888888"/>
+          <w:sz w:val="18"/>
+        </w:rPr>
+        <w:t xml:space="preserve">2026-07-09   </w:t>
+      </w:r>
+      <w:hyperlink r:id="rId30">
+        <w:r>
+          <w:rPr>
+            <w:color w:val="1A4D2E"/>
+            <w:u w:val="single"/>
+            <w:b/>
+          </w:rPr>
+          <w:t>Acessar materia</w:t>
+        </w:r>
+      </w:hyperlink>
+    </w:p>
+    <w:p>
+      <w:pPr>
+        <w:spacing w:after="120"/>
+      </w:pPr>
+      <w:r>
+        <w:rPr>
+          <w:i/>
+          <w:color w:val="888888"/>
+          <w:sz w:val="16"/>
+        </w:rPr>
+        <w:t>Previsões de expansão do Sistema Interligado Nacional, com impacto no planejamento e investimentos do setor elétrico.</w:t>
+      </w:r>
+    </w:p>
+    <w:p>
+      <w:pPr>
+        <w:spacing w:before="240" w:after="80"/>
+      </w:pPr>
+      <w:r>
+        <w:rPr>
+          <w:b/>
+          <w:color w:val="1A4D2E"/>
+          <w:sz w:val="20"/>
+        </w:rPr>
+        <w:t>ANM | NOTÍCIAS</w:t>
+      </w:r>
+    </w:p>
+    <w:p>
+      <w:pPr>
+        <w:spacing w:before="0" w:after="40"/>
+        <w:pBdr>
+          <w:bottom w:val="single" w:sz="8" w:space="1" w:color="1A4D2E"/>
+        </w:pBdr>
+      </w:pPr>
+    </w:p>
+    <w:p>
+      <w:pPr>
+        <w:spacing w:before="160" w:after="40"/>
+      </w:pPr>
+      <w:r>
+        <w:rPr>
+          <w:b/>
+          <w:color w:val="1A1A1A"/>
+          <w:sz w:val="22"/>
+        </w:rPr>
+        <w:t xml:space="preserve">Royalties da mineração injetam mais de R$ 477 milhões em estados e municípios produtores   </w:t>
+      </w:r>
+      <w:r>
+        <w:rPr>
+          <w:b/>
+          <w:color w:val="D68910"/>
+          <w:sz w:val="16"/>
+        </w:rPr>
+        <w:t>[MÉDIA]</w:t>
+      </w:r>
+    </w:p>
+    <w:p>
+      <w:pPr>
+        <w:spacing w:after="40"/>
+      </w:pPr>
+      <w:r>
+        <w:rPr>
+          <w:color w:val="4A4A4A"/>
+          <w:sz w:val="20"/>
+        </w:rPr>
+        <w:t>Royalties da mineração injetaram mais de R$ 477 milhões em estados e municípios produtores.</w:t>
+      </w:r>
+    </w:p>
+    <w:p>
+      <w:pPr>
+        <w:spacing w:after="40"/>
+      </w:pPr>
+      <w:r>
+        <w:rPr>
+          <w:b/>
+          <w:color w:val="888888"/>
+          <w:sz w:val="18"/>
+        </w:rPr>
+        <w:t xml:space="preserve">Publicado: </w:t>
+      </w:r>
+      <w:r>
+        <w:rPr>
+          <w:color w:val="888888"/>
+          <w:sz w:val="18"/>
+        </w:rPr>
+        <w:t xml:space="preserve">data nao identificada   </w:t>
+      </w:r>
+      <w:hyperlink r:id="rId31">
+        <w:r>
+          <w:rPr>
+            <w:color w:val="1A4D2E"/>
+            <w:u w:val="single"/>
+            <w:b/>
+          </w:rPr>
+          <w:t>Acessar materia</w:t>
+        </w:r>
+      </w:hyperlink>
+    </w:p>
+    <w:p>
+      <w:pPr>
+        <w:spacing w:after="120"/>
+      </w:pPr>
+      <w:r>
+        <w:rPr>
+          <w:i/>
+          <w:color w:val="888888"/>
+          <w:sz w:val="16"/>
+        </w:rPr>
+        <w:t>Notícia sobre o impacto financeiro dos royalties da mineração, relevante para o setor e entes federativos. Data não clara, incluído por padrão.</w:t>
       </w:r>
     </w:p>
     <w:p/>
@@ -3360,7 +2517,7 @@
           <w:color w:val="1A4D2E"/>
           <w:sz w:val="20"/>
         </w:rPr>
-        <w:t>ANPD | NOTÍCIAS</w:t>
+        <w:t>ANVISA | NOTÍCIAS</w:t>
       </w:r>
     </w:p>
     <w:p>
@@ -3381,7 +2538,7 @@
           <w:color w:val="1A1A1A"/>
           <w:sz w:val="22"/>
         </w:rPr>
-        <w:t xml:space="preserve">ANPD instaura processo de sanção contra OS por falha na proteção de dados de 500 mil pacientes   </w:t>
+        <w:t xml:space="preserve">Anvisa determina apreensão de lotes falsificados de Mounjaro   </w:t>
       </w:r>
       <w:r>
         <w:rPr>
@@ -3401,7 +2558,7 @@
           <w:color w:val="4A4A4A"/>
           <w:sz w:val="20"/>
         </w:rPr>
-        <w:t>Ataque cibernético expôs dados sensíveis de pacientes de unidades geridas pelo Instituto Saúde e Cidadania (Isac), levando à instauração de processo de sanção pela ANPD.</w:t>
+        <w:t>A Anvisa determinou a apreensão de lotes falsificados do medicamento Mounjaro e proibiu a comercialização de produtos sem registro.</w:t>
       </w:r>
     </w:p>
     <w:p>
@@ -3421,9 +2578,9 @@
           <w:color w:val="888888"/>
           <w:sz w:val="18"/>
         </w:rPr>
-        <w:t xml:space="preserve">2026-07-08T10:40   </w:t>
+        <w:t xml:space="preserve">2026-07-10   </w:t>
       </w:r>
-      <w:hyperlink r:id="rId41">
+      <w:hyperlink r:id="rId32">
         <w:r>
           <w:rPr>
             <w:color w:val="1A4D2E"/>
@@ -3444,29 +2601,8 @@
           <w:color w:val="888888"/>
           <w:sz w:val="16"/>
         </w:rPr>
-        <w:t>Instauração de processo de sanção por falha grave na proteção de dados sensíveis, com repercussão para empresas que tratam dados pessoais.</w:t>
+        <w:t>Medida de fiscalização com impacto direto na saúde pública e no mercado farmacêutico.</w:t>
       </w:r>
-    </w:p>
-    <w:p>
-      <w:pPr>
-        <w:spacing w:before="240" w:after="80"/>
-      </w:pPr>
-      <w:r>
-        <w:rPr>
-          <w:b/>
-          <w:color w:val="1A4D2E"/>
-          <w:sz w:val="20"/>
-        </w:rPr>
-        <w:t>MINISTÉRIO DA AGRICULTURA | NOTÍCIAS</w:t>
-      </w:r>
-    </w:p>
-    <w:p>
-      <w:pPr>
-        <w:spacing w:before="0" w:after="40"/>
-        <w:pBdr>
-          <w:bottom w:val="single" w:sz="8" w:space="1" w:color="1A4D2E"/>
-        </w:pBdr>
-      </w:pPr>
     </w:p>
     <w:p>
       <w:pPr>
@@ -3478,7 +2614,7 @@
           <w:color w:val="1A1A1A"/>
           <w:sz w:val="22"/>
         </w:rPr>
-        <w:t xml:space="preserve">Aberturas de mercado para o Brasil na Nigéria e na Mauritânia   </w:t>
+        <w:t xml:space="preserve">Anvisa convida Visas a participarem de pesquisas estratégicas   </w:t>
       </w:r>
       <w:r>
         <w:rPr>
@@ -3498,7 +2634,7 @@
           <w:color w:val="4A4A4A"/>
           <w:sz w:val="20"/>
         </w:rPr>
-        <w:t>O Ministério da Agricultura e o Ministério das Relações Exteriores anunciam a abertura de novos mercados para produtos brasileiros na Nigéria e na Mauritânia.</w:t>
+        <w:t>A Anvisa lançou duas pesquisas para aprimorar os instrumentos de inspeção em serviços de saúde e de interesse para a saúde.</w:t>
       </w:r>
     </w:p>
     <w:p>
@@ -3518,9 +2654,9 @@
           <w:color w:val="888888"/>
           <w:sz w:val="18"/>
         </w:rPr>
-        <w:t xml:space="preserve">2026-07-08   </w:t>
+        <w:t xml:space="preserve">2026-07-09   </w:t>
       </w:r>
-      <w:hyperlink r:id="rId42">
+      <w:hyperlink r:id="rId33">
         <w:r>
           <w:rPr>
             <w:color w:val="1A4D2E"/>
@@ -3541,29 +2677,8 @@
           <w:color w:val="888888"/>
           <w:sz w:val="16"/>
         </w:rPr>
-        <w:t>Abertura de novos mercados para exportações brasileiras, com impacto no agronegócio.</w:t>
+        <w:t>Lançamento de pesquisas para aprimorar a fiscalização sanitária, relevante para o setor de saúde.</w:t>
       </w:r>
-    </w:p>
-    <w:p>
-      <w:pPr>
-        <w:spacing w:before="240" w:after="80"/>
-      </w:pPr>
-      <w:r>
-        <w:rPr>
-          <w:b/>
-          <w:color w:val="1A4D2E"/>
-          <w:sz w:val="20"/>
-        </w:rPr>
-        <w:t>ANVISA | NOTÍCIAS</w:t>
-      </w:r>
-    </w:p>
-    <w:p>
-      <w:pPr>
-        <w:spacing w:before="0" w:after="40"/>
-        <w:pBdr>
-          <w:bottom w:val="single" w:sz="8" w:space="1" w:color="1A4D2E"/>
-        </w:pBdr>
-      </w:pPr>
     </w:p>
     <w:p>
       <w:pPr>
@@ -3575,7 +2690,7 @@
           <w:color w:val="1A1A1A"/>
           <w:sz w:val="22"/>
         </w:rPr>
-        <w:t xml:space="preserve">Confira os destaques da 12ª Reunião Ordinária Pública da Diretoria da Anvisa   </w:t>
+        <w:t xml:space="preserve">Anvisa determina recolhimento de suplementos alimentares irregulares   </w:t>
       </w:r>
       <w:r>
         <w:rPr>
@@ -3595,7 +2710,7 @@
           <w:color w:val="4A4A4A"/>
           <w:sz w:val="20"/>
         </w:rPr>
-        <w:t>A atualização da composição das vacinas contra a Covid-19 em uso no Brasil foi um dos itens aprovados na 12ª Reunião Ordinária Pública da Diretoria da Anvisa.</w:t>
+        <w:t>A Anvisa determinou o recolhimento de suplementos alimentares da marca Alivemed por indícios de composição em desacordo com a regulamentação.</w:t>
       </w:r>
     </w:p>
     <w:p>
@@ -3615,9 +2730,9 @@
           <w:color w:val="888888"/>
           <w:sz w:val="18"/>
         </w:rPr>
-        <w:t xml:space="preserve">2026-07-08   </w:t>
+        <w:t xml:space="preserve">2026-07-09   </w:t>
       </w:r>
-      <w:hyperlink r:id="rId43">
+      <w:hyperlink r:id="rId34">
         <w:r>
           <w:rPr>
             <w:color w:val="1A4D2E"/>
@@ -3638,7 +2753,7 @@
           <w:color w:val="888888"/>
           <w:sz w:val="16"/>
         </w:rPr>
-        <w:t>Destaques de reunião da diretoria com aprovação de atualização de vacinas, com impacto na saúde pública e setor farmacêutico.</w:t>
+        <w:t>Medida de fiscalização com impacto direto na comercialização de suplementos alimentares.</w:t>
       </w:r>
     </w:p>
     <w:p>
@@ -3651,7 +2766,7 @@
           <w:color w:val="1A1A1A"/>
           <w:sz w:val="22"/>
         </w:rPr>
-        <w:t xml:space="preserve">Anvisa aprova medicamento para tratar doença de Chagas em pacientes pediátricos   </w:t>
+        <w:t xml:space="preserve">Venda, distribuição, propaganda e uso de suplementos da Bioghen fabricados até 9/4 seguem proibidos   </w:t>
       </w:r>
       <w:r>
         <w:rPr>
@@ -3671,7 +2786,7 @@
           <w:color w:val="4A4A4A"/>
           <w:sz w:val="20"/>
         </w:rPr>
-        <w:t>A Anvisa aprovou um novo medicamento indicado para o tratamento da doença de Chagas em pacientes pediátricos, na faixa etária de 0 a 17 anos.</w:t>
+        <w:t>A Anvisa manteve a proibição de venda, distribuição, propaganda e uso de suplementos da Bioghen fabricados até 9/4, após avaliar pedido de revisão.</w:t>
       </w:r>
     </w:p>
     <w:p>
@@ -3691,9 +2806,9 @@
           <w:color w:val="888888"/>
           <w:sz w:val="18"/>
         </w:rPr>
-        <w:t xml:space="preserve">2026-07-08   </w:t>
+        <w:t xml:space="preserve">2026-07-09   </w:t>
       </w:r>
-      <w:hyperlink r:id="rId44">
+      <w:hyperlink r:id="rId35">
         <w:r>
           <w:rPr>
             <w:color w:val="1A4D2E"/>
@@ -3714,7 +2829,7 @@
           <w:color w:val="888888"/>
           <w:sz w:val="16"/>
         </w:rPr>
-        <w:t>Aprovação de novo medicamento para doença de Chagas em pediatria, com impacto na saúde pública e setor farmacêutico.</w:t>
+        <w:t>Manutenção de proibição de produtos, com impacto direto na empresa e no mercado de suplementos.</w:t>
       </w:r>
     </w:p>
     <w:p/>
@@ -3767,7 +2882,7 @@
           <w:color w:val="4A4A4A"/>
           <w:sz w:val="18"/>
         </w:rPr>
-        <w:t>B3 | Ofícios e Comunicados - Nenhuma publicação encontrada na janela temporal.</w:t>
+        <w:t>CCEE | Noticias - Nenhum resultado encontrado na janela temporal.</w:t>
       </w:r>
     </w:p>
     <w:p>
@@ -3779,7 +2894,7 @@
           <w:color w:val="4A4A4A"/>
           <w:sz w:val="18"/>
         </w:rPr>
-        <w:t>ANP | Notícias - Nenhuma publicação encontrada na janela temporal.</w:t>
+        <w:t>Ministério da Fazenda | Notícias - Nenhum resultado encontrado na janela temporal.</w:t>
       </w:r>
     </w:p>
     <w:p>
@@ -3791,7 +2906,7 @@
           <w:color w:val="4A4A4A"/>
           <w:sz w:val="18"/>
         </w:rPr>
-        <w:t>ONS | Notícias - Nenhuma publicação encontrada na janela temporal.</w:t>
+        <w:t>ANPD | Notícias - Nenhum resultado encontrado na janela temporal.</w:t>
       </w:r>
     </w:p>
     <w:p>
@@ -3803,7 +2918,7 @@
           <w:color w:val="4A4A4A"/>
           <w:sz w:val="18"/>
         </w:rPr>
-        <w:t>ANEEL | Últimas Notícias - Nenhuma publicação encontrada na janela temporal.</w:t>
+        <w:t>CVM | Notícias - Nenhum resultado encontrado na janela temporal.</w:t>
       </w:r>
     </w:p>
     <w:p>
@@ -3815,7 +2930,7 @@
           <w:color w:val="4A4A4A"/>
           <w:sz w:val="18"/>
         </w:rPr>
-        <w:t>Secretaria de Prêmios e Apostas | Notícias - A fonte explicitamente indica 'Nenhum resultado foi encontrado'.</w:t>
+        <w:t>B3 | Ofícios e Comunicados - Nenhum resultado encontrado na janela temporal.</w:t>
       </w:r>
     </w:p>
     <w:p>
@@ -3827,7 +2942,7 @@
           <w:color w:val="4A4A4A"/>
           <w:sz w:val="18"/>
         </w:rPr>
-        <w:t>COAF | Notícias - Nenhuma publicação encontrada na janela temporal.</w:t>
+        <w:t>ONS | Notícias - Nenhum item encontrado na fonte.</w:t>
       </w:r>
     </w:p>
     <w:p>
@@ -3839,7 +2954,7 @@
           <w:color w:val="4A4A4A"/>
           <w:sz w:val="18"/>
         </w:rPr>
-        <w:t>INPI | Notícias - A única publicação recente está fora da janela temporal (após 2026-07-09T10:51).</w:t>
+        <w:t>ANEEL | Últimas Notícias - Nenhum resultado encontrado na janela temporal.</w:t>
       </w:r>
     </w:p>
     <w:p>
@@ -3851,7 +2966,31 @@
           <w:color w:val="4A4A4A"/>
           <w:sz w:val="18"/>
         </w:rPr>
-        <w:t>ANM | Notícias - A única publicação recente está fora da janela temporal (após 2026-07-09T10:51).</w:t>
+        <w:t>Secretaria de Prêmios e Apostas | Notícias - Nenhum resultado encontrado na fonte.</w:t>
+      </w:r>
+    </w:p>
+    <w:p>
+      <w:pPr>
+        <w:pStyle w:val="ListBullet"/>
+      </w:pPr>
+      <w:r>
+        <w:rPr>
+          <w:color w:val="4A4A4A"/>
+          <w:sz w:val="18"/>
+        </w:rPr>
+        <w:t>INPI | Notícias - Nenhum resultado encontrado na janela temporal.</w:t>
+      </w:r>
+    </w:p>
+    <w:p>
+      <w:pPr>
+        <w:pStyle w:val="ListBullet"/>
+      </w:pPr>
+      <w:r>
+        <w:rPr>
+          <w:color w:val="4A4A4A"/>
+          <w:sz w:val="18"/>
+        </w:rPr>
+        <w:t>Ministério da Agricultura | Notícias - Nenhum resultado encontrado na janela temporal.</w:t>
       </w:r>
     </w:p>
     <w:p>
@@ -3873,7 +3012,67 @@
           <w:color w:val="4A4A4A"/>
           <w:sz w:val="18"/>
         </w:rPr>
-        <w:t>Receita Federal | Normas - A fonte é uma interface de busca e não apresenta conteúdo recente diretamente extraível.</w:t>
+        <w:t>Destaques do D.O.U. - Página de busca, não lista publicações diretamente.</w:t>
+      </w:r>
+    </w:p>
+    <w:p>
+      <w:pPr>
+        <w:pStyle w:val="ListBullet"/>
+      </w:pPr>
+      <w:r>
+        <w:rPr>
+          <w:color w:val="4A4A4A"/>
+          <w:sz w:val="18"/>
+        </w:rPr>
+        <w:t>Receita Federal | Normas - Página de busca, não lista publicações diretamente.</w:t>
+      </w:r>
+    </w:p>
+    <w:p>
+      <w:pPr>
+        <w:pStyle w:val="ListBullet"/>
+      </w:pPr>
+      <w:r>
+        <w:rPr>
+          <w:color w:val="4A4A4A"/>
+          <w:sz w:val="18"/>
+        </w:rPr>
+        <w:t>CGU | Notícias - Conteúdo restrito, requer autenticação.</w:t>
+      </w:r>
+    </w:p>
+    <w:p>
+      <w:pPr>
+        <w:pStyle w:val="ListBullet"/>
+      </w:pPr>
+      <w:r>
+        <w:rPr>
+          <w:color w:val="4A4A4A"/>
+          <w:sz w:val="18"/>
+        </w:rPr>
+        <w:t>COAF | Notícias - Conteúdo não carregado ('Carregando') ou não disponível.</w:t>
+      </w:r>
+    </w:p>
+    <w:p>
+      <w:pPr>
+        <w:pStyle w:val="ListBullet"/>
+      </w:pPr>
+      <w:r>
+        <w:rPr>
+          <w:color w:val="4A4A4A"/>
+          <w:sz w:val="18"/>
+        </w:rPr>
+        <w:t>Ministério do Meio Ambiente | Notícias - Conteúdo restrito, requer autenticação.</w:t>
+      </w:r>
+    </w:p>
+    <w:p>
+      <w:pPr>
+        <w:pStyle w:val="ListBullet"/>
+      </w:pPr>
+      <w:r>
+        <w:rPr>
+          <w:color w:val="4A4A4A"/>
+          <w:sz w:val="18"/>
+        </w:rPr>
+        <w:t>SENACON | Notícias - Conteúdo restrito, requer autenticação.</w:t>
       </w:r>
     </w:p>
     <w:p>
@@ -3895,19 +3094,7 @@
           <w:color w:val="4A4A4A"/>
           <w:sz w:val="18"/>
         </w:rPr>
-        <w:t>CGU | Notícias - Conteúdo restrito, requer autenticação.</w:t>
-      </w:r>
-    </w:p>
-    <w:p>
-      <w:pPr>
-        <w:pStyle w:val="ListBullet"/>
-      </w:pPr>
-      <w:r>
-        <w:rPr>
-          <w:color w:val="4A4A4A"/>
-          <w:sz w:val="18"/>
-        </w:rPr>
-        <w:t>Ministério do Meio Ambiente | Notícias - Conteúdo restrito, requer autenticação.</w:t>
+        <w:t>Planalto | Resenha Diaria - Internal Server Error: Failed to scrape. All scraping engines failed to retrieve content from this URL. Engines tried: [index, fire-engine;chrome-cdp, fire-engine(retry);chrome-cdp, fire-engine;tlscli</w:t>
       </w:r>
     </w:p>
     <w:p/>
@@ -3955,7 +3142,7 @@
           <w:color w:val="888888"/>
           <w:sz w:val="16"/>
         </w:rPr>
-        <w:t>Janela analisada: 2026-07-08T00:00 ate 2026-07-09T10:51</w:t>
+        <w:t>Janela analisada: 2026-07-09T00:00 ate 2026-07-10T10:13</w:t>
       </w:r>
     </w:p>
     <w:sectPr>

</xml_diff>

<commit_message>
📰 Atualiza boletim - 2026-07-13
</commit_message>
<xml_diff>
--- a/output/boletim.docx
+++ b/output/boletim.docx
@@ -52,7 +52,7 @@
                 <w:color w:val="FFFFFF"/>
                 <w:sz w:val="28"/>
               </w:rPr>
-              <w:t>10 de julho de 2026</w:t>
+              <w:t>13 de julho de 2026</w:t>
             </w:r>
           </w:p>
         </w:tc>
@@ -87,7 +87,7 @@
                 <w:color w:val="1A4D2E"/>
                 <w:sz w:val="56"/>
               </w:rPr>
-              <w:t>27</w:t>
+              <w:t>0</w:t>
             </w:r>
           </w:p>
         </w:tc>
@@ -106,7 +106,7 @@
                 <w:color w:val="C0392B"/>
                 <w:sz w:val="56"/>
               </w:rPr>
-              <w:t>9</w:t>
+              <w:t>0</w:t>
             </w:r>
           </w:p>
         </w:tc>
@@ -125,7 +125,7 @@
                 <w:color w:val="D68910"/>
                 <w:sz w:val="56"/>
               </w:rPr>
-              <w:t>16</w:t>
+              <w:t>0</w:t>
             </w:r>
           </w:p>
         </w:tc>
@@ -144,7 +144,7 @@
                 <w:color w:val="7F8C8D"/>
                 <w:sz w:val="56"/>
               </w:rPr>
-              <w:t>2</w:t>
+              <w:t>0</w:t>
             </w:r>
           </w:p>
         </w:tc>
@@ -225,2876 +225,29 @@
       </w:tr>
     </w:tbl>
     <w:p/>
-    <w:tbl>
-      <w:tblPr>
-        <w:tblW w:type="auto" w:w="0"/>
-        <w:tblLayout w:type="fixed"/>
-        <w:tblLook w:firstColumn="1" w:firstRow="1" w:lastColumn="0" w:lastRow="0" w:noHBand="0" w:noVBand="1" w:val="04A0"/>
-      </w:tblPr>
-      <w:tblGrid>
-        <w:gridCol w:w="9638"/>
-      </w:tblGrid>
-      <w:tr>
-        <w:tc>
-          <w:tcPr>
-            <w:tcW w:type="dxa" w:w="9638"/>
-            <w:shd w:val="clear" w:color="auto" w:fill="1A4D2E"/>
-          </w:tcPr>
-          <w:p>
-            <w:pPr>
-              <w:spacing w:before="120" w:after="40"/>
-            </w:pPr>
-            <w:r>
-              <w:rPr>
-                <w:b w:val="0"/>
-                <w:color w:val="FFFFFF"/>
-                <w:sz w:val="32"/>
-              </w:rPr>
-              <w:t>Destaques do dia</w:t>
-            </w:r>
-          </w:p>
-          <w:p>
-            <w:pPr>
-              <w:spacing w:after="120"/>
-            </w:pPr>
-            <w:r>
-              <w:rPr>
-                <w:color w:val="A8D8B9"/>
-                <w:sz w:val="18"/>
-              </w:rPr>
-              <w:t>Selecionados por alta relevancia</w:t>
-            </w:r>
-          </w:p>
-        </w:tc>
-      </w:tr>
-    </w:tbl>
-    <w:tbl>
-      <w:tblPr>
-        <w:tblW w:type="auto" w:w="0"/>
-        <w:tblLayout w:type="fixed"/>
-        <w:tblLook w:firstColumn="1" w:firstRow="1" w:lastColumn="0" w:lastRow="0" w:noHBand="0" w:noVBand="1" w:val="04A0"/>
-      </w:tblPr>
-      <w:tblGrid>
-        <w:gridCol w:w="9638"/>
-      </w:tblGrid>
-      <w:tr>
-        <w:tc>
-          <w:tcPr>
-            <w:tcW w:type="dxa" w:w="9638"/>
-            <w:shd w:val="clear" w:color="auto" w:fill="F0F7F2"/>
-          </w:tcPr>
-          <w:p>
-            <w:pPr>
-              <w:spacing w:before="120" w:after="40"/>
-            </w:pPr>
-            <w:r>
-              <w:rPr>
-                <w:b/>
-                <w:color w:val="1A4D2E"/>
-                <w:sz w:val="16"/>
-              </w:rPr>
-              <w:t>BANCO CENTRAL | NORMAS</w:t>
-            </w:r>
-          </w:p>
-          <w:p>
-            <w:pPr>
-              <w:spacing w:after="40"/>
-            </w:pPr>
-            <w:hyperlink r:id="rId9">
-              <w:r>
-                <w:rPr>
-                  <w:color w:val="1A1A1A"/>
-                  <w:u w:val="single"/>
-                  <w:b/>
-                </w:rPr>
-                <w:t>Comunicado n° 45.535, 10/7/2026</w:t>
-              </w:r>
-            </w:hyperlink>
-          </w:p>
-          <w:p>
-            <w:pPr>
-              <w:spacing w:after="120"/>
-            </w:pPr>
-            <w:r>
-              <w:rPr>
-                <w:color w:val="4A4A4A"/>
-                <w:sz w:val="18"/>
-              </w:rPr>
-              <w:t>Divulga a Taxa Básica Financeira (TBF), o Redutor "R" e a Taxa Referencial (TR) relativos a 9 de julho de 2026.</w:t>
-            </w:r>
-          </w:p>
-        </w:tc>
-      </w:tr>
-    </w:tbl>
-    <w:tbl>
-      <w:tblPr>
-        <w:tblW w:type="auto" w:w="0"/>
-        <w:tblLayout w:type="fixed"/>
-        <w:tblLook w:firstColumn="1" w:firstRow="1" w:lastColumn="0" w:lastRow="0" w:noHBand="0" w:noVBand="1" w:val="04A0"/>
-      </w:tblPr>
-      <w:tblGrid>
-        <w:gridCol w:w="9638"/>
-      </w:tblGrid>
-      <w:tr>
-        <w:tc>
-          <w:tcPr>
-            <w:tcW w:type="dxa" w:w="9638"/>
-            <w:shd w:val="clear" w:color="auto" w:fill="F0F7F2"/>
-          </w:tcPr>
-          <w:p>
-            <w:pPr>
-              <w:spacing w:before="120" w:after="40"/>
-            </w:pPr>
-            <w:r>
-              <w:rPr>
-                <w:b/>
-                <w:color w:val="1A4D2E"/>
-                <w:sz w:val="16"/>
-              </w:rPr>
-              <w:t>BANCO CENTRAL | NORMAS</w:t>
-            </w:r>
-          </w:p>
-          <w:p>
-            <w:pPr>
-              <w:spacing w:after="40"/>
-            </w:pPr>
-            <w:hyperlink r:id="rId10">
-              <w:r>
-                <w:rPr>
-                  <w:color w:val="1A1A1A"/>
-                  <w:u w:val="single"/>
-                  <w:b/>
-                </w:rPr>
-                <w:t>Comunicado n° 45.534, 9/7/2026</w:t>
-              </w:r>
-            </w:hyperlink>
-          </w:p>
-          <w:p>
-            <w:pPr>
-              <w:spacing w:after="120"/>
-            </w:pPr>
-            <w:r>
-              <w:rPr>
-                <w:color w:val="4A4A4A"/>
-                <w:sz w:val="18"/>
-              </w:rPr>
-              <w:t>Divulga condições para a realização de operações compromissadas com instituições financeiras participantes do módulo Oferta Pública (Ofpub).</w:t>
-            </w:r>
-          </w:p>
-        </w:tc>
-      </w:tr>
-    </w:tbl>
-    <w:tbl>
-      <w:tblPr>
-        <w:tblW w:type="auto" w:w="0"/>
-        <w:tblLayout w:type="fixed"/>
-        <w:tblLook w:firstColumn="1" w:firstRow="1" w:lastColumn="0" w:lastRow="0" w:noHBand="0" w:noVBand="1" w:val="04A0"/>
-      </w:tblPr>
-      <w:tblGrid>
-        <w:gridCol w:w="9638"/>
-      </w:tblGrid>
-      <w:tr>
-        <w:tc>
-          <w:tcPr>
-            <w:tcW w:type="dxa" w:w="9638"/>
-            <w:shd w:val="clear" w:color="auto" w:fill="F0F7F2"/>
-          </w:tcPr>
-          <w:p>
-            <w:pPr>
-              <w:spacing w:before="120" w:after="40"/>
-            </w:pPr>
-            <w:r>
-              <w:rPr>
-                <w:b/>
-                <w:color w:val="1A4D2E"/>
-                <w:sz w:val="16"/>
-              </w:rPr>
-              <w:t>BANCO CENTRAL | NORMAS</w:t>
-            </w:r>
-          </w:p>
-          <w:p>
-            <w:pPr>
-              <w:spacing w:after="40"/>
-            </w:pPr>
-            <w:hyperlink r:id="rId11">
-              <w:r>
-                <w:rPr>
-                  <w:color w:val="1A1A1A"/>
-                  <w:u w:val="single"/>
-                  <w:b/>
-                </w:rPr>
-                <w:t>Comunicado n° 45.533, 9/7/2026</w:t>
-              </w:r>
-            </w:hyperlink>
-          </w:p>
-          <w:p>
-            <w:pPr>
-              <w:spacing w:after="120"/>
-            </w:pPr>
-            <w:r>
-              <w:rPr>
-                <w:color w:val="4A4A4A"/>
-                <w:sz w:val="18"/>
-              </w:rPr>
-              <w:t>Divulga as condições de oferta pública para a realização de operações de swap para fins de rolagem do vencimento de 03/08/2026.</w:t>
-            </w:r>
-          </w:p>
-        </w:tc>
-      </w:tr>
-    </w:tbl>
-    <w:tbl>
-      <w:tblPr>
-        <w:tblW w:type="auto" w:w="0"/>
-        <w:tblLayout w:type="fixed"/>
-        <w:tblLook w:firstColumn="1" w:firstRow="1" w:lastColumn="0" w:lastRow="0" w:noHBand="0" w:noVBand="1" w:val="04A0"/>
-      </w:tblPr>
-      <w:tblGrid>
-        <w:gridCol w:w="9638"/>
-      </w:tblGrid>
-      <w:tr>
-        <w:tc>
-          <w:tcPr>
-            <w:tcW w:type="dxa" w:w="9638"/>
-            <w:shd w:val="clear" w:color="auto" w:fill="F0F7F2"/>
-          </w:tcPr>
-          <w:p>
-            <w:pPr>
-              <w:spacing w:before="120" w:after="40"/>
-            </w:pPr>
-            <w:r>
-              <w:rPr>
-                <w:b/>
-                <w:color w:val="1A4D2E"/>
-                <w:sz w:val="16"/>
-              </w:rPr>
-              <w:t>BANCO CENTRAL | NORMAS</w:t>
-            </w:r>
-          </w:p>
-          <w:p>
-            <w:pPr>
-              <w:spacing w:after="40"/>
-            </w:pPr>
-            <w:hyperlink r:id="rId12">
-              <w:r>
-                <w:rPr>
-                  <w:color w:val="1A1A1A"/>
-                  <w:u w:val="single"/>
-                  <w:b/>
-                </w:rPr>
-                <w:t>Instrução Normativa BCB n° 761, 9/7/2026</w:t>
-              </w:r>
-            </w:hyperlink>
-          </w:p>
-          <w:p>
-            <w:pPr>
-              <w:spacing w:after="120"/>
-            </w:pPr>
-            <w:r>
-              <w:rPr>
-                <w:color w:val="4A4A4A"/>
-                <w:sz w:val="18"/>
-              </w:rPr>
-              <w:t>Divulga orientações sobre medidas reforçadas para instituições financeiras em operações com países com deficiências nas recomendações do Gafi.</w:t>
-            </w:r>
-          </w:p>
-        </w:tc>
-      </w:tr>
-    </w:tbl>
-    <w:tbl>
-      <w:tblPr>
-        <w:tblW w:type="auto" w:w="0"/>
-        <w:tblLayout w:type="fixed"/>
-        <w:tblLook w:firstColumn="1" w:firstRow="1" w:lastColumn="0" w:lastRow="0" w:noHBand="0" w:noVBand="1" w:val="04A0"/>
-      </w:tblPr>
-      <w:tblGrid>
-        <w:gridCol w:w="9638"/>
-      </w:tblGrid>
-      <w:tr>
-        <w:tc>
-          <w:tcPr>
-            <w:tcW w:type="dxa" w:w="9638"/>
-            <w:shd w:val="clear" w:color="auto" w:fill="F0F7F2"/>
-          </w:tcPr>
-          <w:p>
-            <w:pPr>
-              <w:spacing w:before="120" w:after="40"/>
-            </w:pPr>
-            <w:r>
-              <w:rPr>
-                <w:b/>
-                <w:color w:val="1A4D2E"/>
-                <w:sz w:val="16"/>
-              </w:rPr>
-              <w:t>MME | NOTÍCIAS</w:t>
-            </w:r>
-          </w:p>
-          <w:p>
-            <w:pPr>
-              <w:spacing w:after="40"/>
-            </w:pPr>
-            <w:hyperlink r:id="rId13">
-              <w:r>
-                <w:rPr>
-                  <w:color w:val="1A1A1A"/>
-                  <w:u w:val="single"/>
-                  <w:b/>
-                </w:rPr>
-                <w:t>Resolução do CMSE estabelece novas diretrizes para despacho de geração térmica</w:t>
-              </w:r>
-            </w:hyperlink>
-          </w:p>
-          <w:p>
-            <w:pPr>
-              <w:spacing w:after="120"/>
-            </w:pPr>
-            <w:r>
-              <w:rPr>
-                <w:color w:val="4A4A4A"/>
-                <w:sz w:val="18"/>
-              </w:rPr>
-              <w:t>Resolução do Comitê de Monitoramento do Setor Elétrico (CMSE) publicada no DOU estabelece novas diretrizes para despacho de geração térmica.</w:t>
-            </w:r>
-          </w:p>
-        </w:tc>
-      </w:tr>
-    </w:tbl>
-    <w:p/>
-    <w:tbl>
-      <w:tblPr>
-        <w:tblW w:type="auto" w:w="0"/>
-        <w:tblLayout w:type="fixed"/>
-        <w:tblLook w:firstColumn="1" w:firstRow="1" w:lastColumn="0" w:lastRow="0" w:noHBand="0" w:noVBand="1" w:val="04A0"/>
-      </w:tblPr>
-      <w:tblGrid>
-        <w:gridCol w:w="9638"/>
-      </w:tblGrid>
-      <w:tr>
-        <w:tc>
-          <w:tcPr>
-            <w:tcW w:type="dxa" w:w="9638"/>
-            <w:shd w:val="clear" w:color="auto" w:fill="1A4D2E"/>
-          </w:tcPr>
-          <w:p>
-            <w:pPr>
-              <w:spacing w:before="120" w:after="40"/>
-            </w:pPr>
-            <w:r>
-              <w:rPr>
-                <w:b w:val="0"/>
-                <w:color w:val="FFFFFF"/>
-                <w:sz w:val="32"/>
-              </w:rPr>
-              <w:t>Financeiro e Mercado de Capitais</w:t>
-            </w:r>
-          </w:p>
-        </w:tc>
-      </w:tr>
-    </w:tbl>
     <w:p>
       <w:pPr>
-        <w:spacing w:before="240" w:after="80"/>
+        <w:jc w:val="center"/>
       </w:pPr>
       <w:r>
         <w:rPr>
-          <w:b/>
-          <w:color w:val="1A4D2E"/>
-          <w:sz w:val="20"/>
+          <w:color w:val="888888"/>
+          <w:sz w:val="24"/>
         </w:rPr>
-        <w:t>BANCO CENTRAL | NORMAS</w:t>
+        <w:t>Nao ha itens para este boletim na janela temporal atual.</w:t>
       </w:r>
     </w:p>
     <w:p>
       <w:pPr>
-        <w:spacing w:before="0" w:after="40"/>
-        <w:pBdr>
-          <w:bottom w:val="single" w:sz="8" w:space="1" w:color="1A4D2E"/>
-        </w:pBdr>
-      </w:pPr>
-    </w:p>
-    <w:p>
-      <w:pPr>
-        <w:spacing w:before="160" w:after="40"/>
-      </w:pPr>
-      <w:r>
-        <w:rPr>
-          <w:b/>
-          <w:color w:val="1A1A1A"/>
-          <w:sz w:val="22"/>
-        </w:rPr>
-        <w:t xml:space="preserve">Comunicado n° 45.538, 10/7/2026   </w:t>
-      </w:r>
-      <w:r>
-        <w:rPr>
-          <w:b/>
-          <w:color w:val="D68910"/>
-          <w:sz w:val="16"/>
-        </w:rPr>
-        <w:t>[MÉDIA]</w:t>
-      </w:r>
-    </w:p>
-    <w:p>
-      <w:pPr>
-        <w:spacing w:after="40"/>
-      </w:pPr>
-      <w:r>
-        <w:rPr>
-          <w:color w:val="4A4A4A"/>
-          <w:sz w:val="20"/>
-        </w:rPr>
-        <w:t>Divulga nome de pessoas com interesse em exercer o controle de Instituição de Pagamento.</w:t>
-      </w:r>
-    </w:p>
-    <w:p>
-      <w:pPr>
-        <w:spacing w:after="40"/>
-      </w:pPr>
-      <w:r>
-        <w:rPr>
-          <w:b/>
-          <w:color w:val="888888"/>
-          <w:sz w:val="18"/>
-        </w:rPr>
-        <w:t xml:space="preserve">Publicado: </w:t>
-      </w:r>
-      <w:r>
-        <w:rPr>
-          <w:color w:val="888888"/>
-          <w:sz w:val="18"/>
-        </w:rPr>
-        <w:t xml:space="preserve">2026-07-10T09:42   </w:t>
-      </w:r>
-      <w:hyperlink r:id="rId14">
-        <w:r>
-          <w:rPr>
-            <w:color w:val="1A4D2E"/>
-            <w:u w:val="single"/>
-            <w:b/>
-          </w:rPr>
-          <w:t>Acessar materia</w:t>
-        </w:r>
-      </w:hyperlink>
-    </w:p>
-    <w:p>
-      <w:pPr>
-        <w:spacing w:after="120"/>
+        <w:jc w:val="center"/>
       </w:pPr>
       <w:r>
         <w:rPr>
           <w:i/>
           <w:color w:val="888888"/>
-          <w:sz w:val="16"/>
-        </w:rPr>
-        <w:t>Divulgação de nomes de interessados em controle de Instituição de Pagamento, relevante para o mercado financeiro.</w:t>
-      </w:r>
-    </w:p>
-    <w:p>
-      <w:pPr>
-        <w:spacing w:before="160" w:after="40"/>
-      </w:pPr>
-      <w:r>
-        <w:rPr>
-          <w:b/>
-          <w:color w:val="1A1A1A"/>
-          <w:sz w:val="22"/>
-        </w:rPr>
-        <w:t xml:space="preserve">Comunicado n° 45.537, 10/7/2026   </w:t>
-      </w:r>
-      <w:r>
-        <w:rPr>
-          <w:b/>
-          <w:color w:val="D68910"/>
-          <w:sz w:val="16"/>
-        </w:rPr>
-        <w:t>[MÉDIA]</w:t>
-      </w:r>
-    </w:p>
-    <w:p>
-      <w:pPr>
-        <w:spacing w:after="40"/>
-      </w:pPr>
-      <w:r>
-        <w:rPr>
-          <w:color w:val="4A4A4A"/>
           <w:sz w:val="20"/>
         </w:rPr>
-        <w:t>Divulga nome de pessoas com interesse em exercer o controle de Instituição de Pagamento.</w:t>
-      </w:r>
-    </w:p>
-    <w:p>
-      <w:pPr>
-        <w:spacing w:after="40"/>
-      </w:pPr>
-      <w:r>
-        <w:rPr>
-          <w:b/>
-          <w:color w:val="888888"/>
-          <w:sz w:val="18"/>
-        </w:rPr>
-        <w:t xml:space="preserve">Publicado: </w:t>
-      </w:r>
-      <w:r>
-        <w:rPr>
-          <w:color w:val="888888"/>
-          <w:sz w:val="18"/>
-        </w:rPr>
-        <w:t xml:space="preserve">2026-07-10T09:39   </w:t>
-      </w:r>
-      <w:hyperlink r:id="rId15">
-        <w:r>
-          <w:rPr>
-            <w:color w:val="1A4D2E"/>
-            <w:u w:val="single"/>
-            <w:b/>
-          </w:rPr>
-          <w:t>Acessar materia</w:t>
-        </w:r>
-      </w:hyperlink>
-    </w:p>
-    <w:p>
-      <w:pPr>
-        <w:spacing w:after="120"/>
-      </w:pPr>
-      <w:r>
-        <w:rPr>
-          <w:i/>
-          <w:color w:val="888888"/>
-          <w:sz w:val="16"/>
-        </w:rPr>
-        <w:t>Divulgação de nomes de interessados em controle de Instituição de Pagamento, relevante para o mercado financeiro.</w:t>
-      </w:r>
-    </w:p>
-    <w:p>
-      <w:pPr>
-        <w:spacing w:before="160" w:after="40"/>
-      </w:pPr>
-      <w:r>
-        <w:rPr>
-          <w:b/>
-          <w:color w:val="1A1A1A"/>
-          <w:sz w:val="22"/>
-        </w:rPr>
-        <w:t xml:space="preserve">Comunicado n° 45.536, 10/7/2026   </w:t>
-      </w:r>
-      <w:r>
-        <w:rPr>
-          <w:b/>
-          <w:color w:val="D68910"/>
-          <w:sz w:val="16"/>
-        </w:rPr>
-        <w:t>[MÉDIA]</w:t>
-      </w:r>
-    </w:p>
-    <w:p>
-      <w:pPr>
-        <w:spacing w:after="40"/>
-      </w:pPr>
-      <w:r>
-        <w:rPr>
-          <w:color w:val="4A4A4A"/>
-          <w:sz w:val="20"/>
-        </w:rPr>
-        <w:t>Divulga nomes de pessoas eleitas ou nomeadas para cargos de administração em instituições autorizadas a funcionar, para fins de objeções.</w:t>
-      </w:r>
-    </w:p>
-    <w:p>
-      <w:pPr>
-        <w:spacing w:after="40"/>
-      </w:pPr>
-      <w:r>
-        <w:rPr>
-          <w:b/>
-          <w:color w:val="888888"/>
-          <w:sz w:val="18"/>
-        </w:rPr>
-        <w:t xml:space="preserve">Publicado: </w:t>
-      </w:r>
-      <w:r>
-        <w:rPr>
-          <w:color w:val="888888"/>
-          <w:sz w:val="18"/>
-        </w:rPr>
-        <w:t xml:space="preserve">2026-07-10T09:34   </w:t>
-      </w:r>
-      <w:hyperlink r:id="rId16">
-        <w:r>
-          <w:rPr>
-            <w:color w:val="1A4D2E"/>
-            <w:u w:val="single"/>
-            <w:b/>
-          </w:rPr>
-          <w:t>Acessar materia</w:t>
-        </w:r>
-      </w:hyperlink>
-    </w:p>
-    <w:p>
-      <w:pPr>
-        <w:spacing w:after="120"/>
-      </w:pPr>
-      <w:r>
-        <w:rPr>
-          <w:i/>
-          <w:color w:val="888888"/>
-          <w:sz w:val="16"/>
-        </w:rPr>
-        <w:t>Divulgação de nomes para cargos de administração em instituições financeiras, relevante para o setor regulado.</w:t>
-      </w:r>
-    </w:p>
-    <w:p>
-      <w:pPr>
-        <w:spacing w:before="160" w:after="40"/>
-      </w:pPr>
-      <w:r>
-        <w:rPr>
-          <w:b/>
-          <w:color w:val="1A1A1A"/>
-          <w:sz w:val="22"/>
-        </w:rPr>
-        <w:t xml:space="preserve">Comunicado n° 45.535, 10/7/2026   </w:t>
-      </w:r>
-      <w:r>
-        <w:rPr>
-          <w:b/>
-          <w:color w:val="C0392B"/>
-          <w:sz w:val="16"/>
-        </w:rPr>
-        <w:t>[ALTA]</w:t>
-      </w:r>
-    </w:p>
-    <w:p>
-      <w:pPr>
-        <w:spacing w:after="40"/>
-      </w:pPr>
-      <w:r>
-        <w:rPr>
-          <w:color w:val="4A4A4A"/>
-          <w:sz w:val="20"/>
-        </w:rPr>
-        <w:t>Divulga a Taxa Básica Financeira (TBF), o Redutor "R" e a Taxa Referencial (TR) relativos a 9 de julho de 2026.</w:t>
-      </w:r>
-    </w:p>
-    <w:p>
-      <w:pPr>
-        <w:spacing w:after="40"/>
-      </w:pPr>
-      <w:r>
-        <w:rPr>
-          <w:b/>
-          <w:color w:val="888888"/>
-          <w:sz w:val="18"/>
-        </w:rPr>
-        <w:t xml:space="preserve">Publicado: </w:t>
-      </w:r>
-      <w:r>
-        <w:rPr>
-          <w:color w:val="888888"/>
-          <w:sz w:val="18"/>
-        </w:rPr>
-        <w:t xml:space="preserve">2026-07-10T09:06   </w:t>
-      </w:r>
-      <w:hyperlink r:id="rId9">
-        <w:r>
-          <w:rPr>
-            <w:color w:val="1A4D2E"/>
-            <w:u w:val="single"/>
-            <w:b/>
-          </w:rPr>
-          <w:t>Acessar materia</w:t>
-        </w:r>
-      </w:hyperlink>
-    </w:p>
-    <w:p>
-      <w:pPr>
-        <w:spacing w:after="120"/>
-      </w:pPr>
-      <w:r>
-        <w:rPr>
-          <w:i/>
-          <w:color w:val="888888"/>
-          <w:sz w:val="16"/>
-        </w:rPr>
-        <w:t>Divulgação de taxas de referência importantes para o mercado financeiro.</w:t>
-      </w:r>
-    </w:p>
-    <w:p>
-      <w:pPr>
-        <w:spacing w:before="160" w:after="40"/>
-      </w:pPr>
-      <w:r>
-        <w:rPr>
-          <w:b/>
-          <w:color w:val="1A1A1A"/>
-          <w:sz w:val="22"/>
-        </w:rPr>
-        <w:t xml:space="preserve">Comunicado n° 45.534, 9/7/2026   </w:t>
-      </w:r>
-      <w:r>
-        <w:rPr>
-          <w:b/>
-          <w:color w:val="C0392B"/>
-          <w:sz w:val="16"/>
-        </w:rPr>
-        <w:t>[ALTA]</w:t>
-      </w:r>
-    </w:p>
-    <w:p>
-      <w:pPr>
-        <w:spacing w:after="40"/>
-      </w:pPr>
-      <w:r>
-        <w:rPr>
-          <w:color w:val="4A4A4A"/>
-          <w:sz w:val="20"/>
-        </w:rPr>
-        <w:t>Divulga condições para a realização de operações compromissadas com instituições financeiras participantes do módulo Oferta Pública (Ofpub).</w:t>
-      </w:r>
-    </w:p>
-    <w:p>
-      <w:pPr>
-        <w:spacing w:after="40"/>
-      </w:pPr>
-      <w:r>
-        <w:rPr>
-          <w:b/>
-          <w:color w:val="888888"/>
-          <w:sz w:val="18"/>
-        </w:rPr>
-        <w:t xml:space="preserve">Publicado: </w:t>
-      </w:r>
-      <w:r>
-        <w:rPr>
-          <w:color w:val="888888"/>
-          <w:sz w:val="18"/>
-        </w:rPr>
-        <w:t xml:space="preserve">2026-07-09T18:31   </w:t>
-      </w:r>
-      <w:hyperlink r:id="rId10">
-        <w:r>
-          <w:rPr>
-            <w:color w:val="1A4D2E"/>
-            <w:u w:val="single"/>
-            <w:b/>
-          </w:rPr>
-          <w:t>Acessar materia</w:t>
-        </w:r>
-      </w:hyperlink>
-    </w:p>
-    <w:p>
-      <w:pPr>
-        <w:spacing w:after="120"/>
-      </w:pPr>
-      <w:r>
-        <w:rPr>
-          <w:i/>
-          <w:color w:val="888888"/>
-          <w:sz w:val="16"/>
-        </w:rPr>
-        <w:t>Estabelece condições para operações financeiras, com impacto direto em instituições do mercado.</w:t>
-      </w:r>
-    </w:p>
-    <w:p>
-      <w:pPr>
-        <w:spacing w:before="160" w:after="40"/>
-      </w:pPr>
-      <w:r>
-        <w:rPr>
-          <w:b/>
-          <w:color w:val="1A1A1A"/>
-          <w:sz w:val="22"/>
-        </w:rPr>
-        <w:t xml:space="preserve">Comunicado n° 45.533, 9/7/2026   </w:t>
-      </w:r>
-      <w:r>
-        <w:rPr>
-          <w:b/>
-          <w:color w:val="C0392B"/>
-          <w:sz w:val="16"/>
-        </w:rPr>
-        <w:t>[ALTA]</w:t>
-      </w:r>
-    </w:p>
-    <w:p>
-      <w:pPr>
-        <w:spacing w:after="40"/>
-      </w:pPr>
-      <w:r>
-        <w:rPr>
-          <w:color w:val="4A4A4A"/>
-          <w:sz w:val="20"/>
-        </w:rPr>
-        <w:t>Divulga as condições de oferta pública para a realização de operações de swap para fins de rolagem do vencimento de 03/08/2026.</w:t>
-      </w:r>
-    </w:p>
-    <w:p>
-      <w:pPr>
-        <w:spacing w:after="40"/>
-      </w:pPr>
-      <w:r>
-        <w:rPr>
-          <w:b/>
-          <w:color w:val="888888"/>
-          <w:sz w:val="18"/>
-        </w:rPr>
-        <w:t xml:space="preserve">Publicado: </w:t>
-      </w:r>
-      <w:r>
-        <w:rPr>
-          <w:color w:val="888888"/>
-          <w:sz w:val="18"/>
-        </w:rPr>
-        <w:t xml:space="preserve">2026-07-09T18:30   </w:t>
-      </w:r>
-      <w:hyperlink r:id="rId11">
-        <w:r>
-          <w:rPr>
-            <w:color w:val="1A4D2E"/>
-            <w:u w:val="single"/>
-            <w:b/>
-          </w:rPr>
-          <w:t>Acessar materia</w:t>
-        </w:r>
-      </w:hyperlink>
-    </w:p>
-    <w:p>
-      <w:pPr>
-        <w:spacing w:after="120"/>
-      </w:pPr>
-      <w:r>
-        <w:rPr>
-          <w:i/>
-          <w:color w:val="888888"/>
-          <w:sz w:val="16"/>
-        </w:rPr>
-        <w:t>Define condições para operações de swap, impactando o mercado de câmbio e derivativos.</w:t>
-      </w:r>
-    </w:p>
-    <w:p>
-      <w:pPr>
-        <w:spacing w:before="160" w:after="40"/>
-      </w:pPr>
-      <w:r>
-        <w:rPr>
-          <w:b/>
-          <w:color w:val="1A1A1A"/>
-          <w:sz w:val="22"/>
-        </w:rPr>
-        <w:t xml:space="preserve">Instrução Normativa BCB n° 761, 9/7/2026   </w:t>
-      </w:r>
-      <w:r>
-        <w:rPr>
-          <w:b/>
-          <w:color w:val="C0392B"/>
-          <w:sz w:val="16"/>
-        </w:rPr>
-        <w:t>[ALTA]</w:t>
-      </w:r>
-    </w:p>
-    <w:p>
-      <w:pPr>
-        <w:spacing w:after="40"/>
-      </w:pPr>
-      <w:r>
-        <w:rPr>
-          <w:color w:val="4A4A4A"/>
-          <w:sz w:val="20"/>
-        </w:rPr>
-        <w:t>Divulga orientações sobre medidas reforçadas para instituições financeiras em operações com países com deficiências nas recomendações do Gafi.</w:t>
-      </w:r>
-    </w:p>
-    <w:p>
-      <w:pPr>
-        <w:spacing w:after="40"/>
-      </w:pPr>
-      <w:r>
-        <w:rPr>
-          <w:b/>
-          <w:color w:val="888888"/>
-          <w:sz w:val="18"/>
-        </w:rPr>
-        <w:t xml:space="preserve">Publicado: </w:t>
-      </w:r>
-      <w:r>
-        <w:rPr>
-          <w:color w:val="888888"/>
-          <w:sz w:val="18"/>
-        </w:rPr>
-        <w:t xml:space="preserve">2026-07-09T16:33   </w:t>
-      </w:r>
-      <w:hyperlink r:id="rId12">
-        <w:r>
-          <w:rPr>
-            <w:color w:val="1A4D2E"/>
-            <w:u w:val="single"/>
-            <w:b/>
-          </w:rPr>
-          <w:t>Acessar materia</w:t>
-        </w:r>
-      </w:hyperlink>
-    </w:p>
-    <w:p>
-      <w:pPr>
-        <w:spacing w:after="120"/>
-      </w:pPr>
-      <w:r>
-        <w:rPr>
-          <w:i/>
-          <w:color w:val="888888"/>
-          <w:sz w:val="16"/>
-        </w:rPr>
-        <w:t>Instrução normativa com impacto regulatório direto sobre compliance e prevenção à lavagem de dinheiro para instituições financeiras.</w:t>
-      </w:r>
-    </w:p>
-    <w:p>
-      <w:pPr>
-        <w:spacing w:before="160" w:after="40"/>
-      </w:pPr>
-      <w:r>
-        <w:rPr>
-          <w:b/>
-          <w:color w:val="1A1A1A"/>
-          <w:sz w:val="22"/>
-        </w:rPr>
-        <w:t xml:space="preserve">Instrução Normativa BCB n° 760, 9/7/2026   </w:t>
-      </w:r>
-      <w:r>
-        <w:rPr>
-          <w:b/>
-          <w:color w:val="D68910"/>
-          <w:sz w:val="16"/>
-        </w:rPr>
-        <w:t>[MÉDIA]</w:t>
-      </w:r>
-    </w:p>
-    <w:p>
-      <w:pPr>
-        <w:spacing w:after="40"/>
-      </w:pPr>
-      <w:r>
-        <w:rPr>
-          <w:color w:val="4A4A4A"/>
-          <w:sz w:val="20"/>
-        </w:rPr>
-        <w:t>Divulga a versão 9.0 do Manual de Experiência do Cliente no Open Finance.</w:t>
-      </w:r>
-    </w:p>
-    <w:p>
-      <w:pPr>
-        <w:spacing w:after="40"/>
-      </w:pPr>
-      <w:r>
-        <w:rPr>
-          <w:b/>
-          <w:color w:val="888888"/>
-          <w:sz w:val="18"/>
-        </w:rPr>
-        <w:t xml:space="preserve">Publicado: </w:t>
-      </w:r>
-      <w:r>
-        <w:rPr>
-          <w:color w:val="888888"/>
-          <w:sz w:val="18"/>
-        </w:rPr>
-        <w:t xml:space="preserve">2026-07-09T13:46   </w:t>
-      </w:r>
-      <w:hyperlink r:id="rId17">
-        <w:r>
-          <w:rPr>
-            <w:color w:val="1A4D2E"/>
-            <w:u w:val="single"/>
-            <w:b/>
-          </w:rPr>
-          <w:t>Acessar materia</w:t>
-        </w:r>
-      </w:hyperlink>
-    </w:p>
-    <w:p>
-      <w:pPr>
-        <w:spacing w:after="120"/>
-      </w:pPr>
-      <w:r>
-        <w:rPr>
-          <w:i/>
-          <w:color w:val="888888"/>
-          <w:sz w:val="16"/>
-        </w:rPr>
-        <w:t>Atualização de manual técnico do Open Finance, com impacto operacional para as instituições.</w:t>
-      </w:r>
-    </w:p>
-    <w:p>
-      <w:pPr>
-        <w:spacing w:before="160" w:after="40"/>
-      </w:pPr>
-      <w:r>
-        <w:rPr>
-          <w:b/>
-          <w:color w:val="1A1A1A"/>
-          <w:sz w:val="22"/>
-        </w:rPr>
-        <w:t xml:space="preserve">Instrução Normativa BCB n° 759, 9/7/2026   </w:t>
-      </w:r>
-      <w:r>
-        <w:rPr>
-          <w:b/>
-          <w:color w:val="D68910"/>
-          <w:sz w:val="16"/>
-        </w:rPr>
-        <w:t>[MÉDIA]</w:t>
-      </w:r>
-    </w:p>
-    <w:p>
-      <w:pPr>
-        <w:spacing w:after="40"/>
-      </w:pPr>
-      <w:r>
-        <w:rPr>
-          <w:color w:val="4A4A4A"/>
-          <w:sz w:val="20"/>
-        </w:rPr>
-        <w:t>Divulga a versão 8.0 do Manual de Escopo de Dados e Serviços do Open Finance.</w:t>
-      </w:r>
-    </w:p>
-    <w:p>
-      <w:pPr>
-        <w:spacing w:after="40"/>
-      </w:pPr>
-      <w:r>
-        <w:rPr>
-          <w:b/>
-          <w:color w:val="888888"/>
-          <w:sz w:val="18"/>
-        </w:rPr>
-        <w:t xml:space="preserve">Publicado: </w:t>
-      </w:r>
-      <w:r>
-        <w:rPr>
-          <w:color w:val="888888"/>
-          <w:sz w:val="18"/>
-        </w:rPr>
-        <w:t xml:space="preserve">2026-07-09T13:26   </w:t>
-      </w:r>
-      <w:hyperlink r:id="rId18">
-        <w:r>
-          <w:rPr>
-            <w:color w:val="1A4D2E"/>
-            <w:u w:val="single"/>
-            <w:b/>
-          </w:rPr>
-          <w:t>Acessar materia</w:t>
-        </w:r>
-      </w:hyperlink>
-    </w:p>
-    <w:p>
-      <w:pPr>
-        <w:spacing w:after="120"/>
-      </w:pPr>
-      <w:r>
-        <w:rPr>
-          <w:i/>
-          <w:color w:val="888888"/>
-          <w:sz w:val="16"/>
-        </w:rPr>
-        <w:t>Atualização de manual técnico do Open Finance, com impacto operacional para as instituições.</w:t>
-      </w:r>
-    </w:p>
-    <w:p>
-      <w:pPr>
-        <w:spacing w:before="160" w:after="40"/>
-      </w:pPr>
-      <w:r>
-        <w:rPr>
-          <w:b/>
-          <w:color w:val="1A1A1A"/>
-          <w:sz w:val="22"/>
-        </w:rPr>
-        <w:t xml:space="preserve">Comunicado n° 45.532, 9/7/2026   </w:t>
-      </w:r>
-      <w:r>
-        <w:rPr>
-          <w:b/>
-          <w:color w:val="D68910"/>
-          <w:sz w:val="16"/>
-        </w:rPr>
-        <w:t>[MÉDIA]</w:t>
-      </w:r>
-    </w:p>
-    <w:p>
-      <w:pPr>
-        <w:spacing w:after="40"/>
-      </w:pPr>
-      <w:r>
-        <w:rPr>
-          <w:color w:val="4A4A4A"/>
-          <w:sz w:val="20"/>
-        </w:rPr>
-        <w:t>Divulga o resultado de leilões de swap.</w:t>
-      </w:r>
-    </w:p>
-    <w:p>
-      <w:pPr>
-        <w:spacing w:after="40"/>
-      </w:pPr>
-      <w:r>
-        <w:rPr>
-          <w:b/>
-          <w:color w:val="888888"/>
-          <w:sz w:val="18"/>
-        </w:rPr>
-        <w:t xml:space="preserve">Publicado: </w:t>
-      </w:r>
-      <w:r>
-        <w:rPr>
-          <w:color w:val="888888"/>
-          <w:sz w:val="18"/>
-        </w:rPr>
-        <w:t xml:space="preserve">2026-07-09T11:44   </w:t>
-      </w:r>
-      <w:hyperlink r:id="rId19">
-        <w:r>
-          <w:rPr>
-            <w:color w:val="1A4D2E"/>
-            <w:u w:val="single"/>
-            <w:b/>
-          </w:rPr>
-          <w:t>Acessar materia</w:t>
-        </w:r>
-      </w:hyperlink>
-    </w:p>
-    <w:p>
-      <w:pPr>
-        <w:spacing w:after="120"/>
-      </w:pPr>
-      <w:r>
-        <w:rPr>
-          <w:i/>
-          <w:color w:val="888888"/>
-          <w:sz w:val="16"/>
-        </w:rPr>
-        <w:t>Informação sobre o resultado de leilões de swap, relevante para o mercado financeiro.</w:t>
-      </w:r>
-    </w:p>
-    <w:p>
-      <w:pPr>
-        <w:spacing w:before="160" w:after="40"/>
-      </w:pPr>
-      <w:r>
-        <w:rPr>
-          <w:b/>
-          <w:color w:val="1A1A1A"/>
-          <w:sz w:val="22"/>
-        </w:rPr>
-        <w:t xml:space="preserve">Comunicado n° 45.531, 9/7/2026   </w:t>
-      </w:r>
-      <w:r>
-        <w:rPr>
-          <w:b/>
-          <w:color w:val="D68910"/>
-          <w:sz w:val="16"/>
-        </w:rPr>
-        <w:t>[MÉDIA]</w:t>
-      </w:r>
-    </w:p>
-    <w:p>
-      <w:pPr>
-        <w:spacing w:after="40"/>
-      </w:pPr>
-      <w:r>
-        <w:rPr>
-          <w:color w:val="4A4A4A"/>
-          <w:sz w:val="20"/>
-        </w:rPr>
-        <w:t>Divulga a realização de leilão de Swap Cambial Tradicional para fins de rolagem.</w:t>
-      </w:r>
-    </w:p>
-    <w:p>
-      <w:pPr>
-        <w:spacing w:after="40"/>
-      </w:pPr>
-      <w:r>
-        <w:rPr>
-          <w:b/>
-          <w:color w:val="888888"/>
-          <w:sz w:val="18"/>
-        </w:rPr>
-        <w:t xml:space="preserve">Publicado: </w:t>
-      </w:r>
-      <w:r>
-        <w:rPr>
-          <w:color w:val="888888"/>
-          <w:sz w:val="18"/>
-        </w:rPr>
-        <w:t xml:space="preserve">2026-07-09T11:30   </w:t>
-      </w:r>
-      <w:hyperlink r:id="rId20">
-        <w:r>
-          <w:rPr>
-            <w:color w:val="1A4D2E"/>
-            <w:u w:val="single"/>
-            <w:b/>
-          </w:rPr>
-          <w:t>Acessar materia</w:t>
-        </w:r>
-      </w:hyperlink>
-    </w:p>
-    <w:p>
-      <w:pPr>
-        <w:spacing w:after="120"/>
-      </w:pPr>
-      <w:r>
-        <w:rPr>
-          <w:i/>
-          <w:color w:val="888888"/>
-          <w:sz w:val="16"/>
-        </w:rPr>
-        <w:t>Anúncio de leilão de swap cambial, relevante para o mercado financeiro.</w:t>
-      </w:r>
-    </w:p>
-    <w:p>
-      <w:pPr>
-        <w:spacing w:before="160" w:after="40"/>
-      </w:pPr>
-      <w:r>
-        <w:rPr>
-          <w:b/>
-          <w:color w:val="1A1A1A"/>
-          <w:sz w:val="22"/>
-        </w:rPr>
-        <w:t xml:space="preserve">Comunicado n° 45.530, 9/7/2026   </w:t>
-      </w:r>
-      <w:r>
-        <w:rPr>
-          <w:b/>
-          <w:color w:val="D68910"/>
-          <w:sz w:val="16"/>
-        </w:rPr>
-        <w:t>[MÉDIA]</w:t>
-      </w:r>
-    </w:p>
-    <w:p>
-      <w:pPr>
-        <w:spacing w:after="40"/>
-      </w:pPr>
-      <w:r>
-        <w:rPr>
-          <w:color w:val="4A4A4A"/>
-          <w:sz w:val="20"/>
-        </w:rPr>
-        <w:t>Divulga a realização de leilão de Swap Cambial Tradicional para fins de rolagem.</w:t>
-      </w:r>
-    </w:p>
-    <w:p>
-      <w:pPr>
-        <w:spacing w:after="40"/>
-      </w:pPr>
-      <w:r>
-        <w:rPr>
-          <w:b/>
-          <w:color w:val="888888"/>
-          <w:sz w:val="18"/>
-        </w:rPr>
-        <w:t xml:space="preserve">Publicado: </w:t>
-      </w:r>
-      <w:r>
-        <w:rPr>
-          <w:color w:val="888888"/>
-          <w:sz w:val="18"/>
-        </w:rPr>
-        <w:t xml:space="preserve">2026-07-09T11:30   </w:t>
-      </w:r>
-      <w:hyperlink r:id="rId21">
-        <w:r>
-          <w:rPr>
-            <w:color w:val="1A4D2E"/>
-            <w:u w:val="single"/>
-            <w:b/>
-          </w:rPr>
-          <w:t>Acessar materia</w:t>
-        </w:r>
-      </w:hyperlink>
-    </w:p>
-    <w:p>
-      <w:pPr>
-        <w:spacing w:after="120"/>
-      </w:pPr>
-      <w:r>
-        <w:rPr>
-          <w:i/>
-          <w:color w:val="888888"/>
-          <w:sz w:val="16"/>
-        </w:rPr>
-        <w:t>Anúncio de leilão de swap cambial, relevante para o mercado financeiro.</w:t>
-      </w:r>
-    </w:p>
-    <w:p>
-      <w:pPr>
-        <w:spacing w:before="160" w:after="40"/>
-      </w:pPr>
-      <w:r>
-        <w:rPr>
-          <w:b/>
-          <w:color w:val="1A1A1A"/>
-          <w:sz w:val="22"/>
-        </w:rPr>
-        <w:t xml:space="preserve">Comunicado n° 45.529, 9/7/2026   </w:t>
-      </w:r>
-      <w:r>
-        <w:rPr>
-          <w:b/>
-          <w:color w:val="D68910"/>
-          <w:sz w:val="16"/>
-        </w:rPr>
-        <w:t>[MÉDIA]</w:t>
-      </w:r>
-    </w:p>
-    <w:p>
-      <w:pPr>
-        <w:spacing w:after="40"/>
-      </w:pPr>
-      <w:r>
-        <w:rPr>
-          <w:color w:val="4A4A4A"/>
-          <w:sz w:val="20"/>
-        </w:rPr>
-        <w:t>Divulga nome de pessoa com interesse em participar do controle de Instituição de Pagamento.</w:t>
-      </w:r>
-    </w:p>
-    <w:p>
-      <w:pPr>
-        <w:spacing w:after="40"/>
-      </w:pPr>
-      <w:r>
-        <w:rPr>
-          <w:b/>
-          <w:color w:val="888888"/>
-          <w:sz w:val="18"/>
-        </w:rPr>
-        <w:t xml:space="preserve">Publicado: </w:t>
-      </w:r>
-      <w:r>
-        <w:rPr>
-          <w:color w:val="888888"/>
-          <w:sz w:val="18"/>
-        </w:rPr>
-        <w:t xml:space="preserve">2026-07-09T10:21   </w:t>
-      </w:r>
-      <w:hyperlink r:id="rId22">
-        <w:r>
-          <w:rPr>
-            <w:color w:val="1A4D2E"/>
-            <w:u w:val="single"/>
-            <w:b/>
-          </w:rPr>
-          <w:t>Acessar materia</w:t>
-        </w:r>
-      </w:hyperlink>
-    </w:p>
-    <w:p>
-      <w:pPr>
-        <w:spacing w:after="120"/>
-      </w:pPr>
-      <w:r>
-        <w:rPr>
-          <w:i/>
-          <w:color w:val="888888"/>
-          <w:sz w:val="16"/>
-        </w:rPr>
-        <w:t>Divulgação de nome de interessado em controle de Instituição de Pagamento, relevante para o mercado financeiro.</w:t>
-      </w:r>
-    </w:p>
-    <w:p>
-      <w:pPr>
-        <w:spacing w:before="160" w:after="40"/>
-      </w:pPr>
-      <w:r>
-        <w:rPr>
-          <w:b/>
-          <w:color w:val="1A1A1A"/>
-          <w:sz w:val="22"/>
-        </w:rPr>
-        <w:t xml:space="preserve">Comunicado n° 45.528, 9/7/2026   </w:t>
-      </w:r>
-      <w:r>
-        <w:rPr>
-          <w:b/>
-          <w:color w:val="D68910"/>
-          <w:sz w:val="16"/>
-        </w:rPr>
-        <w:t>[MÉDIA]</w:t>
-      </w:r>
-    </w:p>
-    <w:p>
-      <w:pPr>
-        <w:spacing w:after="40"/>
-      </w:pPr>
-      <w:r>
-        <w:rPr>
-          <w:color w:val="4A4A4A"/>
-          <w:sz w:val="20"/>
-        </w:rPr>
-        <w:t>Divulga, para fins de recebimento de eventuais objeções, nomes de pessoas eleitas ou nomeadas para ocupar cargos de administração em instituições autorizadas a funcionar.</w:t>
-      </w:r>
-    </w:p>
-    <w:p>
-      <w:pPr>
-        <w:spacing w:after="40"/>
-      </w:pPr>
-      <w:r>
-        <w:rPr>
-          <w:b/>
-          <w:color w:val="888888"/>
-          <w:sz w:val="18"/>
-        </w:rPr>
-        <w:t xml:space="preserve">Publicado: </w:t>
-      </w:r>
-      <w:r>
-        <w:rPr>
-          <w:color w:val="888888"/>
-          <w:sz w:val="18"/>
-        </w:rPr>
-        <w:t xml:space="preserve">2026-07-09T09:36   </w:t>
-      </w:r>
-      <w:hyperlink r:id="rId23">
-        <w:r>
-          <w:rPr>
-            <w:color w:val="1A4D2E"/>
-            <w:u w:val="single"/>
-            <w:b/>
-          </w:rPr>
-          <w:t>Acessar materia</w:t>
-        </w:r>
-      </w:hyperlink>
-    </w:p>
-    <w:p>
-      <w:pPr>
-        <w:spacing w:after="120"/>
-      </w:pPr>
-      <w:r>
-        <w:rPr>
-          <w:i/>
-          <w:color w:val="888888"/>
-          <w:sz w:val="16"/>
-        </w:rPr>
-        <w:t>Divulgação de nomes para cargos de administração em instituições financeiras, relevante para o setor regulado.</w:t>
-      </w:r>
-    </w:p>
-    <w:p/>
-    <w:tbl>
-      <w:tblPr>
-        <w:tblW w:type="auto" w:w="0"/>
-        <w:tblLayout w:type="fixed"/>
-        <w:tblLook w:firstColumn="1" w:firstRow="1" w:lastColumn="0" w:lastRow="0" w:noHBand="0" w:noVBand="1" w:val="04A0"/>
-      </w:tblPr>
-      <w:tblGrid>
-        <w:gridCol w:w="9638"/>
-      </w:tblGrid>
-      <w:tr>
-        <w:tc>
-          <w:tcPr>
-            <w:tcW w:type="dxa" w:w="9638"/>
-            <w:shd w:val="clear" w:color="auto" w:fill="1A4D2E"/>
-          </w:tcPr>
-          <w:p>
-            <w:pPr>
-              <w:spacing w:before="120" w:after="40"/>
-            </w:pPr>
-            <w:r>
-              <w:rPr>
-                <w:b w:val="0"/>
-                <w:color w:val="FFFFFF"/>
-                <w:sz w:val="32"/>
-              </w:rPr>
-              <w:t>Energia e Recursos</w:t>
-            </w:r>
-          </w:p>
-        </w:tc>
-      </w:tr>
-    </w:tbl>
-    <w:p>
-      <w:pPr>
-        <w:spacing w:before="240" w:after="80"/>
-      </w:pPr>
-      <w:r>
-        <w:rPr>
-          <w:b/>
-          <w:color w:val="1A4D2E"/>
-          <w:sz w:val="20"/>
-        </w:rPr>
-        <w:t>ANP | NOTÍCIAS</w:t>
-      </w:r>
-    </w:p>
-    <w:p>
-      <w:pPr>
-        <w:spacing w:before="0" w:after="40"/>
-        <w:pBdr>
-          <w:bottom w:val="single" w:sz="8" w:space="1" w:color="1A4D2E"/>
-        </w:pBdr>
-      </w:pPr>
-    </w:p>
-    <w:p>
-      <w:pPr>
-        <w:spacing w:before="160" w:after="40"/>
-      </w:pPr>
-      <w:r>
-        <w:rPr>
-          <w:b/>
-          <w:color w:val="1A1A1A"/>
-          <w:sz w:val="22"/>
-        </w:rPr>
-        <w:t xml:space="preserve">Inscrições para Jornada Empreendedora PRH-ANP 2026 podem ser feitas até 17 de julho   </w:t>
-      </w:r>
-      <w:r>
-        <w:rPr>
-          <w:b/>
-          <w:color w:val="7F8C8D"/>
-          <w:sz w:val="16"/>
-        </w:rPr>
-        <w:t>[BAIXA]</w:t>
-      </w:r>
-    </w:p>
-    <w:p>
-      <w:pPr>
-        <w:spacing w:after="40"/>
-      </w:pPr>
-      <w:r>
-        <w:rPr>
-          <w:color w:val="4A4A4A"/>
-          <w:sz w:val="20"/>
-        </w:rPr>
-        <w:t>Inscrições abertas para a Jornada Empreendedora do PRH-ANP 2026, com prazo até 17 de julho.</w:t>
-      </w:r>
-    </w:p>
-    <w:p>
-      <w:pPr>
-        <w:spacing w:after="40"/>
-      </w:pPr>
-      <w:r>
-        <w:rPr>
-          <w:b/>
-          <w:color w:val="888888"/>
-          <w:sz w:val="18"/>
-        </w:rPr>
-        <w:t xml:space="preserve">Publicado: </w:t>
-      </w:r>
-      <w:r>
-        <w:rPr>
-          <w:color w:val="888888"/>
-          <w:sz w:val="18"/>
-        </w:rPr>
-        <w:t xml:space="preserve">2026-07-09   </w:t>
-      </w:r>
-      <w:hyperlink r:id="rId24">
-        <w:r>
-          <w:rPr>
-            <w:color w:val="1A4D2E"/>
-            <w:u w:val="single"/>
-            <w:b/>
-          </w:rPr>
-          <w:t>Acessar materia</w:t>
-        </w:r>
-      </w:hyperlink>
-    </w:p>
-    <w:p>
-      <w:pPr>
-        <w:spacing w:after="120"/>
-      </w:pPr>
-      <w:r>
-        <w:rPr>
-          <w:i/>
-          <w:color w:val="888888"/>
-          <w:sz w:val="16"/>
-        </w:rPr>
-        <w:t>Notícia sobre evento de capacitação, de interesse geral mas com baixo impacto regulatório direto.</w:t>
-      </w:r>
-    </w:p>
-    <w:p>
-      <w:pPr>
-        <w:spacing w:before="160" w:after="40"/>
-      </w:pPr>
-      <w:r>
-        <w:rPr>
-          <w:b/>
-          <w:color w:val="1A1A1A"/>
-          <w:sz w:val="22"/>
-        </w:rPr>
-        <w:t xml:space="preserve">ANP estará presente na Rio Innovation Week   </w:t>
-      </w:r>
-      <w:r>
-        <w:rPr>
-          <w:b/>
-          <w:color w:val="7F8C8D"/>
-          <w:sz w:val="16"/>
-        </w:rPr>
-        <w:t>[BAIXA]</w:t>
-      </w:r>
-    </w:p>
-    <w:p>
-      <w:pPr>
-        <w:spacing w:after="40"/>
-      </w:pPr>
-      <w:r>
-        <w:rPr>
-          <w:color w:val="4A4A4A"/>
-          <w:sz w:val="20"/>
-        </w:rPr>
-        <w:t>A Agência Nacional do Petróleo, Gás Natural e Biocombustíveis (ANP) participará da Rio Innovation Week, realizando dois seminários.</w:t>
-      </w:r>
-    </w:p>
-    <w:p>
-      <w:pPr>
-        <w:spacing w:after="40"/>
-      </w:pPr>
-      <w:r>
-        <w:rPr>
-          <w:b/>
-          <w:color w:val="888888"/>
-          <w:sz w:val="18"/>
-        </w:rPr>
-        <w:t xml:space="preserve">Publicado: </w:t>
-      </w:r>
-      <w:r>
-        <w:rPr>
-          <w:color w:val="888888"/>
-          <w:sz w:val="18"/>
-        </w:rPr>
-        <w:t xml:space="preserve">2026-07-09   </w:t>
-      </w:r>
-      <w:hyperlink r:id="rId25">
-        <w:r>
-          <w:rPr>
-            <w:color w:val="1A4D2E"/>
-            <w:u w:val="single"/>
-            <w:b/>
-          </w:rPr>
-          <w:t>Acessar materia</w:t>
-        </w:r>
-      </w:hyperlink>
-    </w:p>
-    <w:p>
-      <w:pPr>
-        <w:spacing w:after="120"/>
-      </w:pPr>
-      <w:r>
-        <w:rPr>
-          <w:i/>
-          <w:color w:val="888888"/>
-          <w:sz w:val="16"/>
-        </w:rPr>
-        <w:t>Notícia sobre participação em evento, de caráter institucional.</w:t>
-      </w:r>
-    </w:p>
-    <w:p>
-      <w:pPr>
-        <w:spacing w:before="160" w:after="40"/>
-      </w:pPr>
-      <w:r>
-        <w:rPr>
-          <w:b/>
-          <w:color w:val="1A1A1A"/>
-          <w:sz w:val="22"/>
-        </w:rPr>
-        <w:t xml:space="preserve">ANP publica cartilha com orientações para postos de combustíveis   </w:t>
-      </w:r>
-      <w:r>
-        <w:rPr>
-          <w:b/>
-          <w:color w:val="D68910"/>
-          <w:sz w:val="16"/>
-        </w:rPr>
-        <w:t>[MÉDIA]</w:t>
-      </w:r>
-    </w:p>
-    <w:p>
-      <w:pPr>
-        <w:spacing w:after="40"/>
-      </w:pPr>
-      <w:r>
-        <w:rPr>
-          <w:color w:val="4A4A4A"/>
-          <w:sz w:val="20"/>
-        </w:rPr>
-        <w:t>A ANP atualizou e publicou uma cartilha com orientações para postos de combustíveis, detalhando procedimentos da legislação vigente.</w:t>
-      </w:r>
-    </w:p>
-    <w:p>
-      <w:pPr>
-        <w:spacing w:after="40"/>
-      </w:pPr>
-      <w:r>
-        <w:rPr>
-          <w:b/>
-          <w:color w:val="888888"/>
-          <w:sz w:val="18"/>
-        </w:rPr>
-        <w:t xml:space="preserve">Publicado: </w:t>
-      </w:r>
-      <w:r>
-        <w:rPr>
-          <w:color w:val="888888"/>
-          <w:sz w:val="18"/>
-        </w:rPr>
-        <w:t xml:space="preserve">2026-07-09   </w:t>
-      </w:r>
-      <w:hyperlink r:id="rId26">
-        <w:r>
-          <w:rPr>
-            <w:color w:val="1A4D2E"/>
-            <w:u w:val="single"/>
-            <w:b/>
-          </w:rPr>
-          <w:t>Acessar materia</w:t>
-        </w:r>
-      </w:hyperlink>
-    </w:p>
-    <w:p>
-      <w:pPr>
-        <w:spacing w:after="120"/>
-      </w:pPr>
-      <w:r>
-        <w:rPr>
-          <w:i/>
-          <w:color w:val="888888"/>
-          <w:sz w:val="16"/>
-        </w:rPr>
-        <w:t>Publicação de orientações regulatórias para o setor de combustíveis, impactando operadores.</w:t>
-      </w:r>
-    </w:p>
-    <w:p>
-      <w:pPr>
-        <w:spacing w:before="160" w:after="40"/>
-      </w:pPr>
-      <w:r>
-        <w:rPr>
-          <w:b/>
-          <w:color w:val="1A1A1A"/>
-          <w:sz w:val="22"/>
-        </w:rPr>
-        <w:t xml:space="preserve">ANP realiza 2ª edição do workshop Net Zero ANP, sobre hidrogênio de bai   </w:t>
-      </w:r>
-      <w:r>
-        <w:rPr>
-          <w:b/>
-          <w:color w:val="D68910"/>
-          <w:sz w:val="16"/>
-        </w:rPr>
-        <w:t>[MÉDIA]</w:t>
-      </w:r>
-    </w:p>
-    <w:p>
-      <w:pPr>
-        <w:spacing w:after="40"/>
-      </w:pPr>
-      <w:r>
-        <w:rPr>
-          <w:color w:val="4A4A4A"/>
-          <w:sz w:val="20"/>
-        </w:rPr>
-        <w:t>A ANP realiza a segunda edição do workshop Net Zero ANP, focado em hidrogênio de baixo carbono.</w:t>
-      </w:r>
-    </w:p>
-    <w:p>
-      <w:pPr>
-        <w:spacing w:after="40"/>
-      </w:pPr>
-      <w:r>
-        <w:rPr>
-          <w:b/>
-          <w:color w:val="888888"/>
-          <w:sz w:val="18"/>
-        </w:rPr>
-        <w:t xml:space="preserve">Publicado: </w:t>
-      </w:r>
-      <w:r>
-        <w:rPr>
-          <w:color w:val="888888"/>
-          <w:sz w:val="18"/>
-        </w:rPr>
-        <w:t xml:space="preserve">data nao identificada   </w:t>
-      </w:r>
-      <w:hyperlink r:id="rId27">
-        <w:r>
-          <w:rPr>
-            <w:color w:val="1A4D2E"/>
-            <w:u w:val="single"/>
-            <w:b/>
-          </w:rPr>
-          <w:t>Acessar materia</w:t>
-        </w:r>
-      </w:hyperlink>
-    </w:p>
-    <w:p>
-      <w:pPr>
-        <w:spacing w:after="120"/>
-      </w:pPr>
-      <w:r>
-        <w:rPr>
-          <w:i/>
-          <w:color w:val="888888"/>
-          <w:sz w:val="16"/>
-        </w:rPr>
-        <w:t>Workshop sobre tema estratégico (hidrogênio de baixo carbono) para o setor de energia. Data não clara, incluído por padrão.</w:t>
-      </w:r>
-    </w:p>
-    <w:p>
-      <w:pPr>
-        <w:spacing w:before="240" w:after="80"/>
-      </w:pPr>
-      <w:r>
-        <w:rPr>
-          <w:b/>
-          <w:color w:val="1A4D2E"/>
-          <w:sz w:val="20"/>
-        </w:rPr>
-        <w:t>MME | NOTÍCIAS</w:t>
-      </w:r>
-    </w:p>
-    <w:p>
-      <w:pPr>
-        <w:spacing w:before="0" w:after="40"/>
-        <w:pBdr>
-          <w:bottom w:val="single" w:sz="8" w:space="1" w:color="1A4D2E"/>
-        </w:pBdr>
-      </w:pPr>
-    </w:p>
-    <w:p>
-      <w:pPr>
-        <w:spacing w:before="160" w:after="40"/>
-      </w:pPr>
-      <w:r>
-        <w:rPr>
-          <w:b/>
-          <w:color w:val="1A1A1A"/>
-          <w:sz w:val="22"/>
-        </w:rPr>
-        <w:t xml:space="preserve">Resolução do CMSE estabelece novas diretrizes para despacho de geração térmica   </w:t>
-      </w:r>
-      <w:r>
-        <w:rPr>
-          <w:b/>
-          <w:color w:val="C0392B"/>
-          <w:sz w:val="16"/>
-        </w:rPr>
-        <w:t>[ALTA]</w:t>
-      </w:r>
-    </w:p>
-    <w:p>
-      <w:pPr>
-        <w:spacing w:after="40"/>
-      </w:pPr>
-      <w:r>
-        <w:rPr>
-          <w:color w:val="4A4A4A"/>
-          <w:sz w:val="20"/>
-        </w:rPr>
-        <w:t>Resolução do Comitê de Monitoramento do Setor Elétrico (CMSE) publicada no DOU estabelece novas diretrizes para despacho de geração térmica.</w:t>
-      </w:r>
-    </w:p>
-    <w:p>
-      <w:pPr>
-        <w:spacing w:after="40"/>
-      </w:pPr>
-      <w:r>
-        <w:rPr>
-          <w:b/>
-          <w:color w:val="888888"/>
-          <w:sz w:val="18"/>
-        </w:rPr>
-        <w:t xml:space="preserve">Publicado: </w:t>
-      </w:r>
-      <w:r>
-        <w:rPr>
-          <w:color w:val="888888"/>
-          <w:sz w:val="18"/>
-        </w:rPr>
-        <w:t xml:space="preserve">2026-07-09   </w:t>
-      </w:r>
-      <w:hyperlink r:id="rId13">
-        <w:r>
-          <w:rPr>
-            <w:color w:val="1A4D2E"/>
-            <w:u w:val="single"/>
-            <w:b/>
-          </w:rPr>
-          <w:t>Acessar materia</w:t>
-        </w:r>
-      </w:hyperlink>
-    </w:p>
-    <w:p>
-      <w:pPr>
-        <w:spacing w:after="120"/>
-      </w:pPr>
-      <w:r>
-        <w:rPr>
-          <w:i/>
-          <w:color w:val="888888"/>
-          <w:sz w:val="16"/>
-        </w:rPr>
-        <w:t>Nova resolução com diretrizes para o despacho de geração térmica, impactando o setor elétrico.</w:t>
-      </w:r>
-    </w:p>
-    <w:p>
-      <w:pPr>
-        <w:spacing w:before="160" w:after="40"/>
-      </w:pPr>
-      <w:r>
-        <w:rPr>
-          <w:b/>
-          <w:color w:val="1A1A1A"/>
-          <w:sz w:val="22"/>
-        </w:rPr>
-        <w:t xml:space="preserve">MME abre consulta pública sobre Plano de Ação Nacional para a Mineração Artesanal e em Pequena Escala de Ouro   </w:t>
-      </w:r>
-      <w:r>
-        <w:rPr>
-          <w:b/>
-          <w:color w:val="D68910"/>
-          <w:sz w:val="16"/>
-        </w:rPr>
-        <w:t>[MÉDIA]</w:t>
-      </w:r>
-    </w:p>
-    <w:p>
-      <w:pPr>
-        <w:spacing w:after="40"/>
-      </w:pPr>
-      <w:r>
-        <w:rPr>
-          <w:color w:val="4A4A4A"/>
-          <w:sz w:val="20"/>
-        </w:rPr>
-        <w:t>O Ministério de Minas e Energia (MME) abriu consulta pública para o Plano de Ação Nacional para a Mineração Artesanal e em Pequena Escala de Ouro.</w:t>
-      </w:r>
-    </w:p>
-    <w:p>
-      <w:pPr>
-        <w:spacing w:after="40"/>
-      </w:pPr>
-      <w:r>
-        <w:rPr>
-          <w:b/>
-          <w:color w:val="888888"/>
-          <w:sz w:val="18"/>
-        </w:rPr>
-        <w:t xml:space="preserve">Publicado: </w:t>
-      </w:r>
-      <w:r>
-        <w:rPr>
-          <w:color w:val="888888"/>
-          <w:sz w:val="18"/>
-        </w:rPr>
-        <w:t xml:space="preserve">2026-07-09   </w:t>
-      </w:r>
-      <w:hyperlink r:id="rId28">
-        <w:r>
-          <w:rPr>
-            <w:color w:val="1A4D2E"/>
-            <w:u w:val="single"/>
-            <w:b/>
-          </w:rPr>
-          <w:t>Acessar materia</w:t>
-        </w:r>
-      </w:hyperlink>
-    </w:p>
-    <w:p>
-      <w:pPr>
-        <w:spacing w:after="120"/>
-      </w:pPr>
-      <w:r>
-        <w:rPr>
-          <w:i/>
-          <w:color w:val="888888"/>
-          <w:sz w:val="16"/>
-        </w:rPr>
-        <w:t>Abertura de consulta pública sobre plano de ação para mineração, relevante para o setor.</w:t>
-      </w:r>
-    </w:p>
-    <w:p>
-      <w:pPr>
-        <w:spacing w:before="160" w:after="40"/>
-      </w:pPr>
-      <w:r>
-        <w:rPr>
-          <w:b/>
-          <w:color w:val="1A1A1A"/>
-          <w:sz w:val="22"/>
-        </w:rPr>
-        <w:t xml:space="preserve">EPE e MME publicam Caderno de Requisitos de Energia e Potência do PDE 2032   </w:t>
-      </w:r>
-      <w:r>
-        <w:rPr>
-          <w:b/>
-          <w:color w:val="D68910"/>
-          <w:sz w:val="16"/>
-        </w:rPr>
-        <w:t>[MÉDIA]</w:t>
-      </w:r>
-    </w:p>
-    <w:p>
-      <w:pPr>
-        <w:spacing w:after="40"/>
-      </w:pPr>
-      <w:r>
-        <w:rPr>
-          <w:color w:val="4A4A4A"/>
-          <w:sz w:val="20"/>
-        </w:rPr>
-        <w:t>A EPE e o MME publicam o Caderno de Requisitos de Energia e Potência do Plano Decenal de Expansão de Energia (PDE) 2032.</w:t>
-      </w:r>
-    </w:p>
-    <w:p>
-      <w:pPr>
-        <w:spacing w:after="40"/>
-      </w:pPr>
-      <w:r>
-        <w:rPr>
-          <w:b/>
-          <w:color w:val="888888"/>
-          <w:sz w:val="18"/>
-        </w:rPr>
-        <w:t xml:space="preserve">Publicado: </w:t>
-      </w:r>
-      <w:r>
-        <w:rPr>
-          <w:color w:val="888888"/>
-          <w:sz w:val="18"/>
-        </w:rPr>
-        <w:t xml:space="preserve">data nao identificada   </w:t>
-      </w:r>
-      <w:hyperlink r:id="rId29">
-        <w:r>
-          <w:rPr>
-            <w:color w:val="1A4D2E"/>
-            <w:u w:val="single"/>
-            <w:b/>
-          </w:rPr>
-          <w:t>Acessar materia</w:t>
-        </w:r>
-      </w:hyperlink>
-    </w:p>
-    <w:p>
-      <w:pPr>
-        <w:spacing w:after="120"/>
-      </w:pPr>
-      <w:r>
-        <w:rPr>
-          <w:i/>
-          <w:color w:val="888888"/>
-          <w:sz w:val="16"/>
-        </w:rPr>
-        <w:t>Publicação de caderno técnico sobre planejamento energético, relevante para o setor. Data não clara, incluído por padrão.</w:t>
-      </w:r>
-    </w:p>
-    <w:p>
-      <w:pPr>
-        <w:spacing w:before="240" w:after="80"/>
-      </w:pPr>
-      <w:r>
-        <w:rPr>
-          <w:b/>
-          <w:color w:val="1A4D2E"/>
-          <w:sz w:val="20"/>
-        </w:rPr>
-        <w:t>EPE | NOTÍCIAS</w:t>
-      </w:r>
-    </w:p>
-    <w:p>
-      <w:pPr>
-        <w:spacing w:before="0" w:after="40"/>
-        <w:pBdr>
-          <w:bottom w:val="single" w:sz="8" w:space="1" w:color="1A4D2E"/>
-        </w:pBdr>
-      </w:pPr>
-    </w:p>
-    <w:p>
-      <w:pPr>
-        <w:spacing w:before="160" w:after="40"/>
-      </w:pPr>
-      <w:r>
-        <w:rPr>
-          <w:b/>
-          <w:color w:val="1A1A1A"/>
-          <w:sz w:val="22"/>
-        </w:rPr>
-        <w:t xml:space="preserve">EPE prevê expansões do Sistema Interligado Nacional no PET/PELP do 1º semestre de 2026   </w:t>
-      </w:r>
-      <w:r>
-        <w:rPr>
-          <w:b/>
-          <w:color w:val="C0392B"/>
-          <w:sz w:val="16"/>
-        </w:rPr>
-        <w:t>[ALTA]</w:t>
-      </w:r>
-    </w:p>
-    <w:p>
-      <w:pPr>
-        <w:spacing w:after="40"/>
-      </w:pPr>
-      <w:r>
-        <w:rPr>
-          <w:color w:val="4A4A4A"/>
-          <w:sz w:val="20"/>
-        </w:rPr>
-        <w:t>O PET/PELP apresenta estatísticas referentes à expansão planejada, contextualizando os principais destaques dos estados, com informações sobre as próximas obras a serem licitadas e seus investimentos e benefícios, bem como proporciona uma visão geral sobre os estudos de planejamento em andamento, a serem contemplados nas próximas edições do documento.</w:t>
-      </w:r>
-    </w:p>
-    <w:p>
-      <w:pPr>
-        <w:spacing w:after="40"/>
-      </w:pPr>
-      <w:r>
-        <w:rPr>
-          <w:b/>
-          <w:color w:val="888888"/>
-          <w:sz w:val="18"/>
-        </w:rPr>
-        <w:t xml:space="preserve">Publicado: </w:t>
-      </w:r>
-      <w:r>
-        <w:rPr>
-          <w:color w:val="888888"/>
-          <w:sz w:val="18"/>
-        </w:rPr>
-        <w:t xml:space="preserve">2026-07-09   </w:t>
-      </w:r>
-      <w:hyperlink r:id="rId30">
-        <w:r>
-          <w:rPr>
-            <w:color w:val="1A4D2E"/>
-            <w:u w:val="single"/>
-            <w:b/>
-          </w:rPr>
-          <w:t>Acessar materia</w:t>
-        </w:r>
-      </w:hyperlink>
-    </w:p>
-    <w:p>
-      <w:pPr>
-        <w:spacing w:after="120"/>
-      </w:pPr>
-      <w:r>
-        <w:rPr>
-          <w:i/>
-          <w:color w:val="888888"/>
-          <w:sz w:val="16"/>
-        </w:rPr>
-        <w:t>Previsões de expansão do Sistema Interligado Nacional, com impacto no planejamento e investimentos do setor elétrico.</w:t>
-      </w:r>
-    </w:p>
-    <w:p>
-      <w:pPr>
-        <w:spacing w:before="240" w:after="80"/>
-      </w:pPr>
-      <w:r>
-        <w:rPr>
-          <w:b/>
-          <w:color w:val="1A4D2E"/>
-          <w:sz w:val="20"/>
-        </w:rPr>
-        <w:t>ANM | NOTÍCIAS</w:t>
-      </w:r>
-    </w:p>
-    <w:p>
-      <w:pPr>
-        <w:spacing w:before="0" w:after="40"/>
-        <w:pBdr>
-          <w:bottom w:val="single" w:sz="8" w:space="1" w:color="1A4D2E"/>
-        </w:pBdr>
-      </w:pPr>
-    </w:p>
-    <w:p>
-      <w:pPr>
-        <w:spacing w:before="160" w:after="40"/>
-      </w:pPr>
-      <w:r>
-        <w:rPr>
-          <w:b/>
-          <w:color w:val="1A1A1A"/>
-          <w:sz w:val="22"/>
-        </w:rPr>
-        <w:t xml:space="preserve">Royalties da mineração injetam mais de R$ 477 milhões em estados e municípios produtores   </w:t>
-      </w:r>
-      <w:r>
-        <w:rPr>
-          <w:b/>
-          <w:color w:val="D68910"/>
-          <w:sz w:val="16"/>
-        </w:rPr>
-        <w:t>[MÉDIA]</w:t>
-      </w:r>
-    </w:p>
-    <w:p>
-      <w:pPr>
-        <w:spacing w:after="40"/>
-      </w:pPr>
-      <w:r>
-        <w:rPr>
-          <w:color w:val="4A4A4A"/>
-          <w:sz w:val="20"/>
-        </w:rPr>
-        <w:t>Royalties da mineração injetaram mais de R$ 477 milhões em estados e municípios produtores.</w:t>
-      </w:r>
-    </w:p>
-    <w:p>
-      <w:pPr>
-        <w:spacing w:after="40"/>
-      </w:pPr>
-      <w:r>
-        <w:rPr>
-          <w:b/>
-          <w:color w:val="888888"/>
-          <w:sz w:val="18"/>
-        </w:rPr>
-        <w:t xml:space="preserve">Publicado: </w:t>
-      </w:r>
-      <w:r>
-        <w:rPr>
-          <w:color w:val="888888"/>
-          <w:sz w:val="18"/>
-        </w:rPr>
-        <w:t xml:space="preserve">data nao identificada   </w:t>
-      </w:r>
-      <w:hyperlink r:id="rId31">
-        <w:r>
-          <w:rPr>
-            <w:color w:val="1A4D2E"/>
-            <w:u w:val="single"/>
-            <w:b/>
-          </w:rPr>
-          <w:t>Acessar materia</w:t>
-        </w:r>
-      </w:hyperlink>
-    </w:p>
-    <w:p>
-      <w:pPr>
-        <w:spacing w:after="120"/>
-      </w:pPr>
-      <w:r>
-        <w:rPr>
-          <w:i/>
-          <w:color w:val="888888"/>
-          <w:sz w:val="16"/>
-        </w:rPr>
-        <w:t>Notícia sobre o impacto financeiro dos royalties da mineração, relevante para o setor e entes federativos. Data não clara, incluído por padrão.</w:t>
-      </w:r>
-    </w:p>
-    <w:p/>
-    <w:tbl>
-      <w:tblPr>
-        <w:tblW w:type="auto" w:w="0"/>
-        <w:tblLayout w:type="fixed"/>
-        <w:tblLook w:firstColumn="1" w:firstRow="1" w:lastColumn="0" w:lastRow="0" w:noHBand="0" w:noVBand="1" w:val="04A0"/>
-      </w:tblPr>
-      <w:tblGrid>
-        <w:gridCol w:w="9638"/>
-      </w:tblGrid>
-      <w:tr>
-        <w:tc>
-          <w:tcPr>
-            <w:tcW w:type="dxa" w:w="9638"/>
-            <w:shd w:val="clear" w:color="auto" w:fill="1A4D2E"/>
-          </w:tcPr>
-          <w:p>
-            <w:pPr>
-              <w:spacing w:before="120" w:after="40"/>
-            </w:pPr>
-            <w:r>
-              <w:rPr>
-                <w:b w:val="0"/>
-                <w:color w:val="FFFFFF"/>
-                <w:sz w:val="32"/>
-              </w:rPr>
-              <w:t>Regulatório e Setorial</w:t>
-            </w:r>
-          </w:p>
-        </w:tc>
-      </w:tr>
-    </w:tbl>
-    <w:p>
-      <w:pPr>
-        <w:spacing w:before="240" w:after="80"/>
-      </w:pPr>
-      <w:r>
-        <w:rPr>
-          <w:b/>
-          <w:color w:val="1A4D2E"/>
-          <w:sz w:val="20"/>
-        </w:rPr>
-        <w:t>ANVISA | NOTÍCIAS</w:t>
-      </w:r>
-    </w:p>
-    <w:p>
-      <w:pPr>
-        <w:spacing w:before="0" w:after="40"/>
-        <w:pBdr>
-          <w:bottom w:val="single" w:sz="8" w:space="1" w:color="1A4D2E"/>
-        </w:pBdr>
-      </w:pPr>
-    </w:p>
-    <w:p>
-      <w:pPr>
-        <w:spacing w:before="160" w:after="40"/>
-      </w:pPr>
-      <w:r>
-        <w:rPr>
-          <w:b/>
-          <w:color w:val="1A1A1A"/>
-          <w:sz w:val="22"/>
-        </w:rPr>
-        <w:t xml:space="preserve">Anvisa determina apreensão de lotes falsificados de Mounjaro   </w:t>
-      </w:r>
-      <w:r>
-        <w:rPr>
-          <w:b/>
-          <w:color w:val="C0392B"/>
-          <w:sz w:val="16"/>
-        </w:rPr>
-        <w:t>[ALTA]</w:t>
-      </w:r>
-    </w:p>
-    <w:p>
-      <w:pPr>
-        <w:spacing w:after="40"/>
-      </w:pPr>
-      <w:r>
-        <w:rPr>
-          <w:color w:val="4A4A4A"/>
-          <w:sz w:val="20"/>
-        </w:rPr>
-        <w:t>A Anvisa determinou a apreensão de lotes falsificados do medicamento Mounjaro e proibiu a comercialização de produtos sem registro.</w:t>
-      </w:r>
-    </w:p>
-    <w:p>
-      <w:pPr>
-        <w:spacing w:after="40"/>
-      </w:pPr>
-      <w:r>
-        <w:rPr>
-          <w:b/>
-          <w:color w:val="888888"/>
-          <w:sz w:val="18"/>
-        </w:rPr>
-        <w:t xml:space="preserve">Publicado: </w:t>
-      </w:r>
-      <w:r>
-        <w:rPr>
-          <w:color w:val="888888"/>
-          <w:sz w:val="18"/>
-        </w:rPr>
-        <w:t xml:space="preserve">2026-07-10   </w:t>
-      </w:r>
-      <w:hyperlink r:id="rId32">
-        <w:r>
-          <w:rPr>
-            <w:color w:val="1A4D2E"/>
-            <w:u w:val="single"/>
-            <w:b/>
-          </w:rPr>
-          <w:t>Acessar materia</w:t>
-        </w:r>
-      </w:hyperlink>
-    </w:p>
-    <w:p>
-      <w:pPr>
-        <w:spacing w:after="120"/>
-      </w:pPr>
-      <w:r>
-        <w:rPr>
-          <w:i/>
-          <w:color w:val="888888"/>
-          <w:sz w:val="16"/>
-        </w:rPr>
-        <w:t>Medida de fiscalização com impacto direto na saúde pública e no mercado farmacêutico.</w:t>
-      </w:r>
-    </w:p>
-    <w:p>
-      <w:pPr>
-        <w:spacing w:before="160" w:after="40"/>
-      </w:pPr>
-      <w:r>
-        <w:rPr>
-          <w:b/>
-          <w:color w:val="1A1A1A"/>
-          <w:sz w:val="22"/>
-        </w:rPr>
-        <w:t xml:space="preserve">Anvisa convida Visas a participarem de pesquisas estratégicas   </w:t>
-      </w:r>
-      <w:r>
-        <w:rPr>
-          <w:b/>
-          <w:color w:val="D68910"/>
-          <w:sz w:val="16"/>
-        </w:rPr>
-        <w:t>[MÉDIA]</w:t>
-      </w:r>
-    </w:p>
-    <w:p>
-      <w:pPr>
-        <w:spacing w:after="40"/>
-      </w:pPr>
-      <w:r>
-        <w:rPr>
-          <w:color w:val="4A4A4A"/>
-          <w:sz w:val="20"/>
-        </w:rPr>
-        <w:t>A Anvisa lançou duas pesquisas para aprimorar os instrumentos de inspeção em serviços de saúde e de interesse para a saúde.</w:t>
-      </w:r>
-    </w:p>
-    <w:p>
-      <w:pPr>
-        <w:spacing w:after="40"/>
-      </w:pPr>
-      <w:r>
-        <w:rPr>
-          <w:b/>
-          <w:color w:val="888888"/>
-          <w:sz w:val="18"/>
-        </w:rPr>
-        <w:t xml:space="preserve">Publicado: </w:t>
-      </w:r>
-      <w:r>
-        <w:rPr>
-          <w:color w:val="888888"/>
-          <w:sz w:val="18"/>
-        </w:rPr>
-        <w:t xml:space="preserve">2026-07-09   </w:t>
-      </w:r>
-      <w:hyperlink r:id="rId33">
-        <w:r>
-          <w:rPr>
-            <w:color w:val="1A4D2E"/>
-            <w:u w:val="single"/>
-            <w:b/>
-          </w:rPr>
-          <w:t>Acessar materia</w:t>
-        </w:r>
-      </w:hyperlink>
-    </w:p>
-    <w:p>
-      <w:pPr>
-        <w:spacing w:after="120"/>
-      </w:pPr>
-      <w:r>
-        <w:rPr>
-          <w:i/>
-          <w:color w:val="888888"/>
-          <w:sz w:val="16"/>
-        </w:rPr>
-        <w:t>Lançamento de pesquisas para aprimorar a fiscalização sanitária, relevante para o setor de saúde.</w:t>
-      </w:r>
-    </w:p>
-    <w:p>
-      <w:pPr>
-        <w:spacing w:before="160" w:after="40"/>
-      </w:pPr>
-      <w:r>
-        <w:rPr>
-          <w:b/>
-          <w:color w:val="1A1A1A"/>
-          <w:sz w:val="22"/>
-        </w:rPr>
-        <w:t xml:space="preserve">Anvisa determina recolhimento de suplementos alimentares irregulares   </w:t>
-      </w:r>
-      <w:r>
-        <w:rPr>
-          <w:b/>
-          <w:color w:val="C0392B"/>
-          <w:sz w:val="16"/>
-        </w:rPr>
-        <w:t>[ALTA]</w:t>
-      </w:r>
-    </w:p>
-    <w:p>
-      <w:pPr>
-        <w:spacing w:after="40"/>
-      </w:pPr>
-      <w:r>
-        <w:rPr>
-          <w:color w:val="4A4A4A"/>
-          <w:sz w:val="20"/>
-        </w:rPr>
-        <w:t>A Anvisa determinou o recolhimento de suplementos alimentares da marca Alivemed por indícios de composição em desacordo com a regulamentação.</w:t>
-      </w:r>
-    </w:p>
-    <w:p>
-      <w:pPr>
-        <w:spacing w:after="40"/>
-      </w:pPr>
-      <w:r>
-        <w:rPr>
-          <w:b/>
-          <w:color w:val="888888"/>
-          <w:sz w:val="18"/>
-        </w:rPr>
-        <w:t xml:space="preserve">Publicado: </w:t>
-      </w:r>
-      <w:r>
-        <w:rPr>
-          <w:color w:val="888888"/>
-          <w:sz w:val="18"/>
-        </w:rPr>
-        <w:t xml:space="preserve">2026-07-09   </w:t>
-      </w:r>
-      <w:hyperlink r:id="rId34">
-        <w:r>
-          <w:rPr>
-            <w:color w:val="1A4D2E"/>
-            <w:u w:val="single"/>
-            <w:b/>
-          </w:rPr>
-          <w:t>Acessar materia</w:t>
-        </w:r>
-      </w:hyperlink>
-    </w:p>
-    <w:p>
-      <w:pPr>
-        <w:spacing w:after="120"/>
-      </w:pPr>
-      <w:r>
-        <w:rPr>
-          <w:i/>
-          <w:color w:val="888888"/>
-          <w:sz w:val="16"/>
-        </w:rPr>
-        <w:t>Medida de fiscalização com impacto direto na comercialização de suplementos alimentares.</w:t>
-      </w:r>
-    </w:p>
-    <w:p>
-      <w:pPr>
-        <w:spacing w:before="160" w:after="40"/>
-      </w:pPr>
-      <w:r>
-        <w:rPr>
-          <w:b/>
-          <w:color w:val="1A1A1A"/>
-          <w:sz w:val="22"/>
-        </w:rPr>
-        <w:t xml:space="preserve">Venda, distribuição, propaganda e uso de suplementos da Bioghen fabricados até 9/4 seguem proibidos   </w:t>
-      </w:r>
-      <w:r>
-        <w:rPr>
-          <w:b/>
-          <w:color w:val="C0392B"/>
-          <w:sz w:val="16"/>
-        </w:rPr>
-        <w:t>[ALTA]</w:t>
-      </w:r>
-    </w:p>
-    <w:p>
-      <w:pPr>
-        <w:spacing w:after="40"/>
-      </w:pPr>
-      <w:r>
-        <w:rPr>
-          <w:color w:val="4A4A4A"/>
-          <w:sz w:val="20"/>
-        </w:rPr>
-        <w:t>A Anvisa manteve a proibição de venda, distribuição, propaganda e uso de suplementos da Bioghen fabricados até 9/4, após avaliar pedido de revisão.</w:t>
-      </w:r>
-    </w:p>
-    <w:p>
-      <w:pPr>
-        <w:spacing w:after="40"/>
-      </w:pPr>
-      <w:r>
-        <w:rPr>
-          <w:b/>
-          <w:color w:val="888888"/>
-          <w:sz w:val="18"/>
-        </w:rPr>
-        <w:t xml:space="preserve">Publicado: </w:t>
-      </w:r>
-      <w:r>
-        <w:rPr>
-          <w:color w:val="888888"/>
-          <w:sz w:val="18"/>
-        </w:rPr>
-        <w:t xml:space="preserve">2026-07-09   </w:t>
-      </w:r>
-      <w:hyperlink r:id="rId35">
-        <w:r>
-          <w:rPr>
-            <w:color w:val="1A4D2E"/>
-            <w:u w:val="single"/>
-            <w:b/>
-          </w:rPr>
-          <w:t>Acessar materia</w:t>
-        </w:r>
-      </w:hyperlink>
-    </w:p>
-    <w:p>
-      <w:pPr>
-        <w:spacing w:after="120"/>
-      </w:pPr>
-      <w:r>
-        <w:rPr>
-          <w:i/>
-          <w:color w:val="888888"/>
-          <w:sz w:val="16"/>
-        </w:rPr>
-        <w:t>Manutenção de proibição de produtos, com impacto direto na empresa e no mercado de suplementos.</w:t>
-      </w:r>
-    </w:p>
-    <w:p/>
-    <w:tbl>
-      <w:tblPr>
-        <w:tblW w:type="auto" w:w="0"/>
-        <w:tblLayout w:type="fixed"/>
-        <w:tblLook w:firstColumn="1" w:firstRow="1" w:lastColumn="0" w:lastRow="0" w:noHBand="0" w:noVBand="1" w:val="04A0"/>
-      </w:tblPr>
-      <w:tblGrid>
-        <w:gridCol w:w="9638"/>
-      </w:tblGrid>
-      <w:tr>
-        <w:tc>
-          <w:tcPr>
-            <w:tcW w:type="dxa" w:w="9638"/>
-          </w:tcPr>
-          <w:p>
-            <w:pPr>
-              <w:spacing w:before="120" w:after="40"/>
-            </w:pPr>
-            <w:r>
-              <w:rPr>
-                <w:b w:val="0"/>
-                <w:color w:val="1A4D2E"/>
-                <w:sz w:val="32"/>
-              </w:rPr>
-              <w:t>Transparencia da coleta</w:t>
-            </w:r>
-          </w:p>
-        </w:tc>
-      </w:tr>
-    </w:tbl>
-    <w:p>
-      <w:r>
-        <w:rPr>
-          <w:b/>
-          <w:color w:val="1A4D2E"/>
-          <w:sz w:val="20"/>
-        </w:rPr>
-        <w:t>Fontes sem publicacao na janela:</w:t>
-      </w:r>
-    </w:p>
-    <w:p>
-      <w:pPr>
-        <w:pStyle w:val="ListBullet"/>
-      </w:pPr>
-      <w:r>
-        <w:rPr>
-          <w:color w:val="4A4A4A"/>
-          <w:sz w:val="18"/>
-        </w:rPr>
-        <w:t>CCEE | Noticias - Nenhum resultado encontrado na janela temporal.</w:t>
-      </w:r>
-    </w:p>
-    <w:p>
-      <w:pPr>
-        <w:pStyle w:val="ListBullet"/>
-      </w:pPr>
-      <w:r>
-        <w:rPr>
-          <w:color w:val="4A4A4A"/>
-          <w:sz w:val="18"/>
-        </w:rPr>
-        <w:t>Ministério da Fazenda | Notícias - Nenhum resultado encontrado na janela temporal.</w:t>
-      </w:r>
-    </w:p>
-    <w:p>
-      <w:pPr>
-        <w:pStyle w:val="ListBullet"/>
-      </w:pPr>
-      <w:r>
-        <w:rPr>
-          <w:color w:val="4A4A4A"/>
-          <w:sz w:val="18"/>
-        </w:rPr>
-        <w:t>ANPD | Notícias - Nenhum resultado encontrado na janela temporal.</w:t>
-      </w:r>
-    </w:p>
-    <w:p>
-      <w:pPr>
-        <w:pStyle w:val="ListBullet"/>
-      </w:pPr>
-      <w:r>
-        <w:rPr>
-          <w:color w:val="4A4A4A"/>
-          <w:sz w:val="18"/>
-        </w:rPr>
-        <w:t>CVM | Notícias - Nenhum resultado encontrado na janela temporal.</w:t>
-      </w:r>
-    </w:p>
-    <w:p>
-      <w:pPr>
-        <w:pStyle w:val="ListBullet"/>
-      </w:pPr>
-      <w:r>
-        <w:rPr>
-          <w:color w:val="4A4A4A"/>
-          <w:sz w:val="18"/>
-        </w:rPr>
-        <w:t>B3 | Ofícios e Comunicados - Nenhum resultado encontrado na janela temporal.</w:t>
-      </w:r>
-    </w:p>
-    <w:p>
-      <w:pPr>
-        <w:pStyle w:val="ListBullet"/>
-      </w:pPr>
-      <w:r>
-        <w:rPr>
-          <w:color w:val="4A4A4A"/>
-          <w:sz w:val="18"/>
-        </w:rPr>
-        <w:t>ONS | Notícias - Nenhum item encontrado na fonte.</w:t>
-      </w:r>
-    </w:p>
-    <w:p>
-      <w:pPr>
-        <w:pStyle w:val="ListBullet"/>
-      </w:pPr>
-      <w:r>
-        <w:rPr>
-          <w:color w:val="4A4A4A"/>
-          <w:sz w:val="18"/>
-        </w:rPr>
-        <w:t>ANEEL | Últimas Notícias - Nenhum resultado encontrado na janela temporal.</w:t>
-      </w:r>
-    </w:p>
-    <w:p>
-      <w:pPr>
-        <w:pStyle w:val="ListBullet"/>
-      </w:pPr>
-      <w:r>
-        <w:rPr>
-          <w:color w:val="4A4A4A"/>
-          <w:sz w:val="18"/>
-        </w:rPr>
-        <w:t>Secretaria de Prêmios e Apostas | Notícias - Nenhum resultado encontrado na fonte.</w:t>
-      </w:r>
-    </w:p>
-    <w:p>
-      <w:pPr>
-        <w:pStyle w:val="ListBullet"/>
-      </w:pPr>
-      <w:r>
-        <w:rPr>
-          <w:color w:val="4A4A4A"/>
-          <w:sz w:val="18"/>
-        </w:rPr>
-        <w:t>INPI | Notícias - Nenhum resultado encontrado na janela temporal.</w:t>
-      </w:r>
-    </w:p>
-    <w:p>
-      <w:pPr>
-        <w:pStyle w:val="ListBullet"/>
-      </w:pPr>
-      <w:r>
-        <w:rPr>
-          <w:color w:val="4A4A4A"/>
-          <w:sz w:val="18"/>
-        </w:rPr>
-        <w:t>Ministério da Agricultura | Notícias - Nenhum resultado encontrado na janela temporal.</w:t>
-      </w:r>
-    </w:p>
-    <w:p>
-      <w:r>
-        <w:rPr>
-          <w:b/>
-          <w:color w:val="D68910"/>
-          <w:sz w:val="20"/>
-        </w:rPr>
-        <w:t>Fontes sem resultado relevante:</w:t>
-      </w:r>
-    </w:p>
-    <w:p>
-      <w:pPr>
-        <w:pStyle w:val="ListBullet"/>
-      </w:pPr>
-      <w:r>
-        <w:rPr>
-          <w:color w:val="4A4A4A"/>
-          <w:sz w:val="18"/>
-        </w:rPr>
-        <w:t>Destaques do D.O.U. - Página de busca, não lista publicações diretamente.</w:t>
-      </w:r>
-    </w:p>
-    <w:p>
-      <w:pPr>
-        <w:pStyle w:val="ListBullet"/>
-      </w:pPr>
-      <w:r>
-        <w:rPr>
-          <w:color w:val="4A4A4A"/>
-          <w:sz w:val="18"/>
-        </w:rPr>
-        <w:t>Receita Federal | Normas - Página de busca, não lista publicações diretamente.</w:t>
-      </w:r>
-    </w:p>
-    <w:p>
-      <w:pPr>
-        <w:pStyle w:val="ListBullet"/>
-      </w:pPr>
-      <w:r>
-        <w:rPr>
-          <w:color w:val="4A4A4A"/>
-          <w:sz w:val="18"/>
-        </w:rPr>
-        <w:t>CGU | Notícias - Conteúdo restrito, requer autenticação.</w:t>
-      </w:r>
-    </w:p>
-    <w:p>
-      <w:pPr>
-        <w:pStyle w:val="ListBullet"/>
-      </w:pPr>
-      <w:r>
-        <w:rPr>
-          <w:color w:val="4A4A4A"/>
-          <w:sz w:val="18"/>
-        </w:rPr>
-        <w:t>COAF | Notícias - Conteúdo não carregado ('Carregando') ou não disponível.</w:t>
-      </w:r>
-    </w:p>
-    <w:p>
-      <w:pPr>
-        <w:pStyle w:val="ListBullet"/>
-      </w:pPr>
-      <w:r>
-        <w:rPr>
-          <w:color w:val="4A4A4A"/>
-          <w:sz w:val="18"/>
-        </w:rPr>
-        <w:t>Ministério do Meio Ambiente | Notícias - Conteúdo restrito, requer autenticação.</w:t>
-      </w:r>
-    </w:p>
-    <w:p>
-      <w:pPr>
-        <w:pStyle w:val="ListBullet"/>
-      </w:pPr>
-      <w:r>
-        <w:rPr>
-          <w:color w:val="4A4A4A"/>
-          <w:sz w:val="18"/>
-        </w:rPr>
-        <w:t>SENACON | Notícias - Conteúdo restrito, requer autenticação.</w:t>
-      </w:r>
-    </w:p>
-    <w:p>
-      <w:r>
-        <w:rPr>
-          <w:b/>
-          <w:color w:val="C0392B"/>
-          <w:sz w:val="20"/>
-        </w:rPr>
-        <w:t>Fontes com erro tecnico:</w:t>
-      </w:r>
-    </w:p>
-    <w:p>
-      <w:pPr>
-        <w:pStyle w:val="ListBullet"/>
-      </w:pPr>
-      <w:r>
-        <w:rPr>
-          <w:color w:val="4A4A4A"/>
-          <w:sz w:val="18"/>
-        </w:rPr>
-        <w:t>Planalto | Resenha Diaria - Internal Server Error: Failed to scrape. All scraping engines failed to retrieve content from this URL. Engines tried: [index, fire-engine;chrome-cdp, fire-engine(retry);chrome-cdp, fire-engine;tlscli</w:t>
+        <w:t>Isso pode ocorrer em fins de semana, feriados ou dias sem publicacoes relevantes.</w:t>
       </w:r>
     </w:p>
     <w:p/>
@@ -3142,7 +295,7 @@
           <w:color w:val="888888"/>
           <w:sz w:val="16"/>
         </w:rPr>
-        <w:t>Janela analisada: 2026-07-09T00:00 ate 2026-07-10T10:13</w:t>
+        <w:t>Janela analisada: 2026-07-10T00:00 ate 2026-07-13T10:25</w:t>
       </w:r>
     </w:p>
     <w:sectPr>

</xml_diff>